<commit_message>
Updating SIOP submission (e.g., added abstract, suggested title, new RQ framing).
</commit_message>
<xml_diff>
--- a/AI_JCM.docx
+++ b/AI_JCM.docx
@@ -14,6 +14,36 @@
     <w:p>
       <w:pPr>
         <w:pStyle w:val="FirstParagraph"/>
+      </w:pPr>
+      <w:r>
+        <w:t xml:space="preserve">An Alternative Title:</w:t>
+      </w:r>
+      <w:r>
+        <w:t xml:space="preserve"> </w:t>
+      </w:r>
+      <w:r>
+        <w:t xml:space="preserve">“Measuring AI-Adopter Types: Comparison of Traditional vs. AI-Facilitated Procedures”</w:t>
+      </w:r>
+    </w:p>
+    <w:p>
+      <w:pPr>
+        <w:pStyle w:val="BodyText"/>
+      </w:pPr>
+      <w:r>
+        <w:t xml:space="preserve">Abstract</w:t>
+      </w:r>
+    </w:p>
+    <w:p>
+      <w:pPr>
+        <w:pStyle w:val="BodyText"/>
+      </w:pPr>
+      <w:r>
+        <w:t xml:space="preserve">The present study is an exploratory comparison of three approaches to developing items intended to assess employees’ orientations toward workplace AI. Items for Callari and Puppione (2025)’s qualitatively-derived ideal AI user types were generated through (a) ChatGPT, (b) AI-GENIE, and (c) industrial-organizational psychology subject-matter experts.</w:t>
+      </w:r>
+    </w:p>
+    <w:p>
+      <w:pPr>
+        <w:pStyle w:val="BodyText"/>
       </w:pPr>
       <w:r>
         <w:t xml:space="preserve">Artificial intelligence (AI) has the potential to alter the fundamental</w:t>
@@ -59,13 +89,7 @@
         <w:t xml:space="preserve"> </w:t>
       </w:r>
       <w:r>
-        <w:t xml:space="preserve">proposes that core job characteristics shape critical psychological states and, ultimately, important employee outcomes. Emerging research suggests that digitization may substantially alter these characteristics. For example, digital technologies may automate repetitive tasks, but they may also fragment work, limit skill</w:t>
-      </w:r>
-      <w:r>
-        <w:t xml:space="preserve"> </w:t>
-      </w:r>
-      <w:r>
-        <w:t xml:space="preserve">use, or diminish employees’ sense of ownership over their work.</w:t>
+        <w:t xml:space="preserve">proposes that core job characteristics shape critical psychological states and, ultimately, important employee outcomes, and emerging research suggests that digitization may substantially alter these characteristics. For example, digital technologies may automate repetitive tasks, but they may also fragment work, limit skill use, or diminish employees’ sense of ownership over their work.</w:t>
       </w:r>
       <w:r>
         <w:t xml:space="preserve"> </w:t>
@@ -103,18 +127,21 @@
         <w:t xml:space="preserve"> </w:t>
       </w:r>
       <w:r>
-        <w:t xml:space="preserve">As AI’s role in the design and performance of work grows it is important</w:t>
-      </w:r>
-      <w:r>
-        <w:t xml:space="preserve"> </w:t>
-      </w:r>
-      <w:r>
-        <w:t xml:space="preserve">to understand how employees engage with the technology.</w:t>
+        <w:t xml:space="preserve">As such, as AI’s role in the design and performance of work grows it is important to understand how employees engage with the technology. The present makes two key contributions to our understanding of AI in the workplace: Our first aim is to create a meausure of type of AI adopter. Second, we accomplish to goal of scale creation via a novel comparison of three approaches to developing items, comparing traditionally-derived subject matter expert ratings, with LLM-derivded procedures including prompting via ChatGPT and through a dedicated R package (AI-GENIE).</w:t>
+      </w:r>
+    </w:p>
+    <w:bookmarkStart w:id="20" w:name="conceptualizing-ai-use-in-the-workplace"/>
+    <w:p>
+      <w:pPr>
+        <w:pStyle w:val="Heading2"/>
+      </w:pPr>
+      <w:r>
+        <w:t xml:space="preserve">Conceptualizing AI Use in the Workplace</w:t>
       </w:r>
     </w:p>
     <w:p>
       <w:pPr>
-        <w:pStyle w:val="BodyText"/>
+        <w:pStyle w:val="FirstParagraph"/>
       </w:pPr>
       <w:r>
         <w:t xml:space="preserve">Conceptualizing and measuring employee AI use is challenging. Existing</w:t>
@@ -415,13 +442,25 @@
         <w:t xml:space="preserve"> </w:t>
       </w:r>
       <w:r>
-        <w:t xml:space="preserve">generative AI can properly measure constructs. The present study is an</w:t>
-      </w:r>
-      <w:r>
-        <w:t xml:space="preserve"> </w:t>
-      </w:r>
-      <w:r>
-        <w:t xml:space="preserve">exploratory comparison of three approaches to developing items intended</w:t>
+        <w:t xml:space="preserve">generative AI can properly measure constructs.</w:t>
+      </w:r>
+    </w:p>
+    <w:bookmarkEnd w:id="20"/>
+    <w:bookmarkStart w:id="21" w:name="the-current-study"/>
+    <w:p>
+      <w:pPr>
+        <w:pStyle w:val="Heading2"/>
+      </w:pPr>
+      <w:r>
+        <w:t xml:space="preserve">The Current Study</w:t>
+      </w:r>
+    </w:p>
+    <w:p>
+      <w:pPr>
+        <w:pStyle w:val="FirstParagraph"/>
+      </w:pPr>
+      <w:r>
+        <w:t xml:space="preserve">The present study is an exploratory comparison of three approaches to developing items intended</w:t>
       </w:r>
       <w:r>
         <w:t xml:space="preserve"> </w:t>
@@ -528,11 +567,64 @@
         <w:t xml:space="preserve">Research Question</w:t>
       </w:r>
       <w:r>
-        <w:t xml:space="preserve">: Does one instrument development procedure emerge as better?</w:t>
+        <w:t xml:space="preserve">: Does one instrument development procedure (ChatGPT, AI-GENIE, or SMEs) emerge as superior to the others?</w:t>
       </w:r>
     </w:p>
+    <w:p>
+      <w:pPr>
+        <w:pStyle w:val="FirstParagraph"/>
+      </w:pPr>
+      <w:r>
+        <w:t xml:space="preserve">OR</w:t>
+      </w:r>
+    </w:p>
+    <w:p>
+      <w:pPr>
+        <w:pStyle w:val="BlockText"/>
+      </w:pPr>
+      <w:r>
+        <w:rPr>
+          <w:i/>
+          <w:iCs/>
+        </w:rPr>
+        <w:t xml:space="preserve">Research Question</w:t>
+      </w:r>
+      <w:r>
+        <w:t xml:space="preserve">:Research Question: Are AI-driven item-generation procedures (i.e., ChatGPT or AI-GENIE) as good as, or even superior to, traditionally generated SME items?</w:t>
+      </w:r>
+    </w:p>
+    <w:p>
+      <w:pPr>
+        <w:pStyle w:val="SourceCode"/>
+      </w:pPr>
+      <w:r>
+        <w:rPr>
+          <w:rStyle w:val="VerbatimChar"/>
+        </w:rPr>
+        <w:t xml:space="preserve">Some items ( chat_ES_5 ) were negatively correlated with the first principal component and </w:t>
+      </w:r>
+      <w:r>
+        <w:br/>
+      </w:r>
+      <w:r>
+        <w:rPr>
+          <w:rStyle w:val="VerbatimChar"/>
+        </w:rPr>
+        <w:t xml:space="preserve">probably should be reversed.  </w:t>
+      </w:r>
+      <w:r>
+        <w:br/>
+      </w:r>
+      <w:r>
+        <w:rPr>
+          <w:rStyle w:val="VerbatimChar"/>
+        </w:rPr>
+        <w:t xml:space="preserve">To do this, run the function again with the 'check.keys=TRUE' option</w:t>
+      </w:r>
+    </w:p>
+    <w:bookmarkEnd w:id="21"/>
     <w:bookmarkEnd w:id="22"/>
-    <w:bookmarkStart w:id="28" w:name="method"/>
+    <w:bookmarkStart w:id="29" w:name="method"/>
     <w:p>
       <w:pPr>
         <w:pStyle w:val="Heading1"/>
@@ -541,7 +633,75 @@
         <w:t xml:space="preserve">Method</w:t>
       </w:r>
     </w:p>
-    <w:bookmarkStart w:id="26" w:name="materials"/>
+    <w:bookmarkStart w:id="23" w:name="participants"/>
+    <w:p>
+      <w:pPr>
+        <w:pStyle w:val="Heading2"/>
+      </w:pPr>
+      <w:r>
+        <w:t xml:space="preserve">Participants</w:t>
+      </w:r>
+    </w:p>
+    <w:p>
+      <w:pPr>
+        <w:pStyle w:val="FirstParagraph"/>
+      </w:pPr>
+      <w:r>
+        <w:t xml:space="preserve">124 undergraduate students responded (Mean age = 21.58, SD = 5.61). The students were given the choice of 50 different majors to choose from, with the greatest representation being Psychology at 38.71% (see</w:t>
+      </w:r>
+      <w:r>
+        <w:t xml:space="preserve"> </w:t>
+      </w:r>
+      <w:hyperlink w:anchor="tbl-majors">
+        <w:r>
+          <w:rPr>
+            <w:rStyle w:val="Hyperlink"/>
+          </w:rPr>
+          <w:t xml:space="preserve">Table 2</w:t>
+        </w:r>
+      </w:hyperlink>
+      <w:r>
+        <w:t xml:space="preserve">). When asked,</w:t>
+      </w:r>
+      <w:r>
+        <w:t xml:space="preserve"> </w:t>
+      </w:r>
+      <w:r>
+        <w:t xml:space="preserve">“Which context did you have in mind as you responded to the statements in this survey?”</w:t>
+      </w:r>
+      <w:r>
+        <w:t xml:space="preserve">, 79.03% indicated</w:t>
+      </w:r>
+      <w:r>
+        <w:t xml:space="preserve"> </w:t>
+      </w:r>
+      <w:r>
+        <w:t xml:space="preserve">“school”</w:t>
+      </w:r>
+      <w:r>
+        <w:t xml:space="preserve">, 12.9% indicated</w:t>
+      </w:r>
+      <w:r>
+        <w:t xml:space="preserve"> </w:t>
+      </w:r>
+      <w:r>
+        <w:t xml:space="preserve">“work”</w:t>
+      </w:r>
+      <w:r>
+        <w:t xml:space="preserve">, and 7.26% stated</w:t>
+      </w:r>
+      <w:r>
+        <w:t xml:space="preserve"> </w:t>
+      </w:r>
+      <w:r>
+        <w:t xml:space="preserve">“other”</w:t>
+      </w:r>
+      <w:r>
+        <w:t xml:space="preserve">.</w:t>
+      </w:r>
+    </w:p>
+    <w:bookmarkEnd w:id="23"/>
+    <w:bookmarkStart w:id="27" w:name="materials"/>
     <w:p>
       <w:pPr>
         <w:pStyle w:val="Heading2"/>
@@ -581,7 +741,7 @@
         <w:t xml:space="preserve">in their qualitative study on the way employees perceive meaningful work in tasks co-generated by Microsoft 365 Copilot specifically. They identified three ideal types, including an Efficiency-Seeking Type (perceives the AI tool as a straightforward task-assistance tool), a Pragmatic Integrator Type (perceives AI tool as a smarter assistant), and a Collaborative Optimiser Type (perceives AI tool an expert-like teammate). Three different methods of item generation were used (and compared) here.</w:t>
       </w:r>
     </w:p>
-    <w:bookmarkStart w:id="23" w:name="expertgenerated-items."/>
+    <w:bookmarkStart w:id="24" w:name="expertgenerated-items."/>
     <w:p>
       <w:pPr>
         <w:pStyle w:val="Heading3"/>
@@ -611,8 +771,8 @@
         <w:t xml:space="preserve">=18 through consensus evaluation of item clarity and content domain coverage.</w:t>
       </w:r>
     </w:p>
-    <w:bookmarkEnd w:id="23"/>
-    <w:bookmarkStart w:id="24" w:name="chatgpt-generated-items."/>
+    <w:bookmarkEnd w:id="24"/>
+    <w:bookmarkStart w:id="25" w:name="chatgpt-generated-items."/>
     <w:p>
       <w:pPr>
         <w:pStyle w:val="Heading3"/>
@@ -626,7 +786,19 @@
         <w:pStyle w:val="FirstParagraph"/>
       </w:pPr>
       <w:r>
-        <w:t xml:space="preserve">The following prompt was input into ChatGPT version: “I need your help with generating a tentative list of survey items. I am reading the attached paper for the third time. I am interested in the three AI user ideal types and the survey items that could be generated to measure an employee’s propensity toward one type or another.” Eight items were generated per dimension, along with rationale for those item choices (total</w:t>
+        <w:t xml:space="preserve">The following prompt was input into ChatGPT version:</w:t>
+      </w:r>
+      <w:r>
+        <w:t xml:space="preserve"> </w:t>
+      </w:r>
+      <w:r>
+        <w:t xml:space="preserve">“I need your help with generating a tentative list of survey items. I am reading the attached paper for the third time. I am interested in the three AI user ideal types and the survey items that could be generated to measure an employee’s propensity toward one type or another.”</w:t>
+      </w:r>
+      <w:r>
+        <w:t xml:space="preserve"> </w:t>
+      </w:r>
+      <w:r>
+        <w:t xml:space="preserve">Eight items were generated per dimension, along with rationale for those item choices (total</w:t>
       </w:r>
       <w:r>
         <w:t xml:space="preserve"> </w:t>
@@ -642,8 +814,8 @@
         <w:t xml:space="preserve">=24). See Appendix B for the full ChatGPT prompt and output, and Appendix C for a full list of items.</w:t>
       </w:r>
     </w:p>
-    <w:bookmarkEnd w:id="24"/>
-    <w:bookmarkStart w:id="25" w:name="ai-genie-generated-items."/>
+    <w:bookmarkEnd w:id="25"/>
+    <w:bookmarkStart w:id="26" w:name="ai-genie-generated-items."/>
     <w:p>
       <w:pPr>
         <w:pStyle w:val="Heading3"/>
@@ -725,9 +897,9 @@
         <w:t xml:space="preserve">=21). See the Appendix for all study items.</w:t>
       </w:r>
     </w:p>
-    <w:bookmarkEnd w:id="25"/>
     <w:bookmarkEnd w:id="26"/>
-    <w:bookmarkStart w:id="27" w:name="procedure"/>
+    <w:bookmarkEnd w:id="27"/>
+    <w:bookmarkStart w:id="28" w:name="procedure"/>
     <w:p>
       <w:pPr>
         <w:pStyle w:val="Heading2"/>
@@ -744,9 +916,9 @@
         <w:t xml:space="preserve">After consent, students were asked to think of the context where they use AI the most frequently (for example, as a student or as an employee) and to keep that role in mind for the entire survey. Respondents were shown items within generative grouping, followed by a few demographic questions. They responded to all AI–Adopter items on a 5-point Likert-type scale ranging from 1 (strongly agree) to 5 (strongly disagree). Following the survey, respondents were debriefed and offered course credit for their time.</w:t>
       </w:r>
     </w:p>
-    <w:bookmarkEnd w:id="27"/>
     <w:bookmarkEnd w:id="28"/>
-    <w:bookmarkStart w:id="32" w:name="results"/>
+    <w:bookmarkEnd w:id="29"/>
+    <w:bookmarkStart w:id="33" w:name="results"/>
     <w:p>
       <w:pPr>
         <w:pStyle w:val="Heading1"/>
@@ -755,94 +927,7 @@
         <w:t xml:space="preserve">Results</w:t>
       </w:r>
     </w:p>
-    <w:p>
-      <w:pPr>
-        <w:pStyle w:val="SourceCode"/>
-      </w:pPr>
-      <w:r>
-        <w:rPr>
-          <w:rStyle w:val="VerbatimChar"/>
-        </w:rPr>
-        <w:t xml:space="preserve">Some items ( chat_ES_5 ) were negatively correlated with the first principal component and </w:t>
-      </w:r>
-      <w:r>
-        <w:br/>
-      </w:r>
-      <w:r>
-        <w:rPr>
-          <w:rStyle w:val="VerbatimChar"/>
-        </w:rPr>
-        <w:t xml:space="preserve">probably should be reversed.  </w:t>
-      </w:r>
-      <w:r>
-        <w:br/>
-      </w:r>
-      <w:r>
-        <w:rPr>
-          <w:rStyle w:val="VerbatimChar"/>
-        </w:rPr>
-        <w:t xml:space="preserve">To do this, run the function again with the 'check.keys=TRUE' option</w:t>
-      </w:r>
-    </w:p>
-    <w:p>
-      <w:pPr>
-        <w:pStyle w:val="FirstParagraph"/>
-      </w:pPr>
-      <w:r>
-        <w:t xml:space="preserve">124 undergraduate students responded (mean age = 21.58, sd = 5.61). The students were given the choice of 50 different majors to choose from, with the greatest representation being Psychology at 38.71% (see</w:t>
-      </w:r>
-      <w:r>
-        <w:t xml:space="preserve"> </w:t>
-      </w:r>
-      <w:hyperlink w:anchor="tbl-majors">
-        <w:r>
-          <w:rPr>
-            <w:rStyle w:val="Hyperlink"/>
-          </w:rPr>
-          <w:t xml:space="preserve">Table 2</w:t>
-        </w:r>
-      </w:hyperlink>
-      <w:r>
-        <w:t xml:space="preserve">). When asked,</w:t>
-      </w:r>
-      <w:r>
-        <w:t xml:space="preserve"> </w:t>
-      </w:r>
-      <w:r>
-        <w:t xml:space="preserve">“Which context did you have in mind as you responded to the statements in this survey?”</w:t>
-      </w:r>
-      <w:r>
-        <w:t xml:space="preserve">, 79.03% indicated</w:t>
-      </w:r>
-      <w:r>
-        <w:t xml:space="preserve"> </w:t>
-      </w:r>
-      <w:r>
-        <w:t xml:space="preserve">“school”</w:t>
-      </w:r>
-      <w:r>
-        <w:t xml:space="preserve">, 12.9% indicated</w:t>
-      </w:r>
-      <w:r>
-        <w:t xml:space="preserve"> </w:t>
-      </w:r>
-      <w:r>
-        <w:t xml:space="preserve">“work”</w:t>
-      </w:r>
-      <w:r>
-        <w:t xml:space="preserve">, and 7.26% stated</w:t>
-      </w:r>
-      <w:r>
-        <w:t xml:space="preserve"> </w:t>
-      </w:r>
-      <w:r>
-        <w:t xml:space="preserve">“other”</w:t>
-      </w:r>
-      <w:r>
-        <w:t xml:space="preserve">.</w:t>
-      </w:r>
-    </w:p>
-    <w:bookmarkStart w:id="30" w:name="traditional-investigation"/>
+    <w:bookmarkStart w:id="31" w:name="traditional-investigation"/>
     <w:p>
       <w:pPr>
         <w:pStyle w:val="Heading2"/>
@@ -1031,24 +1116,22 @@
             <m:r>
               <m:t>e</m:t>
             </m:r>
-            <m:r>
-              <m:rPr>
-                <m:sty m:val="p"/>
-              </m:rPr>
-              <m:t>(</m:t>
-            </m:r>
-            <m:r>
-              <m:t>C</m:t>
-            </m:r>
-            <m:r>
-              <m:t>O</m:t>
-            </m:r>
-            <m:r>
-              <m:rPr>
-                <m:sty m:val="p"/>
-              </m:rPr>
-              <m:t>)</m:t>
-            </m:r>
+            <m:d>
+              <m:dPr>
+                <m:begChr m:val="("/>
+                <m:sepChr m:val=""/>
+                <m:endChr m:val=")"/>
+                <m:grow/>
+              </m:dPr>
+              <m:e>
+                <m:r>
+                  <m:t>C</m:t>
+                </m:r>
+                <m:r>
+                  <m:t>O</m:t>
+                </m:r>
+              </m:e>
+            </m:d>
             <m:r>
               <m:rPr>
                 <m:sty m:val="p"/>
@@ -1064,24 +1147,22 @@
             <m:r>
               <m:t>E</m:t>
             </m:r>
-            <m:r>
-              <m:rPr>
-                <m:sty m:val="p"/>
-              </m:rPr>
-              <m:t>(</m:t>
-            </m:r>
-            <m:r>
-              <m:t>C</m:t>
-            </m:r>
-            <m:r>
-              <m:t>O</m:t>
-            </m:r>
-            <m:r>
-              <m:rPr>
-                <m:sty m:val="p"/>
-              </m:rPr>
-              <m:t>)</m:t>
-            </m:r>
+            <m:d>
+              <m:dPr>
+                <m:begChr m:val="("/>
+                <m:sepChr m:val=""/>
+                <m:endChr m:val=")"/>
+                <m:grow/>
+              </m:dPr>
+              <m:e>
+                <m:r>
+                  <m:t>C</m:t>
+                </m:r>
+                <m:r>
+                  <m:t>O</m:t>
+                </m:r>
+              </m:e>
+            </m:d>
           </m:sub>
         </m:sSub>
       </m:oMath>
@@ -1133,24 +1214,22 @@
             <m:r>
               <m:t>e</m:t>
             </m:r>
-            <m:r>
-              <m:rPr>
-                <m:sty m:val="p"/>
-              </m:rPr>
-              <m:t>(</m:t>
-            </m:r>
-            <m:r>
-              <m:t>P</m:t>
-            </m:r>
-            <m:r>
-              <m:t>I</m:t>
-            </m:r>
-            <m:r>
-              <m:rPr>
-                <m:sty m:val="p"/>
-              </m:rPr>
-              <m:t>)</m:t>
-            </m:r>
+            <m:d>
+              <m:dPr>
+                <m:begChr m:val="("/>
+                <m:sepChr m:val=""/>
+                <m:endChr m:val=")"/>
+                <m:grow/>
+              </m:dPr>
+              <m:e>
+                <m:r>
+                  <m:t>P</m:t>
+                </m:r>
+                <m:r>
+                  <m:t>I</m:t>
+                </m:r>
+              </m:e>
+            </m:d>
             <m:r>
               <m:rPr>
                 <m:sty m:val="p"/>
@@ -1166,24 +1245,22 @@
             <m:r>
               <m:t>E</m:t>
             </m:r>
-            <m:r>
-              <m:rPr>
-                <m:sty m:val="p"/>
-              </m:rPr>
-              <m:t>(</m:t>
-            </m:r>
-            <m:r>
-              <m:t>P</m:t>
-            </m:r>
-            <m:r>
-              <m:t>I</m:t>
-            </m:r>
-            <m:r>
-              <m:rPr>
-                <m:sty m:val="p"/>
-              </m:rPr>
-              <m:t>)</m:t>
-            </m:r>
+            <m:d>
+              <m:dPr>
+                <m:begChr m:val="("/>
+                <m:sepChr m:val=""/>
+                <m:endChr m:val=")"/>
+                <m:grow/>
+              </m:dPr>
+              <m:e>
+                <m:r>
+                  <m:t>P</m:t>
+                </m:r>
+                <m:r>
+                  <m:t>I</m:t>
+                </m:r>
+              </m:e>
+            </m:d>
           </m:sub>
         </m:sSub>
       </m:oMath>
@@ -1356,7 +1433,7 @@
         <w:rPr>
           <w:rStyle w:val="FootnoteReference"/>
         </w:rPr>
-        <w:footnoteReference w:id="29"/>
+        <w:footnoteReference w:id="30"/>
       </w:r>
       <w:r>
         <w:t xml:space="preserve">. Factors 1 and 2 exhibited a significant correlation (r = .762, p &lt; .05), whereas the correlations of Factor 3 with Factors 1 (r = .295) and 2 (r = .289) did not approach statistical significance. Overall, the three-factor model demonstrated relatively good fit, the loading pattern suggests two somewhat clear factors with item cross loadings and an ambiguous third factor.</w:t>
@@ -1438,8 +1515,8 @@
         <w:t xml:space="preserve">ChatGPT-generated items demonstrated worse model fit than the corresponding SME and AI Genie item sets.</w:t>
       </w:r>
     </w:p>
-    <w:bookmarkEnd w:id="30"/>
-    <w:bookmarkStart w:id="31" w:name="semantic-investigation"/>
+    <w:bookmarkEnd w:id="31"/>
+    <w:bookmarkStart w:id="32" w:name="semantic-investigation"/>
     <w:p>
       <w:pPr>
         <w:pStyle w:val="Heading2"/>
@@ -1498,9 +1575,9 @@
         <w:t xml:space="preserve">. Each line is a regularized partial correlation (EBICglasso), meaning the relationship between two items after controlling for all the other items. Thicker lines are stronger associations, and the line colour shows whether the association is positive or negative. Weak relationships are shrunk to zero and dropped. The Walktrap algorithm then detects communities: groups of items that are more tightly connected to each other than to the rest of the network. Unlike in the EFA plots, the node colours here mark these empirically detected communities, not the intended subscales. The number of communities is the EGA estimate of the dimensionality of each item set.</w:t>
       </w:r>
     </w:p>
-    <w:bookmarkEnd w:id="31"/>
     <w:bookmarkEnd w:id="32"/>
-    <w:bookmarkStart w:id="34" w:name="discussion"/>
+    <w:bookmarkEnd w:id="33"/>
+    <w:bookmarkStart w:id="35" w:name="discussion"/>
     <w:p>
       <w:pPr>
         <w:pStyle w:val="Heading1"/>
@@ -1557,7 +1634,7 @@
         <w:t xml:space="preserve">distinct types vs different gradients of expertise (degree of AI collaboration)</w:t>
       </w:r>
     </w:p>
-    <w:bookmarkStart w:id="33" w:name="limitations"/>
+    <w:bookmarkStart w:id="34" w:name="limitations"/>
     <w:p>
       <w:pPr>
         <w:pStyle w:val="Heading2"/>
@@ -1574,9 +1651,9 @@
         <w:t xml:space="preserve">Sample size as well as well as sample characteristics (degree of AI integration within workplace)</w:t>
       </w:r>
     </w:p>
-    <w:bookmarkEnd w:id="33"/>
     <w:bookmarkEnd w:id="34"/>
-    <w:bookmarkStart w:id="71" w:name="references"/>
+    <w:bookmarkEnd w:id="35"/>
+    <w:bookmarkStart w:id="72" w:name="references"/>
     <w:p>
       <w:pPr>
         <w:pStyle w:val="Heading1"/>
@@ -1585,8 +1662,8 @@
         <w:t xml:space="preserve">References</w:t>
       </w:r>
     </w:p>
-    <w:bookmarkStart w:id="43" w:name="refs"/>
-    <w:bookmarkStart w:id="35" w:name="ref-arora2025meaningful"/>
+    <w:bookmarkStart w:id="44" w:name="refs"/>
+    <w:bookmarkStart w:id="36" w:name="ref-arora2025meaningful"/>
     <w:p>
       <w:pPr>
         <w:pStyle w:val="Bibliography"/>
@@ -1621,8 +1698,8 @@
         <w:t xml:space="preserve">(2), 169–193.</w:t>
       </w:r>
     </w:p>
-    <w:bookmarkEnd w:id="35"/>
-    <w:bookmarkStart w:id="36" w:name="ref-callari2025meaningful"/>
+    <w:bookmarkEnd w:id="36"/>
+    <w:bookmarkStart w:id="37" w:name="ref-callari2025meaningful"/>
     <w:p>
       <w:pPr>
         <w:pStyle w:val="Bibliography"/>
@@ -1657,8 +1734,8 @@
         <w:t xml:space="preserve">(10), 5001–5027.</w:t>
       </w:r>
     </w:p>
-    <w:bookmarkEnd w:id="36"/>
-    <w:bookmarkStart w:id="37" w:name="ref-campbell1959convergent"/>
+    <w:bookmarkEnd w:id="37"/>
+    <w:bookmarkStart w:id="38" w:name="ref-campbell1959convergent"/>
     <w:p>
       <w:pPr>
         <w:pStyle w:val="Bibliography"/>
@@ -1693,8 +1770,8 @@
         <w:t xml:space="preserve">(2), 81.</w:t>
       </w:r>
     </w:p>
-    <w:bookmarkEnd w:id="37"/>
-    <w:bookmarkStart w:id="38" w:name="ref-hackman1975development"/>
+    <w:bookmarkEnd w:id="38"/>
+    <w:bookmarkStart w:id="39" w:name="ref-hackman1975development"/>
     <w:p>
       <w:pPr>
         <w:pStyle w:val="Bibliography"/>
@@ -1729,8 +1806,8 @@
         <w:t xml:space="preserve">(2), 159.</w:t>
       </w:r>
     </w:p>
-    <w:bookmarkEnd w:id="38"/>
-    <w:bookmarkStart w:id="39" w:name="ref-hackman1976motivation"/>
+    <w:bookmarkEnd w:id="39"/>
+    <w:bookmarkStart w:id="40" w:name="ref-hackman1976motivation"/>
     <w:p>
       <w:pPr>
         <w:pStyle w:val="Bibliography"/>
@@ -1765,8 +1842,8 @@
         <w:t xml:space="preserve">(2), 250–279.</w:t>
       </w:r>
     </w:p>
-    <w:bookmarkEnd w:id="39"/>
-    <w:bookmarkStart w:id="40" w:name="ref-hu1999cutoff"/>
+    <w:bookmarkEnd w:id="40"/>
+    <w:bookmarkStart w:id="41" w:name="ref-hu1999cutoff"/>
     <w:p>
       <w:pPr>
         <w:pStyle w:val="Bibliography"/>
@@ -1801,8 +1878,8 @@
         <w:t xml:space="preserve">(1), 1–55.</w:t>
       </w:r>
     </w:p>
-    <w:bookmarkEnd w:id="40"/>
-    <w:bookmarkStart w:id="41" w:name="ref-russell2026generative"/>
+    <w:bookmarkEnd w:id="41"/>
+    <w:bookmarkStart w:id="42" w:name="ref-russell2026generative"/>
     <w:p>
       <w:pPr>
         <w:pStyle w:val="Bibliography"/>
@@ -1837,8 +1914,8 @@
         <w:t xml:space="preserve">(8), 217.</w:t>
       </w:r>
     </w:p>
-    <w:bookmarkEnd w:id="41"/>
-    <w:bookmarkStart w:id="42" w:name="ref-zhang2026artificial"/>
+    <w:bookmarkEnd w:id="42"/>
+    <w:bookmarkStart w:id="43" w:name="ref-zhang2026artificial"/>
     <w:p>
       <w:pPr>
         <w:pStyle w:val="Bibliography"/>
@@ -1860,9 +1937,9 @@
         <w:t xml:space="preserve">, 1–18.</w:t>
       </w:r>
     </w:p>
-    <w:bookmarkEnd w:id="42"/>
     <w:bookmarkEnd w:id="43"/>
-    <w:bookmarkStart w:id="44" w:name="tbl-alphas"/>
+    <w:bookmarkEnd w:id="44"/>
+    <w:bookmarkStart w:id="45" w:name="tbl-alphas"/>
     <w:p>
       <w:pPr>
         <w:pStyle w:val="FigureTitle"/>
@@ -1915,7 +1992,6 @@
           </w:tcPr>
           <w:p>
             <w:pPr>
-              <w:pStyle w:val="Normal"/>
               <w:jc w:val="left"/>
               <w:pBdr>
                 <w:bottom w:val="none" w:sz="0" w:space="0" w:color="000000"/>
@@ -1930,6 +2006,7 @@
                 <w:i w:val="false"/>
                 <w:b w:val="false"/>
                 <w:u w:val="none"/>
+                <w:strike w:val="false"/>
                 <w:sz w:val="22"/>
                 <w:szCs w:val="22"/>
                 <w:color w:val="000000"/>
@@ -1941,6 +2018,7 @@
                 <w:i w:val="false"/>
                 <w:b w:val="false"/>
                 <w:u w:val="none"/>
+                <w:strike w:val="false"/>
                 <w:sz w:val="22"/>
                 <w:szCs w:val="22"/>
                 <w:color w:val="000000"/>
@@ -1968,7 +2046,6 @@
           </w:tcPr>
           <w:p>
             <w:pPr>
-              <w:pStyle w:val="Normal"/>
               <w:jc w:val="left"/>
               <w:pBdr>
                 <w:bottom w:val="none" w:sz="0" w:space="0" w:color="000000"/>
@@ -1983,6 +2060,7 @@
                 <w:i w:val="false"/>
                 <w:b w:val="false"/>
                 <w:u w:val="none"/>
+                <w:strike w:val="false"/>
                 <w:sz w:val="22"/>
                 <w:szCs w:val="22"/>
                 <w:color w:val="000000"/>
@@ -1994,6 +2072,7 @@
                 <w:i w:val="false"/>
                 <w:b w:val="false"/>
                 <w:u w:val="none"/>
+                <w:strike w:val="false"/>
                 <w:sz w:val="22"/>
                 <w:szCs w:val="22"/>
                 <w:color w:val="000000"/>
@@ -2021,7 +2100,6 @@
           </w:tcPr>
           <w:p>
             <w:pPr>
-              <w:pStyle w:val="Normal"/>
               <w:jc w:val="left"/>
               <w:pBdr>
                 <w:bottom w:val="none" w:sz="0" w:space="0" w:color="000000"/>
@@ -2036,6 +2114,7 @@
                 <w:i w:val="false"/>
                 <w:b w:val="false"/>
                 <w:u w:val="none"/>
+                <w:strike w:val="false"/>
                 <w:sz w:val="22"/>
                 <w:szCs w:val="22"/>
                 <w:color w:val="000000"/>
@@ -2047,6 +2126,7 @@
                 <w:i w:val="false"/>
                 <w:b w:val="false"/>
                 <w:u w:val="none"/>
+                <w:strike w:val="false"/>
                 <w:sz w:val="22"/>
                 <w:szCs w:val="22"/>
                 <w:color w:val="000000"/>
@@ -2080,7 +2160,6 @@
           </w:tcPr>
           <w:p>
             <w:pPr>
-              <w:pStyle w:val="Normal"/>
               <w:jc w:val="left"/>
               <w:pBdr>
                 <w:bottom w:val="none" w:sz="0" w:space="0" w:color="000000"/>
@@ -2095,6 +2174,7 @@
                 <w:i w:val="false"/>
                 <w:b w:val="false"/>
                 <w:u w:val="none"/>
+                <w:strike w:val="false"/>
                 <w:sz w:val="22"/>
                 <w:szCs w:val="22"/>
                 <w:color w:val="000000"/>
@@ -2106,6 +2186,7 @@
                 <w:i w:val="false"/>
                 <w:b w:val="false"/>
                 <w:u w:val="none"/>
+                <w:strike w:val="false"/>
                 <w:sz w:val="22"/>
                 <w:szCs w:val="22"/>
                 <w:color w:val="000000"/>
@@ -2133,7 +2214,6 @@
           </w:tcPr>
           <w:p>
             <w:pPr>
-              <w:pStyle w:val="Normal"/>
               <w:jc w:val="left"/>
               <w:pBdr>
                 <w:bottom w:val="none" w:sz="0" w:space="0" w:color="000000"/>
@@ -2148,6 +2228,7 @@
                 <w:i w:val="false"/>
                 <w:b w:val="false"/>
                 <w:u w:val="none"/>
+                <w:strike w:val="false"/>
                 <w:sz w:val="22"/>
                 <w:szCs w:val="22"/>
                 <w:color w:val="000000"/>
@@ -2159,6 +2240,7 @@
                 <w:i w:val="false"/>
                 <w:b w:val="false"/>
                 <w:u w:val="none"/>
+                <w:strike w:val="false"/>
                 <w:sz w:val="22"/>
                 <w:szCs w:val="22"/>
                 <w:color w:val="000000"/>
@@ -2186,7 +2268,6 @@
           </w:tcPr>
           <w:p>
             <w:pPr>
-              <w:pStyle w:val="Normal"/>
               <w:jc w:val="left"/>
               <w:pBdr>
                 <w:bottom w:val="none" w:sz="0" w:space="0" w:color="000000"/>
@@ -2201,6 +2282,7 @@
                 <w:i w:val="false"/>
                 <w:b w:val="false"/>
                 <w:u w:val="none"/>
+                <w:strike w:val="false"/>
                 <w:sz w:val="22"/>
                 <w:szCs w:val="22"/>
                 <w:color w:val="000000"/>
@@ -2212,6 +2294,7 @@
                 <w:i w:val="false"/>
                 <w:b w:val="false"/>
                 <w:u w:val="none"/>
+                <w:strike w:val="false"/>
                 <w:sz w:val="22"/>
                 <w:szCs w:val="22"/>
                 <w:color w:val="000000"/>
@@ -2245,7 +2328,6 @@
           </w:tcPr>
           <w:p>
             <w:pPr>
-              <w:pStyle w:val="Normal"/>
               <w:jc w:val="left"/>
               <w:pBdr>
                 <w:bottom w:val="none" w:sz="0" w:space="0" w:color="000000"/>
@@ -2260,6 +2342,7 @@
                 <w:i w:val="false"/>
                 <w:b w:val="false"/>
                 <w:u w:val="none"/>
+                <w:strike w:val="false"/>
                 <w:sz w:val="22"/>
                 <w:szCs w:val="22"/>
                 <w:color w:val="000000"/>
@@ -2271,6 +2354,7 @@
                 <w:i w:val="false"/>
                 <w:b w:val="false"/>
                 <w:u w:val="none"/>
+                <w:strike w:val="false"/>
                 <w:sz w:val="22"/>
                 <w:szCs w:val="22"/>
                 <w:color w:val="000000"/>
@@ -2298,7 +2382,6 @@
           </w:tcPr>
           <w:p>
             <w:pPr>
-              <w:pStyle w:val="Normal"/>
               <w:jc w:val="left"/>
               <w:pBdr>
                 <w:bottom w:val="none" w:sz="0" w:space="0" w:color="000000"/>
@@ -2313,6 +2396,7 @@
                 <w:i w:val="false"/>
                 <w:b w:val="false"/>
                 <w:u w:val="none"/>
+                <w:strike w:val="false"/>
                 <w:sz w:val="22"/>
                 <w:szCs w:val="22"/>
                 <w:color w:val="000000"/>
@@ -2324,6 +2408,7 @@
                 <w:i w:val="false"/>
                 <w:b w:val="false"/>
                 <w:u w:val="none"/>
+                <w:strike w:val="false"/>
                 <w:sz w:val="22"/>
                 <w:szCs w:val="22"/>
                 <w:color w:val="000000"/>
@@ -2351,7 +2436,6 @@
           </w:tcPr>
           <w:p>
             <w:pPr>
-              <w:pStyle w:val="Normal"/>
               <w:jc w:val="left"/>
               <w:pBdr>
                 <w:bottom w:val="none" w:sz="0" w:space="0" w:color="000000"/>
@@ -2366,6 +2450,7 @@
                 <w:i w:val="false"/>
                 <w:b w:val="false"/>
                 <w:u w:val="none"/>
+                <w:strike w:val="false"/>
                 <w:sz w:val="22"/>
                 <w:szCs w:val="22"/>
                 <w:color w:val="000000"/>
@@ -2377,6 +2462,7 @@
                 <w:i w:val="false"/>
                 <w:b w:val="false"/>
                 <w:u w:val="none"/>
+                <w:strike w:val="false"/>
                 <w:sz w:val="22"/>
                 <w:szCs w:val="22"/>
                 <w:color w:val="000000"/>
@@ -2410,7 +2496,6 @@
           </w:tcPr>
           <w:p>
             <w:pPr>
-              <w:pStyle w:val="Normal"/>
               <w:jc w:val="left"/>
               <w:pBdr>
                 <w:bottom w:val="none" w:sz="0" w:space="0" w:color="000000"/>
@@ -2425,6 +2510,7 @@
                 <w:i w:val="false"/>
                 <w:b w:val="false"/>
                 <w:u w:val="none"/>
+                <w:strike w:val="false"/>
                 <w:sz w:val="22"/>
                 <w:szCs w:val="22"/>
                 <w:color w:val="000000"/>
@@ -2436,6 +2522,7 @@
                 <w:i w:val="false"/>
                 <w:b w:val="false"/>
                 <w:u w:val="none"/>
+                <w:strike w:val="false"/>
                 <w:sz w:val="22"/>
                 <w:szCs w:val="22"/>
                 <w:color w:val="000000"/>
@@ -2463,7 +2550,6 @@
           </w:tcPr>
           <w:p>
             <w:pPr>
-              <w:pStyle w:val="Normal"/>
               <w:jc w:val="left"/>
               <w:pBdr>
                 <w:bottom w:val="none" w:sz="0" w:space="0" w:color="000000"/>
@@ -2478,6 +2564,7 @@
                 <w:i w:val="false"/>
                 <w:b w:val="false"/>
                 <w:u w:val="none"/>
+                <w:strike w:val="false"/>
                 <w:sz w:val="22"/>
                 <w:szCs w:val="22"/>
                 <w:color w:val="000000"/>
@@ -2489,6 +2576,7 @@
                 <w:i w:val="false"/>
                 <w:b w:val="false"/>
                 <w:u w:val="none"/>
+                <w:strike w:val="false"/>
                 <w:sz w:val="22"/>
                 <w:szCs w:val="22"/>
                 <w:color w:val="000000"/>
@@ -2516,7 +2604,6 @@
           </w:tcPr>
           <w:p>
             <w:pPr>
-              <w:pStyle w:val="Normal"/>
               <w:jc w:val="left"/>
               <w:pBdr>
                 <w:bottom w:val="none" w:sz="0" w:space="0" w:color="000000"/>
@@ -2531,6 +2618,7 @@
                 <w:i w:val="false"/>
                 <w:b w:val="false"/>
                 <w:u w:val="none"/>
+                <w:strike w:val="false"/>
                 <w:sz w:val="22"/>
                 <w:szCs w:val="22"/>
                 <w:color w:val="000000"/>
@@ -2542,6 +2630,7 @@
                 <w:i w:val="false"/>
                 <w:b w:val="false"/>
                 <w:u w:val="none"/>
+                <w:strike w:val="false"/>
                 <w:sz w:val="22"/>
                 <w:szCs w:val="22"/>
                 <w:color w:val="000000"/>
@@ -2575,7 +2664,6 @@
           </w:tcPr>
           <w:p>
             <w:pPr>
-              <w:pStyle w:val="Normal"/>
               <w:jc w:val="left"/>
               <w:pBdr>
                 <w:bottom w:val="none" w:sz="0" w:space="0" w:color="000000"/>
@@ -2590,6 +2678,7 @@
                 <w:i w:val="false"/>
                 <w:b w:val="false"/>
                 <w:u w:val="none"/>
+                <w:strike w:val="false"/>
                 <w:sz w:val="22"/>
                 <w:szCs w:val="22"/>
                 <w:color w:val="000000"/>
@@ -2601,6 +2690,7 @@
                 <w:i w:val="false"/>
                 <w:b w:val="false"/>
                 <w:u w:val="none"/>
+                <w:strike w:val="false"/>
                 <w:sz w:val="22"/>
                 <w:szCs w:val="22"/>
                 <w:color w:val="000000"/>
@@ -2628,7 +2718,6 @@
           </w:tcPr>
           <w:p>
             <w:pPr>
-              <w:pStyle w:val="Normal"/>
               <w:jc w:val="left"/>
               <w:pBdr>
                 <w:bottom w:val="none" w:sz="0" w:space="0" w:color="000000"/>
@@ -2643,6 +2732,7 @@
                 <w:i w:val="false"/>
                 <w:b w:val="false"/>
                 <w:u w:val="none"/>
+                <w:strike w:val="false"/>
                 <w:sz w:val="22"/>
                 <w:szCs w:val="22"/>
                 <w:color w:val="000000"/>
@@ -2654,6 +2744,7 @@
                 <w:i w:val="false"/>
                 <w:b w:val="false"/>
                 <w:u w:val="none"/>
+                <w:strike w:val="false"/>
                 <w:sz w:val="22"/>
                 <w:szCs w:val="22"/>
                 <w:color w:val="000000"/>
@@ -2681,7 +2772,6 @@
           </w:tcPr>
           <w:p>
             <w:pPr>
-              <w:pStyle w:val="Normal"/>
               <w:jc w:val="left"/>
               <w:pBdr>
                 <w:bottom w:val="none" w:sz="0" w:space="0" w:color="000000"/>
@@ -2696,6 +2786,7 @@
                 <w:i w:val="false"/>
                 <w:b w:val="false"/>
                 <w:u w:val="none"/>
+                <w:strike w:val="false"/>
                 <w:sz w:val="22"/>
                 <w:szCs w:val="22"/>
                 <w:color w:val="000000"/>
@@ -2707,6 +2798,7 @@
                 <w:i w:val="false"/>
                 <w:b w:val="false"/>
                 <w:u w:val="none"/>
+                <w:strike w:val="false"/>
                 <w:sz w:val="22"/>
                 <w:szCs w:val="22"/>
                 <w:color w:val="000000"/>
@@ -2740,7 +2832,6 @@
           </w:tcPr>
           <w:p>
             <w:pPr>
-              <w:pStyle w:val="Normal"/>
               <w:jc w:val="left"/>
               <w:pBdr>
                 <w:bottom w:val="none" w:sz="0" w:space="0" w:color="000000"/>
@@ -2755,6 +2846,7 @@
                 <w:i w:val="false"/>
                 <w:b w:val="false"/>
                 <w:u w:val="none"/>
+                <w:strike w:val="false"/>
                 <w:sz w:val="22"/>
                 <w:szCs w:val="22"/>
                 <w:color w:val="000000"/>
@@ -2766,6 +2858,7 @@
                 <w:i w:val="false"/>
                 <w:b w:val="false"/>
                 <w:u w:val="none"/>
+                <w:strike w:val="false"/>
                 <w:sz w:val="22"/>
                 <w:szCs w:val="22"/>
                 <w:color w:val="000000"/>
@@ -2793,7 +2886,6 @@
           </w:tcPr>
           <w:p>
             <w:pPr>
-              <w:pStyle w:val="Normal"/>
               <w:jc w:val="left"/>
               <w:pBdr>
                 <w:bottom w:val="none" w:sz="0" w:space="0" w:color="000000"/>
@@ -2808,6 +2900,7 @@
                 <w:i w:val="false"/>
                 <w:b w:val="false"/>
                 <w:u w:val="none"/>
+                <w:strike w:val="false"/>
                 <w:sz w:val="22"/>
                 <w:szCs w:val="22"/>
                 <w:color w:val="000000"/>
@@ -2819,6 +2912,7 @@
                 <w:i w:val="false"/>
                 <w:b w:val="false"/>
                 <w:u w:val="none"/>
+                <w:strike w:val="false"/>
                 <w:sz w:val="22"/>
                 <w:szCs w:val="22"/>
                 <w:color w:val="000000"/>
@@ -2846,7 +2940,6 @@
           </w:tcPr>
           <w:p>
             <w:pPr>
-              <w:pStyle w:val="Normal"/>
               <w:jc w:val="left"/>
               <w:pBdr>
                 <w:bottom w:val="none" w:sz="0" w:space="0" w:color="000000"/>
@@ -2861,6 +2954,7 @@
                 <w:i w:val="false"/>
                 <w:b w:val="false"/>
                 <w:u w:val="none"/>
+                <w:strike w:val="false"/>
                 <w:sz w:val="22"/>
                 <w:szCs w:val="22"/>
                 <w:color w:val="000000"/>
@@ -2872,6 +2966,7 @@
                 <w:i w:val="false"/>
                 <w:b w:val="false"/>
                 <w:u w:val="none"/>
+                <w:strike w:val="false"/>
                 <w:sz w:val="22"/>
                 <w:szCs w:val="22"/>
                 <w:color w:val="000000"/>
@@ -2905,7 +3000,6 @@
           </w:tcPr>
           <w:p>
             <w:pPr>
-              <w:pStyle w:val="Normal"/>
               <w:jc w:val="left"/>
               <w:pBdr>
                 <w:bottom w:val="none" w:sz="0" w:space="0" w:color="000000"/>
@@ -2920,6 +3014,7 @@
                 <w:i w:val="false"/>
                 <w:b w:val="false"/>
                 <w:u w:val="none"/>
+                <w:strike w:val="false"/>
                 <w:sz w:val="22"/>
                 <w:szCs w:val="22"/>
                 <w:color w:val="000000"/>
@@ -2931,6 +3026,7 @@
                 <w:i w:val="false"/>
                 <w:b w:val="false"/>
                 <w:u w:val="none"/>
+                <w:strike w:val="false"/>
                 <w:sz w:val="22"/>
                 <w:szCs w:val="22"/>
                 <w:color w:val="000000"/>
@@ -2958,7 +3054,6 @@
           </w:tcPr>
           <w:p>
             <w:pPr>
-              <w:pStyle w:val="Normal"/>
               <w:jc w:val="left"/>
               <w:pBdr>
                 <w:bottom w:val="none" w:sz="0" w:space="0" w:color="000000"/>
@@ -2973,6 +3068,7 @@
                 <w:i w:val="false"/>
                 <w:b w:val="false"/>
                 <w:u w:val="none"/>
+                <w:strike w:val="false"/>
                 <w:sz w:val="22"/>
                 <w:szCs w:val="22"/>
                 <w:color w:val="000000"/>
@@ -2984,6 +3080,7 @@
                 <w:i w:val="false"/>
                 <w:b w:val="false"/>
                 <w:u w:val="none"/>
+                <w:strike w:val="false"/>
                 <w:sz w:val="22"/>
                 <w:szCs w:val="22"/>
                 <w:color w:val="000000"/>
@@ -3011,7 +3108,6 @@
           </w:tcPr>
           <w:p>
             <w:pPr>
-              <w:pStyle w:val="Normal"/>
               <w:jc w:val="left"/>
               <w:pBdr>
                 <w:bottom w:val="none" w:sz="0" w:space="0" w:color="000000"/>
@@ -3026,6 +3122,7 @@
                 <w:i w:val="false"/>
                 <w:b w:val="false"/>
                 <w:u w:val="none"/>
+                <w:strike w:val="false"/>
                 <w:sz w:val="22"/>
                 <w:szCs w:val="22"/>
                 <w:color w:val="000000"/>
@@ -3037,6 +3134,7 @@
                 <w:i w:val="false"/>
                 <w:b w:val="false"/>
                 <w:u w:val="none"/>
+                <w:strike w:val="false"/>
                 <w:sz w:val="22"/>
                 <w:szCs w:val="22"/>
                 <w:color w:val="000000"/>
@@ -3070,7 +3168,6 @@
           </w:tcPr>
           <w:p>
             <w:pPr>
-              <w:pStyle w:val="Normal"/>
               <w:jc w:val="left"/>
               <w:pBdr>
                 <w:bottom w:val="none" w:sz="0" w:space="0" w:color="000000"/>
@@ -3085,6 +3182,7 @@
                 <w:i w:val="false"/>
                 <w:b w:val="false"/>
                 <w:u w:val="none"/>
+                <w:strike w:val="false"/>
                 <w:sz w:val="22"/>
                 <w:szCs w:val="22"/>
                 <w:color w:val="000000"/>
@@ -3096,6 +3194,7 @@
                 <w:i w:val="false"/>
                 <w:b w:val="false"/>
                 <w:u w:val="none"/>
+                <w:strike w:val="false"/>
                 <w:sz w:val="22"/>
                 <w:szCs w:val="22"/>
                 <w:color w:val="000000"/>
@@ -3123,7 +3222,6 @@
           </w:tcPr>
           <w:p>
             <w:pPr>
-              <w:pStyle w:val="Normal"/>
               <w:jc w:val="left"/>
               <w:pBdr>
                 <w:bottom w:val="none" w:sz="0" w:space="0" w:color="000000"/>
@@ -3138,6 +3236,7 @@
                 <w:i w:val="false"/>
                 <w:b w:val="false"/>
                 <w:u w:val="none"/>
+                <w:strike w:val="false"/>
                 <w:sz w:val="22"/>
                 <w:szCs w:val="22"/>
                 <w:color w:val="000000"/>
@@ -3149,6 +3248,7 @@
                 <w:i w:val="false"/>
                 <w:b w:val="false"/>
                 <w:u w:val="none"/>
+                <w:strike w:val="false"/>
                 <w:sz w:val="22"/>
                 <w:szCs w:val="22"/>
                 <w:color w:val="000000"/>
@@ -3176,7 +3276,6 @@
           </w:tcPr>
           <w:p>
             <w:pPr>
-              <w:pStyle w:val="Normal"/>
               <w:jc w:val="left"/>
               <w:pBdr>
                 <w:bottom w:val="none" w:sz="0" w:space="0" w:color="000000"/>
@@ -3191,6 +3290,7 @@
                 <w:i w:val="false"/>
                 <w:b w:val="false"/>
                 <w:u w:val="none"/>
+                <w:strike w:val="false"/>
                 <w:sz w:val="22"/>
                 <w:szCs w:val="22"/>
                 <w:color w:val="000000"/>
@@ -3202,6 +3302,7 @@
                 <w:i w:val="false"/>
                 <w:b w:val="false"/>
                 <w:u w:val="none"/>
+                <w:strike w:val="false"/>
                 <w:sz w:val="22"/>
                 <w:szCs w:val="22"/>
                 <w:color w:val="000000"/>
@@ -3235,7 +3336,6 @@
           </w:tcPr>
           <w:p>
             <w:pPr>
-              <w:pStyle w:val="Normal"/>
               <w:jc w:val="left"/>
               <w:pBdr>
                 <w:bottom w:val="none" w:sz="0" w:space="0" w:color="000000"/>
@@ -3250,6 +3350,7 @@
                 <w:i w:val="false"/>
                 <w:b w:val="false"/>
                 <w:u w:val="none"/>
+                <w:strike w:val="false"/>
                 <w:sz w:val="22"/>
                 <w:szCs w:val="22"/>
                 <w:color w:val="000000"/>
@@ -3261,6 +3362,7 @@
                 <w:i w:val="false"/>
                 <w:b w:val="false"/>
                 <w:u w:val="none"/>
+                <w:strike w:val="false"/>
                 <w:sz w:val="22"/>
                 <w:szCs w:val="22"/>
                 <w:color w:val="000000"/>
@@ -3288,7 +3390,6 @@
           </w:tcPr>
           <w:p>
             <w:pPr>
-              <w:pStyle w:val="Normal"/>
               <w:jc w:val="left"/>
               <w:pBdr>
                 <w:bottom w:val="none" w:sz="0" w:space="0" w:color="000000"/>
@@ -3303,6 +3404,7 @@
                 <w:i w:val="false"/>
                 <w:b w:val="false"/>
                 <w:u w:val="none"/>
+                <w:strike w:val="false"/>
                 <w:sz w:val="22"/>
                 <w:szCs w:val="22"/>
                 <w:color w:val="000000"/>
@@ -3314,6 +3416,7 @@
                 <w:i w:val="false"/>
                 <w:b w:val="false"/>
                 <w:u w:val="none"/>
+                <w:strike w:val="false"/>
                 <w:sz w:val="22"/>
                 <w:szCs w:val="22"/>
                 <w:color w:val="000000"/>
@@ -3341,7 +3444,6 @@
           </w:tcPr>
           <w:p>
             <w:pPr>
-              <w:pStyle w:val="Normal"/>
               <w:jc w:val="left"/>
               <w:pBdr>
                 <w:bottom w:val="none" w:sz="0" w:space="0" w:color="000000"/>
@@ -3356,6 +3458,7 @@
                 <w:i w:val="false"/>
                 <w:b w:val="false"/>
                 <w:u w:val="none"/>
+                <w:strike w:val="false"/>
                 <w:sz w:val="22"/>
                 <w:szCs w:val="22"/>
                 <w:color w:val="000000"/>
@@ -3367,6 +3470,7 @@
                 <w:i w:val="false"/>
                 <w:b w:val="false"/>
                 <w:u w:val="none"/>
+                <w:strike w:val="false"/>
                 <w:sz w:val="22"/>
                 <w:szCs w:val="22"/>
                 <w:color w:val="000000"/>
@@ -3400,7 +3504,6 @@
           </w:tcPr>
           <w:p>
             <w:pPr>
-              <w:pStyle w:val="Normal"/>
               <w:jc w:val="left"/>
               <w:pBdr>
                 <w:bottom w:val="none" w:sz="0" w:space="0" w:color="000000"/>
@@ -3415,6 +3518,7 @@
                 <w:i w:val="false"/>
                 <w:b w:val="false"/>
                 <w:u w:val="none"/>
+                <w:strike w:val="false"/>
                 <w:sz w:val="22"/>
                 <w:szCs w:val="22"/>
                 <w:color w:val="000000"/>
@@ -3426,6 +3530,7 @@
                 <w:i w:val="false"/>
                 <w:b w:val="false"/>
                 <w:u w:val="none"/>
+                <w:strike w:val="false"/>
                 <w:sz w:val="22"/>
                 <w:szCs w:val="22"/>
                 <w:color w:val="000000"/>
@@ -3453,7 +3558,6 @@
           </w:tcPr>
           <w:p>
             <w:pPr>
-              <w:pStyle w:val="Normal"/>
               <w:jc w:val="left"/>
               <w:pBdr>
                 <w:bottom w:val="none" w:sz="0" w:space="0" w:color="000000"/>
@@ -3468,6 +3572,7 @@
                 <w:i w:val="false"/>
                 <w:b w:val="false"/>
                 <w:u w:val="none"/>
+                <w:strike w:val="false"/>
                 <w:sz w:val="22"/>
                 <w:szCs w:val="22"/>
                 <w:color w:val="000000"/>
@@ -3479,6 +3584,7 @@
                 <w:i w:val="false"/>
                 <w:b w:val="false"/>
                 <w:u w:val="none"/>
+                <w:strike w:val="false"/>
                 <w:sz w:val="22"/>
                 <w:szCs w:val="22"/>
                 <w:color w:val="000000"/>
@@ -3506,7 +3612,6 @@
           </w:tcPr>
           <w:p>
             <w:pPr>
-              <w:pStyle w:val="Normal"/>
               <w:jc w:val="left"/>
               <w:pBdr>
                 <w:bottom w:val="none" w:sz="0" w:space="0" w:color="000000"/>
@@ -3521,6 +3626,7 @@
                 <w:i w:val="false"/>
                 <w:b w:val="false"/>
                 <w:u w:val="none"/>
+                <w:strike w:val="false"/>
                 <w:sz w:val="22"/>
                 <w:szCs w:val="22"/>
                 <w:color w:val="000000"/>
@@ -3532,6 +3638,7 @@
                 <w:i w:val="false"/>
                 <w:b w:val="false"/>
                 <w:u w:val="none"/>
+                <w:strike w:val="false"/>
                 <w:sz w:val="22"/>
                 <w:szCs w:val="22"/>
                 <w:color w:val="000000"/>
@@ -3542,13 +3649,13 @@
         </w:tc>
       </w:tr>
     </w:tbl>
-    <w:bookmarkEnd w:id="44"/>
+    <w:bookmarkEnd w:id="45"/>
     <w:p>
       <w:r>
         <w:br w:type="page"/>
       </w:r>
     </w:p>
-    <w:bookmarkStart w:id="45" w:name="tbl-majors"/>
+    <w:bookmarkStart w:id="46" w:name="tbl-majors"/>
     <w:p>
       <w:pPr>
         <w:pStyle w:val="FigureTitle"/>
@@ -3601,7 +3708,6 @@
           </w:tcPr>
           <w:p>
             <w:pPr>
-              <w:pStyle w:val="Normal"/>
               <w:jc w:val="left"/>
               <w:pBdr>
                 <w:bottom w:val="none" w:sz="0" w:space="0" w:color="000000"/>
@@ -3616,6 +3722,7 @@
                 <w:i w:val="false"/>
                 <w:b w:val="false"/>
                 <w:u w:val="none"/>
+                <w:strike w:val="false"/>
                 <w:sz w:val="22"/>
                 <w:szCs w:val="22"/>
                 <w:color w:val="000000"/>
@@ -3627,6 +3734,7 @@
                 <w:i w:val="false"/>
                 <w:b w:val="false"/>
                 <w:u w:val="none"/>
+                <w:strike w:val="false"/>
                 <w:sz w:val="22"/>
                 <w:szCs w:val="22"/>
                 <w:color w:val="000000"/>
@@ -3654,7 +3762,6 @@
           </w:tcPr>
           <w:p>
             <w:pPr>
-              <w:pStyle w:val="Normal"/>
               <w:jc w:val="left"/>
               <w:pBdr>
                 <w:bottom w:val="none" w:sz="0" w:space="0" w:color="000000"/>
@@ -3669,6 +3776,7 @@
                 <w:i w:val="false"/>
                 <w:b w:val="false"/>
                 <w:u w:val="none"/>
+                <w:strike w:val="false"/>
                 <w:sz w:val="22"/>
                 <w:szCs w:val="22"/>
                 <w:color w:val="000000"/>
@@ -3680,6 +3788,7 @@
                 <w:i w:val="false"/>
                 <w:b w:val="false"/>
                 <w:u w:val="none"/>
+                <w:strike w:val="false"/>
                 <w:sz w:val="22"/>
                 <w:szCs w:val="22"/>
                 <w:color w:val="000000"/>
@@ -3707,7 +3816,6 @@
           </w:tcPr>
           <w:p>
             <w:pPr>
-              <w:pStyle w:val="Normal"/>
               <w:jc w:val="left"/>
               <w:pBdr>
                 <w:bottom w:val="none" w:sz="0" w:space="0" w:color="000000"/>
@@ -3722,6 +3830,7 @@
                 <w:i w:val="false"/>
                 <w:b w:val="false"/>
                 <w:u w:val="none"/>
+                <w:strike w:val="false"/>
                 <w:sz w:val="22"/>
                 <w:szCs w:val="22"/>
                 <w:color w:val="000000"/>
@@ -3733,6 +3842,7 @@
                 <w:i w:val="false"/>
                 <w:b w:val="false"/>
                 <w:u w:val="none"/>
+                <w:strike w:val="false"/>
                 <w:sz w:val="22"/>
                 <w:szCs w:val="22"/>
                 <w:color w:val="000000"/>
@@ -3766,7 +3876,6 @@
           </w:tcPr>
           <w:p>
             <w:pPr>
-              <w:pStyle w:val="Normal"/>
               <w:jc w:val="left"/>
               <w:pBdr>
                 <w:bottom w:val="none" w:sz="0" w:space="0" w:color="000000"/>
@@ -3781,6 +3890,7 @@
                 <w:i w:val="false"/>
                 <w:b w:val="false"/>
                 <w:u w:val="none"/>
+                <w:strike w:val="false"/>
                 <w:sz w:val="22"/>
                 <w:szCs w:val="22"/>
                 <w:color w:val="000000"/>
@@ -3792,6 +3902,7 @@
                 <w:i w:val="false"/>
                 <w:b w:val="false"/>
                 <w:u w:val="none"/>
+                <w:strike w:val="false"/>
                 <w:sz w:val="22"/>
                 <w:szCs w:val="22"/>
                 <w:color w:val="000000"/>
@@ -3819,7 +3930,6 @@
           </w:tcPr>
           <w:p>
             <w:pPr>
-              <w:pStyle w:val="Normal"/>
               <w:jc w:val="left"/>
               <w:pBdr>
                 <w:bottom w:val="none" w:sz="0" w:space="0" w:color="000000"/>
@@ -3834,6 +3944,7 @@
                 <w:i w:val="false"/>
                 <w:b w:val="false"/>
                 <w:u w:val="none"/>
+                <w:strike w:val="false"/>
                 <w:sz w:val="22"/>
                 <w:szCs w:val="22"/>
                 <w:color w:val="000000"/>
@@ -3845,6 +3956,7 @@
                 <w:i w:val="false"/>
                 <w:b w:val="false"/>
                 <w:u w:val="none"/>
+                <w:strike w:val="false"/>
                 <w:sz w:val="22"/>
                 <w:szCs w:val="22"/>
                 <w:color w:val="000000"/>
@@ -3872,7 +3984,6 @@
           </w:tcPr>
           <w:p>
             <w:pPr>
-              <w:pStyle w:val="Normal"/>
               <w:jc w:val="left"/>
               <w:pBdr>
                 <w:bottom w:val="none" w:sz="0" w:space="0" w:color="000000"/>
@@ -3887,6 +3998,7 @@
                 <w:i w:val="false"/>
                 <w:b w:val="false"/>
                 <w:u w:val="none"/>
+                <w:strike w:val="false"/>
                 <w:sz w:val="22"/>
                 <w:szCs w:val="22"/>
                 <w:color w:val="000000"/>
@@ -3898,6 +4010,7 @@
                 <w:i w:val="false"/>
                 <w:b w:val="false"/>
                 <w:u w:val="none"/>
+                <w:strike w:val="false"/>
                 <w:sz w:val="22"/>
                 <w:szCs w:val="22"/>
                 <w:color w:val="000000"/>
@@ -3931,7 +4044,6 @@
           </w:tcPr>
           <w:p>
             <w:pPr>
-              <w:pStyle w:val="Normal"/>
               <w:jc w:val="left"/>
               <w:pBdr>
                 <w:bottom w:val="none" w:sz="0" w:space="0" w:color="000000"/>
@@ -3946,6 +4058,7 @@
                 <w:i w:val="false"/>
                 <w:b w:val="false"/>
                 <w:u w:val="none"/>
+                <w:strike w:val="false"/>
                 <w:sz w:val="22"/>
                 <w:szCs w:val="22"/>
                 <w:color w:val="000000"/>
@@ -3957,6 +4070,7 @@
                 <w:i w:val="false"/>
                 <w:b w:val="false"/>
                 <w:u w:val="none"/>
+                <w:strike w:val="false"/>
                 <w:sz w:val="22"/>
                 <w:szCs w:val="22"/>
                 <w:color w:val="000000"/>
@@ -3984,7 +4098,6 @@
           </w:tcPr>
           <w:p>
             <w:pPr>
-              <w:pStyle w:val="Normal"/>
               <w:jc w:val="left"/>
               <w:pBdr>
                 <w:bottom w:val="none" w:sz="0" w:space="0" w:color="000000"/>
@@ -3999,6 +4112,7 @@
                 <w:i w:val="false"/>
                 <w:b w:val="false"/>
                 <w:u w:val="none"/>
+                <w:strike w:val="false"/>
                 <w:sz w:val="22"/>
                 <w:szCs w:val="22"/>
                 <w:color w:val="000000"/>
@@ -4010,6 +4124,7 @@
                 <w:i w:val="false"/>
                 <w:b w:val="false"/>
                 <w:u w:val="none"/>
+                <w:strike w:val="false"/>
                 <w:sz w:val="22"/>
                 <w:szCs w:val="22"/>
                 <w:color w:val="000000"/>
@@ -4037,7 +4152,6 @@
           </w:tcPr>
           <w:p>
             <w:pPr>
-              <w:pStyle w:val="Normal"/>
               <w:jc w:val="left"/>
               <w:pBdr>
                 <w:bottom w:val="none" w:sz="0" w:space="0" w:color="000000"/>
@@ -4052,6 +4166,7 @@
                 <w:i w:val="false"/>
                 <w:b w:val="false"/>
                 <w:u w:val="none"/>
+                <w:strike w:val="false"/>
                 <w:sz w:val="22"/>
                 <w:szCs w:val="22"/>
                 <w:color w:val="000000"/>
@@ -4063,6 +4178,7 @@
                 <w:i w:val="false"/>
                 <w:b w:val="false"/>
                 <w:u w:val="none"/>
+                <w:strike w:val="false"/>
                 <w:sz w:val="22"/>
                 <w:szCs w:val="22"/>
                 <w:color w:val="000000"/>
@@ -4096,7 +4212,6 @@
           </w:tcPr>
           <w:p>
             <w:pPr>
-              <w:pStyle w:val="Normal"/>
               <w:jc w:val="left"/>
               <w:pBdr>
                 <w:bottom w:val="none" w:sz="0" w:space="0" w:color="000000"/>
@@ -4111,6 +4226,7 @@
                 <w:i w:val="false"/>
                 <w:b w:val="false"/>
                 <w:u w:val="none"/>
+                <w:strike w:val="false"/>
                 <w:sz w:val="22"/>
                 <w:szCs w:val="22"/>
                 <w:color w:val="000000"/>
@@ -4122,6 +4238,7 @@
                 <w:i w:val="false"/>
                 <w:b w:val="false"/>
                 <w:u w:val="none"/>
+                <w:strike w:val="false"/>
                 <w:sz w:val="22"/>
                 <w:szCs w:val="22"/>
                 <w:color w:val="000000"/>
@@ -4149,7 +4266,6 @@
           </w:tcPr>
           <w:p>
             <w:pPr>
-              <w:pStyle w:val="Normal"/>
               <w:jc w:val="left"/>
               <w:pBdr>
                 <w:bottom w:val="none" w:sz="0" w:space="0" w:color="000000"/>
@@ -4164,6 +4280,7 @@
                 <w:i w:val="false"/>
                 <w:b w:val="false"/>
                 <w:u w:val="none"/>
+                <w:strike w:val="false"/>
                 <w:sz w:val="22"/>
                 <w:szCs w:val="22"/>
                 <w:color w:val="000000"/>
@@ -4175,6 +4292,7 @@
                 <w:i w:val="false"/>
                 <w:b w:val="false"/>
                 <w:u w:val="none"/>
+                <w:strike w:val="false"/>
                 <w:sz w:val="22"/>
                 <w:szCs w:val="22"/>
                 <w:color w:val="000000"/>
@@ -4202,7 +4320,6 @@
           </w:tcPr>
           <w:p>
             <w:pPr>
-              <w:pStyle w:val="Normal"/>
               <w:jc w:val="left"/>
               <w:pBdr>
                 <w:bottom w:val="none" w:sz="0" w:space="0" w:color="000000"/>
@@ -4217,6 +4334,7 @@
                 <w:i w:val="false"/>
                 <w:b w:val="false"/>
                 <w:u w:val="none"/>
+                <w:strike w:val="false"/>
                 <w:sz w:val="22"/>
                 <w:szCs w:val="22"/>
                 <w:color w:val="000000"/>
@@ -4228,6 +4346,7 @@
                 <w:i w:val="false"/>
                 <w:b w:val="false"/>
                 <w:u w:val="none"/>
+                <w:strike w:val="false"/>
                 <w:sz w:val="22"/>
                 <w:szCs w:val="22"/>
                 <w:color w:val="000000"/>
@@ -4261,7 +4380,6 @@
           </w:tcPr>
           <w:p>
             <w:pPr>
-              <w:pStyle w:val="Normal"/>
               <w:jc w:val="left"/>
               <w:pBdr>
                 <w:bottom w:val="none" w:sz="0" w:space="0" w:color="000000"/>
@@ -4276,6 +4394,7 @@
                 <w:i w:val="false"/>
                 <w:b w:val="false"/>
                 <w:u w:val="none"/>
+                <w:strike w:val="false"/>
                 <w:sz w:val="22"/>
                 <w:szCs w:val="22"/>
                 <w:color w:val="000000"/>
@@ -4287,6 +4406,7 @@
                 <w:i w:val="false"/>
                 <w:b w:val="false"/>
                 <w:u w:val="none"/>
+                <w:strike w:val="false"/>
                 <w:sz w:val="22"/>
                 <w:szCs w:val="22"/>
                 <w:color w:val="000000"/>
@@ -4314,7 +4434,6 @@
           </w:tcPr>
           <w:p>
             <w:pPr>
-              <w:pStyle w:val="Normal"/>
               <w:jc w:val="left"/>
               <w:pBdr>
                 <w:bottom w:val="none" w:sz="0" w:space="0" w:color="000000"/>
@@ -4329,6 +4448,7 @@
                 <w:i w:val="false"/>
                 <w:b w:val="false"/>
                 <w:u w:val="none"/>
+                <w:strike w:val="false"/>
                 <w:sz w:val="22"/>
                 <w:szCs w:val="22"/>
                 <w:color w:val="000000"/>
@@ -4340,6 +4460,7 @@
                 <w:i w:val="false"/>
                 <w:b w:val="false"/>
                 <w:u w:val="none"/>
+                <w:strike w:val="false"/>
                 <w:sz w:val="22"/>
                 <w:szCs w:val="22"/>
                 <w:color w:val="000000"/>
@@ -4367,7 +4488,6 @@
           </w:tcPr>
           <w:p>
             <w:pPr>
-              <w:pStyle w:val="Normal"/>
               <w:jc w:val="left"/>
               <w:pBdr>
                 <w:bottom w:val="none" w:sz="0" w:space="0" w:color="000000"/>
@@ -4382,6 +4502,7 @@
                 <w:i w:val="false"/>
                 <w:b w:val="false"/>
                 <w:u w:val="none"/>
+                <w:strike w:val="false"/>
                 <w:sz w:val="22"/>
                 <w:szCs w:val="22"/>
                 <w:color w:val="000000"/>
@@ -4393,6 +4514,7 @@
                 <w:i w:val="false"/>
                 <w:b w:val="false"/>
                 <w:u w:val="none"/>
+                <w:strike w:val="false"/>
                 <w:sz w:val="22"/>
                 <w:szCs w:val="22"/>
                 <w:color w:val="000000"/>
@@ -4426,7 +4548,6 @@
           </w:tcPr>
           <w:p>
             <w:pPr>
-              <w:pStyle w:val="Normal"/>
               <w:jc w:val="left"/>
               <w:pBdr>
                 <w:bottom w:val="none" w:sz="0" w:space="0" w:color="000000"/>
@@ -4441,6 +4562,7 @@
                 <w:i w:val="false"/>
                 <w:b w:val="false"/>
                 <w:u w:val="none"/>
+                <w:strike w:val="false"/>
                 <w:sz w:val="22"/>
                 <w:szCs w:val="22"/>
                 <w:color w:val="000000"/>
@@ -4452,6 +4574,7 @@
                 <w:i w:val="false"/>
                 <w:b w:val="false"/>
                 <w:u w:val="none"/>
+                <w:strike w:val="false"/>
                 <w:sz w:val="22"/>
                 <w:szCs w:val="22"/>
                 <w:color w:val="000000"/>
@@ -4479,7 +4602,6 @@
           </w:tcPr>
           <w:p>
             <w:pPr>
-              <w:pStyle w:val="Normal"/>
               <w:jc w:val="left"/>
               <w:pBdr>
                 <w:bottom w:val="none" w:sz="0" w:space="0" w:color="000000"/>
@@ -4494,6 +4616,7 @@
                 <w:i w:val="false"/>
                 <w:b w:val="false"/>
                 <w:u w:val="none"/>
+                <w:strike w:val="false"/>
                 <w:sz w:val="22"/>
                 <w:szCs w:val="22"/>
                 <w:color w:val="000000"/>
@@ -4505,6 +4628,7 @@
                 <w:i w:val="false"/>
                 <w:b w:val="false"/>
                 <w:u w:val="none"/>
+                <w:strike w:val="false"/>
                 <w:sz w:val="22"/>
                 <w:szCs w:val="22"/>
                 <w:color w:val="000000"/>
@@ -4532,7 +4656,6 @@
           </w:tcPr>
           <w:p>
             <w:pPr>
-              <w:pStyle w:val="Normal"/>
               <w:jc w:val="left"/>
               <w:pBdr>
                 <w:bottom w:val="none" w:sz="0" w:space="0" w:color="000000"/>
@@ -4547,6 +4670,7 @@
                 <w:i w:val="false"/>
                 <w:b w:val="false"/>
                 <w:u w:val="none"/>
+                <w:strike w:val="false"/>
                 <w:sz w:val="22"/>
                 <w:szCs w:val="22"/>
                 <w:color w:val="000000"/>
@@ -4558,6 +4682,7 @@
                 <w:i w:val="false"/>
                 <w:b w:val="false"/>
                 <w:u w:val="none"/>
+                <w:strike w:val="false"/>
                 <w:sz w:val="22"/>
                 <w:szCs w:val="22"/>
                 <w:color w:val="000000"/>
@@ -4591,7 +4716,6 @@
           </w:tcPr>
           <w:p>
             <w:pPr>
-              <w:pStyle w:val="Normal"/>
               <w:jc w:val="left"/>
               <w:pBdr>
                 <w:bottom w:val="none" w:sz="0" w:space="0" w:color="000000"/>
@@ -4606,6 +4730,7 @@
                 <w:i w:val="false"/>
                 <w:b w:val="false"/>
                 <w:u w:val="none"/>
+                <w:strike w:val="false"/>
                 <w:sz w:val="22"/>
                 <w:szCs w:val="22"/>
                 <w:color w:val="000000"/>
@@ -4617,6 +4742,7 @@
                 <w:i w:val="false"/>
                 <w:b w:val="false"/>
                 <w:u w:val="none"/>
+                <w:strike w:val="false"/>
                 <w:sz w:val="22"/>
                 <w:szCs w:val="22"/>
                 <w:color w:val="000000"/>
@@ -4644,7 +4770,6 @@
           </w:tcPr>
           <w:p>
             <w:pPr>
-              <w:pStyle w:val="Normal"/>
               <w:jc w:val="left"/>
               <w:pBdr>
                 <w:bottom w:val="none" w:sz="0" w:space="0" w:color="000000"/>
@@ -4659,6 +4784,7 @@
                 <w:i w:val="false"/>
                 <w:b w:val="false"/>
                 <w:u w:val="none"/>
+                <w:strike w:val="false"/>
                 <w:sz w:val="22"/>
                 <w:szCs w:val="22"/>
                 <w:color w:val="000000"/>
@@ -4670,6 +4796,7 @@
                 <w:i w:val="false"/>
                 <w:b w:val="false"/>
                 <w:u w:val="none"/>
+                <w:strike w:val="false"/>
                 <w:sz w:val="22"/>
                 <w:szCs w:val="22"/>
                 <w:color w:val="000000"/>
@@ -4697,7 +4824,6 @@
           </w:tcPr>
           <w:p>
             <w:pPr>
-              <w:pStyle w:val="Normal"/>
               <w:jc w:val="left"/>
               <w:pBdr>
                 <w:bottom w:val="none" w:sz="0" w:space="0" w:color="000000"/>
@@ -4712,6 +4838,7 @@
                 <w:i w:val="false"/>
                 <w:b w:val="false"/>
                 <w:u w:val="none"/>
+                <w:strike w:val="false"/>
                 <w:sz w:val="22"/>
                 <w:szCs w:val="22"/>
                 <w:color w:val="000000"/>
@@ -4723,6 +4850,7 @@
                 <w:i w:val="false"/>
                 <w:b w:val="false"/>
                 <w:u w:val="none"/>
+                <w:strike w:val="false"/>
                 <w:sz w:val="22"/>
                 <w:szCs w:val="22"/>
                 <w:color w:val="000000"/>
@@ -4756,7 +4884,6 @@
           </w:tcPr>
           <w:p>
             <w:pPr>
-              <w:pStyle w:val="Normal"/>
               <w:jc w:val="left"/>
               <w:pBdr>
                 <w:bottom w:val="none" w:sz="0" w:space="0" w:color="000000"/>
@@ -4771,6 +4898,7 @@
                 <w:i w:val="false"/>
                 <w:b w:val="false"/>
                 <w:u w:val="none"/>
+                <w:strike w:val="false"/>
                 <w:sz w:val="22"/>
                 <w:szCs w:val="22"/>
                 <w:color w:val="000000"/>
@@ -4782,6 +4910,7 @@
                 <w:i w:val="false"/>
                 <w:b w:val="false"/>
                 <w:u w:val="none"/>
+                <w:strike w:val="false"/>
                 <w:sz w:val="22"/>
                 <w:szCs w:val="22"/>
                 <w:color w:val="000000"/>
@@ -4809,7 +4938,6 @@
           </w:tcPr>
           <w:p>
             <w:pPr>
-              <w:pStyle w:val="Normal"/>
               <w:jc w:val="left"/>
               <w:pBdr>
                 <w:bottom w:val="none" w:sz="0" w:space="0" w:color="000000"/>
@@ -4824,6 +4952,7 @@
                 <w:i w:val="false"/>
                 <w:b w:val="false"/>
                 <w:u w:val="none"/>
+                <w:strike w:val="false"/>
                 <w:sz w:val="22"/>
                 <w:szCs w:val="22"/>
                 <w:color w:val="000000"/>
@@ -4835,6 +4964,7 @@
                 <w:i w:val="false"/>
                 <w:b w:val="false"/>
                 <w:u w:val="none"/>
+                <w:strike w:val="false"/>
                 <w:sz w:val="22"/>
                 <w:szCs w:val="22"/>
                 <w:color w:val="000000"/>
@@ -4862,7 +4992,6 @@
           </w:tcPr>
           <w:p>
             <w:pPr>
-              <w:pStyle w:val="Normal"/>
               <w:jc w:val="left"/>
               <w:pBdr>
                 <w:bottom w:val="none" w:sz="0" w:space="0" w:color="000000"/>
@@ -4877,6 +5006,7 @@
                 <w:i w:val="false"/>
                 <w:b w:val="false"/>
                 <w:u w:val="none"/>
+                <w:strike w:val="false"/>
                 <w:sz w:val="22"/>
                 <w:szCs w:val="22"/>
                 <w:color w:val="000000"/>
@@ -4888,6 +5018,7 @@
                 <w:i w:val="false"/>
                 <w:b w:val="false"/>
                 <w:u w:val="none"/>
+                <w:strike w:val="false"/>
                 <w:sz w:val="22"/>
                 <w:szCs w:val="22"/>
                 <w:color w:val="000000"/>
@@ -4921,7 +5052,6 @@
           </w:tcPr>
           <w:p>
             <w:pPr>
-              <w:pStyle w:val="Normal"/>
               <w:jc w:val="left"/>
               <w:pBdr>
                 <w:bottom w:val="none" w:sz="0" w:space="0" w:color="000000"/>
@@ -4936,6 +5066,7 @@
                 <w:i w:val="false"/>
                 <w:b w:val="false"/>
                 <w:u w:val="none"/>
+                <w:strike w:val="false"/>
                 <w:sz w:val="22"/>
                 <w:szCs w:val="22"/>
                 <w:color w:val="000000"/>
@@ -4947,6 +5078,7 @@
                 <w:i w:val="false"/>
                 <w:b w:val="false"/>
                 <w:u w:val="none"/>
+                <w:strike w:val="false"/>
                 <w:sz w:val="22"/>
                 <w:szCs w:val="22"/>
                 <w:color w:val="000000"/>
@@ -4974,7 +5106,6 @@
           </w:tcPr>
           <w:p>
             <w:pPr>
-              <w:pStyle w:val="Normal"/>
               <w:jc w:val="left"/>
               <w:pBdr>
                 <w:bottom w:val="none" w:sz="0" w:space="0" w:color="000000"/>
@@ -4989,6 +5120,7 @@
                 <w:i w:val="false"/>
                 <w:b w:val="false"/>
                 <w:u w:val="none"/>
+                <w:strike w:val="false"/>
                 <w:sz w:val="22"/>
                 <w:szCs w:val="22"/>
                 <w:color w:val="000000"/>
@@ -5000,6 +5132,7 @@
                 <w:i w:val="false"/>
                 <w:b w:val="false"/>
                 <w:u w:val="none"/>
+                <w:strike w:val="false"/>
                 <w:sz w:val="22"/>
                 <w:szCs w:val="22"/>
                 <w:color w:val="000000"/>
@@ -5027,7 +5160,6 @@
           </w:tcPr>
           <w:p>
             <w:pPr>
-              <w:pStyle w:val="Normal"/>
               <w:jc w:val="left"/>
               <w:pBdr>
                 <w:bottom w:val="none" w:sz="0" w:space="0" w:color="000000"/>
@@ -5042,6 +5174,7 @@
                 <w:i w:val="false"/>
                 <w:b w:val="false"/>
                 <w:u w:val="none"/>
+                <w:strike w:val="false"/>
                 <w:sz w:val="22"/>
                 <w:szCs w:val="22"/>
                 <w:color w:val="000000"/>
@@ -5053,6 +5186,7 @@
                 <w:i w:val="false"/>
                 <w:b w:val="false"/>
                 <w:u w:val="none"/>
+                <w:strike w:val="false"/>
                 <w:sz w:val="22"/>
                 <w:szCs w:val="22"/>
                 <w:color w:val="000000"/>
@@ -5086,7 +5220,6 @@
           </w:tcPr>
           <w:p>
             <w:pPr>
-              <w:pStyle w:val="Normal"/>
               <w:jc w:val="left"/>
               <w:pBdr>
                 <w:bottom w:val="none" w:sz="0" w:space="0" w:color="000000"/>
@@ -5101,6 +5234,7 @@
                 <w:i w:val="false"/>
                 <w:b w:val="false"/>
                 <w:u w:val="none"/>
+                <w:strike w:val="false"/>
                 <w:sz w:val="22"/>
                 <w:szCs w:val="22"/>
                 <w:color w:val="000000"/>
@@ -5112,6 +5246,7 @@
                 <w:i w:val="false"/>
                 <w:b w:val="false"/>
                 <w:u w:val="none"/>
+                <w:strike w:val="false"/>
                 <w:sz w:val="22"/>
                 <w:szCs w:val="22"/>
                 <w:color w:val="000000"/>
@@ -5139,7 +5274,6 @@
           </w:tcPr>
           <w:p>
             <w:pPr>
-              <w:pStyle w:val="Normal"/>
               <w:jc w:val="left"/>
               <w:pBdr>
                 <w:bottom w:val="none" w:sz="0" w:space="0" w:color="000000"/>
@@ -5154,6 +5288,7 @@
                 <w:i w:val="false"/>
                 <w:b w:val="false"/>
                 <w:u w:val="none"/>
+                <w:strike w:val="false"/>
                 <w:sz w:val="22"/>
                 <w:szCs w:val="22"/>
                 <w:color w:val="000000"/>
@@ -5165,6 +5300,7 @@
                 <w:i w:val="false"/>
                 <w:b w:val="false"/>
                 <w:u w:val="none"/>
+                <w:strike w:val="false"/>
                 <w:sz w:val="22"/>
                 <w:szCs w:val="22"/>
                 <w:color w:val="000000"/>
@@ -5192,7 +5328,6 @@
           </w:tcPr>
           <w:p>
             <w:pPr>
-              <w:pStyle w:val="Normal"/>
               <w:jc w:val="left"/>
               <w:pBdr>
                 <w:bottom w:val="none" w:sz="0" w:space="0" w:color="000000"/>
@@ -5207,6 +5342,7 @@
                 <w:i w:val="false"/>
                 <w:b w:val="false"/>
                 <w:u w:val="none"/>
+                <w:strike w:val="false"/>
                 <w:sz w:val="22"/>
                 <w:szCs w:val="22"/>
                 <w:color w:val="000000"/>
@@ -5218,6 +5354,7 @@
                 <w:i w:val="false"/>
                 <w:b w:val="false"/>
                 <w:u w:val="none"/>
+                <w:strike w:val="false"/>
                 <w:sz w:val="22"/>
                 <w:szCs w:val="22"/>
                 <w:color w:val="000000"/>
@@ -5251,7 +5388,6 @@
           </w:tcPr>
           <w:p>
             <w:pPr>
-              <w:pStyle w:val="Normal"/>
               <w:jc w:val="left"/>
               <w:pBdr>
                 <w:bottom w:val="none" w:sz="0" w:space="0" w:color="000000"/>
@@ -5266,6 +5402,7 @@
                 <w:i w:val="false"/>
                 <w:b w:val="false"/>
                 <w:u w:val="none"/>
+                <w:strike w:val="false"/>
                 <w:sz w:val="22"/>
                 <w:szCs w:val="22"/>
                 <w:color w:val="000000"/>
@@ -5277,6 +5414,7 @@
                 <w:i w:val="false"/>
                 <w:b w:val="false"/>
                 <w:u w:val="none"/>
+                <w:strike w:val="false"/>
                 <w:sz w:val="22"/>
                 <w:szCs w:val="22"/>
                 <w:color w:val="000000"/>
@@ -5304,7 +5442,6 @@
           </w:tcPr>
           <w:p>
             <w:pPr>
-              <w:pStyle w:val="Normal"/>
               <w:jc w:val="left"/>
               <w:pBdr>
                 <w:bottom w:val="none" w:sz="0" w:space="0" w:color="000000"/>
@@ -5319,6 +5456,7 @@
                 <w:i w:val="false"/>
                 <w:b w:val="false"/>
                 <w:u w:val="none"/>
+                <w:strike w:val="false"/>
                 <w:sz w:val="22"/>
                 <w:szCs w:val="22"/>
                 <w:color w:val="000000"/>
@@ -5330,6 +5468,7 @@
                 <w:i w:val="false"/>
                 <w:b w:val="false"/>
                 <w:u w:val="none"/>
+                <w:strike w:val="false"/>
                 <w:sz w:val="22"/>
                 <w:szCs w:val="22"/>
                 <w:color w:val="000000"/>
@@ -5357,7 +5496,6 @@
           </w:tcPr>
           <w:p>
             <w:pPr>
-              <w:pStyle w:val="Normal"/>
               <w:jc w:val="left"/>
               <w:pBdr>
                 <w:bottom w:val="none" w:sz="0" w:space="0" w:color="000000"/>
@@ -5372,6 +5510,7 @@
                 <w:i w:val="false"/>
                 <w:b w:val="false"/>
                 <w:u w:val="none"/>
+                <w:strike w:val="false"/>
                 <w:sz w:val="22"/>
                 <w:szCs w:val="22"/>
                 <w:color w:val="000000"/>
@@ -5383,6 +5522,7 @@
                 <w:i w:val="false"/>
                 <w:b w:val="false"/>
                 <w:u w:val="none"/>
+                <w:strike w:val="false"/>
                 <w:sz w:val="22"/>
                 <w:szCs w:val="22"/>
                 <w:color w:val="000000"/>
@@ -5416,7 +5556,6 @@
           </w:tcPr>
           <w:p>
             <w:pPr>
-              <w:pStyle w:val="Normal"/>
               <w:jc w:val="left"/>
               <w:pBdr>
                 <w:bottom w:val="none" w:sz="0" w:space="0" w:color="000000"/>
@@ -5431,6 +5570,7 @@
                 <w:i w:val="false"/>
                 <w:b w:val="false"/>
                 <w:u w:val="none"/>
+                <w:strike w:val="false"/>
                 <w:sz w:val="22"/>
                 <w:szCs w:val="22"/>
                 <w:color w:val="000000"/>
@@ -5442,6 +5582,7 @@
                 <w:i w:val="false"/>
                 <w:b w:val="false"/>
                 <w:u w:val="none"/>
+                <w:strike w:val="false"/>
                 <w:sz w:val="22"/>
                 <w:szCs w:val="22"/>
                 <w:color w:val="000000"/>
@@ -5469,7 +5610,6 @@
           </w:tcPr>
           <w:p>
             <w:pPr>
-              <w:pStyle w:val="Normal"/>
               <w:jc w:val="left"/>
               <w:pBdr>
                 <w:bottom w:val="none" w:sz="0" w:space="0" w:color="000000"/>
@@ -5484,6 +5624,7 @@
                 <w:i w:val="false"/>
                 <w:b w:val="false"/>
                 <w:u w:val="none"/>
+                <w:strike w:val="false"/>
                 <w:sz w:val="22"/>
                 <w:szCs w:val="22"/>
                 <w:color w:val="000000"/>
@@ -5495,6 +5636,7 @@
                 <w:i w:val="false"/>
                 <w:b w:val="false"/>
                 <w:u w:val="none"/>
+                <w:strike w:val="false"/>
                 <w:sz w:val="22"/>
                 <w:szCs w:val="22"/>
                 <w:color w:val="000000"/>
@@ -5522,7 +5664,6 @@
           </w:tcPr>
           <w:p>
             <w:pPr>
-              <w:pStyle w:val="Normal"/>
               <w:jc w:val="left"/>
               <w:pBdr>
                 <w:bottom w:val="none" w:sz="0" w:space="0" w:color="000000"/>
@@ -5537,6 +5678,7 @@
                 <w:i w:val="false"/>
                 <w:b w:val="false"/>
                 <w:u w:val="none"/>
+                <w:strike w:val="false"/>
                 <w:sz w:val="22"/>
                 <w:szCs w:val="22"/>
                 <w:color w:val="000000"/>
@@ -5548,6 +5690,7 @@
                 <w:i w:val="false"/>
                 <w:b w:val="false"/>
                 <w:u w:val="none"/>
+                <w:strike w:val="false"/>
                 <w:sz w:val="22"/>
                 <w:szCs w:val="22"/>
                 <w:color w:val="000000"/>
@@ -5581,7 +5724,6 @@
           </w:tcPr>
           <w:p>
             <w:pPr>
-              <w:pStyle w:val="Normal"/>
               <w:jc w:val="left"/>
               <w:pBdr>
                 <w:bottom w:val="none" w:sz="0" w:space="0" w:color="000000"/>
@@ -5596,6 +5738,7 @@
                 <w:i w:val="false"/>
                 <w:b w:val="false"/>
                 <w:u w:val="none"/>
+                <w:strike w:val="false"/>
                 <w:sz w:val="22"/>
                 <w:szCs w:val="22"/>
                 <w:color w:val="000000"/>
@@ -5607,6 +5750,7 @@
                 <w:i w:val="false"/>
                 <w:b w:val="false"/>
                 <w:u w:val="none"/>
+                <w:strike w:val="false"/>
                 <w:sz w:val="22"/>
                 <w:szCs w:val="22"/>
                 <w:color w:val="000000"/>
@@ -5634,7 +5778,6 @@
           </w:tcPr>
           <w:p>
             <w:pPr>
-              <w:pStyle w:val="Normal"/>
               <w:jc w:val="left"/>
               <w:pBdr>
                 <w:bottom w:val="none" w:sz="0" w:space="0" w:color="000000"/>
@@ -5649,6 +5792,7 @@
                 <w:i w:val="false"/>
                 <w:b w:val="false"/>
                 <w:u w:val="none"/>
+                <w:strike w:val="false"/>
                 <w:sz w:val="22"/>
                 <w:szCs w:val="22"/>
                 <w:color w:val="000000"/>
@@ -5660,6 +5804,7 @@
                 <w:i w:val="false"/>
                 <w:b w:val="false"/>
                 <w:u w:val="none"/>
+                <w:strike w:val="false"/>
                 <w:sz w:val="22"/>
                 <w:szCs w:val="22"/>
                 <w:color w:val="000000"/>
@@ -5687,7 +5832,6 @@
           </w:tcPr>
           <w:p>
             <w:pPr>
-              <w:pStyle w:val="Normal"/>
               <w:jc w:val="left"/>
               <w:pBdr>
                 <w:bottom w:val="none" w:sz="0" w:space="0" w:color="000000"/>
@@ -5702,6 +5846,7 @@
                 <w:i w:val="false"/>
                 <w:b w:val="false"/>
                 <w:u w:val="none"/>
+                <w:strike w:val="false"/>
                 <w:sz w:val="22"/>
                 <w:szCs w:val="22"/>
                 <w:color w:val="000000"/>
@@ -5713,6 +5858,7 @@
                 <w:i w:val="false"/>
                 <w:b w:val="false"/>
                 <w:u w:val="none"/>
+                <w:strike w:val="false"/>
                 <w:sz w:val="22"/>
                 <w:szCs w:val="22"/>
                 <w:color w:val="000000"/>
@@ -5746,7 +5892,6 @@
           </w:tcPr>
           <w:p>
             <w:pPr>
-              <w:pStyle w:val="Normal"/>
               <w:jc w:val="left"/>
               <w:pBdr>
                 <w:bottom w:val="none" w:sz="0" w:space="0" w:color="000000"/>
@@ -5761,6 +5906,7 @@
                 <w:i w:val="false"/>
                 <w:b w:val="false"/>
                 <w:u w:val="none"/>
+                <w:strike w:val="false"/>
                 <w:sz w:val="22"/>
                 <w:szCs w:val="22"/>
                 <w:color w:val="000000"/>
@@ -5772,6 +5918,7 @@
                 <w:i w:val="false"/>
                 <w:b w:val="false"/>
                 <w:u w:val="none"/>
+                <w:strike w:val="false"/>
                 <w:sz w:val="22"/>
                 <w:szCs w:val="22"/>
                 <w:color w:val="000000"/>
@@ -5799,7 +5946,6 @@
           </w:tcPr>
           <w:p>
             <w:pPr>
-              <w:pStyle w:val="Normal"/>
               <w:jc w:val="left"/>
               <w:pBdr>
                 <w:bottom w:val="none" w:sz="0" w:space="0" w:color="000000"/>
@@ -5814,6 +5960,7 @@
                 <w:i w:val="false"/>
                 <w:b w:val="false"/>
                 <w:u w:val="none"/>
+                <w:strike w:val="false"/>
                 <w:sz w:val="22"/>
                 <w:szCs w:val="22"/>
                 <w:color w:val="000000"/>
@@ -5825,6 +5972,7 @@
                 <w:i w:val="false"/>
                 <w:b w:val="false"/>
                 <w:u w:val="none"/>
+                <w:strike w:val="false"/>
                 <w:sz w:val="22"/>
                 <w:szCs w:val="22"/>
                 <w:color w:val="000000"/>
@@ -5852,7 +6000,6 @@
           </w:tcPr>
           <w:p>
             <w:pPr>
-              <w:pStyle w:val="Normal"/>
               <w:jc w:val="left"/>
               <w:pBdr>
                 <w:bottom w:val="none" w:sz="0" w:space="0" w:color="000000"/>
@@ -5867,6 +6014,7 @@
                 <w:i w:val="false"/>
                 <w:b w:val="false"/>
                 <w:u w:val="none"/>
+                <w:strike w:val="false"/>
                 <w:sz w:val="22"/>
                 <w:szCs w:val="22"/>
                 <w:color w:val="000000"/>
@@ -5878,6 +6026,7 @@
                 <w:i w:val="false"/>
                 <w:b w:val="false"/>
                 <w:u w:val="none"/>
+                <w:strike w:val="false"/>
                 <w:sz w:val="22"/>
                 <w:szCs w:val="22"/>
                 <w:color w:val="000000"/>
@@ -5911,7 +6060,6 @@
           </w:tcPr>
           <w:p>
             <w:pPr>
-              <w:pStyle w:val="Normal"/>
               <w:jc w:val="left"/>
               <w:pBdr>
                 <w:bottom w:val="none" w:sz="0" w:space="0" w:color="000000"/>
@@ -5926,6 +6074,7 @@
                 <w:i w:val="false"/>
                 <w:b w:val="false"/>
                 <w:u w:val="none"/>
+                <w:strike w:val="false"/>
                 <w:sz w:val="22"/>
                 <w:szCs w:val="22"/>
                 <w:color w:val="000000"/>
@@ -5937,6 +6086,7 @@
                 <w:i w:val="false"/>
                 <w:b w:val="false"/>
                 <w:u w:val="none"/>
+                <w:strike w:val="false"/>
                 <w:sz w:val="22"/>
                 <w:szCs w:val="22"/>
                 <w:color w:val="000000"/>
@@ -5964,7 +6114,6 @@
           </w:tcPr>
           <w:p>
             <w:pPr>
-              <w:pStyle w:val="Normal"/>
               <w:jc w:val="left"/>
               <w:pBdr>
                 <w:bottom w:val="none" w:sz="0" w:space="0" w:color="000000"/>
@@ -5979,6 +6128,7 @@
                 <w:i w:val="false"/>
                 <w:b w:val="false"/>
                 <w:u w:val="none"/>
+                <w:strike w:val="false"/>
                 <w:sz w:val="22"/>
                 <w:szCs w:val="22"/>
                 <w:color w:val="000000"/>
@@ -5990,6 +6140,7 @@
                 <w:i w:val="false"/>
                 <w:b w:val="false"/>
                 <w:u w:val="none"/>
+                <w:strike w:val="false"/>
                 <w:sz w:val="22"/>
                 <w:szCs w:val="22"/>
                 <w:color w:val="000000"/>
@@ -6017,7 +6168,6 @@
           </w:tcPr>
           <w:p>
             <w:pPr>
-              <w:pStyle w:val="Normal"/>
               <w:jc w:val="left"/>
               <w:pBdr>
                 <w:bottom w:val="none" w:sz="0" w:space="0" w:color="000000"/>
@@ -6032,6 +6182,7 @@
                 <w:i w:val="false"/>
                 <w:b w:val="false"/>
                 <w:u w:val="none"/>
+                <w:strike w:val="false"/>
                 <w:sz w:val="22"/>
                 <w:szCs w:val="22"/>
                 <w:color w:val="000000"/>
@@ -6043,6 +6194,7 @@
                 <w:i w:val="false"/>
                 <w:b w:val="false"/>
                 <w:u w:val="none"/>
+                <w:strike w:val="false"/>
                 <w:sz w:val="22"/>
                 <w:szCs w:val="22"/>
                 <w:color w:val="000000"/>
@@ -6076,7 +6228,6 @@
           </w:tcPr>
           <w:p>
             <w:pPr>
-              <w:pStyle w:val="Normal"/>
               <w:jc w:val="left"/>
               <w:pBdr>
                 <w:bottom w:val="none" w:sz="0" w:space="0" w:color="000000"/>
@@ -6091,6 +6242,7 @@
                 <w:i w:val="false"/>
                 <w:b w:val="false"/>
                 <w:u w:val="none"/>
+                <w:strike w:val="false"/>
                 <w:sz w:val="22"/>
                 <w:szCs w:val="22"/>
                 <w:color w:val="000000"/>
@@ -6102,6 +6254,7 @@
                 <w:i w:val="false"/>
                 <w:b w:val="false"/>
                 <w:u w:val="none"/>
+                <w:strike w:val="false"/>
                 <w:sz w:val="22"/>
                 <w:szCs w:val="22"/>
                 <w:color w:val="000000"/>
@@ -6129,7 +6282,6 @@
           </w:tcPr>
           <w:p>
             <w:pPr>
-              <w:pStyle w:val="Normal"/>
               <w:jc w:val="left"/>
               <w:pBdr>
                 <w:bottom w:val="none" w:sz="0" w:space="0" w:color="000000"/>
@@ -6144,6 +6296,7 @@
                 <w:i w:val="false"/>
                 <w:b w:val="false"/>
                 <w:u w:val="none"/>
+                <w:strike w:val="false"/>
                 <w:sz w:val="22"/>
                 <w:szCs w:val="22"/>
                 <w:color w:val="000000"/>
@@ -6155,6 +6308,7 @@
                 <w:i w:val="false"/>
                 <w:b w:val="false"/>
                 <w:u w:val="none"/>
+                <w:strike w:val="false"/>
                 <w:sz w:val="22"/>
                 <w:szCs w:val="22"/>
                 <w:color w:val="000000"/>
@@ -6182,7 +6336,6 @@
           </w:tcPr>
           <w:p>
             <w:pPr>
-              <w:pStyle w:val="Normal"/>
               <w:jc w:val="left"/>
               <w:pBdr>
                 <w:bottom w:val="none" w:sz="0" w:space="0" w:color="000000"/>
@@ -6197,6 +6350,7 @@
                 <w:i w:val="false"/>
                 <w:b w:val="false"/>
                 <w:u w:val="none"/>
+                <w:strike w:val="false"/>
                 <w:sz w:val="22"/>
                 <w:szCs w:val="22"/>
                 <w:color w:val="000000"/>
@@ -6208,6 +6362,7 @@
                 <w:i w:val="false"/>
                 <w:b w:val="false"/>
                 <w:u w:val="none"/>
+                <w:strike w:val="false"/>
                 <w:sz w:val="22"/>
                 <w:szCs w:val="22"/>
                 <w:color w:val="000000"/>
@@ -6241,7 +6396,6 @@
           </w:tcPr>
           <w:p>
             <w:pPr>
-              <w:pStyle w:val="Normal"/>
               <w:jc w:val="left"/>
               <w:pBdr>
                 <w:bottom w:val="none" w:sz="0" w:space="0" w:color="000000"/>
@@ -6256,6 +6410,7 @@
                 <w:i w:val="false"/>
                 <w:b w:val="false"/>
                 <w:u w:val="none"/>
+                <w:strike w:val="false"/>
                 <w:sz w:val="22"/>
                 <w:szCs w:val="22"/>
                 <w:color w:val="000000"/>
@@ -6267,6 +6422,7 @@
                 <w:i w:val="false"/>
                 <w:b w:val="false"/>
                 <w:u w:val="none"/>
+                <w:strike w:val="false"/>
                 <w:sz w:val="22"/>
                 <w:szCs w:val="22"/>
                 <w:color w:val="000000"/>
@@ -6294,7 +6450,6 @@
           </w:tcPr>
           <w:p>
             <w:pPr>
-              <w:pStyle w:val="Normal"/>
               <w:jc w:val="left"/>
               <w:pBdr>
                 <w:bottom w:val="none" w:sz="0" w:space="0" w:color="000000"/>
@@ -6309,6 +6464,7 @@
                 <w:i w:val="false"/>
                 <w:b w:val="false"/>
                 <w:u w:val="none"/>
+                <w:strike w:val="false"/>
                 <w:sz w:val="22"/>
                 <w:szCs w:val="22"/>
                 <w:color w:val="000000"/>
@@ -6320,6 +6476,7 @@
                 <w:i w:val="false"/>
                 <w:b w:val="false"/>
                 <w:u w:val="none"/>
+                <w:strike w:val="false"/>
                 <w:sz w:val="22"/>
                 <w:szCs w:val="22"/>
                 <w:color w:val="000000"/>
@@ -6347,7 +6504,6 @@
           </w:tcPr>
           <w:p>
             <w:pPr>
-              <w:pStyle w:val="Normal"/>
               <w:jc w:val="left"/>
               <w:pBdr>
                 <w:bottom w:val="none" w:sz="0" w:space="0" w:color="000000"/>
@@ -6362,6 +6518,7 @@
                 <w:i w:val="false"/>
                 <w:b w:val="false"/>
                 <w:u w:val="none"/>
+                <w:strike w:val="false"/>
                 <w:sz w:val="22"/>
                 <w:szCs w:val="22"/>
                 <w:color w:val="000000"/>
@@ -6373,6 +6530,7 @@
                 <w:i w:val="false"/>
                 <w:b w:val="false"/>
                 <w:u w:val="none"/>
+                <w:strike w:val="false"/>
                 <w:sz w:val="22"/>
                 <w:szCs w:val="22"/>
                 <w:color w:val="000000"/>
@@ -6406,7 +6564,6 @@
           </w:tcPr>
           <w:p>
             <w:pPr>
-              <w:pStyle w:val="Normal"/>
               <w:jc w:val="left"/>
               <w:pBdr>
                 <w:bottom w:val="none" w:sz="0" w:space="0" w:color="000000"/>
@@ -6421,6 +6578,7 @@
                 <w:i w:val="false"/>
                 <w:b w:val="false"/>
                 <w:u w:val="none"/>
+                <w:strike w:val="false"/>
                 <w:sz w:val="22"/>
                 <w:szCs w:val="22"/>
                 <w:color w:val="000000"/>
@@ -6432,6 +6590,7 @@
                 <w:i w:val="false"/>
                 <w:b w:val="false"/>
                 <w:u w:val="none"/>
+                <w:strike w:val="false"/>
                 <w:sz w:val="22"/>
                 <w:szCs w:val="22"/>
                 <w:color w:val="000000"/>
@@ -6459,7 +6618,6 @@
           </w:tcPr>
           <w:p>
             <w:pPr>
-              <w:pStyle w:val="Normal"/>
               <w:jc w:val="left"/>
               <w:pBdr>
                 <w:bottom w:val="none" w:sz="0" w:space="0" w:color="000000"/>
@@ -6474,6 +6632,7 @@
                 <w:i w:val="false"/>
                 <w:b w:val="false"/>
                 <w:u w:val="none"/>
+                <w:strike w:val="false"/>
                 <w:sz w:val="22"/>
                 <w:szCs w:val="22"/>
                 <w:color w:val="000000"/>
@@ -6485,6 +6644,7 @@
                 <w:i w:val="false"/>
                 <w:b w:val="false"/>
                 <w:u w:val="none"/>
+                <w:strike w:val="false"/>
                 <w:sz w:val="22"/>
                 <w:szCs w:val="22"/>
                 <w:color w:val="000000"/>
@@ -6512,7 +6672,6 @@
           </w:tcPr>
           <w:p>
             <w:pPr>
-              <w:pStyle w:val="Normal"/>
               <w:jc w:val="left"/>
               <w:pBdr>
                 <w:bottom w:val="none" w:sz="0" w:space="0" w:color="000000"/>
@@ -6527,6 +6686,7 @@
                 <w:i w:val="false"/>
                 <w:b w:val="false"/>
                 <w:u w:val="none"/>
+                <w:strike w:val="false"/>
                 <w:sz w:val="22"/>
                 <w:szCs w:val="22"/>
                 <w:color w:val="000000"/>
@@ -6538,6 +6698,7 @@
                 <w:i w:val="false"/>
                 <w:b w:val="false"/>
                 <w:u w:val="none"/>
+                <w:strike w:val="false"/>
                 <w:sz w:val="22"/>
                 <w:szCs w:val="22"/>
                 <w:color w:val="000000"/>
@@ -6571,7 +6732,6 @@
           </w:tcPr>
           <w:p>
             <w:pPr>
-              <w:pStyle w:val="Normal"/>
               <w:jc w:val="left"/>
               <w:pBdr>
                 <w:bottom w:val="none" w:sz="0" w:space="0" w:color="000000"/>
@@ -6586,6 +6746,7 @@
                 <w:i w:val="false"/>
                 <w:b w:val="false"/>
                 <w:u w:val="none"/>
+                <w:strike w:val="false"/>
                 <w:sz w:val="22"/>
                 <w:szCs w:val="22"/>
                 <w:color w:val="000000"/>
@@ -6597,6 +6758,7 @@
                 <w:i w:val="false"/>
                 <w:b w:val="false"/>
                 <w:u w:val="none"/>
+                <w:strike w:val="false"/>
                 <w:sz w:val="22"/>
                 <w:szCs w:val="22"/>
                 <w:color w:val="000000"/>
@@ -6624,7 +6786,6 @@
           </w:tcPr>
           <w:p>
             <w:pPr>
-              <w:pStyle w:val="Normal"/>
               <w:jc w:val="left"/>
               <w:pBdr>
                 <w:bottom w:val="none" w:sz="0" w:space="0" w:color="000000"/>
@@ -6639,6 +6800,7 @@
                 <w:i w:val="false"/>
                 <w:b w:val="false"/>
                 <w:u w:val="none"/>
+                <w:strike w:val="false"/>
                 <w:sz w:val="22"/>
                 <w:szCs w:val="22"/>
                 <w:color w:val="000000"/>
@@ -6650,6 +6812,7 @@
                 <w:i w:val="false"/>
                 <w:b w:val="false"/>
                 <w:u w:val="none"/>
+                <w:strike w:val="false"/>
                 <w:sz w:val="22"/>
                 <w:szCs w:val="22"/>
                 <w:color w:val="000000"/>
@@ -6677,7 +6840,6 @@
           </w:tcPr>
           <w:p>
             <w:pPr>
-              <w:pStyle w:val="Normal"/>
               <w:jc w:val="left"/>
               <w:pBdr>
                 <w:bottom w:val="none" w:sz="0" w:space="0" w:color="000000"/>
@@ -6692,6 +6854,7 @@
                 <w:i w:val="false"/>
                 <w:b w:val="false"/>
                 <w:u w:val="none"/>
+                <w:strike w:val="false"/>
                 <w:sz w:val="22"/>
                 <w:szCs w:val="22"/>
                 <w:color w:val="000000"/>
@@ -6703,6 +6866,7 @@
                 <w:i w:val="false"/>
                 <w:b w:val="false"/>
                 <w:u w:val="none"/>
+                <w:strike w:val="false"/>
                 <w:sz w:val="22"/>
                 <w:szCs w:val="22"/>
                 <w:color w:val="000000"/>
@@ -6736,7 +6900,6 @@
           </w:tcPr>
           <w:p>
             <w:pPr>
-              <w:pStyle w:val="Normal"/>
               <w:jc w:val="left"/>
               <w:pBdr>
                 <w:bottom w:val="none" w:sz="0" w:space="0" w:color="000000"/>
@@ -6751,6 +6914,7 @@
                 <w:i w:val="false"/>
                 <w:b w:val="false"/>
                 <w:u w:val="none"/>
+                <w:strike w:val="false"/>
                 <w:sz w:val="22"/>
                 <w:szCs w:val="22"/>
                 <w:color w:val="000000"/>
@@ -6762,6 +6926,7 @@
                 <w:i w:val="false"/>
                 <w:b w:val="false"/>
                 <w:u w:val="none"/>
+                <w:strike w:val="false"/>
                 <w:sz w:val="22"/>
                 <w:szCs w:val="22"/>
                 <w:color w:val="000000"/>
@@ -6789,7 +6954,6 @@
           </w:tcPr>
           <w:p>
             <w:pPr>
-              <w:pStyle w:val="Normal"/>
               <w:jc w:val="left"/>
               <w:pBdr>
                 <w:bottom w:val="none" w:sz="0" w:space="0" w:color="000000"/>
@@ -6804,6 +6968,7 @@
                 <w:i w:val="false"/>
                 <w:b w:val="false"/>
                 <w:u w:val="none"/>
+                <w:strike w:val="false"/>
                 <w:sz w:val="22"/>
                 <w:szCs w:val="22"/>
                 <w:color w:val="000000"/>
@@ -6815,6 +6980,7 @@
                 <w:i w:val="false"/>
                 <w:b w:val="false"/>
                 <w:u w:val="none"/>
+                <w:strike w:val="false"/>
                 <w:sz w:val="22"/>
                 <w:szCs w:val="22"/>
                 <w:color w:val="000000"/>
@@ -6842,7 +7008,6 @@
           </w:tcPr>
           <w:p>
             <w:pPr>
-              <w:pStyle w:val="Normal"/>
               <w:jc w:val="left"/>
               <w:pBdr>
                 <w:bottom w:val="none" w:sz="0" w:space="0" w:color="000000"/>
@@ -6857,6 +7022,7 @@
                 <w:i w:val="false"/>
                 <w:b w:val="false"/>
                 <w:u w:val="none"/>
+                <w:strike w:val="false"/>
                 <w:sz w:val="22"/>
                 <w:szCs w:val="22"/>
                 <w:color w:val="000000"/>
@@ -6868,6 +7034,7 @@
                 <w:i w:val="false"/>
                 <w:b w:val="false"/>
                 <w:u w:val="none"/>
+                <w:strike w:val="false"/>
                 <w:sz w:val="22"/>
                 <w:szCs w:val="22"/>
                 <w:color w:val="000000"/>
@@ -6901,7 +7068,6 @@
           </w:tcPr>
           <w:p>
             <w:pPr>
-              <w:pStyle w:val="Normal"/>
               <w:jc w:val="left"/>
               <w:pBdr>
                 <w:bottom w:val="none" w:sz="0" w:space="0" w:color="000000"/>
@@ -6916,6 +7082,7 @@
                 <w:i w:val="false"/>
                 <w:b w:val="false"/>
                 <w:u w:val="none"/>
+                <w:strike w:val="false"/>
                 <w:sz w:val="22"/>
                 <w:szCs w:val="22"/>
                 <w:color w:val="000000"/>
@@ -6927,6 +7094,7 @@
                 <w:i w:val="false"/>
                 <w:b w:val="false"/>
                 <w:u w:val="none"/>
+                <w:strike w:val="false"/>
                 <w:sz w:val="22"/>
                 <w:szCs w:val="22"/>
                 <w:color w:val="000000"/>
@@ -6954,7 +7122,6 @@
           </w:tcPr>
           <w:p>
             <w:pPr>
-              <w:pStyle w:val="Normal"/>
               <w:jc w:val="left"/>
               <w:pBdr>
                 <w:bottom w:val="none" w:sz="0" w:space="0" w:color="000000"/>
@@ -6969,6 +7136,7 @@
                 <w:i w:val="false"/>
                 <w:b w:val="false"/>
                 <w:u w:val="none"/>
+                <w:strike w:val="false"/>
                 <w:sz w:val="22"/>
                 <w:szCs w:val="22"/>
                 <w:color w:val="000000"/>
@@ -6980,6 +7148,7 @@
                 <w:i w:val="false"/>
                 <w:b w:val="false"/>
                 <w:u w:val="none"/>
+                <w:strike w:val="false"/>
                 <w:sz w:val="22"/>
                 <w:szCs w:val="22"/>
                 <w:color w:val="000000"/>
@@ -7007,7 +7176,6 @@
           </w:tcPr>
           <w:p>
             <w:pPr>
-              <w:pStyle w:val="Normal"/>
               <w:jc w:val="left"/>
               <w:pBdr>
                 <w:bottom w:val="none" w:sz="0" w:space="0" w:color="000000"/>
@@ -7022,6 +7190,7 @@
                 <w:i w:val="false"/>
                 <w:b w:val="false"/>
                 <w:u w:val="none"/>
+                <w:strike w:val="false"/>
                 <w:sz w:val="22"/>
                 <w:szCs w:val="22"/>
                 <w:color w:val="000000"/>
@@ -7033,6 +7202,7 @@
                 <w:i w:val="false"/>
                 <w:b w:val="false"/>
                 <w:u w:val="none"/>
+                <w:strike w:val="false"/>
                 <w:sz w:val="22"/>
                 <w:szCs w:val="22"/>
                 <w:color w:val="000000"/>
@@ -7066,7 +7236,6 @@
           </w:tcPr>
           <w:p>
             <w:pPr>
-              <w:pStyle w:val="Normal"/>
               <w:jc w:val="left"/>
               <w:pBdr>
                 <w:bottom w:val="none" w:sz="0" w:space="0" w:color="000000"/>
@@ -7081,6 +7250,7 @@
                 <w:i w:val="false"/>
                 <w:b w:val="false"/>
                 <w:u w:val="none"/>
+                <w:strike w:val="false"/>
                 <w:sz w:val="22"/>
                 <w:szCs w:val="22"/>
                 <w:color w:val="000000"/>
@@ -7092,6 +7262,7 @@
                 <w:i w:val="false"/>
                 <w:b w:val="false"/>
                 <w:u w:val="none"/>
+                <w:strike w:val="false"/>
                 <w:sz w:val="22"/>
                 <w:szCs w:val="22"/>
                 <w:color w:val="000000"/>
@@ -7119,7 +7290,6 @@
           </w:tcPr>
           <w:p>
             <w:pPr>
-              <w:pStyle w:val="Normal"/>
               <w:jc w:val="left"/>
               <w:pBdr>
                 <w:bottom w:val="none" w:sz="0" w:space="0" w:color="000000"/>
@@ -7134,6 +7304,7 @@
                 <w:i w:val="false"/>
                 <w:b w:val="false"/>
                 <w:u w:val="none"/>
+                <w:strike w:val="false"/>
                 <w:sz w:val="22"/>
                 <w:szCs w:val="22"/>
                 <w:color w:val="000000"/>
@@ -7145,6 +7316,7 @@
                 <w:i w:val="false"/>
                 <w:b w:val="false"/>
                 <w:u w:val="none"/>
+                <w:strike w:val="false"/>
                 <w:sz w:val="22"/>
                 <w:szCs w:val="22"/>
                 <w:color w:val="000000"/>
@@ -7172,7 +7344,6 @@
           </w:tcPr>
           <w:p>
             <w:pPr>
-              <w:pStyle w:val="Normal"/>
               <w:jc w:val="left"/>
               <w:pBdr>
                 <w:bottom w:val="none" w:sz="0" w:space="0" w:color="000000"/>
@@ -7187,6 +7358,7 @@
                 <w:i w:val="false"/>
                 <w:b w:val="false"/>
                 <w:u w:val="none"/>
+                <w:strike w:val="false"/>
                 <w:sz w:val="22"/>
                 <w:szCs w:val="22"/>
                 <w:color w:val="000000"/>
@@ -7198,6 +7370,7 @@
                 <w:i w:val="false"/>
                 <w:b w:val="false"/>
                 <w:u w:val="none"/>
+                <w:strike w:val="false"/>
                 <w:sz w:val="22"/>
                 <w:szCs w:val="22"/>
                 <w:color w:val="000000"/>
@@ -7231,7 +7404,6 @@
           </w:tcPr>
           <w:p>
             <w:pPr>
-              <w:pStyle w:val="Normal"/>
               <w:jc w:val="left"/>
               <w:pBdr>
                 <w:bottom w:val="none" w:sz="0" w:space="0" w:color="000000"/>
@@ -7246,6 +7418,7 @@
                 <w:i w:val="false"/>
                 <w:b w:val="false"/>
                 <w:u w:val="none"/>
+                <w:strike w:val="false"/>
                 <w:sz w:val="22"/>
                 <w:szCs w:val="22"/>
                 <w:color w:val="000000"/>
@@ -7257,6 +7430,7 @@
                 <w:i w:val="false"/>
                 <w:b w:val="false"/>
                 <w:u w:val="none"/>
+                <w:strike w:val="false"/>
                 <w:sz w:val="22"/>
                 <w:szCs w:val="22"/>
                 <w:color w:val="000000"/>
@@ -7284,7 +7458,6 @@
           </w:tcPr>
           <w:p>
             <w:pPr>
-              <w:pStyle w:val="Normal"/>
               <w:jc w:val="left"/>
               <w:pBdr>
                 <w:bottom w:val="none" w:sz="0" w:space="0" w:color="000000"/>
@@ -7299,6 +7472,7 @@
                 <w:i w:val="false"/>
                 <w:b w:val="false"/>
                 <w:u w:val="none"/>
+                <w:strike w:val="false"/>
                 <w:sz w:val="22"/>
                 <w:szCs w:val="22"/>
                 <w:color w:val="000000"/>
@@ -7310,6 +7484,7 @@
                 <w:i w:val="false"/>
                 <w:b w:val="false"/>
                 <w:u w:val="none"/>
+                <w:strike w:val="false"/>
                 <w:sz w:val="22"/>
                 <w:szCs w:val="22"/>
                 <w:color w:val="000000"/>
@@ -7337,7 +7512,6 @@
           </w:tcPr>
           <w:p>
             <w:pPr>
-              <w:pStyle w:val="Normal"/>
               <w:jc w:val="left"/>
               <w:pBdr>
                 <w:bottom w:val="none" w:sz="0" w:space="0" w:color="000000"/>
@@ -7352,6 +7526,7 @@
                 <w:i w:val="false"/>
                 <w:b w:val="false"/>
                 <w:u w:val="none"/>
+                <w:strike w:val="false"/>
                 <w:sz w:val="22"/>
                 <w:szCs w:val="22"/>
                 <w:color w:val="000000"/>
@@ -7363,6 +7538,7 @@
                 <w:i w:val="false"/>
                 <w:b w:val="false"/>
                 <w:u w:val="none"/>
+                <w:strike w:val="false"/>
                 <w:sz w:val="22"/>
                 <w:szCs w:val="22"/>
                 <w:color w:val="000000"/>
@@ -7396,7 +7572,6 @@
           </w:tcPr>
           <w:p>
             <w:pPr>
-              <w:pStyle w:val="Normal"/>
               <w:jc w:val="left"/>
               <w:pBdr>
                 <w:bottom w:val="none" w:sz="0" w:space="0" w:color="000000"/>
@@ -7411,6 +7586,7 @@
                 <w:i w:val="false"/>
                 <w:b w:val="false"/>
                 <w:u w:val="none"/>
+                <w:strike w:val="false"/>
                 <w:sz w:val="22"/>
                 <w:szCs w:val="22"/>
                 <w:color w:val="000000"/>
@@ -7422,6 +7598,7 @@
                 <w:i w:val="false"/>
                 <w:b w:val="false"/>
                 <w:u w:val="none"/>
+                <w:strike w:val="false"/>
                 <w:sz w:val="22"/>
                 <w:szCs w:val="22"/>
                 <w:color w:val="000000"/>
@@ -7449,7 +7626,6 @@
           </w:tcPr>
           <w:p>
             <w:pPr>
-              <w:pStyle w:val="Normal"/>
               <w:jc w:val="left"/>
               <w:pBdr>
                 <w:bottom w:val="none" w:sz="0" w:space="0" w:color="000000"/>
@@ -7464,6 +7640,7 @@
                 <w:i w:val="false"/>
                 <w:b w:val="false"/>
                 <w:u w:val="none"/>
+                <w:strike w:val="false"/>
                 <w:sz w:val="22"/>
                 <w:szCs w:val="22"/>
                 <w:color w:val="000000"/>
@@ -7475,6 +7652,7 @@
                 <w:i w:val="false"/>
                 <w:b w:val="false"/>
                 <w:u w:val="none"/>
+                <w:strike w:val="false"/>
                 <w:sz w:val="22"/>
                 <w:szCs w:val="22"/>
                 <w:color w:val="000000"/>
@@ -7502,7 +7680,6 @@
           </w:tcPr>
           <w:p>
             <w:pPr>
-              <w:pStyle w:val="Normal"/>
               <w:jc w:val="left"/>
               <w:pBdr>
                 <w:bottom w:val="none" w:sz="0" w:space="0" w:color="000000"/>
@@ -7517,6 +7694,7 @@
                 <w:i w:val="false"/>
                 <w:b w:val="false"/>
                 <w:u w:val="none"/>
+                <w:strike w:val="false"/>
                 <w:sz w:val="22"/>
                 <w:szCs w:val="22"/>
                 <w:color w:val="000000"/>
@@ -7528,6 +7706,7 @@
                 <w:i w:val="false"/>
                 <w:b w:val="false"/>
                 <w:u w:val="none"/>
+                <w:strike w:val="false"/>
                 <w:sz w:val="22"/>
                 <w:szCs w:val="22"/>
                 <w:color w:val="000000"/>
@@ -7561,7 +7740,6 @@
           </w:tcPr>
           <w:p>
             <w:pPr>
-              <w:pStyle w:val="Normal"/>
               <w:jc w:val="left"/>
               <w:pBdr>
                 <w:bottom w:val="none" w:sz="0" w:space="0" w:color="000000"/>
@@ -7576,6 +7754,7 @@
                 <w:i w:val="false"/>
                 <w:b w:val="false"/>
                 <w:u w:val="none"/>
+                <w:strike w:val="false"/>
                 <w:sz w:val="22"/>
                 <w:szCs w:val="22"/>
                 <w:color w:val="000000"/>
@@ -7587,6 +7766,7 @@
                 <w:i w:val="false"/>
                 <w:b w:val="false"/>
                 <w:u w:val="none"/>
+                <w:strike w:val="false"/>
                 <w:sz w:val="22"/>
                 <w:szCs w:val="22"/>
                 <w:color w:val="000000"/>
@@ -7614,7 +7794,6 @@
           </w:tcPr>
           <w:p>
             <w:pPr>
-              <w:pStyle w:val="Normal"/>
               <w:jc w:val="left"/>
               <w:pBdr>
                 <w:bottom w:val="none" w:sz="0" w:space="0" w:color="000000"/>
@@ -7629,6 +7808,7 @@
                 <w:i w:val="false"/>
                 <w:b w:val="false"/>
                 <w:u w:val="none"/>
+                <w:strike w:val="false"/>
                 <w:sz w:val="22"/>
                 <w:szCs w:val="22"/>
                 <w:color w:val="000000"/>
@@ -7640,6 +7820,7 @@
                 <w:i w:val="false"/>
                 <w:b w:val="false"/>
                 <w:u w:val="none"/>
+                <w:strike w:val="false"/>
                 <w:sz w:val="22"/>
                 <w:szCs w:val="22"/>
                 <w:color w:val="000000"/>
@@ -7667,7 +7848,6 @@
           </w:tcPr>
           <w:p>
             <w:pPr>
-              <w:pStyle w:val="Normal"/>
               <w:jc w:val="left"/>
               <w:pBdr>
                 <w:bottom w:val="none" w:sz="0" w:space="0" w:color="000000"/>
@@ -7682,6 +7862,7 @@
                 <w:i w:val="false"/>
                 <w:b w:val="false"/>
                 <w:u w:val="none"/>
+                <w:strike w:val="false"/>
                 <w:sz w:val="22"/>
                 <w:szCs w:val="22"/>
                 <w:color w:val="000000"/>
@@ -7693,6 +7874,7 @@
                 <w:i w:val="false"/>
                 <w:b w:val="false"/>
                 <w:u w:val="none"/>
+                <w:strike w:val="false"/>
                 <w:sz w:val="22"/>
                 <w:szCs w:val="22"/>
                 <w:color w:val="000000"/>
@@ -7726,7 +7908,6 @@
           </w:tcPr>
           <w:p>
             <w:pPr>
-              <w:pStyle w:val="Normal"/>
               <w:jc w:val="left"/>
               <w:pBdr>
                 <w:bottom w:val="none" w:sz="0" w:space="0" w:color="000000"/>
@@ -7741,6 +7922,7 @@
                 <w:i w:val="false"/>
                 <w:b w:val="false"/>
                 <w:u w:val="none"/>
+                <w:strike w:val="false"/>
                 <w:sz w:val="22"/>
                 <w:szCs w:val="22"/>
                 <w:color w:val="000000"/>
@@ -7752,6 +7934,7 @@
                 <w:i w:val="false"/>
                 <w:b w:val="false"/>
                 <w:u w:val="none"/>
+                <w:strike w:val="false"/>
                 <w:sz w:val="22"/>
                 <w:szCs w:val="22"/>
                 <w:color w:val="000000"/>
@@ -7779,7 +7962,6 @@
           </w:tcPr>
           <w:p>
             <w:pPr>
-              <w:pStyle w:val="Normal"/>
               <w:jc w:val="left"/>
               <w:pBdr>
                 <w:bottom w:val="none" w:sz="0" w:space="0" w:color="000000"/>
@@ -7794,6 +7976,7 @@
                 <w:i w:val="false"/>
                 <w:b w:val="false"/>
                 <w:u w:val="none"/>
+                <w:strike w:val="false"/>
                 <w:sz w:val="22"/>
                 <w:szCs w:val="22"/>
                 <w:color w:val="000000"/>
@@ -7805,6 +7988,7 @@
                 <w:i w:val="false"/>
                 <w:b w:val="false"/>
                 <w:u w:val="none"/>
+                <w:strike w:val="false"/>
                 <w:sz w:val="22"/>
                 <w:szCs w:val="22"/>
                 <w:color w:val="000000"/>
@@ -7832,7 +8016,6 @@
           </w:tcPr>
           <w:p>
             <w:pPr>
-              <w:pStyle w:val="Normal"/>
               <w:jc w:val="left"/>
               <w:pBdr>
                 <w:bottom w:val="none" w:sz="0" w:space="0" w:color="000000"/>
@@ -7847,6 +8030,7 @@
                 <w:i w:val="false"/>
                 <w:b w:val="false"/>
                 <w:u w:val="none"/>
+                <w:strike w:val="false"/>
                 <w:sz w:val="22"/>
                 <w:szCs w:val="22"/>
                 <w:color w:val="000000"/>
@@ -7858,6 +8042,7 @@
                 <w:i w:val="false"/>
                 <w:b w:val="false"/>
                 <w:u w:val="none"/>
+                <w:strike w:val="false"/>
                 <w:sz w:val="22"/>
                 <w:szCs w:val="22"/>
                 <w:color w:val="000000"/>
@@ -7868,13 +8053,13 @@
         </w:tc>
       </w:tr>
     </w:tbl>
-    <w:bookmarkEnd w:id="45"/>
+    <w:bookmarkEnd w:id="46"/>
     <w:p>
       <w:r>
         <w:br w:type="page"/>
       </w:r>
     </w:p>
-    <w:bookmarkStart w:id="46" w:name="tbl-corrs"/>
+    <w:bookmarkStart w:id="47" w:name="tbl-corrs"/>
     <w:p>
       <w:pPr>
         <w:pStyle w:val="FigureTitle"/>
@@ -8039,9 +8224,6 @@
                 <m:t>M</m:t>
               </m:r>
             </m:oMath>
-            <w:r>
-              <w:t xml:space="preserve">​</w:t>
-            </w:r>
           </w:p>
         </w:tc>
         <w:tc>
@@ -8059,9 +8241,6 @@
                 <m:t>D</m:t>
               </m:r>
             </m:oMath>
-            <w:r>
-              <w:t xml:space="preserve">​</w:t>
-            </w:r>
           </w:p>
         </w:tc>
       </w:tr>
@@ -9151,13 +9330,13 @@
         </w:tc>
       </w:tr>
     </w:tbl>
-    <w:bookmarkEnd w:id="46"/>
+    <w:bookmarkEnd w:id="47"/>
     <w:p>
       <w:r>
         <w:br w:type="page"/>
       </w:r>
     </w:p>
-    <w:bookmarkStart w:id="50" w:name="fig-net-gpt"/>
+    <w:bookmarkStart w:id="51" w:name="fig-net-gpt"/>
     <w:p>
       <w:pPr>
         <w:pStyle w:val="FigureTitle"/>
@@ -9183,18 +9362,18 @@
           <wp:inline>
             <wp:extent cx="5943600" cy="5943600"/>
             <wp:effectExtent b="0" l="0" r="0" t="0"/>
-            <wp:docPr descr="" title="" id="48" name="Picture"/>
+            <wp:docPr descr="" title="" id="49" name="Picture"/>
             <a:graphic>
               <a:graphicData uri="http://schemas.openxmlformats.org/drawingml/2006/picture">
                 <pic:pic>
                   <pic:nvPicPr>
-                    <pic:cNvPr descr="AI_JCM_files/figure-docx/fig-net-gpt-1.png" id="49" name="Picture"/>
+                    <pic:cNvPr descr="AI_JCM_files/figure-docx/fig-net-gpt-1.png" id="50" name="Picture"/>
                     <pic:cNvPicPr>
                       <a:picLocks noChangeArrowheads="1" noChangeAspect="1"/>
                     </pic:cNvPicPr>
                   </pic:nvPicPr>
                   <pic:blipFill>
-                    <a:blip r:embed="rId47"/>
+                    <a:blip r:embed="rId48"/>
                     <a:stretch>
                       <a:fillRect/>
                     </a:stretch>
@@ -9221,13 +9400,13 @@
         </w:drawing>
       </w:r>
     </w:p>
-    <w:bookmarkEnd w:id="50"/>
+    <w:bookmarkEnd w:id="51"/>
     <w:p>
       <w:r>
         <w:br w:type="page"/>
       </w:r>
     </w:p>
-    <w:bookmarkStart w:id="54" w:name="fig-net-sme"/>
+    <w:bookmarkStart w:id="55" w:name="fig-net-sme"/>
     <w:p>
       <w:pPr>
         <w:pStyle w:val="FigureTitle"/>
@@ -9253,18 +9432,18 @@
           <wp:inline>
             <wp:extent cx="5943600" cy="5943600"/>
             <wp:effectExtent b="0" l="0" r="0" t="0"/>
-            <wp:docPr descr="" title="" id="52" name="Picture"/>
+            <wp:docPr descr="" title="" id="53" name="Picture"/>
             <a:graphic>
               <a:graphicData uri="http://schemas.openxmlformats.org/drawingml/2006/picture">
                 <pic:pic>
                   <pic:nvPicPr>
-                    <pic:cNvPr descr="AI_JCM_files/figure-docx/fig-net-sme-1.png" id="53" name="Picture"/>
+                    <pic:cNvPr descr="AI_JCM_files/figure-docx/fig-net-sme-1.png" id="54" name="Picture"/>
                     <pic:cNvPicPr>
                       <a:picLocks noChangeArrowheads="1" noChangeAspect="1"/>
                     </pic:cNvPicPr>
                   </pic:nvPicPr>
                   <pic:blipFill>
-                    <a:blip r:embed="rId51"/>
+                    <a:blip r:embed="rId52"/>
                     <a:stretch>
                       <a:fillRect/>
                     </a:stretch>
@@ -9291,13 +9470,13 @@
         </w:drawing>
       </w:r>
     </w:p>
-    <w:bookmarkEnd w:id="54"/>
+    <w:bookmarkEnd w:id="55"/>
     <w:p>
       <w:r>
         <w:br w:type="page"/>
       </w:r>
     </w:p>
-    <w:bookmarkStart w:id="58" w:name="fig-net-genie"/>
+    <w:bookmarkStart w:id="59" w:name="fig-net-genie"/>
     <w:p>
       <w:pPr>
         <w:pStyle w:val="FigureTitle"/>
@@ -9323,18 +9502,18 @@
           <wp:inline>
             <wp:extent cx="5943600" cy="5943600"/>
             <wp:effectExtent b="0" l="0" r="0" t="0"/>
-            <wp:docPr descr="" title="" id="56" name="Picture"/>
+            <wp:docPr descr="" title="" id="57" name="Picture"/>
             <a:graphic>
               <a:graphicData uri="http://schemas.openxmlformats.org/drawingml/2006/picture">
                 <pic:pic>
                   <pic:nvPicPr>
-                    <pic:cNvPr descr="AI_JCM_files/figure-docx/fig-net-genie-1.png" id="57" name="Picture"/>
+                    <pic:cNvPr descr="AI_JCM_files/figure-docx/fig-net-genie-1.png" id="58" name="Picture"/>
                     <pic:cNvPicPr>
                       <a:picLocks noChangeArrowheads="1" noChangeAspect="1"/>
                     </pic:cNvPicPr>
                   </pic:nvPicPr>
                   <pic:blipFill>
-                    <a:blip r:embed="rId55"/>
+                    <a:blip r:embed="rId56"/>
                     <a:stretch>
                       <a:fillRect/>
                     </a:stretch>
@@ -9361,13 +9540,13 @@
         </w:drawing>
       </w:r>
     </w:p>
-    <w:bookmarkEnd w:id="58"/>
+    <w:bookmarkEnd w:id="59"/>
     <w:p>
       <w:r>
         <w:br w:type="page"/>
       </w:r>
     </w:p>
-    <w:bookmarkStart w:id="62" w:name="fig-ega-gpt"/>
+    <w:bookmarkStart w:id="63" w:name="fig-ega-gpt"/>
     <w:p>
       <w:pPr>
         <w:pStyle w:val="FigureTitle"/>
@@ -9393,18 +9572,18 @@
           <wp:inline>
             <wp:extent cx="5943600" cy="5943600"/>
             <wp:effectExtent b="0" l="0" r="0" t="0"/>
-            <wp:docPr descr="" title="" id="60" name="Picture"/>
+            <wp:docPr descr="" title="" id="61" name="Picture"/>
             <a:graphic>
               <a:graphicData uri="http://schemas.openxmlformats.org/drawingml/2006/picture">
                 <pic:pic>
                   <pic:nvPicPr>
-                    <pic:cNvPr descr="AI_JCM_files/figure-docx/fig-ega-gpt-1.png" id="61" name="Picture"/>
+                    <pic:cNvPr descr="AI_JCM_files/figure-docx/fig-ega-gpt-1.png" id="62" name="Picture"/>
                     <pic:cNvPicPr>
                       <a:picLocks noChangeArrowheads="1" noChangeAspect="1"/>
                     </pic:cNvPicPr>
                   </pic:nvPicPr>
                   <pic:blipFill>
-                    <a:blip r:embed="rId59"/>
+                    <a:blip r:embed="rId60"/>
                     <a:stretch>
                       <a:fillRect/>
                     </a:stretch>
@@ -9431,13 +9610,13 @@
         </w:drawing>
       </w:r>
     </w:p>
-    <w:bookmarkEnd w:id="62"/>
+    <w:bookmarkEnd w:id="63"/>
     <w:p>
       <w:r>
         <w:br w:type="page"/>
       </w:r>
     </w:p>
-    <w:bookmarkStart w:id="66" w:name="fig-ega-sme"/>
+    <w:bookmarkStart w:id="67" w:name="fig-ega-sme"/>
     <w:p>
       <w:pPr>
         <w:pStyle w:val="FigureTitle"/>
@@ -9463,18 +9642,18 @@
           <wp:inline>
             <wp:extent cx="5943600" cy="5943600"/>
             <wp:effectExtent b="0" l="0" r="0" t="0"/>
-            <wp:docPr descr="" title="" id="64" name="Picture"/>
+            <wp:docPr descr="" title="" id="65" name="Picture"/>
             <a:graphic>
               <a:graphicData uri="http://schemas.openxmlformats.org/drawingml/2006/picture">
                 <pic:pic>
                   <pic:nvPicPr>
-                    <pic:cNvPr descr="AI_JCM_files/figure-docx/fig-ega-sme-1.png" id="65" name="Picture"/>
+                    <pic:cNvPr descr="AI_JCM_files/figure-docx/fig-ega-sme-1.png" id="66" name="Picture"/>
                     <pic:cNvPicPr>
                       <a:picLocks noChangeArrowheads="1" noChangeAspect="1"/>
                     </pic:cNvPicPr>
                   </pic:nvPicPr>
                   <pic:blipFill>
-                    <a:blip r:embed="rId63"/>
+                    <a:blip r:embed="rId64"/>
                     <a:stretch>
                       <a:fillRect/>
                     </a:stretch>
@@ -9501,13 +9680,13 @@
         </w:drawing>
       </w:r>
     </w:p>
-    <w:bookmarkEnd w:id="66"/>
+    <w:bookmarkEnd w:id="67"/>
     <w:p>
       <w:r>
         <w:br w:type="page"/>
       </w:r>
     </w:p>
-    <w:bookmarkStart w:id="70" w:name="fig-ega-genie"/>
+    <w:bookmarkStart w:id="71" w:name="fig-ega-genie"/>
     <w:p>
       <w:pPr>
         <w:pStyle w:val="FigureTitle"/>
@@ -9533,18 +9712,18 @@
           <wp:inline>
             <wp:extent cx="5943600" cy="5943600"/>
             <wp:effectExtent b="0" l="0" r="0" t="0"/>
-            <wp:docPr descr="" title="" id="68" name="Picture"/>
+            <wp:docPr descr="" title="" id="69" name="Picture"/>
             <a:graphic>
               <a:graphicData uri="http://schemas.openxmlformats.org/drawingml/2006/picture">
                 <pic:pic>
                   <pic:nvPicPr>
-                    <pic:cNvPr descr="AI_JCM_files/figure-docx/fig-ega-genie-1.png" id="69" name="Picture"/>
+                    <pic:cNvPr descr="AI_JCM_files/figure-docx/fig-ega-genie-1.png" id="70" name="Picture"/>
                     <pic:cNvPicPr>
                       <a:picLocks noChangeArrowheads="1" noChangeAspect="1"/>
                     </pic:cNvPicPr>
                   </pic:nvPicPr>
                   <pic:blipFill>
-                    <a:blip r:embed="rId67"/>
+                    <a:blip r:embed="rId68"/>
                     <a:stretch>
                       <a:fillRect/>
                     </a:stretch>
@@ -9571,20 +9750,20 @@
         </w:drawing>
       </w:r>
     </w:p>
-    <w:bookmarkEnd w:id="70"/>
+    <w:bookmarkEnd w:id="71"/>
     <w:p>
       <w:r>
         <w:br w:type="page"/>
       </w:r>
     </w:p>
-    <w:bookmarkEnd w:id="71"/>
+    <w:bookmarkEnd w:id="72"/>
     <w:sectPr>
-      <w:headerReference r:id="rId8" w:type="even"/>
-      <w:headerReference r:id="rId9" w:type="default"/>
-      <w:footerReference r:id="rId10" w:type="even"/>
-      <w:footerReference r:id="rId11" w:type="default"/>
-      <w:headerReference r:id="rId12" w:type="first"/>
-      <w:footerReference r:id="rId13" w:type="first"/>
+      <w:headerReference r:id="rId9" w:type="even"/>
+      <w:headerReference r:id="rId11" w:type="default"/>
+      <w:footerReference r:id="rId14" w:type="even"/>
+      <w:footerReference r:id="rId13" w:type="default"/>
+      <w:headerReference r:id="rId10" w:type="first"/>
+      <w:footerReference r:id="rId12" w:type="first"/>
       <w:pgSz w:h="15840" w:w="12240"/>
       <w:pgMar w:bottom="1440" w:footer="720" w:gutter="0" w:header="720" w:left="1440" w:right="1440" w:top="1440"/>
       <w:cols w:space="720"/>
@@ -9643,7 +9822,7 @@
       </w:r>
     </w:p>
   </w:footnote>
-  <w:footnote w:id="29">
+  <w:footnote w:id="30">
     <w:p>
       <w:pPr>
         <w:pStyle w:val="FootnoteText"/>

</xml_diff>

<commit_message>
adding a discussion section draft
</commit_message>
<xml_diff>
--- a/AI_JCM.docx
+++ b/AI_JCM.docx
@@ -38,7 +38,7 @@
         <w:pStyle w:val="BodyText"/>
       </w:pPr>
       <w:r>
-        <w:t xml:space="preserve">The present study is an exploratory comparison of three approaches to developing items intended to assess employees’ orientations toward workplace AI. Items for Callari and Puppione (2025)’s qualitatively-derived ideal AI user types were generated through (a) ChatGPT, (b) AI-GENIE, and (c) industrial-organizational psychology subject-matter experts.</w:t>
+        <w:t xml:space="preserve">The present study is an exploratory comparison of three approaches to developing items intended to assess employees’ orientations toward workplace AI. Items for Callari and Puppione (2025)’s qualitatively-derived ideal AI user types were generated through (a) ChatGPT, (b) AI-GENIE, and (c) industrial-organizational psychology subject-matter experts. Traditional (e.g., EFAs) and semantic (e.g., exploratory graph analyses) results suggest noteworthy differences in the factor structure and communities across the three item-generation procedures.</w:t>
       </w:r>
     </w:p>
     <w:p>
@@ -127,7 +127,7 @@
         <w:t xml:space="preserve"> </w:t>
       </w:r>
       <w:r>
-        <w:t xml:space="preserve">As such, as AI’s role in the design and performance of work grows it is important to understand how employees engage with the technology. The present makes two key contributions to our understanding of AI in the workplace: Our first aim is to create a meausure of type of AI adopter. Second, we accomplish to goal of scale creation via a novel comparison of three approaches to developing items, comparing traditionally-derived subject matter expert ratings, with LLM-derivded procedures including prompting via ChatGPT and through a dedicated R package (AI-GENIE).</w:t>
+        <w:t xml:space="preserve">As such, as AI’s role in the design and performance of work grows it is important to understand how employees engage with the technology. The present makes two key contributions to our understanding of AI in the workplace: Our first aim is to create a measure of type of AI adopter. Second, we accomplish to goal of scale creation via a novel comparison of three approaches to developing items, comparing traditionally-derived subject matter expert ratings, with LLM-derived procedures including prompting via ChatGPT and through a dedicated R package (AI-GENIE).</w:t>
       </w:r>
     </w:p>
     <w:bookmarkStart w:id="20" w:name="conceptualizing-ai-use-in-the-workplace"/>
@@ -913,7 +913,27 @@
         <w:pStyle w:val="FirstParagraph"/>
       </w:pPr>
       <w:r>
-        <w:t xml:space="preserve">After consent, students were asked to think of the context where they use AI the most frequently (for example, as a student or as an employee) and to keep that role in mind for the entire survey. Respondents were shown items within generative grouping, followed by a few demographic questions. They responded to all AI–Adopter items on a 5-point Likert-type scale ranging from 1 (strongly agree) to 5 (strongly disagree). Following the survey, respondents were debriefed and offered course credit for their time.</w:t>
+        <w:t xml:space="preserve">After consent, students were asked to think of the context where they use AI the most frequently (for example, as a student or as an employee) and to keep that role in mind for the entire survey. Respondents were shown items within generative grouping, followed by a few demographic questions. They responded to all AI–Adopter items on a 5-point Likert-type scale ranging from 1 (</w:t>
+      </w:r>
+      <w:r>
+        <w:rPr>
+          <w:i/>
+          <w:iCs/>
+        </w:rPr>
+        <w:t xml:space="preserve">strongly agree</w:t>
+      </w:r>
+      <w:r>
+        <w:t xml:space="preserve">) to 5 (</w:t>
+      </w:r>
+      <w:r>
+        <w:rPr>
+          <w:i/>
+          <w:iCs/>
+        </w:rPr>
+        <w:t xml:space="preserve">strongly disagree</w:t>
+      </w:r>
+      <w:r>
+        <w:t xml:space="preserve">). Following the survey, respondents were debriefed and offered course credit for their time.</w:t>
       </w:r>
     </w:p>
     <w:bookmarkEnd w:id="28"/>
@@ -1402,15 +1422,7 @@
         <w:pStyle w:val="BodyText"/>
       </w:pPr>
       <w:r>
-        <w:t xml:space="preserve">Parallel analysis suggested different levels of dimensionality across the item sets, with a one-factor solution for the AI Genie and SME item sets and a two-factor solution for the ChatGPT item set. Because the item pools were constructed to represent three conceptual domains, the three-factor solutions are discussed here to evaluate the pattern of item loadings and correspondence between the intended and emergent factor structures.</w:t>
-      </w:r>
-    </w:p>
-    <w:p>
-      <w:pPr>
-        <w:pStyle w:val="BodyText"/>
-      </w:pPr>
-      <w:r>
-        <w:t xml:space="preserve">The three-factor solution for the AI Genie-generated items demonstrated substantially better fit compared to the one- and two-factor models, χ²(150) = 207.64, p = .001, RMSEA = .064, 90% CI [.041, .084], CFI = .960, TLI = .944, and SRMR = .036. Item loading patterns provided partial evidence of a three-factor structure, albeit with several non–hypothesized associations and substantive cross–loadings (see</w:t>
+        <w:t xml:space="preserve">The three-factor solution for the AI-GENIE-generated items demonstrated substantially better fit compared to the one- and two-factor models, χ²(150) = 207.64, p = .001, RMSEA = .064, 90% CI [.041, .084], CFI = .960, TLI = .944, and SRMR = .036. Item loading patterns provided partial evidence of a three-factor structure, albeit with several non–hypothesized associations and substantive cross–loadings (see</w:t>
       </w:r>
       <w:r>
         <w:t xml:space="preserve"> </w:t>
@@ -1577,70 +1589,13 @@
     </w:p>
     <w:bookmarkEnd w:id="32"/>
     <w:bookmarkEnd w:id="33"/>
-    <w:bookmarkStart w:id="35" w:name="discussion"/>
+    <w:bookmarkStart w:id="37" w:name="discussion"/>
     <w:p>
       <w:pPr>
         <w:pStyle w:val="Heading1"/>
       </w:pPr>
       <w:r>
         <w:t xml:space="preserve">Discussion</w:t>
-      </w:r>
-    </w:p>
-    <w:p>
-      <w:pPr>
-        <w:pStyle w:val="Compact"/>
-        <w:numPr>
-          <w:ilvl w:val="0"/>
-          <w:numId w:val="1001"/>
-        </w:numPr>
-      </w:pPr>
-      <w:r>
-        <w:t xml:space="preserve">methodological contribution – EGAs plus EFAs, empirical vs semantic</w:t>
-      </w:r>
-    </w:p>
-    <w:p>
-      <w:pPr>
-        <w:pStyle w:val="Compact"/>
-        <w:numPr>
-          <w:ilvl w:val="0"/>
-          <w:numId w:val="1002"/>
-        </w:numPr>
-      </w:pPr>
-      <w:r>
-        <w:t xml:space="preserve">cross–loading clearing up</w:t>
-      </w:r>
-    </w:p>
-    <w:p>
-      <w:pPr>
-        <w:pStyle w:val="Compact"/>
-        <w:numPr>
-          <w:ilvl w:val="0"/>
-          <w:numId w:val="1003"/>
-        </w:numPr>
-      </w:pPr>
-      <w:r>
-        <w:t xml:space="preserve">theoretical contribution (AI adopter type)</w:t>
-      </w:r>
-    </w:p>
-    <w:p>
-      <w:pPr>
-        <w:pStyle w:val="Compact"/>
-        <w:numPr>
-          <w:ilvl w:val="0"/>
-          <w:numId w:val="1004"/>
-        </w:numPr>
-      </w:pPr>
-      <w:r>
-        <w:t xml:space="preserve">distinct types vs different gradients of expertise (degree of AI collaboration)</w:t>
-      </w:r>
-    </w:p>
-    <w:bookmarkStart w:id="34" w:name="limitations"/>
-    <w:p>
-      <w:pPr>
-        <w:pStyle w:val="Heading2"/>
-      </w:pPr>
-      <w:r>
-        <w:t xml:space="preserve">Limitations</w:t>
       </w:r>
     </w:p>
     <w:p>
@@ -1648,12 +1603,88 @@
         <w:pStyle w:val="FirstParagraph"/>
       </w:pPr>
       <w:r>
-        <w:t xml:space="preserve">Sample size as well as well as sample characteristics (degree of AI integration within workplace)</w:t>
+        <w:t xml:space="preserve">The purpose of this stuy was twofold: 1) to create a measure of type of AI adopter, 2) to compare three approaches to developing items, comparing traditionally-derived subject matter expert ratings, with LLM-derivded procedures using ChatGPT and AI-GENIE. The primary question of interest was whether the AI-driven item-generation procedures (i.e., ChatGPT or AI-GENIE) as good as, or even superior to, traditionally generated SME items.</w:t>
+      </w:r>
+    </w:p>
+    <w:p>
+      <w:pPr>
+        <w:pStyle w:val="BodyText"/>
+      </w:pPr>
+      <w:r>
+        <w:t xml:space="preserve">First, all three procedures did result in a measure of AI adopter type. The results of the traditional analyses suggest the the SME-generated items demonstrated the best fit, followed by AI-GENIE and then ChatGPT. However, items did not load cleanly as expected within dimensions. The semantic exploratory graph analyses…</w:t>
+      </w:r>
+    </w:p>
+    <w:bookmarkStart w:id="34" w:name="implications"/>
+    <w:p>
+      <w:pPr>
+        <w:pStyle w:val="Heading2"/>
+      </w:pPr>
+      <w:r>
+        <w:t xml:space="preserve">Implications</w:t>
+      </w:r>
+    </w:p>
+    <w:p>
+      <w:pPr>
+        <w:pStyle w:val="FirstParagraph"/>
+      </w:pPr>
+      <w:r>
+        <w:t xml:space="preserve">One of the theoretical contributions we make is to explore the ways AI is being used at present.</w:t>
+      </w:r>
+      <w:r>
+        <w:t xml:space="preserve"> </w:t>
+      </w:r>
+      <w:r>
+        <w:t xml:space="preserve">Callari and Puppione (</w:t>
+      </w:r>
+      <w:hyperlink w:anchor="ref-callari2025meaningful">
+        <w:r>
+          <w:rPr>
+            <w:rStyle w:val="Hyperlink"/>
+          </w:rPr>
+          <w:t xml:space="preserve">2025</w:t>
+        </w:r>
+      </w:hyperlink>
+      <w:r>
+        <w:t xml:space="preserve">)</w:t>
+      </w:r>
+      <w:r>
+        <w:t xml:space="preserve"> </w:t>
+      </w:r>
+      <w:r>
+        <w:t xml:space="preserve">presented three ideal types of AI users that we based our quantitative scale creation on. The somewhat mixed results suggest that there may not be distinct types of AI users, but rather, we can conceptualize AI use on an continuum of expertise, whereby greater levels of expertise are evidenced by a higher degree of AI collaboration.</w:t>
       </w:r>
     </w:p>
     <w:bookmarkEnd w:id="34"/>
+    <w:bookmarkStart w:id="35" w:name="limitations-future-directions"/>
+    <w:p>
+      <w:pPr>
+        <w:pStyle w:val="Heading2"/>
+      </w:pPr>
+      <w:r>
+        <w:t xml:space="preserve">Limitations &amp; Future Directions</w:t>
+      </w:r>
+    </w:p>
+    <w:p>
+      <w:pPr>
+        <w:pStyle w:val="FirstParagraph"/>
+      </w:pPr>
+      <w:r>
+        <w:t xml:space="preserve">We note a number of limitations that future study/comparisons would benefit from. First, for this SIOP submission, we present a modest sample size. An additional study comparing these three procedures with a larger sample size is warranted. In addition, this first pilot sample was obtained from university students were were asked to keep one context in mind as they responded to the survey. The majority of respondents indicated they had school in mind, whereas a smaller percentage had work in mind. Future research should incorporate full time employees across industries, and account for degree of AI integration within their workplaces.</w:t>
+      </w:r>
+    </w:p>
     <w:bookmarkEnd w:id="35"/>
-    <w:bookmarkStart w:id="72" w:name="references"/>
+    <w:bookmarkStart w:id="36" w:name="conclusion"/>
+    <w:p>
+      <w:pPr>
+        <w:pStyle w:val="Heading2"/>
+      </w:pPr>
+      <w:r>
+        <w:t xml:space="preserve">Conclusion</w:t>
+      </w:r>
+    </w:p>
+    <w:bookmarkEnd w:id="36"/>
+    <w:bookmarkEnd w:id="37"/>
+    <w:bookmarkStart w:id="74" w:name="references"/>
     <w:p>
       <w:pPr>
         <w:pStyle w:val="Heading1"/>
@@ -1662,8 +1693,8 @@
         <w:t xml:space="preserve">References</w:t>
       </w:r>
     </w:p>
-    <w:bookmarkStart w:id="44" w:name="refs"/>
-    <w:bookmarkStart w:id="36" w:name="ref-arora2025meaningful"/>
+    <w:bookmarkStart w:id="46" w:name="refs"/>
+    <w:bookmarkStart w:id="38" w:name="ref-arora2025meaningful"/>
     <w:p>
       <w:pPr>
         <w:pStyle w:val="Bibliography"/>
@@ -1698,8 +1729,8 @@
         <w:t xml:space="preserve">(2), 169–193.</w:t>
       </w:r>
     </w:p>
-    <w:bookmarkEnd w:id="36"/>
-    <w:bookmarkStart w:id="37" w:name="ref-callari2025meaningful"/>
+    <w:bookmarkEnd w:id="38"/>
+    <w:bookmarkStart w:id="39" w:name="ref-callari2025meaningful"/>
     <w:p>
       <w:pPr>
         <w:pStyle w:val="Bibliography"/>
@@ -1734,8 +1765,8 @@
         <w:t xml:space="preserve">(10), 5001–5027.</w:t>
       </w:r>
     </w:p>
-    <w:bookmarkEnd w:id="37"/>
-    <w:bookmarkStart w:id="38" w:name="ref-campbell1959convergent"/>
+    <w:bookmarkEnd w:id="39"/>
+    <w:bookmarkStart w:id="40" w:name="ref-campbell1959convergent"/>
     <w:p>
       <w:pPr>
         <w:pStyle w:val="Bibliography"/>
@@ -1770,8 +1801,8 @@
         <w:t xml:space="preserve">(2), 81.</w:t>
       </w:r>
     </w:p>
-    <w:bookmarkEnd w:id="38"/>
-    <w:bookmarkStart w:id="39" w:name="ref-hackman1975development"/>
+    <w:bookmarkEnd w:id="40"/>
+    <w:bookmarkStart w:id="41" w:name="ref-hackman1975development"/>
     <w:p>
       <w:pPr>
         <w:pStyle w:val="Bibliography"/>
@@ -1806,8 +1837,8 @@
         <w:t xml:space="preserve">(2), 159.</w:t>
       </w:r>
     </w:p>
-    <w:bookmarkEnd w:id="39"/>
-    <w:bookmarkStart w:id="40" w:name="ref-hackman1976motivation"/>
+    <w:bookmarkEnd w:id="41"/>
+    <w:bookmarkStart w:id="42" w:name="ref-hackman1976motivation"/>
     <w:p>
       <w:pPr>
         <w:pStyle w:val="Bibliography"/>
@@ -1842,8 +1873,8 @@
         <w:t xml:space="preserve">(2), 250–279.</w:t>
       </w:r>
     </w:p>
-    <w:bookmarkEnd w:id="40"/>
-    <w:bookmarkStart w:id="41" w:name="ref-hu1999cutoff"/>
+    <w:bookmarkEnd w:id="42"/>
+    <w:bookmarkStart w:id="43" w:name="ref-hu1999cutoff"/>
     <w:p>
       <w:pPr>
         <w:pStyle w:val="Bibliography"/>
@@ -1878,8 +1909,8 @@
         <w:t xml:space="preserve">(1), 1–55.</w:t>
       </w:r>
     </w:p>
-    <w:bookmarkEnd w:id="41"/>
-    <w:bookmarkStart w:id="42" w:name="ref-russell2026generative"/>
+    <w:bookmarkEnd w:id="43"/>
+    <w:bookmarkStart w:id="44" w:name="ref-russell2026generative"/>
     <w:p>
       <w:pPr>
         <w:pStyle w:val="Bibliography"/>
@@ -1914,8 +1945,8 @@
         <w:t xml:space="preserve">(8), 217.</w:t>
       </w:r>
     </w:p>
-    <w:bookmarkEnd w:id="42"/>
-    <w:bookmarkStart w:id="43" w:name="ref-zhang2026artificial"/>
+    <w:bookmarkEnd w:id="44"/>
+    <w:bookmarkStart w:id="45" w:name="ref-zhang2026artificial"/>
     <w:p>
       <w:pPr>
         <w:pStyle w:val="Bibliography"/>
@@ -1937,9 +1968,9 @@
         <w:t xml:space="preserve">, 1–18.</w:t>
       </w:r>
     </w:p>
-    <w:bookmarkEnd w:id="43"/>
-    <w:bookmarkEnd w:id="44"/>
-    <w:bookmarkStart w:id="45" w:name="tbl-alphas"/>
+    <w:bookmarkEnd w:id="45"/>
+    <w:bookmarkEnd w:id="46"/>
+    <w:bookmarkStart w:id="47" w:name="tbl-alphas"/>
     <w:p>
       <w:pPr>
         <w:pStyle w:val="FigureTitle"/>
@@ -3649,13 +3680,13 @@
         </w:tc>
       </w:tr>
     </w:tbl>
-    <w:bookmarkEnd w:id="45"/>
+    <w:bookmarkEnd w:id="47"/>
     <w:p>
       <w:r>
         <w:br w:type="page"/>
       </w:r>
     </w:p>
-    <w:bookmarkStart w:id="46" w:name="tbl-majors"/>
+    <w:bookmarkStart w:id="48" w:name="tbl-majors"/>
     <w:p>
       <w:pPr>
         <w:pStyle w:val="FigureTitle"/>
@@ -8053,13 +8084,13 @@
         </w:tc>
       </w:tr>
     </w:tbl>
-    <w:bookmarkEnd w:id="46"/>
+    <w:bookmarkEnd w:id="48"/>
     <w:p>
       <w:r>
         <w:br w:type="page"/>
       </w:r>
     </w:p>
-    <w:bookmarkStart w:id="47" w:name="tbl-corrs"/>
+    <w:bookmarkStart w:id="49" w:name="tbl-corrs"/>
     <w:p>
       <w:pPr>
         <w:pStyle w:val="FigureTitle"/>
@@ -9330,13 +9361,13 @@
         </w:tc>
       </w:tr>
     </w:tbl>
-    <w:bookmarkEnd w:id="47"/>
+    <w:bookmarkEnd w:id="49"/>
     <w:p>
       <w:r>
         <w:br w:type="page"/>
       </w:r>
     </w:p>
-    <w:bookmarkStart w:id="51" w:name="fig-net-gpt"/>
+    <w:bookmarkStart w:id="53" w:name="fig-net-gpt"/>
     <w:p>
       <w:pPr>
         <w:pStyle w:val="FigureTitle"/>
@@ -9362,18 +9393,18 @@
           <wp:inline>
             <wp:extent cx="5943600" cy="5943600"/>
             <wp:effectExtent b="0" l="0" r="0" t="0"/>
-            <wp:docPr descr="" title="" id="49" name="Picture"/>
+            <wp:docPr descr="" title="" id="51" name="Picture"/>
             <a:graphic>
               <a:graphicData uri="http://schemas.openxmlformats.org/drawingml/2006/picture">
                 <pic:pic>
                   <pic:nvPicPr>
-                    <pic:cNvPr descr="AI_JCM_files/figure-docx/fig-net-gpt-1.png" id="50" name="Picture"/>
+                    <pic:cNvPr descr="AI_JCM_files/figure-docx/fig-net-gpt-1.png" id="52" name="Picture"/>
                     <pic:cNvPicPr>
                       <a:picLocks noChangeArrowheads="1" noChangeAspect="1"/>
                     </pic:cNvPicPr>
                   </pic:nvPicPr>
                   <pic:blipFill>
-                    <a:blip r:embed="rId48"/>
+                    <a:blip r:embed="rId50"/>
                     <a:stretch>
                       <a:fillRect/>
                     </a:stretch>
@@ -9400,13 +9431,13 @@
         </w:drawing>
       </w:r>
     </w:p>
-    <w:bookmarkEnd w:id="51"/>
+    <w:bookmarkEnd w:id="53"/>
     <w:p>
       <w:r>
         <w:br w:type="page"/>
       </w:r>
     </w:p>
-    <w:bookmarkStart w:id="55" w:name="fig-net-sme"/>
+    <w:bookmarkStart w:id="57" w:name="fig-net-sme"/>
     <w:p>
       <w:pPr>
         <w:pStyle w:val="FigureTitle"/>
@@ -9432,18 +9463,18 @@
           <wp:inline>
             <wp:extent cx="5943600" cy="5943600"/>
             <wp:effectExtent b="0" l="0" r="0" t="0"/>
-            <wp:docPr descr="" title="" id="53" name="Picture"/>
+            <wp:docPr descr="" title="" id="55" name="Picture"/>
             <a:graphic>
               <a:graphicData uri="http://schemas.openxmlformats.org/drawingml/2006/picture">
                 <pic:pic>
                   <pic:nvPicPr>
-                    <pic:cNvPr descr="AI_JCM_files/figure-docx/fig-net-sme-1.png" id="54" name="Picture"/>
+                    <pic:cNvPr descr="AI_JCM_files/figure-docx/fig-net-sme-1.png" id="56" name="Picture"/>
                     <pic:cNvPicPr>
                       <a:picLocks noChangeArrowheads="1" noChangeAspect="1"/>
                     </pic:cNvPicPr>
                   </pic:nvPicPr>
                   <pic:blipFill>
-                    <a:blip r:embed="rId52"/>
+                    <a:blip r:embed="rId54"/>
                     <a:stretch>
                       <a:fillRect/>
                     </a:stretch>
@@ -9470,13 +9501,13 @@
         </w:drawing>
       </w:r>
     </w:p>
-    <w:bookmarkEnd w:id="55"/>
+    <w:bookmarkEnd w:id="57"/>
     <w:p>
       <w:r>
         <w:br w:type="page"/>
       </w:r>
     </w:p>
-    <w:bookmarkStart w:id="59" w:name="fig-net-genie"/>
+    <w:bookmarkStart w:id="61" w:name="fig-net-genie"/>
     <w:p>
       <w:pPr>
         <w:pStyle w:val="FigureTitle"/>
@@ -9502,18 +9533,18 @@
           <wp:inline>
             <wp:extent cx="5943600" cy="5943600"/>
             <wp:effectExtent b="0" l="0" r="0" t="0"/>
-            <wp:docPr descr="" title="" id="57" name="Picture"/>
+            <wp:docPr descr="" title="" id="59" name="Picture"/>
             <a:graphic>
               <a:graphicData uri="http://schemas.openxmlformats.org/drawingml/2006/picture">
                 <pic:pic>
                   <pic:nvPicPr>
-                    <pic:cNvPr descr="AI_JCM_files/figure-docx/fig-net-genie-1.png" id="58" name="Picture"/>
+                    <pic:cNvPr descr="AI_JCM_files/figure-docx/fig-net-genie-1.png" id="60" name="Picture"/>
                     <pic:cNvPicPr>
                       <a:picLocks noChangeArrowheads="1" noChangeAspect="1"/>
                     </pic:cNvPicPr>
                   </pic:nvPicPr>
                   <pic:blipFill>
-                    <a:blip r:embed="rId56"/>
+                    <a:blip r:embed="rId58"/>
                     <a:stretch>
                       <a:fillRect/>
                     </a:stretch>
@@ -9540,13 +9571,13 @@
         </w:drawing>
       </w:r>
     </w:p>
-    <w:bookmarkEnd w:id="59"/>
+    <w:bookmarkEnd w:id="61"/>
     <w:p>
       <w:r>
         <w:br w:type="page"/>
       </w:r>
     </w:p>
-    <w:bookmarkStart w:id="63" w:name="fig-ega-gpt"/>
+    <w:bookmarkStart w:id="65" w:name="fig-ega-gpt"/>
     <w:p>
       <w:pPr>
         <w:pStyle w:val="FigureTitle"/>
@@ -9572,18 +9603,18 @@
           <wp:inline>
             <wp:extent cx="5943600" cy="5943600"/>
             <wp:effectExtent b="0" l="0" r="0" t="0"/>
-            <wp:docPr descr="" title="" id="61" name="Picture"/>
+            <wp:docPr descr="" title="" id="63" name="Picture"/>
             <a:graphic>
               <a:graphicData uri="http://schemas.openxmlformats.org/drawingml/2006/picture">
                 <pic:pic>
                   <pic:nvPicPr>
-                    <pic:cNvPr descr="AI_JCM_files/figure-docx/fig-ega-gpt-1.png" id="62" name="Picture"/>
+                    <pic:cNvPr descr="AI_JCM_files/figure-docx/fig-ega-gpt-1.png" id="64" name="Picture"/>
                     <pic:cNvPicPr>
                       <a:picLocks noChangeArrowheads="1" noChangeAspect="1"/>
                     </pic:cNvPicPr>
                   </pic:nvPicPr>
                   <pic:blipFill>
-                    <a:blip r:embed="rId60"/>
+                    <a:blip r:embed="rId62"/>
                     <a:stretch>
                       <a:fillRect/>
                     </a:stretch>
@@ -9610,13 +9641,13 @@
         </w:drawing>
       </w:r>
     </w:p>
-    <w:bookmarkEnd w:id="63"/>
+    <w:bookmarkEnd w:id="65"/>
     <w:p>
       <w:r>
         <w:br w:type="page"/>
       </w:r>
     </w:p>
-    <w:bookmarkStart w:id="67" w:name="fig-ega-sme"/>
+    <w:bookmarkStart w:id="69" w:name="fig-ega-sme"/>
     <w:p>
       <w:pPr>
         <w:pStyle w:val="FigureTitle"/>
@@ -9642,18 +9673,18 @@
           <wp:inline>
             <wp:extent cx="5943600" cy="5943600"/>
             <wp:effectExtent b="0" l="0" r="0" t="0"/>
-            <wp:docPr descr="" title="" id="65" name="Picture"/>
+            <wp:docPr descr="" title="" id="67" name="Picture"/>
             <a:graphic>
               <a:graphicData uri="http://schemas.openxmlformats.org/drawingml/2006/picture">
                 <pic:pic>
                   <pic:nvPicPr>
-                    <pic:cNvPr descr="AI_JCM_files/figure-docx/fig-ega-sme-1.png" id="66" name="Picture"/>
+                    <pic:cNvPr descr="AI_JCM_files/figure-docx/fig-ega-sme-1.png" id="68" name="Picture"/>
                     <pic:cNvPicPr>
                       <a:picLocks noChangeArrowheads="1" noChangeAspect="1"/>
                     </pic:cNvPicPr>
                   </pic:nvPicPr>
                   <pic:blipFill>
-                    <a:blip r:embed="rId64"/>
+                    <a:blip r:embed="rId66"/>
                     <a:stretch>
                       <a:fillRect/>
                     </a:stretch>
@@ -9680,13 +9711,13 @@
         </w:drawing>
       </w:r>
     </w:p>
-    <w:bookmarkEnd w:id="67"/>
+    <w:bookmarkEnd w:id="69"/>
     <w:p>
       <w:r>
         <w:br w:type="page"/>
       </w:r>
     </w:p>
-    <w:bookmarkStart w:id="71" w:name="fig-ega-genie"/>
+    <w:bookmarkStart w:id="73" w:name="fig-ega-genie"/>
     <w:p>
       <w:pPr>
         <w:pStyle w:val="FigureTitle"/>
@@ -9712,18 +9743,18 @@
           <wp:inline>
             <wp:extent cx="5943600" cy="5943600"/>
             <wp:effectExtent b="0" l="0" r="0" t="0"/>
-            <wp:docPr descr="" title="" id="69" name="Picture"/>
+            <wp:docPr descr="" title="" id="71" name="Picture"/>
             <a:graphic>
               <a:graphicData uri="http://schemas.openxmlformats.org/drawingml/2006/picture">
                 <pic:pic>
                   <pic:nvPicPr>
-                    <pic:cNvPr descr="AI_JCM_files/figure-docx/fig-ega-genie-1.png" id="70" name="Picture"/>
+                    <pic:cNvPr descr="AI_JCM_files/figure-docx/fig-ega-genie-1.png" id="72" name="Picture"/>
                     <pic:cNvPicPr>
                       <a:picLocks noChangeArrowheads="1" noChangeAspect="1"/>
                     </pic:cNvPicPr>
                   </pic:nvPicPr>
                   <pic:blipFill>
-                    <a:blip r:embed="rId68"/>
+                    <a:blip r:embed="rId70"/>
                     <a:stretch>
                       <a:fillRect/>
                     </a:stretch>
@@ -9750,13 +9781,13 @@
         </w:drawing>
       </w:r>
     </w:p>
-    <w:bookmarkEnd w:id="71"/>
+    <w:bookmarkEnd w:id="73"/>
     <w:p>
       <w:r>
         <w:br w:type="page"/>
       </w:r>
     </w:p>
-    <w:bookmarkEnd w:id="72"/>
+    <w:bookmarkEnd w:id="74"/>
     <w:sectPr>
       <w:headerReference r:id="rId9" w:type="even"/>
       <w:headerReference r:id="rId11" w:type="default"/>
@@ -9837,7 +9868,7 @@
         <w:t xml:space="preserve"> </w:t>
       </w:r>
       <w:r>
-        <w:t xml:space="preserve">Each figure shows the results of an exploratory factor analysis as a network. The large grey nodes are the extracted factors. The smaller coloured nodes are the survey items, and their colour shows which subscale the item was written for: Efficiency Seeking, Pragmatic Integrator or Collaborative Optimiser. A line between an item and a factor means the item loads on that factor at |.30| or higher. Thicker, darker lines mean stronger loadings, and red lines mean negative loadings. If the items worked as intended, each factor would be surrounded by a cluster of items of a single colour, and each item would connect to only one factor. Factors that collect items of mixed colours, or items that connect to several factors (cross-loadings), suggest the intended three-type structure is not holding up.</w:t>
+        <w:t xml:space="preserve">Each figure shows the results of an exploratory factor analysis as a network. The large grey nodes are the extracted factors. The smaller colored nodes are the survey items, and their colour shows which subscale the item was written for: Efficiency Seeking, Pragmatic Integrator or Collaborative Optimiser. A line between an item and a factor means the item loads on that factor at |.30| or higher. Thicker, darker lines mean stronger loadings, and red lines mean negative loadings. If the items worked as intended, each factor would be surrounded by a cluster of items of a single colour, and each item would connect to only one factor. Factors that collect items of mixed colours, or items that connect to several factors (cross-loadings), suggest the intended three-type structure is not holding up.</w:t>
       </w:r>
     </w:p>
   </w:footnote>
@@ -10279,279 +10310,6 @@
       </w:pPr>
     </w:lvl>
   </w:abstractNum>
-  <w:abstractNum w:abstractNumId="99411">
-    <w:nsid w:val="00A99411"/>
-    <w:multiLevelType w:val="multilevel"/>
-    <w:lvl w:ilvl="0">
-      <w:start w:val="1"/>
-      <w:numFmt w:val="decimal"/>
-      <w:lvlText w:val="%1."/>
-      <w:lvlJc w:val="left"/>
-      <w:pPr>
-        <w:ind w:left="720" w:hanging="360"/>
-      </w:pPr>
-    </w:lvl>
-    <w:lvl w:ilvl="1">
-      <w:start w:val="1"/>
-      <w:numFmt w:val="decimal"/>
-      <w:lvlText w:val="%2."/>
-      <w:lvlJc w:val="left"/>
-      <w:pPr>
-        <w:ind w:left="1440" w:hanging="360"/>
-      </w:pPr>
-    </w:lvl>
-    <w:lvl w:ilvl="2">
-      <w:start w:val="1"/>
-      <w:numFmt w:val="decimal"/>
-      <w:lvlText w:val="%3."/>
-      <w:lvlJc w:val="left"/>
-      <w:pPr>
-        <w:ind w:left="2160" w:hanging="360"/>
-      </w:pPr>
-    </w:lvl>
-    <w:lvl w:ilvl="3">
-      <w:start w:val="1"/>
-      <w:numFmt w:val="decimal"/>
-      <w:lvlText w:val="%4."/>
-      <w:lvlJc w:val="left"/>
-      <w:pPr>
-        <w:ind w:left="2880" w:hanging="360"/>
-      </w:pPr>
-    </w:lvl>
-    <w:lvl w:ilvl="4">
-      <w:start w:val="1"/>
-      <w:numFmt w:val="decimal"/>
-      <w:lvlText w:val="%5."/>
-      <w:lvlJc w:val="left"/>
-      <w:pPr>
-        <w:ind w:left="3600" w:hanging="360"/>
-      </w:pPr>
-    </w:lvl>
-    <w:lvl w:ilvl="5">
-      <w:start w:val="1"/>
-      <w:numFmt w:val="decimal"/>
-      <w:lvlText w:val="%6."/>
-      <w:lvlJc w:val="left"/>
-      <w:pPr>
-        <w:ind w:left="4320" w:hanging="360"/>
-      </w:pPr>
-    </w:lvl>
-    <w:lvl w:ilvl="6">
-      <w:start w:val="1"/>
-      <w:numFmt w:val="decimal"/>
-      <w:lvlText w:val="%7."/>
-      <w:lvlJc w:val="left"/>
-      <w:pPr>
-        <w:ind w:left="5040" w:hanging="360"/>
-      </w:pPr>
-    </w:lvl>
-    <w:lvl w:ilvl="7">
-      <w:start w:val="1"/>
-      <w:numFmt w:val="decimal"/>
-      <w:lvlText w:val="%8."/>
-      <w:lvlJc w:val="left"/>
-      <w:pPr>
-        <w:ind w:left="5760" w:hanging="360"/>
-      </w:pPr>
-    </w:lvl>
-    <w:lvl w:ilvl="8">
-      <w:start w:val="1"/>
-      <w:numFmt w:val="decimal"/>
-      <w:lvlText w:val="%9."/>
-      <w:lvlJc w:val="left"/>
-      <w:pPr>
-        <w:ind w:left="6480" w:hanging="360"/>
-      </w:pPr>
-    </w:lvl>
-  </w:abstractNum>
-  <w:abstractNum w:abstractNumId="991">
-    <w:nsid w:val="0000A991"/>
-    <w:multiLevelType w:val="multilevel"/>
-    <w:lvl w:ilvl="0">
-      <w:numFmt w:val="bullet"/>
-      <w:lvlText w:val=""/>
-      <w:lvlJc w:val="left"/>
-      <w:pPr>
-        <w:ind w:left="720" w:hanging="360"/>
-      </w:pPr>
-      <w:rPr>
-        <w:rFonts w:ascii="Symbol" w:hAnsi="Symbol" w:cs="Symbol" w:hint="default"/>
-      </w:rPr>
-    </w:lvl>
-    <w:lvl w:ilvl="1">
-      <w:numFmt w:val="bullet"/>
-      <w:lvlText w:val="o"/>
-      <w:lvlJc w:val="left"/>
-      <w:pPr>
-        <w:ind w:left="1440" w:hanging="360"/>
-      </w:pPr>
-      <w:rPr>
-        <w:rFonts w:ascii="Courier New" w:hAnsi="Courier New" w:cs="Courier New" w:hint="default"/>
-      </w:rPr>
-    </w:lvl>
-    <w:lvl w:ilvl="2">
-      <w:numFmt w:val="bullet"/>
-      <w:lvlText w:val=""/>
-      <w:lvlJc w:val="left"/>
-      <w:pPr>
-        <w:ind w:left="2160" w:hanging="360"/>
-      </w:pPr>
-      <w:rPr>
-        <w:rFonts w:ascii="Wingdings" w:hAnsi="Wingdings" w:cs="Wingdings" w:hint="default"/>
-      </w:rPr>
-    </w:lvl>
-    <w:lvl w:ilvl="3">
-      <w:numFmt w:val="bullet"/>
-      <w:lvlText w:val=""/>
-      <w:lvlJc w:val="left"/>
-      <w:pPr>
-        <w:ind w:left="2880" w:hanging="360"/>
-      </w:pPr>
-      <w:rPr>
-        <w:rFonts w:ascii="Symbol" w:hAnsi="Symbol" w:cs="Symbol" w:hint="default"/>
-      </w:rPr>
-    </w:lvl>
-    <w:lvl w:ilvl="4">
-      <w:numFmt w:val="bullet"/>
-      <w:lvlText w:val="o"/>
-      <w:lvlJc w:val="left"/>
-      <w:pPr>
-        <w:ind w:left="3600" w:hanging="360"/>
-      </w:pPr>
-      <w:rPr>
-        <w:rFonts w:ascii="Courier New" w:hAnsi="Courier New" w:cs="Courier New" w:hint="default"/>
-      </w:rPr>
-    </w:lvl>
-    <w:lvl w:ilvl="5">
-      <w:numFmt w:val="bullet"/>
-      <w:lvlText w:val=""/>
-      <w:lvlJc w:val="left"/>
-      <w:pPr>
-        <w:ind w:left="4320" w:hanging="360"/>
-      </w:pPr>
-      <w:rPr>
-        <w:rFonts w:ascii="Wingdings" w:hAnsi="Wingdings" w:cs="Wingdings" w:hint="default"/>
-      </w:rPr>
-    </w:lvl>
-    <w:lvl w:ilvl="6">
-      <w:numFmt w:val="bullet"/>
-      <w:lvlText w:val=""/>
-      <w:lvlJc w:val="left"/>
-      <w:pPr>
-        <w:ind w:left="5040" w:hanging="360"/>
-      </w:pPr>
-      <w:rPr>
-        <w:rFonts w:ascii="Symbol" w:hAnsi="Symbol" w:cs="Symbol" w:hint="default"/>
-      </w:rPr>
-    </w:lvl>
-    <w:lvl w:ilvl="7">
-      <w:numFmt w:val="bullet"/>
-      <w:lvlText w:val="o"/>
-      <w:lvlJc w:val="left"/>
-      <w:pPr>
-        <w:ind w:left="5760" w:hanging="360"/>
-      </w:pPr>
-      <w:rPr>
-        <w:rFonts w:ascii="Courier New" w:hAnsi="Courier New" w:cs="Courier New" w:hint="default"/>
-      </w:rPr>
-    </w:lvl>
-    <w:lvl w:ilvl="8">
-      <w:numFmt w:val="bullet"/>
-      <w:lvlText w:val=""/>
-      <w:lvlJc w:val="left"/>
-      <w:pPr>
-        <w:ind w:left="6480" w:hanging="360"/>
-      </w:pPr>
-      <w:rPr>
-        <w:rFonts w:ascii="Wingdings" w:hAnsi="Wingdings" w:cs="Wingdings" w:hint="default"/>
-      </w:rPr>
-    </w:lvl>
-  </w:abstractNum>
-  <w:abstractNum w:abstractNumId="99412">
-    <w:nsid w:val="00A99412"/>
-    <w:multiLevelType w:val="multilevel"/>
-    <w:lvl w:ilvl="0">
-      <w:start w:val="2"/>
-      <w:numFmt w:val="decimal"/>
-      <w:lvlText w:val="%1."/>
-      <w:lvlJc w:val="left"/>
-      <w:pPr>
-        <w:ind w:left="720" w:hanging="360"/>
-      </w:pPr>
-    </w:lvl>
-    <w:lvl w:ilvl="1">
-      <w:start w:val="2"/>
-      <w:numFmt w:val="decimal"/>
-      <w:lvlText w:val="%2."/>
-      <w:lvlJc w:val="left"/>
-      <w:pPr>
-        <w:ind w:left="1440" w:hanging="360"/>
-      </w:pPr>
-    </w:lvl>
-    <w:lvl w:ilvl="2">
-      <w:start w:val="2"/>
-      <w:numFmt w:val="decimal"/>
-      <w:lvlText w:val="%3."/>
-      <w:lvlJc w:val="left"/>
-      <w:pPr>
-        <w:ind w:left="2160" w:hanging="360"/>
-      </w:pPr>
-    </w:lvl>
-    <w:lvl w:ilvl="3">
-      <w:start w:val="2"/>
-      <w:numFmt w:val="decimal"/>
-      <w:lvlText w:val="%4."/>
-      <w:lvlJc w:val="left"/>
-      <w:pPr>
-        <w:ind w:left="2880" w:hanging="360"/>
-      </w:pPr>
-    </w:lvl>
-    <w:lvl w:ilvl="4">
-      <w:start w:val="2"/>
-      <w:numFmt w:val="decimal"/>
-      <w:lvlText w:val="%5."/>
-      <w:lvlJc w:val="left"/>
-      <w:pPr>
-        <w:ind w:left="3600" w:hanging="360"/>
-      </w:pPr>
-    </w:lvl>
-    <w:lvl w:ilvl="5">
-      <w:start w:val="2"/>
-      <w:numFmt w:val="decimal"/>
-      <w:lvlText w:val="%6."/>
-      <w:lvlJc w:val="left"/>
-      <w:pPr>
-        <w:ind w:left="4320" w:hanging="360"/>
-      </w:pPr>
-    </w:lvl>
-    <w:lvl w:ilvl="6">
-      <w:start w:val="2"/>
-      <w:numFmt w:val="decimal"/>
-      <w:lvlText w:val="%7."/>
-      <w:lvlJc w:val="left"/>
-      <w:pPr>
-        <w:ind w:left="5040" w:hanging="360"/>
-      </w:pPr>
-    </w:lvl>
-    <w:lvl w:ilvl="7">
-      <w:start w:val="2"/>
-      <w:numFmt w:val="decimal"/>
-      <w:lvlText w:val="%8."/>
-      <w:lvlJc w:val="left"/>
-      <w:pPr>
-        <w:ind w:left="5760" w:hanging="360"/>
-      </w:pPr>
-    </w:lvl>
-    <w:lvl w:ilvl="8">
-      <w:start w:val="2"/>
-      <w:numFmt w:val="decimal"/>
-      <w:lvlText w:val="%9."/>
-      <w:lvlJc w:val="left"/>
-      <w:pPr>
-        <w:ind w:left="6480" w:hanging="360"/>
-      </w:pPr>
-    </w:lvl>
-  </w:abstractNum>
   <w:num w16cid:durableId="423961382" w:numId="1">
     <w:abstractNumId w:val="10"/>
   </w:num>
@@ -10617,72 +10375,6 @@
   </w:num>
   <w:num w:numId="1000">
     <w:abstractNumId w:val="990"/>
-  </w:num>
-  <w:num w:numId="1001">
-    <w:abstractNumId w:val="99411"/>
-    <w:lvlOverride w:ilvl="0">
-      <w:startOverride w:val="1"/>
-    </w:lvlOverride>
-    <w:lvlOverride w:ilvl="1">
-      <w:startOverride w:val="1"/>
-    </w:lvlOverride>
-    <w:lvlOverride w:ilvl="2">
-      <w:startOverride w:val="1"/>
-    </w:lvlOverride>
-    <w:lvlOverride w:ilvl="3">
-      <w:startOverride w:val="1"/>
-    </w:lvlOverride>
-    <w:lvlOverride w:ilvl="4">
-      <w:startOverride w:val="1"/>
-    </w:lvlOverride>
-    <w:lvlOverride w:ilvl="5">
-      <w:startOverride w:val="1"/>
-    </w:lvlOverride>
-    <w:lvlOverride w:ilvl="6">
-      <w:startOverride w:val="1"/>
-    </w:lvlOverride>
-    <w:lvlOverride w:ilvl="7">
-      <w:startOverride w:val="1"/>
-    </w:lvlOverride>
-    <w:lvlOverride w:ilvl="8">
-      <w:startOverride w:val="1"/>
-    </w:lvlOverride>
-  </w:num>
-  <w:num w:numId="1002">
-    <w:abstractNumId w:val="991"/>
-  </w:num>
-  <w:num w:numId="1003">
-    <w:abstractNumId w:val="99412"/>
-    <w:lvlOverride w:ilvl="0">
-      <w:startOverride w:val="2"/>
-    </w:lvlOverride>
-    <w:lvlOverride w:ilvl="1">
-      <w:startOverride w:val="2"/>
-    </w:lvlOverride>
-    <w:lvlOverride w:ilvl="2">
-      <w:startOverride w:val="2"/>
-    </w:lvlOverride>
-    <w:lvlOverride w:ilvl="3">
-      <w:startOverride w:val="2"/>
-    </w:lvlOverride>
-    <w:lvlOverride w:ilvl="4">
-      <w:startOverride w:val="2"/>
-    </w:lvlOverride>
-    <w:lvlOverride w:ilvl="5">
-      <w:startOverride w:val="2"/>
-    </w:lvlOverride>
-    <w:lvlOverride w:ilvl="6">
-      <w:startOverride w:val="2"/>
-    </w:lvlOverride>
-    <w:lvlOverride w:ilvl="7">
-      <w:startOverride w:val="2"/>
-    </w:lvlOverride>
-    <w:lvlOverride w:ilvl="8">
-      <w:startOverride w:val="2"/>
-    </w:lvlOverride>
-  </w:num>
-  <w:num w:numId="1004">
-    <w:abstractNumId w:val="991"/>
   </w:num>
 </w:numbering>
 </file>

</xml_diff>

<commit_message>
updating language for consistency
</commit_message>
<xml_diff>
--- a/AI_JCM.docx
+++ b/AI_JCM.docx
@@ -647,21 +647,7 @@
         <w:pStyle w:val="FirstParagraph"/>
       </w:pPr>
       <w:r>
-        <w:t xml:space="preserve">124 undergraduate students responded (Mean age = 21.58, SD = 5.61). The students were given the choice of 50 different majors to choose from, with the greatest representation being Psychology at 38.71% (see</w:t>
-      </w:r>
-      <w:r>
-        <w:t xml:space="preserve"> </w:t>
-      </w:r>
-      <w:hyperlink w:anchor="tbl-majors">
-        <w:r>
-          <w:rPr>
-            <w:rStyle w:val="Hyperlink"/>
-          </w:rPr>
-          <w:t xml:space="preserve">Table 2</w:t>
-        </w:r>
-      </w:hyperlink>
-      <w:r>
-        <w:t xml:space="preserve">). When asked,</w:t>
+        <w:t xml:space="preserve">124 undergraduate students responded (Mean age = 21.58, SD = 5.61). The students were given the choice of 50 different majors to choose from, with the greatest representation being Psychology at 38.71%, with a second largest group of Construction at 15.32%. When asked,</w:t>
       </w:r>
       <w:r>
         <w:t xml:space="preserve"> </w:t>
@@ -1684,7 +1670,7 @@
     </w:p>
     <w:bookmarkEnd w:id="36"/>
     <w:bookmarkEnd w:id="37"/>
-    <w:bookmarkStart w:id="74" w:name="references"/>
+    <w:bookmarkStart w:id="73" w:name="references"/>
     <w:p>
       <w:pPr>
         <w:pStyle w:val="Heading1"/>
@@ -3686,4411 +3672,12 @@
         <w:br w:type="page"/>
       </w:r>
     </w:p>
-    <w:bookmarkStart w:id="48" w:name="tbl-majors"/>
-    <w:p>
-      <w:pPr>
-        <w:pStyle w:val="FigureTitle"/>
-      </w:pPr>
-      <w:r>
-        <w:t xml:space="preserve">Table 2</w:t>
-      </w:r>
-    </w:p>
-    <w:p>
-      <w:pPr>
-        <w:pStyle w:val="Caption"/>
-      </w:pPr>
-      <w:r>
-        <w:t xml:space="preserve">Indicated major (current study respondents)</w:t>
-      </w:r>
-    </w:p>
-    <w:tbl xmlns:w="http://schemas.openxmlformats.org/wordprocessingml/2006/main" xmlns:r="http://schemas.openxmlformats.org/officeDocument/2006/relationships" xmlns:w14="http://schemas.microsoft.com/office/word/2010/wordml" xmlns:wp="http://schemas.openxmlformats.org/drawingml/2006/wordprocessingDrawing" xmlns:a="http://schemas.openxmlformats.org/drawingml/2006/main" xmlns:pic="http://schemas.openxmlformats.org/drawingml/2006/picture">
-      <w:tblPr>
-        <w:tblLayout w:type="fixed"/>
-        <w:jc w:val="center"/>
-        <w:tblLook w:firstRow="1" w:lastRow="0" w:firstColumn="0" w:lastColumn="0" w:noHBand="0" w:noVBand="1"/>
-      </w:tblPr>
-      <w:tblGrid>
-        <w:gridCol w:w="5760"/>
-        <w:gridCol w:w="2880"/>
-        <w:gridCol w:w="2880"/>
-      </w:tblGrid>
-      <w:tr>
-        <w:trPr>
-          <w:trHeight w:val="360" w:hRule="auto"/>
-          <w:tblHeader/>
-        </w:trPr>
-        header 1
-        <w:tc>
-          <w:tcPr>
-            <w:tcBorders>
-              <w:bottom w:val="single" w:sz="6" w:space="0" w:color="000000"/>
-              <w:top w:val="single" w:sz="6" w:space="0" w:color="000000"/>
-              <w:left w:val="none" w:sz="0" w:space="0" w:color="000000"/>
-              <w:right w:val="none" w:sz="0" w:space="0" w:color="000000"/>
-            </w:tcBorders>
-            <w:shd w:val="clear" w:color="auto" w:fill="FFFFFF"/>
-            <w:tcMar>
-              <w:top w:w="0" w:type="dxa"/>
-              <w:bottom w:w="0" w:type="dxa"/>
-              <w:left w:w="0" w:type="dxa"/>
-              <w:right w:w="0" w:type="dxa"/>
-            </w:tcMar>
-            <w:vAlign w:val="center"/>
-          </w:tcPr>
-          <w:p>
-            <w:pPr>
-              <w:jc w:val="left"/>
-              <w:pBdr>
-                <w:bottom w:val="none" w:sz="0" w:space="0" w:color="000000"/>
-                <w:top w:val="none" w:sz="0" w:space="0" w:color="000000"/>
-                <w:left w:val="none" w:sz="0" w:space="0" w:color="000000"/>
-                <w:right w:val="none" w:sz="0" w:space="0" w:color="000000"/>
-              </w:pBdr>
-              <w:spacing w:after="100" w:before="100" w:line="480"/>
-              <w:ind w:left="100" w:right="100" w:firstLine="0" w:firstLineChars="0"/>
-              <w:rPr>
-                <w:rFonts w:ascii="Times New Roman" w:hAnsi="Times New Roman" w:eastAsia="Times New Roman" w:cs="Times New Roman"/>
-                <w:i w:val="false"/>
-                <w:b w:val="false"/>
-                <w:u w:val="none"/>
-                <w:strike w:val="false"/>
-                <w:sz w:val="22"/>
-                <w:szCs w:val="22"/>
-                <w:color w:val="000000"/>
-              </w:rPr>
-            </w:pPr>
-            <w:r xmlns:w="http://schemas.openxmlformats.org/wordprocessingml/2006/main" xmlns:wp="http://schemas.openxmlformats.org/drawingml/2006/wordprocessingDrawing" xmlns:r="http://schemas.openxmlformats.org/officeDocument/2006/relationships" xmlns:w14="http://schemas.microsoft.com/office/word/2010/wordml">
-              <w:rPr>
-                <w:rFonts w:ascii="Times New Roman" w:hAnsi="Times New Roman" w:eastAsia="Times New Roman" w:cs="Times New Roman"/>
-                <w:i w:val="false"/>
-                <w:b w:val="false"/>
-                <w:u w:val="none"/>
-                <w:strike w:val="false"/>
-                <w:sz w:val="22"/>
-                <w:szCs w:val="22"/>
-                <w:color w:val="000000"/>
-              </w:rPr>
-              <w:t xml:space="preserve">Major</w:t>
-            </w:r>
-          </w:p>
-        </w:tc>
-        <w:tc>
-          <w:tcPr>
-            <w:tcBorders>
-              <w:bottom w:val="single" w:sz="6" w:space="0" w:color="000000"/>
-              <w:top w:val="single" w:sz="6" w:space="0" w:color="000000"/>
-              <w:left w:val="none" w:sz="0" w:space="0" w:color="000000"/>
-              <w:right w:val="none" w:sz="0" w:space="0" w:color="000000"/>
-            </w:tcBorders>
-            <w:shd w:val="clear" w:color="auto" w:fill="FFFFFF"/>
-            <w:tcMar>
-              <w:top w:w="0" w:type="dxa"/>
-              <w:bottom w:w="0" w:type="dxa"/>
-              <w:left w:w="0" w:type="dxa"/>
-              <w:right w:w="0" w:type="dxa"/>
-            </w:tcMar>
-            <w:vAlign w:val="center"/>
-          </w:tcPr>
-          <w:p>
-            <w:pPr>
-              <w:jc w:val="left"/>
-              <w:pBdr>
-                <w:bottom w:val="none" w:sz="0" w:space="0" w:color="000000"/>
-                <w:top w:val="none" w:sz="0" w:space="0" w:color="000000"/>
-                <w:left w:val="none" w:sz="0" w:space="0" w:color="000000"/>
-                <w:right w:val="none" w:sz="0" w:space="0" w:color="000000"/>
-              </w:pBdr>
-              <w:spacing w:after="100" w:before="100" w:line="480"/>
-              <w:ind w:left="100" w:right="100" w:firstLine="0" w:firstLineChars="0"/>
-              <w:rPr>
-                <w:rFonts w:ascii="Times New Roman" w:hAnsi="Times New Roman" w:eastAsia="Times New Roman" w:cs="Times New Roman"/>
-                <w:i w:val="false"/>
-                <w:b w:val="false"/>
-                <w:u w:val="none"/>
-                <w:strike w:val="false"/>
-                <w:sz w:val="22"/>
-                <w:szCs w:val="22"/>
-                <w:color w:val="000000"/>
-              </w:rPr>
-            </w:pPr>
-            <w:r xmlns:w="http://schemas.openxmlformats.org/wordprocessingml/2006/main" xmlns:wp="http://schemas.openxmlformats.org/drawingml/2006/wordprocessingDrawing" xmlns:r="http://schemas.openxmlformats.org/officeDocument/2006/relationships" xmlns:w14="http://schemas.microsoft.com/office/word/2010/wordml">
-              <w:rPr>
-                <w:rFonts w:ascii="Times New Roman" w:hAnsi="Times New Roman" w:eastAsia="Times New Roman" w:cs="Times New Roman"/>
-                <w:i w:val="false"/>
-                <w:b w:val="false"/>
-                <w:u w:val="none"/>
-                <w:strike w:val="false"/>
-                <w:sz w:val="22"/>
-                <w:szCs w:val="22"/>
-                <w:color w:val="000000"/>
-              </w:rPr>
-              <w:t xml:space="preserve">Total (n)</w:t>
-            </w:r>
-          </w:p>
-        </w:tc>
-        <w:tc>
-          <w:tcPr>
-            <w:tcBorders>
-              <w:bottom w:val="single" w:sz="6" w:space="0" w:color="000000"/>
-              <w:top w:val="single" w:sz="6" w:space="0" w:color="000000"/>
-              <w:left w:val="none" w:sz="0" w:space="0" w:color="000000"/>
-              <w:right w:val="none" w:sz="0" w:space="0" w:color="000000"/>
-            </w:tcBorders>
-            <w:shd w:val="clear" w:color="auto" w:fill="FFFFFF"/>
-            <w:tcMar>
-              <w:top w:w="0" w:type="dxa"/>
-              <w:bottom w:w="0" w:type="dxa"/>
-              <w:left w:w="0" w:type="dxa"/>
-              <w:right w:w="0" w:type="dxa"/>
-            </w:tcMar>
-            <w:vAlign w:val="center"/>
-          </w:tcPr>
-          <w:p>
-            <w:pPr>
-              <w:jc w:val="left"/>
-              <w:pBdr>
-                <w:bottom w:val="none" w:sz="0" w:space="0" w:color="000000"/>
-                <w:top w:val="none" w:sz="0" w:space="0" w:color="000000"/>
-                <w:left w:val="none" w:sz="0" w:space="0" w:color="000000"/>
-                <w:right w:val="none" w:sz="0" w:space="0" w:color="000000"/>
-              </w:pBdr>
-              <w:spacing w:after="100" w:before="100" w:line="480"/>
-              <w:ind w:left="100" w:right="100" w:firstLine="0" w:firstLineChars="0"/>
-              <w:rPr>
-                <w:rFonts w:ascii="Times New Roman" w:hAnsi="Times New Roman" w:eastAsia="Times New Roman" w:cs="Times New Roman"/>
-                <w:i w:val="false"/>
-                <w:b w:val="false"/>
-                <w:u w:val="none"/>
-                <w:strike w:val="false"/>
-                <w:sz w:val="22"/>
-                <w:szCs w:val="22"/>
-                <w:color w:val="000000"/>
-              </w:rPr>
-            </w:pPr>
-            <w:r xmlns:w="http://schemas.openxmlformats.org/wordprocessingml/2006/main" xmlns:wp="http://schemas.openxmlformats.org/drawingml/2006/wordprocessingDrawing" xmlns:r="http://schemas.openxmlformats.org/officeDocument/2006/relationships" xmlns:w14="http://schemas.microsoft.com/office/word/2010/wordml">
-              <w:rPr>
-                <w:rFonts w:ascii="Times New Roman" w:hAnsi="Times New Roman" w:eastAsia="Times New Roman" w:cs="Times New Roman"/>
-                <w:i w:val="false"/>
-                <w:b w:val="false"/>
-                <w:u w:val="none"/>
-                <w:strike w:val="false"/>
-                <w:sz w:val="22"/>
-                <w:szCs w:val="22"/>
-                <w:color w:val="000000"/>
-              </w:rPr>
-              <w:t xml:space="preserve">Percent</w:t>
-            </w:r>
-          </w:p>
-        </w:tc>
-      </w:tr>
-      <w:tr>
-        <w:trPr>
-          <w:trHeight w:val="360" w:hRule="auto"/>
-        </w:trPr>
-        body 1
-        <w:tc>
-          <w:tcPr>
-            <w:tcBorders>
-              <w:bottom w:val="none" w:sz="0" w:space="0" w:color="000000"/>
-              <w:top w:val="single" w:sz="6" w:space="0" w:color="000000"/>
-              <w:left w:val="none" w:sz="0" w:space="0" w:color="000000"/>
-              <w:right w:val="none" w:sz="0" w:space="0" w:color="000000"/>
-            </w:tcBorders>
-            <w:shd w:val="clear" w:color="auto" w:fill="FFFFFF"/>
-            <w:tcMar>
-              <w:top w:w="0" w:type="dxa"/>
-              <w:bottom w:w="0" w:type="dxa"/>
-              <w:left w:w="0" w:type="dxa"/>
-              <w:right w:w="0" w:type="dxa"/>
-            </w:tcMar>
-            <w:vAlign w:val="center"/>
-          </w:tcPr>
-          <w:p>
-            <w:pPr>
-              <w:jc w:val="left"/>
-              <w:pBdr>
-                <w:bottom w:val="none" w:sz="0" w:space="0" w:color="000000"/>
-                <w:top w:val="none" w:sz="0" w:space="0" w:color="000000"/>
-                <w:left w:val="none" w:sz="0" w:space="0" w:color="000000"/>
-                <w:right w:val="none" w:sz="0" w:space="0" w:color="000000"/>
-              </w:pBdr>
-              <w:spacing w:after="100" w:before="100" w:line="480"/>
-              <w:ind w:left="100" w:right="100" w:firstLine="0" w:firstLineChars="0"/>
-              <w:rPr>
-                <w:rFonts w:ascii="Times New Roman" w:hAnsi="Times New Roman" w:eastAsia="Times New Roman" w:cs="Times New Roman"/>
-                <w:i w:val="false"/>
-                <w:b w:val="false"/>
-                <w:u w:val="none"/>
-                <w:strike w:val="false"/>
-                <w:sz w:val="22"/>
-                <w:szCs w:val="22"/>
-                <w:color w:val="000000"/>
-              </w:rPr>
-            </w:pPr>
-            <w:r xmlns:w="http://schemas.openxmlformats.org/wordprocessingml/2006/main" xmlns:wp="http://schemas.openxmlformats.org/drawingml/2006/wordprocessingDrawing" xmlns:r="http://schemas.openxmlformats.org/officeDocument/2006/relationships" xmlns:w14="http://schemas.microsoft.com/office/word/2010/wordml">
-              <w:rPr>
-                <w:rFonts w:ascii="Times New Roman" w:hAnsi="Times New Roman" w:eastAsia="Times New Roman" w:cs="Times New Roman"/>
-                <w:i w:val="false"/>
-                <w:b w:val="false"/>
-                <w:u w:val="none"/>
-                <w:strike w:val="false"/>
-                <w:sz w:val="22"/>
-                <w:szCs w:val="22"/>
-                <w:color w:val="000000"/>
-              </w:rPr>
-              <w:t xml:space="preserve">Applied Science   </w:t>
-            </w:r>
-          </w:p>
-        </w:tc>
-        <w:tc>
-          <w:tcPr>
-            <w:tcBorders>
-              <w:bottom w:val="none" w:sz="0" w:space="0" w:color="000000"/>
-              <w:top w:val="single" w:sz="6" w:space="0" w:color="000000"/>
-              <w:left w:val="none" w:sz="0" w:space="0" w:color="000000"/>
-              <w:right w:val="none" w:sz="0" w:space="0" w:color="000000"/>
-            </w:tcBorders>
-            <w:shd w:val="clear" w:color="auto" w:fill="FFFFFF"/>
-            <w:tcMar>
-              <w:top w:w="0" w:type="dxa"/>
-              <w:bottom w:w="0" w:type="dxa"/>
-              <w:left w:w="0" w:type="dxa"/>
-              <w:right w:w="0" w:type="dxa"/>
-            </w:tcMar>
-            <w:vAlign w:val="center"/>
-          </w:tcPr>
-          <w:p>
-            <w:pPr>
-              <w:jc w:val="left"/>
-              <w:pBdr>
-                <w:bottom w:val="none" w:sz="0" w:space="0" w:color="000000"/>
-                <w:top w:val="none" w:sz="0" w:space="0" w:color="000000"/>
-                <w:left w:val="none" w:sz="0" w:space="0" w:color="000000"/>
-                <w:right w:val="none" w:sz="0" w:space="0" w:color="000000"/>
-              </w:pBdr>
-              <w:spacing w:after="100" w:before="100" w:line="480"/>
-              <w:ind w:left="100" w:right="100" w:firstLine="0" w:firstLineChars="0"/>
-              <w:rPr>
-                <w:rFonts w:ascii="Times New Roman" w:hAnsi="Times New Roman" w:eastAsia="Times New Roman" w:cs="Times New Roman"/>
-                <w:i w:val="false"/>
-                <w:b w:val="false"/>
-                <w:u w:val="none"/>
-                <w:strike w:val="false"/>
-                <w:sz w:val="22"/>
-                <w:szCs w:val="22"/>
-                <w:color w:val="000000"/>
-              </w:rPr>
-            </w:pPr>
-            <w:r xmlns:w="http://schemas.openxmlformats.org/wordprocessingml/2006/main" xmlns:wp="http://schemas.openxmlformats.org/drawingml/2006/wordprocessingDrawing" xmlns:r="http://schemas.openxmlformats.org/officeDocument/2006/relationships" xmlns:w14="http://schemas.microsoft.com/office/word/2010/wordml">
-              <w:rPr>
-                <w:rFonts w:ascii="Times New Roman" w:hAnsi="Times New Roman" w:eastAsia="Times New Roman" w:cs="Times New Roman"/>
-                <w:i w:val="false"/>
-                <w:b w:val="false"/>
-                <w:u w:val="none"/>
-                <w:strike w:val="false"/>
-                <w:sz w:val="22"/>
-                <w:szCs w:val="22"/>
-                <w:color w:val="000000"/>
-              </w:rPr>
-              <w:t xml:space="preserve">2</w:t>
-            </w:r>
-          </w:p>
-        </w:tc>
-        <w:tc>
-          <w:tcPr>
-            <w:tcBorders>
-              <w:bottom w:val="none" w:sz="0" w:space="0" w:color="000000"/>
-              <w:top w:val="single" w:sz="6" w:space="0" w:color="000000"/>
-              <w:left w:val="none" w:sz="0" w:space="0" w:color="000000"/>
-              <w:right w:val="none" w:sz="0" w:space="0" w:color="000000"/>
-            </w:tcBorders>
-            <w:shd w:val="clear" w:color="auto" w:fill="FFFFFF"/>
-            <w:tcMar>
-              <w:top w:w="0" w:type="dxa"/>
-              <w:bottom w:w="0" w:type="dxa"/>
-              <w:left w:w="0" w:type="dxa"/>
-              <w:right w:w="0" w:type="dxa"/>
-            </w:tcMar>
-            <w:vAlign w:val="center"/>
-          </w:tcPr>
-          <w:p>
-            <w:pPr>
-              <w:jc w:val="left"/>
-              <w:pBdr>
-                <w:bottom w:val="none" w:sz="0" w:space="0" w:color="000000"/>
-                <w:top w:val="none" w:sz="0" w:space="0" w:color="000000"/>
-                <w:left w:val="none" w:sz="0" w:space="0" w:color="000000"/>
-                <w:right w:val="none" w:sz="0" w:space="0" w:color="000000"/>
-              </w:pBdr>
-              <w:spacing w:after="100" w:before="100" w:line="480"/>
-              <w:ind w:left="100" w:right="100" w:firstLine="0" w:firstLineChars="0"/>
-              <w:rPr>
-                <w:rFonts w:ascii="Times New Roman" w:hAnsi="Times New Roman" w:eastAsia="Times New Roman" w:cs="Times New Roman"/>
-                <w:i w:val="false"/>
-                <w:b w:val="false"/>
-                <w:u w:val="none"/>
-                <w:strike w:val="false"/>
-                <w:sz w:val="22"/>
-                <w:szCs w:val="22"/>
-                <w:color w:val="000000"/>
-              </w:rPr>
-            </w:pPr>
-            <w:r xmlns:w="http://schemas.openxmlformats.org/wordprocessingml/2006/main" xmlns:wp="http://schemas.openxmlformats.org/drawingml/2006/wordprocessingDrawing" xmlns:r="http://schemas.openxmlformats.org/officeDocument/2006/relationships" xmlns:w14="http://schemas.microsoft.com/office/word/2010/wordml">
-              <w:rPr>
-                <w:rFonts w:ascii="Times New Roman" w:hAnsi="Times New Roman" w:eastAsia="Times New Roman" w:cs="Times New Roman"/>
-                <w:i w:val="false"/>
-                <w:b w:val="false"/>
-                <w:u w:val="none"/>
-                <w:strike w:val="false"/>
-                <w:sz w:val="22"/>
-                <w:szCs w:val="22"/>
-                <w:color w:val="000000"/>
-              </w:rPr>
-              <w:t xml:space="preserve">1.61</w:t>
-            </w:r>
-          </w:p>
-        </w:tc>
-      </w:tr>
-      <w:tr>
-        <w:trPr>
-          <w:trHeight w:val="360" w:hRule="auto"/>
-        </w:trPr>
-        body 2
-        <w:tc>
-          <w:tcPr>
-            <w:tcBorders>
-              <w:bottom w:val="none" w:sz="0" w:space="0" w:color="000000"/>
-              <w:top w:val="none" w:sz="0" w:space="0" w:color="000000"/>
-              <w:left w:val="none" w:sz="0" w:space="0" w:color="000000"/>
-              <w:right w:val="none" w:sz="0" w:space="0" w:color="000000"/>
-            </w:tcBorders>
-            <w:shd w:val="clear" w:color="auto" w:fill="FFFFFF"/>
-            <w:tcMar>
-              <w:top w:w="0" w:type="dxa"/>
-              <w:bottom w:w="0" w:type="dxa"/>
-              <w:left w:w="0" w:type="dxa"/>
-              <w:right w:w="0" w:type="dxa"/>
-            </w:tcMar>
-            <w:vAlign w:val="center"/>
-          </w:tcPr>
-          <w:p>
-            <w:pPr>
-              <w:jc w:val="left"/>
-              <w:pBdr>
-                <w:bottom w:val="none" w:sz="0" w:space="0" w:color="000000"/>
-                <w:top w:val="none" w:sz="0" w:space="0" w:color="000000"/>
-                <w:left w:val="none" w:sz="0" w:space="0" w:color="000000"/>
-                <w:right w:val="none" w:sz="0" w:space="0" w:color="000000"/>
-              </w:pBdr>
-              <w:spacing w:after="100" w:before="100" w:line="480"/>
-              <w:ind w:left="100" w:right="100" w:firstLine="0" w:firstLineChars="0"/>
-              <w:rPr>
-                <w:rFonts w:ascii="Times New Roman" w:hAnsi="Times New Roman" w:eastAsia="Times New Roman" w:cs="Times New Roman"/>
-                <w:i w:val="false"/>
-                <w:b w:val="false"/>
-                <w:u w:val="none"/>
-                <w:strike w:val="false"/>
-                <w:sz w:val="22"/>
-                <w:szCs w:val="22"/>
-                <w:color w:val="000000"/>
-              </w:rPr>
-            </w:pPr>
-            <w:r xmlns:w="http://schemas.openxmlformats.org/wordprocessingml/2006/main" xmlns:wp="http://schemas.openxmlformats.org/drawingml/2006/wordprocessingDrawing" xmlns:r="http://schemas.openxmlformats.org/officeDocument/2006/relationships" xmlns:w14="http://schemas.microsoft.com/office/word/2010/wordml">
-              <w:rPr>
-                <w:rFonts w:ascii="Times New Roman" w:hAnsi="Times New Roman" w:eastAsia="Times New Roman" w:cs="Times New Roman"/>
-                <w:i w:val="false"/>
-                <w:b w:val="false"/>
-                <w:u w:val="none"/>
-                <w:strike w:val="false"/>
-                <w:sz w:val="22"/>
-                <w:szCs w:val="22"/>
-                <w:color w:val="000000"/>
-              </w:rPr>
-              <w:t xml:space="preserve">Applied Social Science    </w:t>
-            </w:r>
-          </w:p>
-        </w:tc>
-        <w:tc>
-          <w:tcPr>
-            <w:tcBorders>
-              <w:bottom w:val="none" w:sz="0" w:space="0" w:color="000000"/>
-              <w:top w:val="none" w:sz="0" w:space="0" w:color="000000"/>
-              <w:left w:val="none" w:sz="0" w:space="0" w:color="000000"/>
-              <w:right w:val="none" w:sz="0" w:space="0" w:color="000000"/>
-            </w:tcBorders>
-            <w:shd w:val="clear" w:color="auto" w:fill="FFFFFF"/>
-            <w:tcMar>
-              <w:top w:w="0" w:type="dxa"/>
-              <w:bottom w:w="0" w:type="dxa"/>
-              <w:left w:w="0" w:type="dxa"/>
-              <w:right w:w="0" w:type="dxa"/>
-            </w:tcMar>
-            <w:vAlign w:val="center"/>
-          </w:tcPr>
-          <w:p>
-            <w:pPr>
-              <w:jc w:val="left"/>
-              <w:pBdr>
-                <w:bottom w:val="none" w:sz="0" w:space="0" w:color="000000"/>
-                <w:top w:val="none" w:sz="0" w:space="0" w:color="000000"/>
-                <w:left w:val="none" w:sz="0" w:space="0" w:color="000000"/>
-                <w:right w:val="none" w:sz="0" w:space="0" w:color="000000"/>
-              </w:pBdr>
-              <w:spacing w:after="100" w:before="100" w:line="480"/>
-              <w:ind w:left="100" w:right="100" w:firstLine="0" w:firstLineChars="0"/>
-              <w:rPr>
-                <w:rFonts w:ascii="Times New Roman" w:hAnsi="Times New Roman" w:eastAsia="Times New Roman" w:cs="Times New Roman"/>
-                <w:i w:val="false"/>
-                <w:b w:val="false"/>
-                <w:u w:val="none"/>
-                <w:strike w:val="false"/>
-                <w:sz w:val="22"/>
-                <w:szCs w:val="22"/>
-                <w:color w:val="000000"/>
-              </w:rPr>
-            </w:pPr>
-            <w:r xmlns:w="http://schemas.openxmlformats.org/wordprocessingml/2006/main" xmlns:wp="http://schemas.openxmlformats.org/drawingml/2006/wordprocessingDrawing" xmlns:r="http://schemas.openxmlformats.org/officeDocument/2006/relationships" xmlns:w14="http://schemas.microsoft.com/office/word/2010/wordml">
-              <w:rPr>
-                <w:rFonts w:ascii="Times New Roman" w:hAnsi="Times New Roman" w:eastAsia="Times New Roman" w:cs="Times New Roman"/>
-                <w:i w:val="false"/>
-                <w:b w:val="false"/>
-                <w:u w:val="none"/>
-                <w:strike w:val="false"/>
-                <w:sz w:val="22"/>
-                <w:szCs w:val="22"/>
-                <w:color w:val="000000"/>
-              </w:rPr>
-              <w:t xml:space="preserve">2</w:t>
-            </w:r>
-          </w:p>
-        </w:tc>
-        <w:tc>
-          <w:tcPr>
-            <w:tcBorders>
-              <w:bottom w:val="none" w:sz="0" w:space="0" w:color="000000"/>
-              <w:top w:val="none" w:sz="0" w:space="0" w:color="000000"/>
-              <w:left w:val="none" w:sz="0" w:space="0" w:color="000000"/>
-              <w:right w:val="none" w:sz="0" w:space="0" w:color="000000"/>
-            </w:tcBorders>
-            <w:shd w:val="clear" w:color="auto" w:fill="FFFFFF"/>
-            <w:tcMar>
-              <w:top w:w="0" w:type="dxa"/>
-              <w:bottom w:w="0" w:type="dxa"/>
-              <w:left w:w="0" w:type="dxa"/>
-              <w:right w:w="0" w:type="dxa"/>
-            </w:tcMar>
-            <w:vAlign w:val="center"/>
-          </w:tcPr>
-          <w:p>
-            <w:pPr>
-              <w:jc w:val="left"/>
-              <w:pBdr>
-                <w:bottom w:val="none" w:sz="0" w:space="0" w:color="000000"/>
-                <w:top w:val="none" w:sz="0" w:space="0" w:color="000000"/>
-                <w:left w:val="none" w:sz="0" w:space="0" w:color="000000"/>
-                <w:right w:val="none" w:sz="0" w:space="0" w:color="000000"/>
-              </w:pBdr>
-              <w:spacing w:after="100" w:before="100" w:line="480"/>
-              <w:ind w:left="100" w:right="100" w:firstLine="0" w:firstLineChars="0"/>
-              <w:rPr>
-                <w:rFonts w:ascii="Times New Roman" w:hAnsi="Times New Roman" w:eastAsia="Times New Roman" w:cs="Times New Roman"/>
-                <w:i w:val="false"/>
-                <w:b w:val="false"/>
-                <w:u w:val="none"/>
-                <w:strike w:val="false"/>
-                <w:sz w:val="22"/>
-                <w:szCs w:val="22"/>
-                <w:color w:val="000000"/>
-              </w:rPr>
-            </w:pPr>
-            <w:r xmlns:w="http://schemas.openxmlformats.org/wordprocessingml/2006/main" xmlns:wp="http://schemas.openxmlformats.org/drawingml/2006/wordprocessingDrawing" xmlns:r="http://schemas.openxmlformats.org/officeDocument/2006/relationships" xmlns:w14="http://schemas.microsoft.com/office/word/2010/wordml">
-              <w:rPr>
-                <w:rFonts w:ascii="Times New Roman" w:hAnsi="Times New Roman" w:eastAsia="Times New Roman" w:cs="Times New Roman"/>
-                <w:i w:val="false"/>
-                <w:b w:val="false"/>
-                <w:u w:val="none"/>
-                <w:strike w:val="false"/>
-                <w:sz w:val="22"/>
-                <w:szCs w:val="22"/>
-                <w:color w:val="000000"/>
-              </w:rPr>
-              <w:t xml:space="preserve">1.61</w:t>
-            </w:r>
-          </w:p>
-        </w:tc>
-      </w:tr>
-      <w:tr>
-        <w:trPr>
-          <w:trHeight w:val="360" w:hRule="auto"/>
-        </w:trPr>
-        body 3
-        <w:tc>
-          <w:tcPr>
-            <w:tcBorders>
-              <w:bottom w:val="none" w:sz="0" w:space="0" w:color="000000"/>
-              <w:top w:val="none" w:sz="0" w:space="0" w:color="000000"/>
-              <w:left w:val="none" w:sz="0" w:space="0" w:color="000000"/>
-              <w:right w:val="none" w:sz="0" w:space="0" w:color="000000"/>
-            </w:tcBorders>
-            <w:shd w:val="clear" w:color="auto" w:fill="FFFFFF"/>
-            <w:tcMar>
-              <w:top w:w="0" w:type="dxa"/>
-              <w:bottom w:w="0" w:type="dxa"/>
-              <w:left w:w="0" w:type="dxa"/>
-              <w:right w:w="0" w:type="dxa"/>
-            </w:tcMar>
-            <w:vAlign w:val="center"/>
-          </w:tcPr>
-          <w:p>
-            <w:pPr>
-              <w:jc w:val="left"/>
-              <w:pBdr>
-                <w:bottom w:val="none" w:sz="0" w:space="0" w:color="000000"/>
-                <w:top w:val="none" w:sz="0" w:space="0" w:color="000000"/>
-                <w:left w:val="none" w:sz="0" w:space="0" w:color="000000"/>
-                <w:right w:val="none" w:sz="0" w:space="0" w:color="000000"/>
-              </w:pBdr>
-              <w:spacing w:after="100" w:before="100" w:line="480"/>
-              <w:ind w:left="100" w:right="100" w:firstLine="0" w:firstLineChars="0"/>
-              <w:rPr>
-                <w:rFonts w:ascii="Times New Roman" w:hAnsi="Times New Roman" w:eastAsia="Times New Roman" w:cs="Times New Roman"/>
-                <w:i w:val="false"/>
-                <w:b w:val="false"/>
-                <w:u w:val="none"/>
-                <w:strike w:val="false"/>
-                <w:sz w:val="22"/>
-                <w:szCs w:val="22"/>
-                <w:color w:val="000000"/>
-              </w:rPr>
-            </w:pPr>
-            <w:r xmlns:w="http://schemas.openxmlformats.org/wordprocessingml/2006/main" xmlns:wp="http://schemas.openxmlformats.org/drawingml/2006/wordprocessingDrawing" xmlns:r="http://schemas.openxmlformats.org/officeDocument/2006/relationships" xmlns:w14="http://schemas.microsoft.com/office/word/2010/wordml">
-              <w:rPr>
-                <w:rFonts w:ascii="Times New Roman" w:hAnsi="Times New Roman" w:eastAsia="Times New Roman" w:cs="Times New Roman"/>
-                <w:i w:val="false"/>
-                <w:b w:val="false"/>
-                <w:u w:val="none"/>
-                <w:strike w:val="false"/>
-                <w:sz w:val="22"/>
-                <w:szCs w:val="22"/>
-                <w:color w:val="000000"/>
-              </w:rPr>
-              <w:t xml:space="preserve">Business Administration   </w:t>
-            </w:r>
-          </w:p>
-        </w:tc>
-        <w:tc>
-          <w:tcPr>
-            <w:tcBorders>
-              <w:bottom w:val="none" w:sz="0" w:space="0" w:color="000000"/>
-              <w:top w:val="none" w:sz="0" w:space="0" w:color="000000"/>
-              <w:left w:val="none" w:sz="0" w:space="0" w:color="000000"/>
-              <w:right w:val="none" w:sz="0" w:space="0" w:color="000000"/>
-            </w:tcBorders>
-            <w:shd w:val="clear" w:color="auto" w:fill="FFFFFF"/>
-            <w:tcMar>
-              <w:top w:w="0" w:type="dxa"/>
-              <w:bottom w:w="0" w:type="dxa"/>
-              <w:left w:w="0" w:type="dxa"/>
-              <w:right w:w="0" w:type="dxa"/>
-            </w:tcMar>
-            <w:vAlign w:val="center"/>
-          </w:tcPr>
-          <w:p>
-            <w:pPr>
-              <w:jc w:val="left"/>
-              <w:pBdr>
-                <w:bottom w:val="none" w:sz="0" w:space="0" w:color="000000"/>
-                <w:top w:val="none" w:sz="0" w:space="0" w:color="000000"/>
-                <w:left w:val="none" w:sz="0" w:space="0" w:color="000000"/>
-                <w:right w:val="none" w:sz="0" w:space="0" w:color="000000"/>
-              </w:pBdr>
-              <w:spacing w:after="100" w:before="100" w:line="480"/>
-              <w:ind w:left="100" w:right="100" w:firstLine="0" w:firstLineChars="0"/>
-              <w:rPr>
-                <w:rFonts w:ascii="Times New Roman" w:hAnsi="Times New Roman" w:eastAsia="Times New Roman" w:cs="Times New Roman"/>
-                <w:i w:val="false"/>
-                <w:b w:val="false"/>
-                <w:u w:val="none"/>
-                <w:strike w:val="false"/>
-                <w:sz w:val="22"/>
-                <w:szCs w:val="22"/>
-                <w:color w:val="000000"/>
-              </w:rPr>
-            </w:pPr>
-            <w:r xmlns:w="http://schemas.openxmlformats.org/wordprocessingml/2006/main" xmlns:wp="http://schemas.openxmlformats.org/drawingml/2006/wordprocessingDrawing" xmlns:r="http://schemas.openxmlformats.org/officeDocument/2006/relationships" xmlns:w14="http://schemas.microsoft.com/office/word/2010/wordml">
-              <w:rPr>
-                <w:rFonts w:ascii="Times New Roman" w:hAnsi="Times New Roman" w:eastAsia="Times New Roman" w:cs="Times New Roman"/>
-                <w:i w:val="false"/>
-                <w:b w:val="false"/>
-                <w:u w:val="none"/>
-                <w:strike w:val="false"/>
-                <w:sz w:val="22"/>
-                <w:szCs w:val="22"/>
-                <w:color w:val="000000"/>
-              </w:rPr>
-              <w:t xml:space="preserve">18</w:t>
-            </w:r>
-          </w:p>
-        </w:tc>
-        <w:tc>
-          <w:tcPr>
-            <w:tcBorders>
-              <w:bottom w:val="none" w:sz="0" w:space="0" w:color="000000"/>
-              <w:top w:val="none" w:sz="0" w:space="0" w:color="000000"/>
-              <w:left w:val="none" w:sz="0" w:space="0" w:color="000000"/>
-              <w:right w:val="none" w:sz="0" w:space="0" w:color="000000"/>
-            </w:tcBorders>
-            <w:shd w:val="clear" w:color="auto" w:fill="FFFFFF"/>
-            <w:tcMar>
-              <w:top w:w="0" w:type="dxa"/>
-              <w:bottom w:w="0" w:type="dxa"/>
-              <w:left w:w="0" w:type="dxa"/>
-              <w:right w:w="0" w:type="dxa"/>
-            </w:tcMar>
-            <w:vAlign w:val="center"/>
-          </w:tcPr>
-          <w:p>
-            <w:pPr>
-              <w:jc w:val="left"/>
-              <w:pBdr>
-                <w:bottom w:val="none" w:sz="0" w:space="0" w:color="000000"/>
-                <w:top w:val="none" w:sz="0" w:space="0" w:color="000000"/>
-                <w:left w:val="none" w:sz="0" w:space="0" w:color="000000"/>
-                <w:right w:val="none" w:sz="0" w:space="0" w:color="000000"/>
-              </w:pBdr>
-              <w:spacing w:after="100" w:before="100" w:line="480"/>
-              <w:ind w:left="100" w:right="100" w:firstLine="0" w:firstLineChars="0"/>
-              <w:rPr>
-                <w:rFonts w:ascii="Times New Roman" w:hAnsi="Times New Roman" w:eastAsia="Times New Roman" w:cs="Times New Roman"/>
-                <w:i w:val="false"/>
-                <w:b w:val="false"/>
-                <w:u w:val="none"/>
-                <w:strike w:val="false"/>
-                <w:sz w:val="22"/>
-                <w:szCs w:val="22"/>
-                <w:color w:val="000000"/>
-              </w:rPr>
-            </w:pPr>
-            <w:r xmlns:w="http://schemas.openxmlformats.org/wordprocessingml/2006/main" xmlns:wp="http://schemas.openxmlformats.org/drawingml/2006/wordprocessingDrawing" xmlns:r="http://schemas.openxmlformats.org/officeDocument/2006/relationships" xmlns:w14="http://schemas.microsoft.com/office/word/2010/wordml">
-              <w:rPr>
-                <w:rFonts w:ascii="Times New Roman" w:hAnsi="Times New Roman" w:eastAsia="Times New Roman" w:cs="Times New Roman"/>
-                <w:i w:val="false"/>
-                <w:b w:val="false"/>
-                <w:u w:val="none"/>
-                <w:strike w:val="false"/>
-                <w:sz w:val="22"/>
-                <w:szCs w:val="22"/>
-                <w:color w:val="000000"/>
-              </w:rPr>
-              <w:t xml:space="preserve">14.52</w:t>
-            </w:r>
-          </w:p>
-        </w:tc>
-      </w:tr>
-      <w:tr>
-        <w:trPr>
-          <w:trHeight w:val="360" w:hRule="auto"/>
-        </w:trPr>
-        body 4
-        <w:tc>
-          <w:tcPr>
-            <w:tcBorders>
-              <w:bottom w:val="none" w:sz="0" w:space="0" w:color="000000"/>
-              <w:top w:val="none" w:sz="0" w:space="0" w:color="000000"/>
-              <w:left w:val="none" w:sz="0" w:space="0" w:color="000000"/>
-              <w:right w:val="none" w:sz="0" w:space="0" w:color="000000"/>
-            </w:tcBorders>
-            <w:shd w:val="clear" w:color="auto" w:fill="FFFFFF"/>
-            <w:tcMar>
-              <w:top w:w="0" w:type="dxa"/>
-              <w:bottom w:w="0" w:type="dxa"/>
-              <w:left w:w="0" w:type="dxa"/>
-              <w:right w:w="0" w:type="dxa"/>
-            </w:tcMar>
-            <w:vAlign w:val="center"/>
-          </w:tcPr>
-          <w:p>
-            <w:pPr>
-              <w:jc w:val="left"/>
-              <w:pBdr>
-                <w:bottom w:val="none" w:sz="0" w:space="0" w:color="000000"/>
-                <w:top w:val="none" w:sz="0" w:space="0" w:color="000000"/>
-                <w:left w:val="none" w:sz="0" w:space="0" w:color="000000"/>
-                <w:right w:val="none" w:sz="0" w:space="0" w:color="000000"/>
-              </w:pBdr>
-              <w:spacing w:after="100" w:before="100" w:line="480"/>
-              <w:ind w:left="100" w:right="100" w:firstLine="0" w:firstLineChars="0"/>
-              <w:rPr>
-                <w:rFonts w:ascii="Times New Roman" w:hAnsi="Times New Roman" w:eastAsia="Times New Roman" w:cs="Times New Roman"/>
-                <w:i w:val="false"/>
-                <w:b w:val="false"/>
-                <w:u w:val="none"/>
-                <w:strike w:val="false"/>
-                <w:sz w:val="22"/>
-                <w:szCs w:val="22"/>
-                <w:color w:val="000000"/>
-              </w:rPr>
-            </w:pPr>
-            <w:r xmlns:w="http://schemas.openxmlformats.org/wordprocessingml/2006/main" xmlns:wp="http://schemas.openxmlformats.org/drawingml/2006/wordprocessingDrawing" xmlns:r="http://schemas.openxmlformats.org/officeDocument/2006/relationships" xmlns:w14="http://schemas.microsoft.com/office/word/2010/wordml">
-              <w:rPr>
-                <w:rFonts w:ascii="Times New Roman" w:hAnsi="Times New Roman" w:eastAsia="Times New Roman" w:cs="Times New Roman"/>
-                <w:i w:val="false"/>
-                <w:b w:val="false"/>
-                <w:u w:val="none"/>
-                <w:strike w:val="false"/>
-                <w:sz w:val="22"/>
-                <w:szCs w:val="22"/>
-                <w:color w:val="000000"/>
-              </w:rPr>
-              <w:t xml:space="preserve">Computer Networking &amp; Information Technology</w:t>
-            </w:r>
-          </w:p>
-        </w:tc>
-        <w:tc>
-          <w:tcPr>
-            <w:tcBorders>
-              <w:bottom w:val="none" w:sz="0" w:space="0" w:color="000000"/>
-              <w:top w:val="none" w:sz="0" w:space="0" w:color="000000"/>
-              <w:left w:val="none" w:sz="0" w:space="0" w:color="000000"/>
-              <w:right w:val="none" w:sz="0" w:space="0" w:color="000000"/>
-            </w:tcBorders>
-            <w:shd w:val="clear" w:color="auto" w:fill="FFFFFF"/>
-            <w:tcMar>
-              <w:top w:w="0" w:type="dxa"/>
-              <w:bottom w:w="0" w:type="dxa"/>
-              <w:left w:w="0" w:type="dxa"/>
-              <w:right w:w="0" w:type="dxa"/>
-            </w:tcMar>
-            <w:vAlign w:val="center"/>
-          </w:tcPr>
-          <w:p>
-            <w:pPr>
-              <w:jc w:val="left"/>
-              <w:pBdr>
-                <w:bottom w:val="none" w:sz="0" w:space="0" w:color="000000"/>
-                <w:top w:val="none" w:sz="0" w:space="0" w:color="000000"/>
-                <w:left w:val="none" w:sz="0" w:space="0" w:color="000000"/>
-                <w:right w:val="none" w:sz="0" w:space="0" w:color="000000"/>
-              </w:pBdr>
-              <w:spacing w:after="100" w:before="100" w:line="480"/>
-              <w:ind w:left="100" w:right="100" w:firstLine="0" w:firstLineChars="0"/>
-              <w:rPr>
-                <w:rFonts w:ascii="Times New Roman" w:hAnsi="Times New Roman" w:eastAsia="Times New Roman" w:cs="Times New Roman"/>
-                <w:i w:val="false"/>
-                <w:b w:val="false"/>
-                <w:u w:val="none"/>
-                <w:strike w:val="false"/>
-                <w:sz w:val="22"/>
-                <w:szCs w:val="22"/>
-                <w:color w:val="000000"/>
-              </w:rPr>
-            </w:pPr>
-            <w:r xmlns:w="http://schemas.openxmlformats.org/wordprocessingml/2006/main" xmlns:wp="http://schemas.openxmlformats.org/drawingml/2006/wordprocessingDrawing" xmlns:r="http://schemas.openxmlformats.org/officeDocument/2006/relationships" xmlns:w14="http://schemas.microsoft.com/office/word/2010/wordml">
-              <w:rPr>
-                <w:rFonts w:ascii="Times New Roman" w:hAnsi="Times New Roman" w:eastAsia="Times New Roman" w:cs="Times New Roman"/>
-                <w:i w:val="false"/>
-                <w:b w:val="false"/>
-                <w:u w:val="none"/>
-                <w:strike w:val="false"/>
-                <w:sz w:val="22"/>
-                <w:szCs w:val="22"/>
-                <w:color w:val="000000"/>
-              </w:rPr>
-              <w:t xml:space="preserve">2</w:t>
-            </w:r>
-          </w:p>
-        </w:tc>
-        <w:tc>
-          <w:tcPr>
-            <w:tcBorders>
-              <w:bottom w:val="none" w:sz="0" w:space="0" w:color="000000"/>
-              <w:top w:val="none" w:sz="0" w:space="0" w:color="000000"/>
-              <w:left w:val="none" w:sz="0" w:space="0" w:color="000000"/>
-              <w:right w:val="none" w:sz="0" w:space="0" w:color="000000"/>
-            </w:tcBorders>
-            <w:shd w:val="clear" w:color="auto" w:fill="FFFFFF"/>
-            <w:tcMar>
-              <w:top w:w="0" w:type="dxa"/>
-              <w:bottom w:w="0" w:type="dxa"/>
-              <w:left w:w="0" w:type="dxa"/>
-              <w:right w:w="0" w:type="dxa"/>
-            </w:tcMar>
-            <w:vAlign w:val="center"/>
-          </w:tcPr>
-          <w:p>
-            <w:pPr>
-              <w:jc w:val="left"/>
-              <w:pBdr>
-                <w:bottom w:val="none" w:sz="0" w:space="0" w:color="000000"/>
-                <w:top w:val="none" w:sz="0" w:space="0" w:color="000000"/>
-                <w:left w:val="none" w:sz="0" w:space="0" w:color="000000"/>
-                <w:right w:val="none" w:sz="0" w:space="0" w:color="000000"/>
-              </w:pBdr>
-              <w:spacing w:after="100" w:before="100" w:line="480"/>
-              <w:ind w:left="100" w:right="100" w:firstLine="0" w:firstLineChars="0"/>
-              <w:rPr>
-                <w:rFonts w:ascii="Times New Roman" w:hAnsi="Times New Roman" w:eastAsia="Times New Roman" w:cs="Times New Roman"/>
-                <w:i w:val="false"/>
-                <w:b w:val="false"/>
-                <w:u w:val="none"/>
-                <w:strike w:val="false"/>
-                <w:sz w:val="22"/>
-                <w:szCs w:val="22"/>
-                <w:color w:val="000000"/>
-              </w:rPr>
-            </w:pPr>
-            <w:r xmlns:w="http://schemas.openxmlformats.org/wordprocessingml/2006/main" xmlns:wp="http://schemas.openxmlformats.org/drawingml/2006/wordprocessingDrawing" xmlns:r="http://schemas.openxmlformats.org/officeDocument/2006/relationships" xmlns:w14="http://schemas.microsoft.com/office/word/2010/wordml">
-              <w:rPr>
-                <w:rFonts w:ascii="Times New Roman" w:hAnsi="Times New Roman" w:eastAsia="Times New Roman" w:cs="Times New Roman"/>
-                <w:i w:val="false"/>
-                <w:b w:val="false"/>
-                <w:u w:val="none"/>
-                <w:strike w:val="false"/>
-                <w:sz w:val="22"/>
-                <w:szCs w:val="22"/>
-                <w:color w:val="000000"/>
-              </w:rPr>
-              <w:t xml:space="preserve">1.61</w:t>
-            </w:r>
-          </w:p>
-        </w:tc>
-      </w:tr>
-      <w:tr>
-        <w:trPr>
-          <w:trHeight w:val="360" w:hRule="auto"/>
-        </w:trPr>
-        body 5
-        <w:tc>
-          <w:tcPr>
-            <w:tcBorders>
-              <w:bottom w:val="none" w:sz="0" w:space="0" w:color="000000"/>
-              <w:top w:val="none" w:sz="0" w:space="0" w:color="000000"/>
-              <w:left w:val="none" w:sz="0" w:space="0" w:color="000000"/>
-              <w:right w:val="none" w:sz="0" w:space="0" w:color="000000"/>
-            </w:tcBorders>
-            <w:shd w:val="clear" w:color="auto" w:fill="FFFFFF"/>
-            <w:tcMar>
-              <w:top w:w="0" w:type="dxa"/>
-              <w:bottom w:w="0" w:type="dxa"/>
-              <w:left w:w="0" w:type="dxa"/>
-              <w:right w:w="0" w:type="dxa"/>
-            </w:tcMar>
-            <w:vAlign w:val="center"/>
-          </w:tcPr>
-          <w:p>
-            <w:pPr>
-              <w:jc w:val="left"/>
-              <w:pBdr>
-                <w:bottom w:val="none" w:sz="0" w:space="0" w:color="000000"/>
-                <w:top w:val="none" w:sz="0" w:space="0" w:color="000000"/>
-                <w:left w:val="none" w:sz="0" w:space="0" w:color="000000"/>
-                <w:right w:val="none" w:sz="0" w:space="0" w:color="000000"/>
-              </w:pBdr>
-              <w:spacing w:after="100" w:before="100" w:line="480"/>
-              <w:ind w:left="100" w:right="100" w:firstLine="0" w:firstLineChars="0"/>
-              <w:rPr>
-                <w:rFonts w:ascii="Times New Roman" w:hAnsi="Times New Roman" w:eastAsia="Times New Roman" w:cs="Times New Roman"/>
-                <w:i w:val="false"/>
-                <w:b w:val="false"/>
-                <w:u w:val="none"/>
-                <w:strike w:val="false"/>
-                <w:sz w:val="22"/>
-                <w:szCs w:val="22"/>
-                <w:color w:val="000000"/>
-              </w:rPr>
-            </w:pPr>
-            <w:r xmlns:w="http://schemas.openxmlformats.org/wordprocessingml/2006/main" xmlns:wp="http://schemas.openxmlformats.org/drawingml/2006/wordprocessingDrawing" xmlns:r="http://schemas.openxmlformats.org/officeDocument/2006/relationships" xmlns:w14="http://schemas.microsoft.com/office/word/2010/wordml">
-              <w:rPr>
-                <w:rFonts w:ascii="Times New Roman" w:hAnsi="Times New Roman" w:eastAsia="Times New Roman" w:cs="Times New Roman"/>
-                <w:i w:val="false"/>
-                <w:b w:val="false"/>
-                <w:u w:val="none"/>
-                <w:strike w:val="false"/>
-                <w:sz w:val="22"/>
-                <w:szCs w:val="22"/>
-                <w:color w:val="000000"/>
-              </w:rPr>
-              <w:t xml:space="preserve">Computer Science</w:t>
-            </w:r>
-          </w:p>
-        </w:tc>
-        <w:tc>
-          <w:tcPr>
-            <w:tcBorders>
-              <w:bottom w:val="none" w:sz="0" w:space="0" w:color="000000"/>
-              <w:top w:val="none" w:sz="0" w:space="0" w:color="000000"/>
-              <w:left w:val="none" w:sz="0" w:space="0" w:color="000000"/>
-              <w:right w:val="none" w:sz="0" w:space="0" w:color="000000"/>
-            </w:tcBorders>
-            <w:shd w:val="clear" w:color="auto" w:fill="FFFFFF"/>
-            <w:tcMar>
-              <w:top w:w="0" w:type="dxa"/>
-              <w:bottom w:w="0" w:type="dxa"/>
-              <w:left w:w="0" w:type="dxa"/>
-              <w:right w:w="0" w:type="dxa"/>
-            </w:tcMar>
-            <w:vAlign w:val="center"/>
-          </w:tcPr>
-          <w:p>
-            <w:pPr>
-              <w:jc w:val="left"/>
-              <w:pBdr>
-                <w:bottom w:val="none" w:sz="0" w:space="0" w:color="000000"/>
-                <w:top w:val="none" w:sz="0" w:space="0" w:color="000000"/>
-                <w:left w:val="none" w:sz="0" w:space="0" w:color="000000"/>
-                <w:right w:val="none" w:sz="0" w:space="0" w:color="000000"/>
-              </w:pBdr>
-              <w:spacing w:after="100" w:before="100" w:line="480"/>
-              <w:ind w:left="100" w:right="100" w:firstLine="0" w:firstLineChars="0"/>
-              <w:rPr>
-                <w:rFonts w:ascii="Times New Roman" w:hAnsi="Times New Roman" w:eastAsia="Times New Roman" w:cs="Times New Roman"/>
-                <w:i w:val="false"/>
-                <w:b w:val="false"/>
-                <w:u w:val="none"/>
-                <w:strike w:val="false"/>
-                <w:sz w:val="22"/>
-                <w:szCs w:val="22"/>
-                <w:color w:val="000000"/>
-              </w:rPr>
-            </w:pPr>
-            <w:r xmlns:w="http://schemas.openxmlformats.org/wordprocessingml/2006/main" xmlns:wp="http://schemas.openxmlformats.org/drawingml/2006/wordprocessingDrawing" xmlns:r="http://schemas.openxmlformats.org/officeDocument/2006/relationships" xmlns:w14="http://schemas.microsoft.com/office/word/2010/wordml">
-              <w:rPr>
-                <w:rFonts w:ascii="Times New Roman" w:hAnsi="Times New Roman" w:eastAsia="Times New Roman" w:cs="Times New Roman"/>
-                <w:i w:val="false"/>
-                <w:b w:val="false"/>
-                <w:u w:val="none"/>
-                <w:strike w:val="false"/>
-                <w:sz w:val="22"/>
-                <w:szCs w:val="22"/>
-                <w:color w:val="000000"/>
-              </w:rPr>
-              <w:t xml:space="preserve">2</w:t>
-            </w:r>
-          </w:p>
-        </w:tc>
-        <w:tc>
-          <w:tcPr>
-            <w:tcBorders>
-              <w:bottom w:val="none" w:sz="0" w:space="0" w:color="000000"/>
-              <w:top w:val="none" w:sz="0" w:space="0" w:color="000000"/>
-              <w:left w:val="none" w:sz="0" w:space="0" w:color="000000"/>
-              <w:right w:val="none" w:sz="0" w:space="0" w:color="000000"/>
-            </w:tcBorders>
-            <w:shd w:val="clear" w:color="auto" w:fill="FFFFFF"/>
-            <w:tcMar>
-              <w:top w:w="0" w:type="dxa"/>
-              <w:bottom w:w="0" w:type="dxa"/>
-              <w:left w:w="0" w:type="dxa"/>
-              <w:right w:w="0" w:type="dxa"/>
-            </w:tcMar>
-            <w:vAlign w:val="center"/>
-          </w:tcPr>
-          <w:p>
-            <w:pPr>
-              <w:jc w:val="left"/>
-              <w:pBdr>
-                <w:bottom w:val="none" w:sz="0" w:space="0" w:color="000000"/>
-                <w:top w:val="none" w:sz="0" w:space="0" w:color="000000"/>
-                <w:left w:val="none" w:sz="0" w:space="0" w:color="000000"/>
-                <w:right w:val="none" w:sz="0" w:space="0" w:color="000000"/>
-              </w:pBdr>
-              <w:spacing w:after="100" w:before="100" w:line="480"/>
-              <w:ind w:left="100" w:right="100" w:firstLine="0" w:firstLineChars="0"/>
-              <w:rPr>
-                <w:rFonts w:ascii="Times New Roman" w:hAnsi="Times New Roman" w:eastAsia="Times New Roman" w:cs="Times New Roman"/>
-                <w:i w:val="false"/>
-                <w:b w:val="false"/>
-                <w:u w:val="none"/>
-                <w:strike w:val="false"/>
-                <w:sz w:val="22"/>
-                <w:szCs w:val="22"/>
-                <w:color w:val="000000"/>
-              </w:rPr>
-            </w:pPr>
-            <w:r xmlns:w="http://schemas.openxmlformats.org/wordprocessingml/2006/main" xmlns:wp="http://schemas.openxmlformats.org/drawingml/2006/wordprocessingDrawing" xmlns:r="http://schemas.openxmlformats.org/officeDocument/2006/relationships" xmlns:w14="http://schemas.microsoft.com/office/word/2010/wordml">
-              <w:rPr>
-                <w:rFonts w:ascii="Times New Roman" w:hAnsi="Times New Roman" w:eastAsia="Times New Roman" w:cs="Times New Roman"/>
-                <w:i w:val="false"/>
-                <w:b w:val="false"/>
-                <w:u w:val="none"/>
-                <w:strike w:val="false"/>
-                <w:sz w:val="22"/>
-                <w:szCs w:val="22"/>
-                <w:color w:val="000000"/>
-              </w:rPr>
-              <w:t xml:space="preserve">1.61</w:t>
-            </w:r>
-          </w:p>
-        </w:tc>
-      </w:tr>
-      <w:tr>
-        <w:trPr>
-          <w:trHeight w:val="360" w:hRule="auto"/>
-        </w:trPr>
-        body 6
-        <w:tc>
-          <w:tcPr>
-            <w:tcBorders>
-              <w:bottom w:val="none" w:sz="0" w:space="0" w:color="000000"/>
-              <w:top w:val="none" w:sz="0" w:space="0" w:color="000000"/>
-              <w:left w:val="none" w:sz="0" w:space="0" w:color="000000"/>
-              <w:right w:val="none" w:sz="0" w:space="0" w:color="000000"/>
-            </w:tcBorders>
-            <w:shd w:val="clear" w:color="auto" w:fill="FFFFFF"/>
-            <w:tcMar>
-              <w:top w:w="0" w:type="dxa"/>
-              <w:bottom w:w="0" w:type="dxa"/>
-              <w:left w:w="0" w:type="dxa"/>
-              <w:right w:w="0" w:type="dxa"/>
-            </w:tcMar>
-            <w:vAlign w:val="center"/>
-          </w:tcPr>
-          <w:p>
-            <w:pPr>
-              <w:jc w:val="left"/>
-              <w:pBdr>
-                <w:bottom w:val="none" w:sz="0" w:space="0" w:color="000000"/>
-                <w:top w:val="none" w:sz="0" w:space="0" w:color="000000"/>
-                <w:left w:val="none" w:sz="0" w:space="0" w:color="000000"/>
-                <w:right w:val="none" w:sz="0" w:space="0" w:color="000000"/>
-              </w:pBdr>
-              <w:spacing w:after="100" w:before="100" w:line="480"/>
-              <w:ind w:left="100" w:right="100" w:firstLine="0" w:firstLineChars="0"/>
-              <w:rPr>
-                <w:rFonts w:ascii="Times New Roman" w:hAnsi="Times New Roman" w:eastAsia="Times New Roman" w:cs="Times New Roman"/>
-                <w:i w:val="false"/>
-                <w:b w:val="false"/>
-                <w:u w:val="none"/>
-                <w:strike w:val="false"/>
-                <w:sz w:val="22"/>
-                <w:szCs w:val="22"/>
-                <w:color w:val="000000"/>
-              </w:rPr>
-            </w:pPr>
-            <w:r xmlns:w="http://schemas.openxmlformats.org/wordprocessingml/2006/main" xmlns:wp="http://schemas.openxmlformats.org/drawingml/2006/wordprocessingDrawing" xmlns:r="http://schemas.openxmlformats.org/officeDocument/2006/relationships" xmlns:w14="http://schemas.microsoft.com/office/word/2010/wordml">
-              <w:rPr>
-                <w:rFonts w:ascii="Times New Roman" w:hAnsi="Times New Roman" w:eastAsia="Times New Roman" w:cs="Times New Roman"/>
-                <w:i w:val="false"/>
-                <w:b w:val="false"/>
-                <w:u w:val="none"/>
-                <w:strike w:val="false"/>
-                <w:sz w:val="22"/>
-                <w:szCs w:val="22"/>
-                <w:color w:val="000000"/>
-              </w:rPr>
-              <w:t xml:space="preserve">Computer and Electrical Engineering    </w:t>
-            </w:r>
-          </w:p>
-        </w:tc>
-        <w:tc>
-          <w:tcPr>
-            <w:tcBorders>
-              <w:bottom w:val="none" w:sz="0" w:space="0" w:color="000000"/>
-              <w:top w:val="none" w:sz="0" w:space="0" w:color="000000"/>
-              <w:left w:val="none" w:sz="0" w:space="0" w:color="000000"/>
-              <w:right w:val="none" w:sz="0" w:space="0" w:color="000000"/>
-            </w:tcBorders>
-            <w:shd w:val="clear" w:color="auto" w:fill="FFFFFF"/>
-            <w:tcMar>
-              <w:top w:w="0" w:type="dxa"/>
-              <w:bottom w:w="0" w:type="dxa"/>
-              <w:left w:w="0" w:type="dxa"/>
-              <w:right w:w="0" w:type="dxa"/>
-            </w:tcMar>
-            <w:vAlign w:val="center"/>
-          </w:tcPr>
-          <w:p>
-            <w:pPr>
-              <w:jc w:val="left"/>
-              <w:pBdr>
-                <w:bottom w:val="none" w:sz="0" w:space="0" w:color="000000"/>
-                <w:top w:val="none" w:sz="0" w:space="0" w:color="000000"/>
-                <w:left w:val="none" w:sz="0" w:space="0" w:color="000000"/>
-                <w:right w:val="none" w:sz="0" w:space="0" w:color="000000"/>
-              </w:pBdr>
-              <w:spacing w:after="100" w:before="100" w:line="480"/>
-              <w:ind w:left="100" w:right="100" w:firstLine="0" w:firstLineChars="0"/>
-              <w:rPr>
-                <w:rFonts w:ascii="Times New Roman" w:hAnsi="Times New Roman" w:eastAsia="Times New Roman" w:cs="Times New Roman"/>
-                <w:i w:val="false"/>
-                <w:b w:val="false"/>
-                <w:u w:val="none"/>
-                <w:strike w:val="false"/>
-                <w:sz w:val="22"/>
-                <w:szCs w:val="22"/>
-                <w:color w:val="000000"/>
-              </w:rPr>
-            </w:pPr>
-            <w:r xmlns:w="http://schemas.openxmlformats.org/wordprocessingml/2006/main" xmlns:wp="http://schemas.openxmlformats.org/drawingml/2006/wordprocessingDrawing" xmlns:r="http://schemas.openxmlformats.org/officeDocument/2006/relationships" xmlns:w14="http://schemas.microsoft.com/office/word/2010/wordml">
-              <w:rPr>
-                <w:rFonts w:ascii="Times New Roman" w:hAnsi="Times New Roman" w:eastAsia="Times New Roman" w:cs="Times New Roman"/>
-                <w:i w:val="false"/>
-                <w:b w:val="false"/>
-                <w:u w:val="none"/>
-                <w:strike w:val="false"/>
-                <w:sz w:val="22"/>
-                <w:szCs w:val="22"/>
-                <w:color w:val="000000"/>
-              </w:rPr>
-              <w:t xml:space="preserve">2</w:t>
-            </w:r>
-          </w:p>
-        </w:tc>
-        <w:tc>
-          <w:tcPr>
-            <w:tcBorders>
-              <w:bottom w:val="none" w:sz="0" w:space="0" w:color="000000"/>
-              <w:top w:val="none" w:sz="0" w:space="0" w:color="000000"/>
-              <w:left w:val="none" w:sz="0" w:space="0" w:color="000000"/>
-              <w:right w:val="none" w:sz="0" w:space="0" w:color="000000"/>
-            </w:tcBorders>
-            <w:shd w:val="clear" w:color="auto" w:fill="FFFFFF"/>
-            <w:tcMar>
-              <w:top w:w="0" w:type="dxa"/>
-              <w:bottom w:w="0" w:type="dxa"/>
-              <w:left w:w="0" w:type="dxa"/>
-              <w:right w:w="0" w:type="dxa"/>
-            </w:tcMar>
-            <w:vAlign w:val="center"/>
-          </w:tcPr>
-          <w:p>
-            <w:pPr>
-              <w:jc w:val="left"/>
-              <w:pBdr>
-                <w:bottom w:val="none" w:sz="0" w:space="0" w:color="000000"/>
-                <w:top w:val="none" w:sz="0" w:space="0" w:color="000000"/>
-                <w:left w:val="none" w:sz="0" w:space="0" w:color="000000"/>
-                <w:right w:val="none" w:sz="0" w:space="0" w:color="000000"/>
-              </w:pBdr>
-              <w:spacing w:after="100" w:before="100" w:line="480"/>
-              <w:ind w:left="100" w:right="100" w:firstLine="0" w:firstLineChars="0"/>
-              <w:rPr>
-                <w:rFonts w:ascii="Times New Roman" w:hAnsi="Times New Roman" w:eastAsia="Times New Roman" w:cs="Times New Roman"/>
-                <w:i w:val="false"/>
-                <w:b w:val="false"/>
-                <w:u w:val="none"/>
-                <w:strike w:val="false"/>
-                <w:sz w:val="22"/>
-                <w:szCs w:val="22"/>
-                <w:color w:val="000000"/>
-              </w:rPr>
-            </w:pPr>
-            <w:r xmlns:w="http://schemas.openxmlformats.org/wordprocessingml/2006/main" xmlns:wp="http://schemas.openxmlformats.org/drawingml/2006/wordprocessingDrawing" xmlns:r="http://schemas.openxmlformats.org/officeDocument/2006/relationships" xmlns:w14="http://schemas.microsoft.com/office/word/2010/wordml">
-              <w:rPr>
-                <w:rFonts w:ascii="Times New Roman" w:hAnsi="Times New Roman" w:eastAsia="Times New Roman" w:cs="Times New Roman"/>
-                <w:i w:val="false"/>
-                <w:b w:val="false"/>
-                <w:u w:val="none"/>
-                <w:strike w:val="false"/>
-                <w:sz w:val="22"/>
-                <w:szCs w:val="22"/>
-                <w:color w:val="000000"/>
-              </w:rPr>
-              <w:t xml:space="preserve">1.61</w:t>
-            </w:r>
-          </w:p>
-        </w:tc>
-      </w:tr>
-      <w:tr>
-        <w:trPr>
-          <w:trHeight w:val="360" w:hRule="auto"/>
-        </w:trPr>
-        body 7
-        <w:tc>
-          <w:tcPr>
-            <w:tcBorders>
-              <w:bottom w:val="none" w:sz="0" w:space="0" w:color="000000"/>
-              <w:top w:val="none" w:sz="0" w:space="0" w:color="000000"/>
-              <w:left w:val="none" w:sz="0" w:space="0" w:color="000000"/>
-              <w:right w:val="none" w:sz="0" w:space="0" w:color="000000"/>
-            </w:tcBorders>
-            <w:shd w:val="clear" w:color="auto" w:fill="FFFFFF"/>
-            <w:tcMar>
-              <w:top w:w="0" w:type="dxa"/>
-              <w:bottom w:w="0" w:type="dxa"/>
-              <w:left w:w="0" w:type="dxa"/>
-              <w:right w:w="0" w:type="dxa"/>
-            </w:tcMar>
-            <w:vAlign w:val="center"/>
-          </w:tcPr>
-          <w:p>
-            <w:pPr>
-              <w:jc w:val="left"/>
-              <w:pBdr>
-                <w:bottom w:val="none" w:sz="0" w:space="0" w:color="000000"/>
-                <w:top w:val="none" w:sz="0" w:space="0" w:color="000000"/>
-                <w:left w:val="none" w:sz="0" w:space="0" w:color="000000"/>
-                <w:right w:val="none" w:sz="0" w:space="0" w:color="000000"/>
-              </w:pBdr>
-              <w:spacing w:after="100" w:before="100" w:line="480"/>
-              <w:ind w:left="100" w:right="100" w:firstLine="0" w:firstLineChars="0"/>
-              <w:rPr>
-                <w:rFonts w:ascii="Times New Roman" w:hAnsi="Times New Roman" w:eastAsia="Times New Roman" w:cs="Times New Roman"/>
-                <w:i w:val="false"/>
-                <w:b w:val="false"/>
-                <w:u w:val="none"/>
-                <w:strike w:val="false"/>
-                <w:sz w:val="22"/>
-                <w:szCs w:val="22"/>
-                <w:color w:val="000000"/>
-              </w:rPr>
-            </w:pPr>
-            <w:r xmlns:w="http://schemas.openxmlformats.org/wordprocessingml/2006/main" xmlns:wp="http://schemas.openxmlformats.org/drawingml/2006/wordprocessingDrawing" xmlns:r="http://schemas.openxmlformats.org/officeDocument/2006/relationships" xmlns:w14="http://schemas.microsoft.com/office/word/2010/wordml">
-              <w:rPr>
-                <w:rFonts w:ascii="Times New Roman" w:hAnsi="Times New Roman" w:eastAsia="Times New Roman" w:cs="Times New Roman"/>
-                <w:i w:val="false"/>
-                <w:b w:val="false"/>
-                <w:u w:val="none"/>
-                <w:strike w:val="false"/>
-                <w:sz w:val="22"/>
-                <w:szCs w:val="22"/>
-                <w:color w:val="000000"/>
-              </w:rPr>
-              <w:t xml:space="preserve">Construction   </w:t>
-            </w:r>
-          </w:p>
-        </w:tc>
-        <w:tc>
-          <w:tcPr>
-            <w:tcBorders>
-              <w:bottom w:val="none" w:sz="0" w:space="0" w:color="000000"/>
-              <w:top w:val="none" w:sz="0" w:space="0" w:color="000000"/>
-              <w:left w:val="none" w:sz="0" w:space="0" w:color="000000"/>
-              <w:right w:val="none" w:sz="0" w:space="0" w:color="000000"/>
-            </w:tcBorders>
-            <w:shd w:val="clear" w:color="auto" w:fill="FFFFFF"/>
-            <w:tcMar>
-              <w:top w:w="0" w:type="dxa"/>
-              <w:bottom w:w="0" w:type="dxa"/>
-              <w:left w:w="0" w:type="dxa"/>
-              <w:right w:w="0" w:type="dxa"/>
-            </w:tcMar>
-            <w:vAlign w:val="center"/>
-          </w:tcPr>
-          <w:p>
-            <w:pPr>
-              <w:jc w:val="left"/>
-              <w:pBdr>
-                <w:bottom w:val="none" w:sz="0" w:space="0" w:color="000000"/>
-                <w:top w:val="none" w:sz="0" w:space="0" w:color="000000"/>
-                <w:left w:val="none" w:sz="0" w:space="0" w:color="000000"/>
-                <w:right w:val="none" w:sz="0" w:space="0" w:color="000000"/>
-              </w:pBdr>
-              <w:spacing w:after="100" w:before="100" w:line="480"/>
-              <w:ind w:left="100" w:right="100" w:firstLine="0" w:firstLineChars="0"/>
-              <w:rPr>
-                <w:rFonts w:ascii="Times New Roman" w:hAnsi="Times New Roman" w:eastAsia="Times New Roman" w:cs="Times New Roman"/>
-                <w:i w:val="false"/>
-                <w:b w:val="false"/>
-                <w:u w:val="none"/>
-                <w:strike w:val="false"/>
-                <w:sz w:val="22"/>
-                <w:szCs w:val="22"/>
-                <w:color w:val="000000"/>
-              </w:rPr>
-            </w:pPr>
-            <w:r xmlns:w="http://schemas.openxmlformats.org/wordprocessingml/2006/main" xmlns:wp="http://schemas.openxmlformats.org/drawingml/2006/wordprocessingDrawing" xmlns:r="http://schemas.openxmlformats.org/officeDocument/2006/relationships" xmlns:w14="http://schemas.microsoft.com/office/word/2010/wordml">
-              <w:rPr>
-                <w:rFonts w:ascii="Times New Roman" w:hAnsi="Times New Roman" w:eastAsia="Times New Roman" w:cs="Times New Roman"/>
-                <w:i w:val="false"/>
-                <w:b w:val="false"/>
-                <w:u w:val="none"/>
-                <w:strike w:val="false"/>
-                <w:sz w:val="22"/>
-                <w:szCs w:val="22"/>
-                <w:color w:val="000000"/>
-              </w:rPr>
-              <w:t xml:space="preserve">19</w:t>
-            </w:r>
-          </w:p>
-        </w:tc>
-        <w:tc>
-          <w:tcPr>
-            <w:tcBorders>
-              <w:bottom w:val="none" w:sz="0" w:space="0" w:color="000000"/>
-              <w:top w:val="none" w:sz="0" w:space="0" w:color="000000"/>
-              <w:left w:val="none" w:sz="0" w:space="0" w:color="000000"/>
-              <w:right w:val="none" w:sz="0" w:space="0" w:color="000000"/>
-            </w:tcBorders>
-            <w:shd w:val="clear" w:color="auto" w:fill="FFFFFF"/>
-            <w:tcMar>
-              <w:top w:w="0" w:type="dxa"/>
-              <w:bottom w:w="0" w:type="dxa"/>
-              <w:left w:w="0" w:type="dxa"/>
-              <w:right w:w="0" w:type="dxa"/>
-            </w:tcMar>
-            <w:vAlign w:val="center"/>
-          </w:tcPr>
-          <w:p>
-            <w:pPr>
-              <w:jc w:val="left"/>
-              <w:pBdr>
-                <w:bottom w:val="none" w:sz="0" w:space="0" w:color="000000"/>
-                <w:top w:val="none" w:sz="0" w:space="0" w:color="000000"/>
-                <w:left w:val="none" w:sz="0" w:space="0" w:color="000000"/>
-                <w:right w:val="none" w:sz="0" w:space="0" w:color="000000"/>
-              </w:pBdr>
-              <w:spacing w:after="100" w:before="100" w:line="480"/>
-              <w:ind w:left="100" w:right="100" w:firstLine="0" w:firstLineChars="0"/>
-              <w:rPr>
-                <w:rFonts w:ascii="Times New Roman" w:hAnsi="Times New Roman" w:eastAsia="Times New Roman" w:cs="Times New Roman"/>
-                <w:i w:val="false"/>
-                <w:b w:val="false"/>
-                <w:u w:val="none"/>
-                <w:strike w:val="false"/>
-                <w:sz w:val="22"/>
-                <w:szCs w:val="22"/>
-                <w:color w:val="000000"/>
-              </w:rPr>
-            </w:pPr>
-            <w:r xmlns:w="http://schemas.openxmlformats.org/wordprocessingml/2006/main" xmlns:wp="http://schemas.openxmlformats.org/drawingml/2006/wordprocessingDrawing" xmlns:r="http://schemas.openxmlformats.org/officeDocument/2006/relationships" xmlns:w14="http://schemas.microsoft.com/office/word/2010/wordml">
-              <w:rPr>
-                <w:rFonts w:ascii="Times New Roman" w:hAnsi="Times New Roman" w:eastAsia="Times New Roman" w:cs="Times New Roman"/>
-                <w:i w:val="false"/>
-                <w:b w:val="false"/>
-                <w:u w:val="none"/>
-                <w:strike w:val="false"/>
-                <w:sz w:val="22"/>
-                <w:szCs w:val="22"/>
-                <w:color w:val="000000"/>
-              </w:rPr>
-              <w:t xml:space="preserve">15.32</w:t>
-            </w:r>
-          </w:p>
-        </w:tc>
-      </w:tr>
-      <w:tr>
-        <w:trPr>
-          <w:trHeight w:val="360" w:hRule="auto"/>
-        </w:trPr>
-        body 8
-        <w:tc>
-          <w:tcPr>
-            <w:tcBorders>
-              <w:bottom w:val="none" w:sz="0" w:space="0" w:color="000000"/>
-              <w:top w:val="none" w:sz="0" w:space="0" w:color="000000"/>
-              <w:left w:val="none" w:sz="0" w:space="0" w:color="000000"/>
-              <w:right w:val="none" w:sz="0" w:space="0" w:color="000000"/>
-            </w:tcBorders>
-            <w:shd w:val="clear" w:color="auto" w:fill="FFFFFF"/>
-            <w:tcMar>
-              <w:top w:w="0" w:type="dxa"/>
-              <w:bottom w:w="0" w:type="dxa"/>
-              <w:left w:w="0" w:type="dxa"/>
-              <w:right w:w="0" w:type="dxa"/>
-            </w:tcMar>
-            <w:vAlign w:val="center"/>
-          </w:tcPr>
-          <w:p>
-            <w:pPr>
-              <w:jc w:val="left"/>
-              <w:pBdr>
-                <w:bottom w:val="none" w:sz="0" w:space="0" w:color="000000"/>
-                <w:top w:val="none" w:sz="0" w:space="0" w:color="000000"/>
-                <w:left w:val="none" w:sz="0" w:space="0" w:color="000000"/>
-                <w:right w:val="none" w:sz="0" w:space="0" w:color="000000"/>
-              </w:pBdr>
-              <w:spacing w:after="100" w:before="100" w:line="480"/>
-              <w:ind w:left="100" w:right="100" w:firstLine="0" w:firstLineChars="0"/>
-              <w:rPr>
-                <w:rFonts w:ascii="Times New Roman" w:hAnsi="Times New Roman" w:eastAsia="Times New Roman" w:cs="Times New Roman"/>
-                <w:i w:val="false"/>
-                <w:b w:val="false"/>
-                <w:u w:val="none"/>
-                <w:strike w:val="false"/>
-                <w:sz w:val="22"/>
-                <w:szCs w:val="22"/>
-                <w:color w:val="000000"/>
-              </w:rPr>
-            </w:pPr>
-            <w:r xmlns:w="http://schemas.openxmlformats.org/wordprocessingml/2006/main" xmlns:wp="http://schemas.openxmlformats.org/drawingml/2006/wordprocessingDrawing" xmlns:r="http://schemas.openxmlformats.org/officeDocument/2006/relationships" xmlns:w14="http://schemas.microsoft.com/office/word/2010/wordml">
-              <w:rPr>
-                <w:rFonts w:ascii="Times New Roman" w:hAnsi="Times New Roman" w:eastAsia="Times New Roman" w:cs="Times New Roman"/>
-                <w:i w:val="false"/>
-                <w:b w:val="false"/>
-                <w:u w:val="none"/>
-                <w:strike w:val="false"/>
-                <w:sz w:val="22"/>
-                <w:szCs w:val="22"/>
-                <w:color w:val="000000"/>
-              </w:rPr>
-              <w:t xml:space="preserve">Criminal Justice &amp; Rehabilitation</w:t>
-            </w:r>
-          </w:p>
-        </w:tc>
-        <w:tc>
-          <w:tcPr>
-            <w:tcBorders>
-              <w:bottom w:val="none" w:sz="0" w:space="0" w:color="000000"/>
-              <w:top w:val="none" w:sz="0" w:space="0" w:color="000000"/>
-              <w:left w:val="none" w:sz="0" w:space="0" w:color="000000"/>
-              <w:right w:val="none" w:sz="0" w:space="0" w:color="000000"/>
-            </w:tcBorders>
-            <w:shd w:val="clear" w:color="auto" w:fill="FFFFFF"/>
-            <w:tcMar>
-              <w:top w:w="0" w:type="dxa"/>
-              <w:bottom w:w="0" w:type="dxa"/>
-              <w:left w:w="0" w:type="dxa"/>
-              <w:right w:w="0" w:type="dxa"/>
-            </w:tcMar>
-            <w:vAlign w:val="center"/>
-          </w:tcPr>
-          <w:p>
-            <w:pPr>
-              <w:jc w:val="left"/>
-              <w:pBdr>
-                <w:bottom w:val="none" w:sz="0" w:space="0" w:color="000000"/>
-                <w:top w:val="none" w:sz="0" w:space="0" w:color="000000"/>
-                <w:left w:val="none" w:sz="0" w:space="0" w:color="000000"/>
-                <w:right w:val="none" w:sz="0" w:space="0" w:color="000000"/>
-              </w:pBdr>
-              <w:spacing w:after="100" w:before="100" w:line="480"/>
-              <w:ind w:left="100" w:right="100" w:firstLine="0" w:firstLineChars="0"/>
-              <w:rPr>
-                <w:rFonts w:ascii="Times New Roman" w:hAnsi="Times New Roman" w:eastAsia="Times New Roman" w:cs="Times New Roman"/>
-                <w:i w:val="false"/>
-                <w:b w:val="false"/>
-                <w:u w:val="none"/>
-                <w:strike w:val="false"/>
-                <w:sz w:val="22"/>
-                <w:szCs w:val="22"/>
-                <w:color w:val="000000"/>
-              </w:rPr>
-            </w:pPr>
-            <w:r xmlns:w="http://schemas.openxmlformats.org/wordprocessingml/2006/main" xmlns:wp="http://schemas.openxmlformats.org/drawingml/2006/wordprocessingDrawing" xmlns:r="http://schemas.openxmlformats.org/officeDocument/2006/relationships" xmlns:w14="http://schemas.microsoft.com/office/word/2010/wordml">
-              <w:rPr>
-                <w:rFonts w:ascii="Times New Roman" w:hAnsi="Times New Roman" w:eastAsia="Times New Roman" w:cs="Times New Roman"/>
-                <w:i w:val="false"/>
-                <w:b w:val="false"/>
-                <w:u w:val="none"/>
-                <w:strike w:val="false"/>
-                <w:sz w:val="22"/>
-                <w:szCs w:val="22"/>
-                <w:color w:val="000000"/>
-              </w:rPr>
-              <w:t xml:space="preserve">8</w:t>
-            </w:r>
-          </w:p>
-        </w:tc>
-        <w:tc>
-          <w:tcPr>
-            <w:tcBorders>
-              <w:bottom w:val="none" w:sz="0" w:space="0" w:color="000000"/>
-              <w:top w:val="none" w:sz="0" w:space="0" w:color="000000"/>
-              <w:left w:val="none" w:sz="0" w:space="0" w:color="000000"/>
-              <w:right w:val="none" w:sz="0" w:space="0" w:color="000000"/>
-            </w:tcBorders>
-            <w:shd w:val="clear" w:color="auto" w:fill="FFFFFF"/>
-            <w:tcMar>
-              <w:top w:w="0" w:type="dxa"/>
-              <w:bottom w:w="0" w:type="dxa"/>
-              <w:left w:w="0" w:type="dxa"/>
-              <w:right w:w="0" w:type="dxa"/>
-            </w:tcMar>
-            <w:vAlign w:val="center"/>
-          </w:tcPr>
-          <w:p>
-            <w:pPr>
-              <w:jc w:val="left"/>
-              <w:pBdr>
-                <w:bottom w:val="none" w:sz="0" w:space="0" w:color="000000"/>
-                <w:top w:val="none" w:sz="0" w:space="0" w:color="000000"/>
-                <w:left w:val="none" w:sz="0" w:space="0" w:color="000000"/>
-                <w:right w:val="none" w:sz="0" w:space="0" w:color="000000"/>
-              </w:pBdr>
-              <w:spacing w:after="100" w:before="100" w:line="480"/>
-              <w:ind w:left="100" w:right="100" w:firstLine="0" w:firstLineChars="0"/>
-              <w:rPr>
-                <w:rFonts w:ascii="Times New Roman" w:hAnsi="Times New Roman" w:eastAsia="Times New Roman" w:cs="Times New Roman"/>
-                <w:i w:val="false"/>
-                <w:b w:val="false"/>
-                <w:u w:val="none"/>
-                <w:strike w:val="false"/>
-                <w:sz w:val="22"/>
-                <w:szCs w:val="22"/>
-                <w:color w:val="000000"/>
-              </w:rPr>
-            </w:pPr>
-            <w:r xmlns:w="http://schemas.openxmlformats.org/wordprocessingml/2006/main" xmlns:wp="http://schemas.openxmlformats.org/drawingml/2006/wordprocessingDrawing" xmlns:r="http://schemas.openxmlformats.org/officeDocument/2006/relationships" xmlns:w14="http://schemas.microsoft.com/office/word/2010/wordml">
-              <w:rPr>
-                <w:rFonts w:ascii="Times New Roman" w:hAnsi="Times New Roman" w:eastAsia="Times New Roman" w:cs="Times New Roman"/>
-                <w:i w:val="false"/>
-                <w:b w:val="false"/>
-                <w:u w:val="none"/>
-                <w:strike w:val="false"/>
-                <w:sz w:val="22"/>
-                <w:szCs w:val="22"/>
-                <w:color w:val="000000"/>
-              </w:rPr>
-              <w:t xml:space="preserve">6.45</w:t>
-            </w:r>
-          </w:p>
-        </w:tc>
-      </w:tr>
-      <w:tr>
-        <w:trPr>
-          <w:trHeight w:val="360" w:hRule="auto"/>
-        </w:trPr>
-        body 9
-        <w:tc>
-          <w:tcPr>
-            <w:tcBorders>
-              <w:bottom w:val="none" w:sz="0" w:space="0" w:color="000000"/>
-              <w:top w:val="none" w:sz="0" w:space="0" w:color="000000"/>
-              <w:left w:val="none" w:sz="0" w:space="0" w:color="000000"/>
-              <w:right w:val="none" w:sz="0" w:space="0" w:color="000000"/>
-            </w:tcBorders>
-            <w:shd w:val="clear" w:color="auto" w:fill="FFFFFF"/>
-            <w:tcMar>
-              <w:top w:w="0" w:type="dxa"/>
-              <w:bottom w:w="0" w:type="dxa"/>
-              <w:left w:w="0" w:type="dxa"/>
-              <w:right w:w="0" w:type="dxa"/>
-            </w:tcMar>
-            <w:vAlign w:val="center"/>
-          </w:tcPr>
-          <w:p>
-            <w:pPr>
-              <w:jc w:val="left"/>
-              <w:pBdr>
-                <w:bottom w:val="none" w:sz="0" w:space="0" w:color="000000"/>
-                <w:top w:val="none" w:sz="0" w:space="0" w:color="000000"/>
-                <w:left w:val="none" w:sz="0" w:space="0" w:color="000000"/>
-                <w:right w:val="none" w:sz="0" w:space="0" w:color="000000"/>
-              </w:pBdr>
-              <w:spacing w:after="100" w:before="100" w:line="480"/>
-              <w:ind w:left="100" w:right="100" w:firstLine="0" w:firstLineChars="0"/>
-              <w:rPr>
-                <w:rFonts w:ascii="Times New Roman" w:hAnsi="Times New Roman" w:eastAsia="Times New Roman" w:cs="Times New Roman"/>
-                <w:i w:val="false"/>
-                <w:b w:val="false"/>
-                <w:u w:val="none"/>
-                <w:strike w:val="false"/>
-                <w:sz w:val="22"/>
-                <w:szCs w:val="22"/>
-                <w:color w:val="000000"/>
-              </w:rPr>
-            </w:pPr>
-            <w:r xmlns:w="http://schemas.openxmlformats.org/wordprocessingml/2006/main" xmlns:wp="http://schemas.openxmlformats.org/drawingml/2006/wordprocessingDrawing" xmlns:r="http://schemas.openxmlformats.org/officeDocument/2006/relationships" xmlns:w14="http://schemas.microsoft.com/office/word/2010/wordml">
-              <w:rPr>
-                <w:rFonts w:ascii="Times New Roman" w:hAnsi="Times New Roman" w:eastAsia="Times New Roman" w:cs="Times New Roman"/>
-                <w:i w:val="false"/>
-                <w:b w:val="false"/>
-                <w:u w:val="none"/>
-                <w:strike w:val="false"/>
-                <w:sz w:val="22"/>
-                <w:szCs w:val="22"/>
-                <w:color w:val="000000"/>
-              </w:rPr>
-              <w:t xml:space="preserve">Dietetics   </w:t>
-            </w:r>
-          </w:p>
-        </w:tc>
-        <w:tc>
-          <w:tcPr>
-            <w:tcBorders>
-              <w:bottom w:val="none" w:sz="0" w:space="0" w:color="000000"/>
-              <w:top w:val="none" w:sz="0" w:space="0" w:color="000000"/>
-              <w:left w:val="none" w:sz="0" w:space="0" w:color="000000"/>
-              <w:right w:val="none" w:sz="0" w:space="0" w:color="000000"/>
-            </w:tcBorders>
-            <w:shd w:val="clear" w:color="auto" w:fill="FFFFFF"/>
-            <w:tcMar>
-              <w:top w:w="0" w:type="dxa"/>
-              <w:bottom w:w="0" w:type="dxa"/>
-              <w:left w:w="0" w:type="dxa"/>
-              <w:right w:w="0" w:type="dxa"/>
-            </w:tcMar>
-            <w:vAlign w:val="center"/>
-          </w:tcPr>
-          <w:p>
-            <w:pPr>
-              <w:jc w:val="left"/>
-              <w:pBdr>
-                <w:bottom w:val="none" w:sz="0" w:space="0" w:color="000000"/>
-                <w:top w:val="none" w:sz="0" w:space="0" w:color="000000"/>
-                <w:left w:val="none" w:sz="0" w:space="0" w:color="000000"/>
-                <w:right w:val="none" w:sz="0" w:space="0" w:color="000000"/>
-              </w:pBdr>
-              <w:spacing w:after="100" w:before="100" w:line="480"/>
-              <w:ind w:left="100" w:right="100" w:firstLine="0" w:firstLineChars="0"/>
-              <w:rPr>
-                <w:rFonts w:ascii="Times New Roman" w:hAnsi="Times New Roman" w:eastAsia="Times New Roman" w:cs="Times New Roman"/>
-                <w:i w:val="false"/>
-                <w:b w:val="false"/>
-                <w:u w:val="none"/>
-                <w:strike w:val="false"/>
-                <w:sz w:val="22"/>
-                <w:szCs w:val="22"/>
-                <w:color w:val="000000"/>
-              </w:rPr>
-            </w:pPr>
-            <w:r xmlns:w="http://schemas.openxmlformats.org/wordprocessingml/2006/main" xmlns:wp="http://schemas.openxmlformats.org/drawingml/2006/wordprocessingDrawing" xmlns:r="http://schemas.openxmlformats.org/officeDocument/2006/relationships" xmlns:w14="http://schemas.microsoft.com/office/word/2010/wordml">
-              <w:rPr>
-                <w:rFonts w:ascii="Times New Roman" w:hAnsi="Times New Roman" w:eastAsia="Times New Roman" w:cs="Times New Roman"/>
-                <w:i w:val="false"/>
-                <w:b w:val="false"/>
-                <w:u w:val="none"/>
-                <w:strike w:val="false"/>
-                <w:sz w:val="22"/>
-                <w:szCs w:val="22"/>
-                <w:color w:val="000000"/>
-              </w:rPr>
-              <w:t xml:space="preserve">4</w:t>
-            </w:r>
-          </w:p>
-        </w:tc>
-        <w:tc>
-          <w:tcPr>
-            <w:tcBorders>
-              <w:bottom w:val="none" w:sz="0" w:space="0" w:color="000000"/>
-              <w:top w:val="none" w:sz="0" w:space="0" w:color="000000"/>
-              <w:left w:val="none" w:sz="0" w:space="0" w:color="000000"/>
-              <w:right w:val="none" w:sz="0" w:space="0" w:color="000000"/>
-            </w:tcBorders>
-            <w:shd w:val="clear" w:color="auto" w:fill="FFFFFF"/>
-            <w:tcMar>
-              <w:top w:w="0" w:type="dxa"/>
-              <w:bottom w:w="0" w:type="dxa"/>
-              <w:left w:w="0" w:type="dxa"/>
-              <w:right w:w="0" w:type="dxa"/>
-            </w:tcMar>
-            <w:vAlign w:val="center"/>
-          </w:tcPr>
-          <w:p>
-            <w:pPr>
-              <w:jc w:val="left"/>
-              <w:pBdr>
-                <w:bottom w:val="none" w:sz="0" w:space="0" w:color="000000"/>
-                <w:top w:val="none" w:sz="0" w:space="0" w:color="000000"/>
-                <w:left w:val="none" w:sz="0" w:space="0" w:color="000000"/>
-                <w:right w:val="none" w:sz="0" w:space="0" w:color="000000"/>
-              </w:pBdr>
-              <w:spacing w:after="100" w:before="100" w:line="480"/>
-              <w:ind w:left="100" w:right="100" w:firstLine="0" w:firstLineChars="0"/>
-              <w:rPr>
-                <w:rFonts w:ascii="Times New Roman" w:hAnsi="Times New Roman" w:eastAsia="Times New Roman" w:cs="Times New Roman"/>
-                <w:i w:val="false"/>
-                <w:b w:val="false"/>
-                <w:u w:val="none"/>
-                <w:strike w:val="false"/>
-                <w:sz w:val="22"/>
-                <w:szCs w:val="22"/>
-                <w:color w:val="000000"/>
-              </w:rPr>
-            </w:pPr>
-            <w:r xmlns:w="http://schemas.openxmlformats.org/wordprocessingml/2006/main" xmlns:wp="http://schemas.openxmlformats.org/drawingml/2006/wordprocessingDrawing" xmlns:r="http://schemas.openxmlformats.org/officeDocument/2006/relationships" xmlns:w14="http://schemas.microsoft.com/office/word/2010/wordml">
-              <w:rPr>
-                <w:rFonts w:ascii="Times New Roman" w:hAnsi="Times New Roman" w:eastAsia="Times New Roman" w:cs="Times New Roman"/>
-                <w:i w:val="false"/>
-                <w:b w:val="false"/>
-                <w:u w:val="none"/>
-                <w:strike w:val="false"/>
-                <w:sz w:val="22"/>
-                <w:szCs w:val="22"/>
-                <w:color w:val="000000"/>
-              </w:rPr>
-              <w:t xml:space="preserve">3.23</w:t>
-            </w:r>
-          </w:p>
-        </w:tc>
-      </w:tr>
-      <w:tr>
-        <w:trPr>
-          <w:trHeight w:val="360" w:hRule="auto"/>
-        </w:trPr>
-        body10
-        <w:tc>
-          <w:tcPr>
-            <w:tcBorders>
-              <w:bottom w:val="none" w:sz="0" w:space="0" w:color="000000"/>
-              <w:top w:val="none" w:sz="0" w:space="0" w:color="000000"/>
-              <w:left w:val="none" w:sz="0" w:space="0" w:color="000000"/>
-              <w:right w:val="none" w:sz="0" w:space="0" w:color="000000"/>
-            </w:tcBorders>
-            <w:shd w:val="clear" w:color="auto" w:fill="FFFFFF"/>
-            <w:tcMar>
-              <w:top w:w="0" w:type="dxa"/>
-              <w:bottom w:w="0" w:type="dxa"/>
-              <w:left w:w="0" w:type="dxa"/>
-              <w:right w:w="0" w:type="dxa"/>
-            </w:tcMar>
-            <w:vAlign w:val="center"/>
-          </w:tcPr>
-          <w:p>
-            <w:pPr>
-              <w:jc w:val="left"/>
-              <w:pBdr>
-                <w:bottom w:val="none" w:sz="0" w:space="0" w:color="000000"/>
-                <w:top w:val="none" w:sz="0" w:space="0" w:color="000000"/>
-                <w:left w:val="none" w:sz="0" w:space="0" w:color="000000"/>
-                <w:right w:val="none" w:sz="0" w:space="0" w:color="000000"/>
-              </w:pBdr>
-              <w:spacing w:after="100" w:before="100" w:line="480"/>
-              <w:ind w:left="100" w:right="100" w:firstLine="0" w:firstLineChars="0"/>
-              <w:rPr>
-                <w:rFonts w:ascii="Times New Roman" w:hAnsi="Times New Roman" w:eastAsia="Times New Roman" w:cs="Times New Roman"/>
-                <w:i w:val="false"/>
-                <w:b w:val="false"/>
-                <w:u w:val="none"/>
-                <w:strike w:val="false"/>
-                <w:sz w:val="22"/>
-                <w:szCs w:val="22"/>
-                <w:color w:val="000000"/>
-              </w:rPr>
-            </w:pPr>
-            <w:r xmlns:w="http://schemas.openxmlformats.org/wordprocessingml/2006/main" xmlns:wp="http://schemas.openxmlformats.org/drawingml/2006/wordprocessingDrawing" xmlns:r="http://schemas.openxmlformats.org/officeDocument/2006/relationships" xmlns:w14="http://schemas.microsoft.com/office/word/2010/wordml">
-              <w:rPr>
-                <w:rFonts w:ascii="Times New Roman" w:hAnsi="Times New Roman" w:eastAsia="Times New Roman" w:cs="Times New Roman"/>
-                <w:i w:val="false"/>
-                <w:b w:val="false"/>
-                <w:u w:val="none"/>
-                <w:strike w:val="false"/>
-                <w:sz w:val="22"/>
-                <w:szCs w:val="22"/>
-                <w:color w:val="000000"/>
-              </w:rPr>
-              <w:t xml:space="preserve">Early Childhood Education   </w:t>
-            </w:r>
-          </w:p>
-        </w:tc>
-        <w:tc>
-          <w:tcPr>
-            <w:tcBorders>
-              <w:bottom w:val="none" w:sz="0" w:space="0" w:color="000000"/>
-              <w:top w:val="none" w:sz="0" w:space="0" w:color="000000"/>
-              <w:left w:val="none" w:sz="0" w:space="0" w:color="000000"/>
-              <w:right w:val="none" w:sz="0" w:space="0" w:color="000000"/>
-            </w:tcBorders>
-            <w:shd w:val="clear" w:color="auto" w:fill="FFFFFF"/>
-            <w:tcMar>
-              <w:top w:w="0" w:type="dxa"/>
-              <w:bottom w:w="0" w:type="dxa"/>
-              <w:left w:w="0" w:type="dxa"/>
-              <w:right w:w="0" w:type="dxa"/>
-            </w:tcMar>
-            <w:vAlign w:val="center"/>
-          </w:tcPr>
-          <w:p>
-            <w:pPr>
-              <w:jc w:val="left"/>
-              <w:pBdr>
-                <w:bottom w:val="none" w:sz="0" w:space="0" w:color="000000"/>
-                <w:top w:val="none" w:sz="0" w:space="0" w:color="000000"/>
-                <w:left w:val="none" w:sz="0" w:space="0" w:color="000000"/>
-                <w:right w:val="none" w:sz="0" w:space="0" w:color="000000"/>
-              </w:pBdr>
-              <w:spacing w:after="100" w:before="100" w:line="480"/>
-              <w:ind w:left="100" w:right="100" w:firstLine="0" w:firstLineChars="0"/>
-              <w:rPr>
-                <w:rFonts w:ascii="Times New Roman" w:hAnsi="Times New Roman" w:eastAsia="Times New Roman" w:cs="Times New Roman"/>
-                <w:i w:val="false"/>
-                <w:b w:val="false"/>
-                <w:u w:val="none"/>
-                <w:strike w:val="false"/>
-                <w:sz w:val="22"/>
-                <w:szCs w:val="22"/>
-                <w:color w:val="000000"/>
-              </w:rPr>
-            </w:pPr>
-            <w:r xmlns:w="http://schemas.openxmlformats.org/wordprocessingml/2006/main" xmlns:wp="http://schemas.openxmlformats.org/drawingml/2006/wordprocessingDrawing" xmlns:r="http://schemas.openxmlformats.org/officeDocument/2006/relationships" xmlns:w14="http://schemas.microsoft.com/office/word/2010/wordml">
-              <w:rPr>
-                <w:rFonts w:ascii="Times New Roman" w:hAnsi="Times New Roman" w:eastAsia="Times New Roman" w:cs="Times New Roman"/>
-                <w:i w:val="false"/>
-                <w:b w:val="false"/>
-                <w:u w:val="none"/>
-                <w:strike w:val="false"/>
-                <w:sz w:val="22"/>
-                <w:szCs w:val="22"/>
-                <w:color w:val="000000"/>
-              </w:rPr>
-              <w:t xml:space="preserve">1</w:t>
-            </w:r>
-          </w:p>
-        </w:tc>
-        <w:tc>
-          <w:tcPr>
-            <w:tcBorders>
-              <w:bottom w:val="none" w:sz="0" w:space="0" w:color="000000"/>
-              <w:top w:val="none" w:sz="0" w:space="0" w:color="000000"/>
-              <w:left w:val="none" w:sz="0" w:space="0" w:color="000000"/>
-              <w:right w:val="none" w:sz="0" w:space="0" w:color="000000"/>
-            </w:tcBorders>
-            <w:shd w:val="clear" w:color="auto" w:fill="FFFFFF"/>
-            <w:tcMar>
-              <w:top w:w="0" w:type="dxa"/>
-              <w:bottom w:w="0" w:type="dxa"/>
-              <w:left w:w="0" w:type="dxa"/>
-              <w:right w:w="0" w:type="dxa"/>
-            </w:tcMar>
-            <w:vAlign w:val="center"/>
-          </w:tcPr>
-          <w:p>
-            <w:pPr>
-              <w:jc w:val="left"/>
-              <w:pBdr>
-                <w:bottom w:val="none" w:sz="0" w:space="0" w:color="000000"/>
-                <w:top w:val="none" w:sz="0" w:space="0" w:color="000000"/>
-                <w:left w:val="none" w:sz="0" w:space="0" w:color="000000"/>
-                <w:right w:val="none" w:sz="0" w:space="0" w:color="000000"/>
-              </w:pBdr>
-              <w:spacing w:after="100" w:before="100" w:line="480"/>
-              <w:ind w:left="100" w:right="100" w:firstLine="0" w:firstLineChars="0"/>
-              <w:rPr>
-                <w:rFonts w:ascii="Times New Roman" w:hAnsi="Times New Roman" w:eastAsia="Times New Roman" w:cs="Times New Roman"/>
-                <w:i w:val="false"/>
-                <w:b w:val="false"/>
-                <w:u w:val="none"/>
-                <w:strike w:val="false"/>
-                <w:sz w:val="22"/>
-                <w:szCs w:val="22"/>
-                <w:color w:val="000000"/>
-              </w:rPr>
-            </w:pPr>
-            <w:r xmlns:w="http://schemas.openxmlformats.org/wordprocessingml/2006/main" xmlns:wp="http://schemas.openxmlformats.org/drawingml/2006/wordprocessingDrawing" xmlns:r="http://schemas.openxmlformats.org/officeDocument/2006/relationships" xmlns:w14="http://schemas.microsoft.com/office/word/2010/wordml">
-              <w:rPr>
-                <w:rFonts w:ascii="Times New Roman" w:hAnsi="Times New Roman" w:eastAsia="Times New Roman" w:cs="Times New Roman"/>
-                <w:i w:val="false"/>
-                <w:b w:val="false"/>
-                <w:u w:val="none"/>
-                <w:strike w:val="false"/>
-                <w:sz w:val="22"/>
-                <w:szCs w:val="22"/>
-                <w:color w:val="000000"/>
-              </w:rPr>
-              <w:t xml:space="preserve">0.81</w:t>
-            </w:r>
-          </w:p>
-        </w:tc>
-      </w:tr>
-      <w:tr>
-        <w:trPr>
-          <w:trHeight w:val="360" w:hRule="auto"/>
-        </w:trPr>
-        body11
-        <w:tc>
-          <w:tcPr>
-            <w:tcBorders>
-              <w:bottom w:val="none" w:sz="0" w:space="0" w:color="000000"/>
-              <w:top w:val="none" w:sz="0" w:space="0" w:color="000000"/>
-              <w:left w:val="none" w:sz="0" w:space="0" w:color="000000"/>
-              <w:right w:val="none" w:sz="0" w:space="0" w:color="000000"/>
-            </w:tcBorders>
-            <w:shd w:val="clear" w:color="auto" w:fill="FFFFFF"/>
-            <w:tcMar>
-              <w:top w:w="0" w:type="dxa"/>
-              <w:bottom w:w="0" w:type="dxa"/>
-              <w:left w:w="0" w:type="dxa"/>
-              <w:right w:w="0" w:type="dxa"/>
-            </w:tcMar>
-            <w:vAlign w:val="center"/>
-          </w:tcPr>
-          <w:p>
-            <w:pPr>
-              <w:jc w:val="left"/>
-              <w:pBdr>
-                <w:bottom w:val="none" w:sz="0" w:space="0" w:color="000000"/>
-                <w:top w:val="none" w:sz="0" w:space="0" w:color="000000"/>
-                <w:left w:val="none" w:sz="0" w:space="0" w:color="000000"/>
-                <w:right w:val="none" w:sz="0" w:space="0" w:color="000000"/>
-              </w:pBdr>
-              <w:spacing w:after="100" w:before="100" w:line="480"/>
-              <w:ind w:left="100" w:right="100" w:firstLine="0" w:firstLineChars="0"/>
-              <w:rPr>
-                <w:rFonts w:ascii="Times New Roman" w:hAnsi="Times New Roman" w:eastAsia="Times New Roman" w:cs="Times New Roman"/>
-                <w:i w:val="false"/>
-                <w:b w:val="false"/>
-                <w:u w:val="none"/>
-                <w:strike w:val="false"/>
-                <w:sz w:val="22"/>
-                <w:szCs w:val="22"/>
-                <w:color w:val="000000"/>
-              </w:rPr>
-            </w:pPr>
-            <w:r xmlns:w="http://schemas.openxmlformats.org/wordprocessingml/2006/main" xmlns:wp="http://schemas.openxmlformats.org/drawingml/2006/wordprocessingDrawing" xmlns:r="http://schemas.openxmlformats.org/officeDocument/2006/relationships" xmlns:w14="http://schemas.microsoft.com/office/word/2010/wordml">
-              <w:rPr>
-                <w:rFonts w:ascii="Times New Roman" w:hAnsi="Times New Roman" w:eastAsia="Times New Roman" w:cs="Times New Roman"/>
-                <w:i w:val="false"/>
-                <w:b w:val="false"/>
-                <w:u w:val="none"/>
-                <w:strike w:val="false"/>
-                <w:sz w:val="22"/>
-                <w:szCs w:val="22"/>
-                <w:color w:val="000000"/>
-              </w:rPr>
-              <w:t xml:space="preserve">Food Science &amp; Technology</w:t>
-            </w:r>
-          </w:p>
-        </w:tc>
-        <w:tc>
-          <w:tcPr>
-            <w:tcBorders>
-              <w:bottom w:val="none" w:sz="0" w:space="0" w:color="000000"/>
-              <w:top w:val="none" w:sz="0" w:space="0" w:color="000000"/>
-              <w:left w:val="none" w:sz="0" w:space="0" w:color="000000"/>
-              <w:right w:val="none" w:sz="0" w:space="0" w:color="000000"/>
-            </w:tcBorders>
-            <w:shd w:val="clear" w:color="auto" w:fill="FFFFFF"/>
-            <w:tcMar>
-              <w:top w:w="0" w:type="dxa"/>
-              <w:bottom w:w="0" w:type="dxa"/>
-              <w:left w:w="0" w:type="dxa"/>
-              <w:right w:w="0" w:type="dxa"/>
-            </w:tcMar>
-            <w:vAlign w:val="center"/>
-          </w:tcPr>
-          <w:p>
-            <w:pPr>
-              <w:jc w:val="left"/>
-              <w:pBdr>
-                <w:bottom w:val="none" w:sz="0" w:space="0" w:color="000000"/>
-                <w:top w:val="none" w:sz="0" w:space="0" w:color="000000"/>
-                <w:left w:val="none" w:sz="0" w:space="0" w:color="000000"/>
-                <w:right w:val="none" w:sz="0" w:space="0" w:color="000000"/>
-              </w:pBdr>
-              <w:spacing w:after="100" w:before="100" w:line="480"/>
-              <w:ind w:left="100" w:right="100" w:firstLine="0" w:firstLineChars="0"/>
-              <w:rPr>
-                <w:rFonts w:ascii="Times New Roman" w:hAnsi="Times New Roman" w:eastAsia="Times New Roman" w:cs="Times New Roman"/>
-                <w:i w:val="false"/>
-                <w:b w:val="false"/>
-                <w:u w:val="none"/>
-                <w:strike w:val="false"/>
-                <w:sz w:val="22"/>
-                <w:szCs w:val="22"/>
-                <w:color w:val="000000"/>
-              </w:rPr>
-            </w:pPr>
-            <w:r xmlns:w="http://schemas.openxmlformats.org/wordprocessingml/2006/main" xmlns:wp="http://schemas.openxmlformats.org/drawingml/2006/wordprocessingDrawing" xmlns:r="http://schemas.openxmlformats.org/officeDocument/2006/relationships" xmlns:w14="http://schemas.microsoft.com/office/word/2010/wordml">
-              <w:rPr>
-                <w:rFonts w:ascii="Times New Roman" w:hAnsi="Times New Roman" w:eastAsia="Times New Roman" w:cs="Times New Roman"/>
-                <w:i w:val="false"/>
-                <w:b w:val="false"/>
-                <w:u w:val="none"/>
-                <w:strike w:val="false"/>
-                <w:sz w:val="22"/>
-                <w:szCs w:val="22"/>
-                <w:color w:val="000000"/>
-              </w:rPr>
-              <w:t xml:space="preserve">1</w:t>
-            </w:r>
-          </w:p>
-        </w:tc>
-        <w:tc>
-          <w:tcPr>
-            <w:tcBorders>
-              <w:bottom w:val="none" w:sz="0" w:space="0" w:color="000000"/>
-              <w:top w:val="none" w:sz="0" w:space="0" w:color="000000"/>
-              <w:left w:val="none" w:sz="0" w:space="0" w:color="000000"/>
-              <w:right w:val="none" w:sz="0" w:space="0" w:color="000000"/>
-            </w:tcBorders>
-            <w:shd w:val="clear" w:color="auto" w:fill="FFFFFF"/>
-            <w:tcMar>
-              <w:top w:w="0" w:type="dxa"/>
-              <w:bottom w:w="0" w:type="dxa"/>
-              <w:left w:w="0" w:type="dxa"/>
-              <w:right w:w="0" w:type="dxa"/>
-            </w:tcMar>
-            <w:vAlign w:val="center"/>
-          </w:tcPr>
-          <w:p>
-            <w:pPr>
-              <w:jc w:val="left"/>
-              <w:pBdr>
-                <w:bottom w:val="none" w:sz="0" w:space="0" w:color="000000"/>
-                <w:top w:val="none" w:sz="0" w:space="0" w:color="000000"/>
-                <w:left w:val="none" w:sz="0" w:space="0" w:color="000000"/>
-                <w:right w:val="none" w:sz="0" w:space="0" w:color="000000"/>
-              </w:pBdr>
-              <w:spacing w:after="100" w:before="100" w:line="480"/>
-              <w:ind w:left="100" w:right="100" w:firstLine="0" w:firstLineChars="0"/>
-              <w:rPr>
-                <w:rFonts w:ascii="Times New Roman" w:hAnsi="Times New Roman" w:eastAsia="Times New Roman" w:cs="Times New Roman"/>
-                <w:i w:val="false"/>
-                <w:b w:val="false"/>
-                <w:u w:val="none"/>
-                <w:strike w:val="false"/>
-                <w:sz w:val="22"/>
-                <w:szCs w:val="22"/>
-                <w:color w:val="000000"/>
-              </w:rPr>
-            </w:pPr>
-            <w:r xmlns:w="http://schemas.openxmlformats.org/wordprocessingml/2006/main" xmlns:wp="http://schemas.openxmlformats.org/drawingml/2006/wordprocessingDrawing" xmlns:r="http://schemas.openxmlformats.org/officeDocument/2006/relationships" xmlns:w14="http://schemas.microsoft.com/office/word/2010/wordml">
-              <w:rPr>
-                <w:rFonts w:ascii="Times New Roman" w:hAnsi="Times New Roman" w:eastAsia="Times New Roman" w:cs="Times New Roman"/>
-                <w:i w:val="false"/>
-                <w:b w:val="false"/>
-                <w:u w:val="none"/>
-                <w:strike w:val="false"/>
-                <w:sz w:val="22"/>
-                <w:szCs w:val="22"/>
-                <w:color w:val="000000"/>
-              </w:rPr>
-              <w:t xml:space="preserve">0.81</w:t>
-            </w:r>
-          </w:p>
-        </w:tc>
-      </w:tr>
-      <w:tr>
-        <w:trPr>
-          <w:trHeight w:val="360" w:hRule="auto"/>
-        </w:trPr>
-        body12
-        <w:tc>
-          <w:tcPr>
-            <w:tcBorders>
-              <w:bottom w:val="none" w:sz="0" w:space="0" w:color="000000"/>
-              <w:top w:val="none" w:sz="0" w:space="0" w:color="000000"/>
-              <w:left w:val="none" w:sz="0" w:space="0" w:color="000000"/>
-              <w:right w:val="none" w:sz="0" w:space="0" w:color="000000"/>
-            </w:tcBorders>
-            <w:shd w:val="clear" w:color="auto" w:fill="FFFFFF"/>
-            <w:tcMar>
-              <w:top w:w="0" w:type="dxa"/>
-              <w:bottom w:w="0" w:type="dxa"/>
-              <w:left w:w="0" w:type="dxa"/>
-              <w:right w:w="0" w:type="dxa"/>
-            </w:tcMar>
-            <w:vAlign w:val="center"/>
-          </w:tcPr>
-          <w:p>
-            <w:pPr>
-              <w:jc w:val="left"/>
-              <w:pBdr>
-                <w:bottom w:val="none" w:sz="0" w:space="0" w:color="000000"/>
-                <w:top w:val="none" w:sz="0" w:space="0" w:color="000000"/>
-                <w:left w:val="none" w:sz="0" w:space="0" w:color="000000"/>
-                <w:right w:val="none" w:sz="0" w:space="0" w:color="000000"/>
-              </w:pBdr>
-              <w:spacing w:after="100" w:before="100" w:line="480"/>
-              <w:ind w:left="100" w:right="100" w:firstLine="0" w:firstLineChars="0"/>
-              <w:rPr>
-                <w:rFonts w:ascii="Times New Roman" w:hAnsi="Times New Roman" w:eastAsia="Times New Roman" w:cs="Times New Roman"/>
-                <w:i w:val="false"/>
-                <w:b w:val="false"/>
-                <w:u w:val="none"/>
-                <w:strike w:val="false"/>
-                <w:sz w:val="22"/>
-                <w:szCs w:val="22"/>
-                <w:color w:val="000000"/>
-              </w:rPr>
-            </w:pPr>
-            <w:r xmlns:w="http://schemas.openxmlformats.org/wordprocessingml/2006/main" xmlns:wp="http://schemas.openxmlformats.org/drawingml/2006/wordprocessingDrawing" xmlns:r="http://schemas.openxmlformats.org/officeDocument/2006/relationships" xmlns:w14="http://schemas.microsoft.com/office/word/2010/wordml">
-              <w:rPr>
-                <w:rFonts w:ascii="Times New Roman" w:hAnsi="Times New Roman" w:eastAsia="Times New Roman" w:cs="Times New Roman"/>
-                <w:i w:val="false"/>
-                <w:b w:val="false"/>
-                <w:u w:val="none"/>
-                <w:strike w:val="false"/>
-                <w:sz w:val="22"/>
-                <w:szCs w:val="22"/>
-                <w:color w:val="000000"/>
-              </w:rPr>
-              <w:t xml:space="preserve">Game, Design and Development</w:t>
-            </w:r>
-          </w:p>
-        </w:tc>
-        <w:tc>
-          <w:tcPr>
-            <w:tcBorders>
-              <w:bottom w:val="none" w:sz="0" w:space="0" w:color="000000"/>
-              <w:top w:val="none" w:sz="0" w:space="0" w:color="000000"/>
-              <w:left w:val="none" w:sz="0" w:space="0" w:color="000000"/>
-              <w:right w:val="none" w:sz="0" w:space="0" w:color="000000"/>
-            </w:tcBorders>
-            <w:shd w:val="clear" w:color="auto" w:fill="FFFFFF"/>
-            <w:tcMar>
-              <w:top w:w="0" w:type="dxa"/>
-              <w:bottom w:w="0" w:type="dxa"/>
-              <w:left w:w="0" w:type="dxa"/>
-              <w:right w:w="0" w:type="dxa"/>
-            </w:tcMar>
-            <w:vAlign w:val="center"/>
-          </w:tcPr>
-          <w:p>
-            <w:pPr>
-              <w:jc w:val="left"/>
-              <w:pBdr>
-                <w:bottom w:val="none" w:sz="0" w:space="0" w:color="000000"/>
-                <w:top w:val="none" w:sz="0" w:space="0" w:color="000000"/>
-                <w:left w:val="none" w:sz="0" w:space="0" w:color="000000"/>
-                <w:right w:val="none" w:sz="0" w:space="0" w:color="000000"/>
-              </w:pBdr>
-              <w:spacing w:after="100" w:before="100" w:line="480"/>
-              <w:ind w:left="100" w:right="100" w:firstLine="0" w:firstLineChars="0"/>
-              <w:rPr>
-                <w:rFonts w:ascii="Times New Roman" w:hAnsi="Times New Roman" w:eastAsia="Times New Roman" w:cs="Times New Roman"/>
-                <w:i w:val="false"/>
-                <w:b w:val="false"/>
-                <w:u w:val="none"/>
-                <w:strike w:val="false"/>
-                <w:sz w:val="22"/>
-                <w:szCs w:val="22"/>
-                <w:color w:val="000000"/>
-              </w:rPr>
-            </w:pPr>
-            <w:r xmlns:w="http://schemas.openxmlformats.org/wordprocessingml/2006/main" xmlns:wp="http://schemas.openxmlformats.org/drawingml/2006/wordprocessingDrawing" xmlns:r="http://schemas.openxmlformats.org/officeDocument/2006/relationships" xmlns:w14="http://schemas.microsoft.com/office/word/2010/wordml">
-              <w:rPr>
-                <w:rFonts w:ascii="Times New Roman" w:hAnsi="Times New Roman" w:eastAsia="Times New Roman" w:cs="Times New Roman"/>
-                <w:i w:val="false"/>
-                <w:b w:val="false"/>
-                <w:u w:val="none"/>
-                <w:strike w:val="false"/>
-                <w:sz w:val="22"/>
-                <w:szCs w:val="22"/>
-                <w:color w:val="000000"/>
-              </w:rPr>
-              <w:t xml:space="preserve">1</w:t>
-            </w:r>
-          </w:p>
-        </w:tc>
-        <w:tc>
-          <w:tcPr>
-            <w:tcBorders>
-              <w:bottom w:val="none" w:sz="0" w:space="0" w:color="000000"/>
-              <w:top w:val="none" w:sz="0" w:space="0" w:color="000000"/>
-              <w:left w:val="none" w:sz="0" w:space="0" w:color="000000"/>
-              <w:right w:val="none" w:sz="0" w:space="0" w:color="000000"/>
-            </w:tcBorders>
-            <w:shd w:val="clear" w:color="auto" w:fill="FFFFFF"/>
-            <w:tcMar>
-              <w:top w:w="0" w:type="dxa"/>
-              <w:bottom w:w="0" w:type="dxa"/>
-              <w:left w:w="0" w:type="dxa"/>
-              <w:right w:w="0" w:type="dxa"/>
-            </w:tcMar>
-            <w:vAlign w:val="center"/>
-          </w:tcPr>
-          <w:p>
-            <w:pPr>
-              <w:jc w:val="left"/>
-              <w:pBdr>
-                <w:bottom w:val="none" w:sz="0" w:space="0" w:color="000000"/>
-                <w:top w:val="none" w:sz="0" w:space="0" w:color="000000"/>
-                <w:left w:val="none" w:sz="0" w:space="0" w:color="000000"/>
-                <w:right w:val="none" w:sz="0" w:space="0" w:color="000000"/>
-              </w:pBdr>
-              <w:spacing w:after="100" w:before="100" w:line="480"/>
-              <w:ind w:left="100" w:right="100" w:firstLine="0" w:firstLineChars="0"/>
-              <w:rPr>
-                <w:rFonts w:ascii="Times New Roman" w:hAnsi="Times New Roman" w:eastAsia="Times New Roman" w:cs="Times New Roman"/>
-                <w:i w:val="false"/>
-                <w:b w:val="false"/>
-                <w:u w:val="none"/>
-                <w:strike w:val="false"/>
-                <w:sz w:val="22"/>
-                <w:szCs w:val="22"/>
-                <w:color w:val="000000"/>
-              </w:rPr>
-            </w:pPr>
-            <w:r xmlns:w="http://schemas.openxmlformats.org/wordprocessingml/2006/main" xmlns:wp="http://schemas.openxmlformats.org/drawingml/2006/wordprocessingDrawing" xmlns:r="http://schemas.openxmlformats.org/officeDocument/2006/relationships" xmlns:w14="http://schemas.microsoft.com/office/word/2010/wordml">
-              <w:rPr>
-                <w:rFonts w:ascii="Times New Roman" w:hAnsi="Times New Roman" w:eastAsia="Times New Roman" w:cs="Times New Roman"/>
-                <w:i w:val="false"/>
-                <w:b w:val="false"/>
-                <w:u w:val="none"/>
-                <w:strike w:val="false"/>
-                <w:sz w:val="22"/>
-                <w:szCs w:val="22"/>
-                <w:color w:val="000000"/>
-              </w:rPr>
-              <w:t xml:space="preserve">0.81</w:t>
-            </w:r>
-          </w:p>
-        </w:tc>
-      </w:tr>
-      <w:tr>
-        <w:trPr>
-          <w:trHeight w:val="360" w:hRule="auto"/>
-        </w:trPr>
-        body13
-        <w:tc>
-          <w:tcPr>
-            <w:tcBorders>
-              <w:bottom w:val="none" w:sz="0" w:space="0" w:color="000000"/>
-              <w:top w:val="none" w:sz="0" w:space="0" w:color="000000"/>
-              <w:left w:val="none" w:sz="0" w:space="0" w:color="000000"/>
-              <w:right w:val="none" w:sz="0" w:space="0" w:color="000000"/>
-            </w:tcBorders>
-            <w:shd w:val="clear" w:color="auto" w:fill="FFFFFF"/>
-            <w:tcMar>
-              <w:top w:w="0" w:type="dxa"/>
-              <w:bottom w:w="0" w:type="dxa"/>
-              <w:left w:w="0" w:type="dxa"/>
-              <w:right w:w="0" w:type="dxa"/>
-            </w:tcMar>
-            <w:vAlign w:val="center"/>
-          </w:tcPr>
-          <w:p>
-            <w:pPr>
-              <w:jc w:val="left"/>
-              <w:pBdr>
-                <w:bottom w:val="none" w:sz="0" w:space="0" w:color="000000"/>
-                <w:top w:val="none" w:sz="0" w:space="0" w:color="000000"/>
-                <w:left w:val="none" w:sz="0" w:space="0" w:color="000000"/>
-                <w:right w:val="none" w:sz="0" w:space="0" w:color="000000"/>
-              </w:pBdr>
-              <w:spacing w:after="100" w:before="100" w:line="480"/>
-              <w:ind w:left="100" w:right="100" w:firstLine="0" w:firstLineChars="0"/>
-              <w:rPr>
-                <w:rFonts w:ascii="Times New Roman" w:hAnsi="Times New Roman" w:eastAsia="Times New Roman" w:cs="Times New Roman"/>
-                <w:i w:val="false"/>
-                <w:b w:val="false"/>
-                <w:u w:val="none"/>
-                <w:strike w:val="false"/>
-                <w:sz w:val="22"/>
-                <w:szCs w:val="22"/>
-                <w:color w:val="000000"/>
-              </w:rPr>
-            </w:pPr>
-            <w:r xmlns:w="http://schemas.openxmlformats.org/wordprocessingml/2006/main" xmlns:wp="http://schemas.openxmlformats.org/drawingml/2006/wordprocessingDrawing" xmlns:r="http://schemas.openxmlformats.org/officeDocument/2006/relationships" xmlns:w14="http://schemas.microsoft.com/office/word/2010/wordml">
-              <w:rPr>
-                <w:rFonts w:ascii="Times New Roman" w:hAnsi="Times New Roman" w:eastAsia="Times New Roman" w:cs="Times New Roman"/>
-                <w:i w:val="false"/>
-                <w:b w:val="false"/>
-                <w:u w:val="none"/>
-                <w:strike w:val="false"/>
-                <w:sz w:val="22"/>
-                <w:szCs w:val="22"/>
-                <w:color w:val="000000"/>
-              </w:rPr>
-              <w:t xml:space="preserve">Graphic Design &amp; Interactive Media</w:t>
-            </w:r>
-          </w:p>
-        </w:tc>
-        <w:tc>
-          <w:tcPr>
-            <w:tcBorders>
-              <w:bottom w:val="none" w:sz="0" w:space="0" w:color="000000"/>
-              <w:top w:val="none" w:sz="0" w:space="0" w:color="000000"/>
-              <w:left w:val="none" w:sz="0" w:space="0" w:color="000000"/>
-              <w:right w:val="none" w:sz="0" w:space="0" w:color="000000"/>
-            </w:tcBorders>
-            <w:shd w:val="clear" w:color="auto" w:fill="FFFFFF"/>
-            <w:tcMar>
-              <w:top w:w="0" w:type="dxa"/>
-              <w:bottom w:w="0" w:type="dxa"/>
-              <w:left w:w="0" w:type="dxa"/>
-              <w:right w:w="0" w:type="dxa"/>
-            </w:tcMar>
-            <w:vAlign w:val="center"/>
-          </w:tcPr>
-          <w:p>
-            <w:pPr>
-              <w:jc w:val="left"/>
-              <w:pBdr>
-                <w:bottom w:val="none" w:sz="0" w:space="0" w:color="000000"/>
-                <w:top w:val="none" w:sz="0" w:space="0" w:color="000000"/>
-                <w:left w:val="none" w:sz="0" w:space="0" w:color="000000"/>
-                <w:right w:val="none" w:sz="0" w:space="0" w:color="000000"/>
-              </w:pBdr>
-              <w:spacing w:after="100" w:before="100" w:line="480"/>
-              <w:ind w:left="100" w:right="100" w:firstLine="0" w:firstLineChars="0"/>
-              <w:rPr>
-                <w:rFonts w:ascii="Times New Roman" w:hAnsi="Times New Roman" w:eastAsia="Times New Roman" w:cs="Times New Roman"/>
-                <w:i w:val="false"/>
-                <w:b w:val="false"/>
-                <w:u w:val="none"/>
-                <w:strike w:val="false"/>
-                <w:sz w:val="22"/>
-                <w:szCs w:val="22"/>
-                <w:color w:val="000000"/>
-              </w:rPr>
-            </w:pPr>
-            <w:r xmlns:w="http://schemas.openxmlformats.org/wordprocessingml/2006/main" xmlns:wp="http://schemas.openxmlformats.org/drawingml/2006/wordprocessingDrawing" xmlns:r="http://schemas.openxmlformats.org/officeDocument/2006/relationships" xmlns:w14="http://schemas.microsoft.com/office/word/2010/wordml">
-              <w:rPr>
-                <w:rFonts w:ascii="Times New Roman" w:hAnsi="Times New Roman" w:eastAsia="Times New Roman" w:cs="Times New Roman"/>
-                <w:i w:val="false"/>
-                <w:b w:val="false"/>
-                <w:u w:val="none"/>
-                <w:strike w:val="false"/>
-                <w:sz w:val="22"/>
-                <w:szCs w:val="22"/>
-                <w:color w:val="000000"/>
-              </w:rPr>
-              <w:t xml:space="preserve">2</w:t>
-            </w:r>
-          </w:p>
-        </w:tc>
-        <w:tc>
-          <w:tcPr>
-            <w:tcBorders>
-              <w:bottom w:val="none" w:sz="0" w:space="0" w:color="000000"/>
-              <w:top w:val="none" w:sz="0" w:space="0" w:color="000000"/>
-              <w:left w:val="none" w:sz="0" w:space="0" w:color="000000"/>
-              <w:right w:val="none" w:sz="0" w:space="0" w:color="000000"/>
-            </w:tcBorders>
-            <w:shd w:val="clear" w:color="auto" w:fill="FFFFFF"/>
-            <w:tcMar>
-              <w:top w:w="0" w:type="dxa"/>
-              <w:bottom w:w="0" w:type="dxa"/>
-              <w:left w:w="0" w:type="dxa"/>
-              <w:right w:w="0" w:type="dxa"/>
-            </w:tcMar>
-            <w:vAlign w:val="center"/>
-          </w:tcPr>
-          <w:p>
-            <w:pPr>
-              <w:jc w:val="left"/>
-              <w:pBdr>
-                <w:bottom w:val="none" w:sz="0" w:space="0" w:color="000000"/>
-                <w:top w:val="none" w:sz="0" w:space="0" w:color="000000"/>
-                <w:left w:val="none" w:sz="0" w:space="0" w:color="000000"/>
-                <w:right w:val="none" w:sz="0" w:space="0" w:color="000000"/>
-              </w:pBdr>
-              <w:spacing w:after="100" w:before="100" w:line="480"/>
-              <w:ind w:left="100" w:right="100" w:firstLine="0" w:firstLineChars="0"/>
-              <w:rPr>
-                <w:rFonts w:ascii="Times New Roman" w:hAnsi="Times New Roman" w:eastAsia="Times New Roman" w:cs="Times New Roman"/>
-                <w:i w:val="false"/>
-                <w:b w:val="false"/>
-                <w:u w:val="none"/>
-                <w:strike w:val="false"/>
-                <w:sz w:val="22"/>
-                <w:szCs w:val="22"/>
-                <w:color w:val="000000"/>
-              </w:rPr>
-            </w:pPr>
-            <w:r xmlns:w="http://schemas.openxmlformats.org/wordprocessingml/2006/main" xmlns:wp="http://schemas.openxmlformats.org/drawingml/2006/wordprocessingDrawing" xmlns:r="http://schemas.openxmlformats.org/officeDocument/2006/relationships" xmlns:w14="http://schemas.microsoft.com/office/word/2010/wordml">
-              <w:rPr>
-                <w:rFonts w:ascii="Times New Roman" w:hAnsi="Times New Roman" w:eastAsia="Times New Roman" w:cs="Times New Roman"/>
-                <w:i w:val="false"/>
-                <w:b w:val="false"/>
-                <w:u w:val="none"/>
-                <w:strike w:val="false"/>
-                <w:sz w:val="22"/>
-                <w:szCs w:val="22"/>
-                <w:color w:val="000000"/>
-              </w:rPr>
-              <w:t xml:space="preserve">1.61</w:t>
-            </w:r>
-          </w:p>
-        </w:tc>
-      </w:tr>
-      <w:tr>
-        <w:trPr>
-          <w:trHeight w:val="360" w:hRule="auto"/>
-        </w:trPr>
-        body14
-        <w:tc>
-          <w:tcPr>
-            <w:tcBorders>
-              <w:bottom w:val="none" w:sz="0" w:space="0" w:color="000000"/>
-              <w:top w:val="none" w:sz="0" w:space="0" w:color="000000"/>
-              <w:left w:val="none" w:sz="0" w:space="0" w:color="000000"/>
-              <w:right w:val="none" w:sz="0" w:space="0" w:color="000000"/>
-            </w:tcBorders>
-            <w:shd w:val="clear" w:color="auto" w:fill="FFFFFF"/>
-            <w:tcMar>
-              <w:top w:w="0" w:type="dxa"/>
-              <w:bottom w:w="0" w:type="dxa"/>
-              <w:left w:w="0" w:type="dxa"/>
-              <w:right w:w="0" w:type="dxa"/>
-            </w:tcMar>
-            <w:vAlign w:val="center"/>
-          </w:tcPr>
-          <w:p>
-            <w:pPr>
-              <w:jc w:val="left"/>
-              <w:pBdr>
-                <w:bottom w:val="none" w:sz="0" w:space="0" w:color="000000"/>
-                <w:top w:val="none" w:sz="0" w:space="0" w:color="000000"/>
-                <w:left w:val="none" w:sz="0" w:space="0" w:color="000000"/>
-                <w:right w:val="none" w:sz="0" w:space="0" w:color="000000"/>
-              </w:pBdr>
-              <w:spacing w:after="100" w:before="100" w:line="480"/>
-              <w:ind w:left="100" w:right="100" w:firstLine="0" w:firstLineChars="0"/>
-              <w:rPr>
-                <w:rFonts w:ascii="Times New Roman" w:hAnsi="Times New Roman" w:eastAsia="Times New Roman" w:cs="Times New Roman"/>
-                <w:i w:val="false"/>
-                <w:b w:val="false"/>
-                <w:u w:val="none"/>
-                <w:strike w:val="false"/>
-                <w:sz w:val="22"/>
-                <w:szCs w:val="22"/>
-                <w:color w:val="000000"/>
-              </w:rPr>
-            </w:pPr>
-            <w:r xmlns:w="http://schemas.openxmlformats.org/wordprocessingml/2006/main" xmlns:wp="http://schemas.openxmlformats.org/drawingml/2006/wordprocessingDrawing" xmlns:r="http://schemas.openxmlformats.org/officeDocument/2006/relationships" xmlns:w14="http://schemas.microsoft.com/office/word/2010/wordml">
-              <w:rPr>
-                <w:rFonts w:ascii="Times New Roman" w:hAnsi="Times New Roman" w:eastAsia="Times New Roman" w:cs="Times New Roman"/>
-                <w:i w:val="false"/>
-                <w:b w:val="false"/>
-                <w:u w:val="none"/>
-                <w:strike w:val="false"/>
-                <w:sz w:val="22"/>
-                <w:szCs w:val="22"/>
-                <w:color w:val="000000"/>
-              </w:rPr>
-              <w:t xml:space="preserve">Health, Wellness &amp; Fitness</w:t>
-            </w:r>
-          </w:p>
-        </w:tc>
-        <w:tc>
-          <w:tcPr>
-            <w:tcBorders>
-              <w:bottom w:val="none" w:sz="0" w:space="0" w:color="000000"/>
-              <w:top w:val="none" w:sz="0" w:space="0" w:color="000000"/>
-              <w:left w:val="none" w:sz="0" w:space="0" w:color="000000"/>
-              <w:right w:val="none" w:sz="0" w:space="0" w:color="000000"/>
-            </w:tcBorders>
-            <w:shd w:val="clear" w:color="auto" w:fill="FFFFFF"/>
-            <w:tcMar>
-              <w:top w:w="0" w:type="dxa"/>
-              <w:bottom w:w="0" w:type="dxa"/>
-              <w:left w:w="0" w:type="dxa"/>
-              <w:right w:w="0" w:type="dxa"/>
-            </w:tcMar>
-            <w:vAlign w:val="center"/>
-          </w:tcPr>
-          <w:p>
-            <w:pPr>
-              <w:jc w:val="left"/>
-              <w:pBdr>
-                <w:bottom w:val="none" w:sz="0" w:space="0" w:color="000000"/>
-                <w:top w:val="none" w:sz="0" w:space="0" w:color="000000"/>
-                <w:left w:val="none" w:sz="0" w:space="0" w:color="000000"/>
-                <w:right w:val="none" w:sz="0" w:space="0" w:color="000000"/>
-              </w:pBdr>
-              <w:spacing w:after="100" w:before="100" w:line="480"/>
-              <w:ind w:left="100" w:right="100" w:firstLine="0" w:firstLineChars="0"/>
-              <w:rPr>
-                <w:rFonts w:ascii="Times New Roman" w:hAnsi="Times New Roman" w:eastAsia="Times New Roman" w:cs="Times New Roman"/>
-                <w:i w:val="false"/>
-                <w:b w:val="false"/>
-                <w:u w:val="none"/>
-                <w:strike w:val="false"/>
-                <w:sz w:val="22"/>
-                <w:szCs w:val="22"/>
-                <w:color w:val="000000"/>
-              </w:rPr>
-            </w:pPr>
-            <w:r xmlns:w="http://schemas.openxmlformats.org/wordprocessingml/2006/main" xmlns:wp="http://schemas.openxmlformats.org/drawingml/2006/wordprocessingDrawing" xmlns:r="http://schemas.openxmlformats.org/officeDocument/2006/relationships" xmlns:w14="http://schemas.microsoft.com/office/word/2010/wordml">
-              <w:rPr>
-                <w:rFonts w:ascii="Times New Roman" w:hAnsi="Times New Roman" w:eastAsia="Times New Roman" w:cs="Times New Roman"/>
-                <w:i w:val="false"/>
-                <w:b w:val="false"/>
-                <w:u w:val="none"/>
-                <w:strike w:val="false"/>
-                <w:sz w:val="22"/>
-                <w:szCs w:val="22"/>
-                <w:color w:val="000000"/>
-              </w:rPr>
-              <w:t xml:space="preserve">1</w:t>
-            </w:r>
-          </w:p>
-        </w:tc>
-        <w:tc>
-          <w:tcPr>
-            <w:tcBorders>
-              <w:bottom w:val="none" w:sz="0" w:space="0" w:color="000000"/>
-              <w:top w:val="none" w:sz="0" w:space="0" w:color="000000"/>
-              <w:left w:val="none" w:sz="0" w:space="0" w:color="000000"/>
-              <w:right w:val="none" w:sz="0" w:space="0" w:color="000000"/>
-            </w:tcBorders>
-            <w:shd w:val="clear" w:color="auto" w:fill="FFFFFF"/>
-            <w:tcMar>
-              <w:top w:w="0" w:type="dxa"/>
-              <w:bottom w:w="0" w:type="dxa"/>
-              <w:left w:w="0" w:type="dxa"/>
-              <w:right w:w="0" w:type="dxa"/>
-            </w:tcMar>
-            <w:vAlign w:val="center"/>
-          </w:tcPr>
-          <w:p>
-            <w:pPr>
-              <w:jc w:val="left"/>
-              <w:pBdr>
-                <w:bottom w:val="none" w:sz="0" w:space="0" w:color="000000"/>
-                <w:top w:val="none" w:sz="0" w:space="0" w:color="000000"/>
-                <w:left w:val="none" w:sz="0" w:space="0" w:color="000000"/>
-                <w:right w:val="none" w:sz="0" w:space="0" w:color="000000"/>
-              </w:pBdr>
-              <w:spacing w:after="100" w:before="100" w:line="480"/>
-              <w:ind w:left="100" w:right="100" w:firstLine="0" w:firstLineChars="0"/>
-              <w:rPr>
-                <w:rFonts w:ascii="Times New Roman" w:hAnsi="Times New Roman" w:eastAsia="Times New Roman" w:cs="Times New Roman"/>
-                <w:i w:val="false"/>
-                <w:b w:val="false"/>
-                <w:u w:val="none"/>
-                <w:strike w:val="false"/>
-                <w:sz w:val="22"/>
-                <w:szCs w:val="22"/>
-                <w:color w:val="000000"/>
-              </w:rPr>
-            </w:pPr>
-            <w:r xmlns:w="http://schemas.openxmlformats.org/wordprocessingml/2006/main" xmlns:wp="http://schemas.openxmlformats.org/drawingml/2006/wordprocessingDrawing" xmlns:r="http://schemas.openxmlformats.org/officeDocument/2006/relationships" xmlns:w14="http://schemas.microsoft.com/office/word/2010/wordml">
-              <w:rPr>
-                <w:rFonts w:ascii="Times New Roman" w:hAnsi="Times New Roman" w:eastAsia="Times New Roman" w:cs="Times New Roman"/>
-                <w:i w:val="false"/>
-                <w:b w:val="false"/>
-                <w:u w:val="none"/>
-                <w:strike w:val="false"/>
-                <w:sz w:val="22"/>
-                <w:szCs w:val="22"/>
-                <w:color w:val="000000"/>
-              </w:rPr>
-              <w:t xml:space="preserve">0.81</w:t>
-            </w:r>
-          </w:p>
-        </w:tc>
-      </w:tr>
-      <w:tr>
-        <w:trPr>
-          <w:trHeight w:val="360" w:hRule="auto"/>
-        </w:trPr>
-        body15
-        <w:tc>
-          <w:tcPr>
-            <w:tcBorders>
-              <w:bottom w:val="none" w:sz="0" w:space="0" w:color="000000"/>
-              <w:top w:val="none" w:sz="0" w:space="0" w:color="000000"/>
-              <w:left w:val="none" w:sz="0" w:space="0" w:color="000000"/>
-              <w:right w:val="none" w:sz="0" w:space="0" w:color="000000"/>
-            </w:tcBorders>
-            <w:shd w:val="clear" w:color="auto" w:fill="FFFFFF"/>
-            <w:tcMar>
-              <w:top w:w="0" w:type="dxa"/>
-              <w:bottom w:w="0" w:type="dxa"/>
-              <w:left w:w="0" w:type="dxa"/>
-              <w:right w:w="0" w:type="dxa"/>
-            </w:tcMar>
-            <w:vAlign w:val="center"/>
-          </w:tcPr>
-          <w:p>
-            <w:pPr>
-              <w:jc w:val="left"/>
-              <w:pBdr>
-                <w:bottom w:val="none" w:sz="0" w:space="0" w:color="000000"/>
-                <w:top w:val="none" w:sz="0" w:space="0" w:color="000000"/>
-                <w:left w:val="none" w:sz="0" w:space="0" w:color="000000"/>
-                <w:right w:val="none" w:sz="0" w:space="0" w:color="000000"/>
-              </w:pBdr>
-              <w:spacing w:after="100" w:before="100" w:line="480"/>
-              <w:ind w:left="100" w:right="100" w:firstLine="0" w:firstLineChars="0"/>
-              <w:rPr>
-                <w:rFonts w:ascii="Times New Roman" w:hAnsi="Times New Roman" w:eastAsia="Times New Roman" w:cs="Times New Roman"/>
-                <w:i w:val="false"/>
-                <w:b w:val="false"/>
-                <w:u w:val="none"/>
-                <w:strike w:val="false"/>
-                <w:sz w:val="22"/>
-                <w:szCs w:val="22"/>
-                <w:color w:val="000000"/>
-              </w:rPr>
-            </w:pPr>
-            <w:r xmlns:w="http://schemas.openxmlformats.org/wordprocessingml/2006/main" xmlns:wp="http://schemas.openxmlformats.org/drawingml/2006/wordprocessingDrawing" xmlns:r="http://schemas.openxmlformats.org/officeDocument/2006/relationships" xmlns:w14="http://schemas.microsoft.com/office/word/2010/wordml">
-              <w:rPr>
-                <w:rFonts w:ascii="Times New Roman" w:hAnsi="Times New Roman" w:eastAsia="Times New Roman" w:cs="Times New Roman"/>
-                <w:i w:val="false"/>
-                <w:b w:val="false"/>
-                <w:u w:val="none"/>
-                <w:strike w:val="false"/>
-                <w:sz w:val="22"/>
-                <w:szCs w:val="22"/>
-                <w:color w:val="000000"/>
-              </w:rPr>
-              <w:t xml:space="preserve">Human Development &amp; Family Studies</w:t>
-            </w:r>
-          </w:p>
-        </w:tc>
-        <w:tc>
-          <w:tcPr>
-            <w:tcBorders>
-              <w:bottom w:val="none" w:sz="0" w:space="0" w:color="000000"/>
-              <w:top w:val="none" w:sz="0" w:space="0" w:color="000000"/>
-              <w:left w:val="none" w:sz="0" w:space="0" w:color="000000"/>
-              <w:right w:val="none" w:sz="0" w:space="0" w:color="000000"/>
-            </w:tcBorders>
-            <w:shd w:val="clear" w:color="auto" w:fill="FFFFFF"/>
-            <w:tcMar>
-              <w:top w:w="0" w:type="dxa"/>
-              <w:bottom w:w="0" w:type="dxa"/>
-              <w:left w:w="0" w:type="dxa"/>
-              <w:right w:w="0" w:type="dxa"/>
-            </w:tcMar>
-            <w:vAlign w:val="center"/>
-          </w:tcPr>
-          <w:p>
-            <w:pPr>
-              <w:jc w:val="left"/>
-              <w:pBdr>
-                <w:bottom w:val="none" w:sz="0" w:space="0" w:color="000000"/>
-                <w:top w:val="none" w:sz="0" w:space="0" w:color="000000"/>
-                <w:left w:val="none" w:sz="0" w:space="0" w:color="000000"/>
-                <w:right w:val="none" w:sz="0" w:space="0" w:color="000000"/>
-              </w:pBdr>
-              <w:spacing w:after="100" w:before="100" w:line="480"/>
-              <w:ind w:left="100" w:right="100" w:firstLine="0" w:firstLineChars="0"/>
-              <w:rPr>
-                <w:rFonts w:ascii="Times New Roman" w:hAnsi="Times New Roman" w:eastAsia="Times New Roman" w:cs="Times New Roman"/>
-                <w:i w:val="false"/>
-                <w:b w:val="false"/>
-                <w:u w:val="none"/>
-                <w:strike w:val="false"/>
-                <w:sz w:val="22"/>
-                <w:szCs w:val="22"/>
-                <w:color w:val="000000"/>
-              </w:rPr>
-            </w:pPr>
-            <w:r xmlns:w="http://schemas.openxmlformats.org/wordprocessingml/2006/main" xmlns:wp="http://schemas.openxmlformats.org/drawingml/2006/wordprocessingDrawing" xmlns:r="http://schemas.openxmlformats.org/officeDocument/2006/relationships" xmlns:w14="http://schemas.microsoft.com/office/word/2010/wordml">
-              <w:rPr>
-                <w:rFonts w:ascii="Times New Roman" w:hAnsi="Times New Roman" w:eastAsia="Times New Roman" w:cs="Times New Roman"/>
-                <w:i w:val="false"/>
-                <w:b w:val="false"/>
-                <w:u w:val="none"/>
-                <w:strike w:val="false"/>
-                <w:sz w:val="22"/>
-                <w:szCs w:val="22"/>
-                <w:color w:val="000000"/>
-              </w:rPr>
-              <w:t xml:space="preserve">1</w:t>
-            </w:r>
-          </w:p>
-        </w:tc>
-        <w:tc>
-          <w:tcPr>
-            <w:tcBorders>
-              <w:bottom w:val="none" w:sz="0" w:space="0" w:color="000000"/>
-              <w:top w:val="none" w:sz="0" w:space="0" w:color="000000"/>
-              <w:left w:val="none" w:sz="0" w:space="0" w:color="000000"/>
-              <w:right w:val="none" w:sz="0" w:space="0" w:color="000000"/>
-            </w:tcBorders>
-            <w:shd w:val="clear" w:color="auto" w:fill="FFFFFF"/>
-            <w:tcMar>
-              <w:top w:w="0" w:type="dxa"/>
-              <w:bottom w:w="0" w:type="dxa"/>
-              <w:left w:w="0" w:type="dxa"/>
-              <w:right w:w="0" w:type="dxa"/>
-            </w:tcMar>
-            <w:vAlign w:val="center"/>
-          </w:tcPr>
-          <w:p>
-            <w:pPr>
-              <w:jc w:val="left"/>
-              <w:pBdr>
-                <w:bottom w:val="none" w:sz="0" w:space="0" w:color="000000"/>
-                <w:top w:val="none" w:sz="0" w:space="0" w:color="000000"/>
-                <w:left w:val="none" w:sz="0" w:space="0" w:color="000000"/>
-                <w:right w:val="none" w:sz="0" w:space="0" w:color="000000"/>
-              </w:pBdr>
-              <w:spacing w:after="100" w:before="100" w:line="480"/>
-              <w:ind w:left="100" w:right="100" w:firstLine="0" w:firstLineChars="0"/>
-              <w:rPr>
-                <w:rFonts w:ascii="Times New Roman" w:hAnsi="Times New Roman" w:eastAsia="Times New Roman" w:cs="Times New Roman"/>
-                <w:i w:val="false"/>
-                <w:b w:val="false"/>
-                <w:u w:val="none"/>
-                <w:strike w:val="false"/>
-                <w:sz w:val="22"/>
-                <w:szCs w:val="22"/>
-                <w:color w:val="000000"/>
-              </w:rPr>
-            </w:pPr>
-            <w:r xmlns:w="http://schemas.openxmlformats.org/wordprocessingml/2006/main" xmlns:wp="http://schemas.openxmlformats.org/drawingml/2006/wordprocessingDrawing" xmlns:r="http://schemas.openxmlformats.org/officeDocument/2006/relationships" xmlns:w14="http://schemas.microsoft.com/office/word/2010/wordml">
-              <w:rPr>
-                <w:rFonts w:ascii="Times New Roman" w:hAnsi="Times New Roman" w:eastAsia="Times New Roman" w:cs="Times New Roman"/>
-                <w:i w:val="false"/>
-                <w:b w:val="false"/>
-                <w:u w:val="none"/>
-                <w:strike w:val="false"/>
-                <w:sz w:val="22"/>
-                <w:szCs w:val="22"/>
-                <w:color w:val="000000"/>
-              </w:rPr>
-              <w:t xml:space="preserve">0.81</w:t>
-            </w:r>
-          </w:p>
-        </w:tc>
-      </w:tr>
-      <w:tr>
-        <w:trPr>
-          <w:trHeight w:val="360" w:hRule="auto"/>
-        </w:trPr>
-        body16
-        <w:tc>
-          <w:tcPr>
-            <w:tcBorders>
-              <w:bottom w:val="none" w:sz="0" w:space="0" w:color="000000"/>
-              <w:top w:val="none" w:sz="0" w:space="0" w:color="000000"/>
-              <w:left w:val="none" w:sz="0" w:space="0" w:color="000000"/>
-              <w:right w:val="none" w:sz="0" w:space="0" w:color="000000"/>
-            </w:tcBorders>
-            <w:shd w:val="clear" w:color="auto" w:fill="FFFFFF"/>
-            <w:tcMar>
-              <w:top w:w="0" w:type="dxa"/>
-              <w:bottom w:w="0" w:type="dxa"/>
-              <w:left w:w="0" w:type="dxa"/>
-              <w:right w:w="0" w:type="dxa"/>
-            </w:tcMar>
-            <w:vAlign w:val="center"/>
-          </w:tcPr>
-          <w:p>
-            <w:pPr>
-              <w:jc w:val="left"/>
-              <w:pBdr>
-                <w:bottom w:val="none" w:sz="0" w:space="0" w:color="000000"/>
-                <w:top w:val="none" w:sz="0" w:space="0" w:color="000000"/>
-                <w:left w:val="none" w:sz="0" w:space="0" w:color="000000"/>
-                <w:right w:val="none" w:sz="0" w:space="0" w:color="000000"/>
-              </w:pBdr>
-              <w:spacing w:after="100" w:before="100" w:line="480"/>
-              <w:ind w:left="100" w:right="100" w:firstLine="0" w:firstLineChars="0"/>
-              <w:rPr>
-                <w:rFonts w:ascii="Times New Roman" w:hAnsi="Times New Roman" w:eastAsia="Times New Roman" w:cs="Times New Roman"/>
-                <w:i w:val="false"/>
-                <w:b w:val="false"/>
-                <w:u w:val="none"/>
-                <w:strike w:val="false"/>
-                <w:sz w:val="22"/>
-                <w:szCs w:val="22"/>
-                <w:color w:val="000000"/>
-              </w:rPr>
-            </w:pPr>
-            <w:r xmlns:w="http://schemas.openxmlformats.org/wordprocessingml/2006/main" xmlns:wp="http://schemas.openxmlformats.org/drawingml/2006/wordprocessingDrawing" xmlns:r="http://schemas.openxmlformats.org/officeDocument/2006/relationships" xmlns:w14="http://schemas.microsoft.com/office/word/2010/wordml">
-              <w:rPr>
-                <w:rFonts w:ascii="Times New Roman" w:hAnsi="Times New Roman" w:eastAsia="Times New Roman" w:cs="Times New Roman"/>
-                <w:i w:val="false"/>
-                <w:b w:val="false"/>
-                <w:u w:val="none"/>
-                <w:strike w:val="false"/>
-                <w:sz w:val="22"/>
-                <w:szCs w:val="22"/>
-                <w:color w:val="000000"/>
-              </w:rPr>
-              <w:t xml:space="preserve">Information &amp; Communication Technology  </w:t>
-            </w:r>
-          </w:p>
-        </w:tc>
-        <w:tc>
-          <w:tcPr>
-            <w:tcBorders>
-              <w:bottom w:val="none" w:sz="0" w:space="0" w:color="000000"/>
-              <w:top w:val="none" w:sz="0" w:space="0" w:color="000000"/>
-              <w:left w:val="none" w:sz="0" w:space="0" w:color="000000"/>
-              <w:right w:val="none" w:sz="0" w:space="0" w:color="000000"/>
-            </w:tcBorders>
-            <w:shd w:val="clear" w:color="auto" w:fill="FFFFFF"/>
-            <w:tcMar>
-              <w:top w:w="0" w:type="dxa"/>
-              <w:bottom w:w="0" w:type="dxa"/>
-              <w:left w:w="0" w:type="dxa"/>
-              <w:right w:w="0" w:type="dxa"/>
-            </w:tcMar>
-            <w:vAlign w:val="center"/>
-          </w:tcPr>
-          <w:p>
-            <w:pPr>
-              <w:jc w:val="left"/>
-              <w:pBdr>
-                <w:bottom w:val="none" w:sz="0" w:space="0" w:color="000000"/>
-                <w:top w:val="none" w:sz="0" w:space="0" w:color="000000"/>
-                <w:left w:val="none" w:sz="0" w:space="0" w:color="000000"/>
-                <w:right w:val="none" w:sz="0" w:space="0" w:color="000000"/>
-              </w:pBdr>
-              <w:spacing w:after="100" w:before="100" w:line="480"/>
-              <w:ind w:left="100" w:right="100" w:firstLine="0" w:firstLineChars="0"/>
-              <w:rPr>
-                <w:rFonts w:ascii="Times New Roman" w:hAnsi="Times New Roman" w:eastAsia="Times New Roman" w:cs="Times New Roman"/>
-                <w:i w:val="false"/>
-                <w:b w:val="false"/>
-                <w:u w:val="none"/>
-                <w:strike w:val="false"/>
-                <w:sz w:val="22"/>
-                <w:szCs w:val="22"/>
-                <w:color w:val="000000"/>
-              </w:rPr>
-            </w:pPr>
-            <w:r xmlns:w="http://schemas.openxmlformats.org/wordprocessingml/2006/main" xmlns:wp="http://schemas.openxmlformats.org/drawingml/2006/wordprocessingDrawing" xmlns:r="http://schemas.openxmlformats.org/officeDocument/2006/relationships" xmlns:w14="http://schemas.microsoft.com/office/word/2010/wordml">
-              <w:rPr>
-                <w:rFonts w:ascii="Times New Roman" w:hAnsi="Times New Roman" w:eastAsia="Times New Roman" w:cs="Times New Roman"/>
-                <w:i w:val="false"/>
-                <w:b w:val="false"/>
-                <w:u w:val="none"/>
-                <w:strike w:val="false"/>
-                <w:sz w:val="22"/>
-                <w:szCs w:val="22"/>
-                <w:color w:val="000000"/>
-              </w:rPr>
-              <w:t xml:space="preserve">1</w:t>
-            </w:r>
-          </w:p>
-        </w:tc>
-        <w:tc>
-          <w:tcPr>
-            <w:tcBorders>
-              <w:bottom w:val="none" w:sz="0" w:space="0" w:color="000000"/>
-              <w:top w:val="none" w:sz="0" w:space="0" w:color="000000"/>
-              <w:left w:val="none" w:sz="0" w:space="0" w:color="000000"/>
-              <w:right w:val="none" w:sz="0" w:space="0" w:color="000000"/>
-            </w:tcBorders>
-            <w:shd w:val="clear" w:color="auto" w:fill="FFFFFF"/>
-            <w:tcMar>
-              <w:top w:w="0" w:type="dxa"/>
-              <w:bottom w:w="0" w:type="dxa"/>
-              <w:left w:w="0" w:type="dxa"/>
-              <w:right w:w="0" w:type="dxa"/>
-            </w:tcMar>
-            <w:vAlign w:val="center"/>
-          </w:tcPr>
-          <w:p>
-            <w:pPr>
-              <w:jc w:val="left"/>
-              <w:pBdr>
-                <w:bottom w:val="none" w:sz="0" w:space="0" w:color="000000"/>
-                <w:top w:val="none" w:sz="0" w:space="0" w:color="000000"/>
-                <w:left w:val="none" w:sz="0" w:space="0" w:color="000000"/>
-                <w:right w:val="none" w:sz="0" w:space="0" w:color="000000"/>
-              </w:pBdr>
-              <w:spacing w:after="100" w:before="100" w:line="480"/>
-              <w:ind w:left="100" w:right="100" w:firstLine="0" w:firstLineChars="0"/>
-              <w:rPr>
-                <w:rFonts w:ascii="Times New Roman" w:hAnsi="Times New Roman" w:eastAsia="Times New Roman" w:cs="Times New Roman"/>
-                <w:i w:val="false"/>
-                <w:b w:val="false"/>
-                <w:u w:val="none"/>
-                <w:strike w:val="false"/>
-                <w:sz w:val="22"/>
-                <w:szCs w:val="22"/>
-                <w:color w:val="000000"/>
-              </w:rPr>
-            </w:pPr>
-            <w:r xmlns:w="http://schemas.openxmlformats.org/wordprocessingml/2006/main" xmlns:wp="http://schemas.openxmlformats.org/drawingml/2006/wordprocessingDrawing" xmlns:r="http://schemas.openxmlformats.org/officeDocument/2006/relationships" xmlns:w14="http://schemas.microsoft.com/office/word/2010/wordml">
-              <w:rPr>
-                <w:rFonts w:ascii="Times New Roman" w:hAnsi="Times New Roman" w:eastAsia="Times New Roman" w:cs="Times New Roman"/>
-                <w:i w:val="false"/>
-                <w:b w:val="false"/>
-                <w:u w:val="none"/>
-                <w:strike w:val="false"/>
-                <w:sz w:val="22"/>
-                <w:szCs w:val="22"/>
-                <w:color w:val="000000"/>
-              </w:rPr>
-              <w:t xml:space="preserve">0.81</w:t>
-            </w:r>
-          </w:p>
-        </w:tc>
-      </w:tr>
-      <w:tr>
-        <w:trPr>
-          <w:trHeight w:val="360" w:hRule="auto"/>
-        </w:trPr>
-        body17
-        <w:tc>
-          <w:tcPr>
-            <w:tcBorders>
-              <w:bottom w:val="none" w:sz="0" w:space="0" w:color="000000"/>
-              <w:top w:val="none" w:sz="0" w:space="0" w:color="000000"/>
-              <w:left w:val="none" w:sz="0" w:space="0" w:color="000000"/>
-              <w:right w:val="none" w:sz="0" w:space="0" w:color="000000"/>
-            </w:tcBorders>
-            <w:shd w:val="clear" w:color="auto" w:fill="FFFFFF"/>
-            <w:tcMar>
-              <w:top w:w="0" w:type="dxa"/>
-              <w:bottom w:w="0" w:type="dxa"/>
-              <w:left w:w="0" w:type="dxa"/>
-              <w:right w:w="0" w:type="dxa"/>
-            </w:tcMar>
-            <w:vAlign w:val="center"/>
-          </w:tcPr>
-          <w:p>
-            <w:pPr>
-              <w:jc w:val="left"/>
-              <w:pBdr>
-                <w:bottom w:val="none" w:sz="0" w:space="0" w:color="000000"/>
-                <w:top w:val="none" w:sz="0" w:space="0" w:color="000000"/>
-                <w:left w:val="none" w:sz="0" w:space="0" w:color="000000"/>
-                <w:right w:val="none" w:sz="0" w:space="0" w:color="000000"/>
-              </w:pBdr>
-              <w:spacing w:after="100" w:before="100" w:line="480"/>
-              <w:ind w:left="100" w:right="100" w:firstLine="0" w:firstLineChars="0"/>
-              <w:rPr>
-                <w:rFonts w:ascii="Times New Roman" w:hAnsi="Times New Roman" w:eastAsia="Times New Roman" w:cs="Times New Roman"/>
-                <w:i w:val="false"/>
-                <w:b w:val="false"/>
-                <w:u w:val="none"/>
-                <w:strike w:val="false"/>
-                <w:sz w:val="22"/>
-                <w:szCs w:val="22"/>
-                <w:color w:val="000000"/>
-              </w:rPr>
-            </w:pPr>
-            <w:r xmlns:w="http://schemas.openxmlformats.org/wordprocessingml/2006/main" xmlns:wp="http://schemas.openxmlformats.org/drawingml/2006/wordprocessingDrawing" xmlns:r="http://schemas.openxmlformats.org/officeDocument/2006/relationships" xmlns:w14="http://schemas.microsoft.com/office/word/2010/wordml">
-              <w:rPr>
-                <w:rFonts w:ascii="Times New Roman" w:hAnsi="Times New Roman" w:eastAsia="Times New Roman" w:cs="Times New Roman"/>
-                <w:i w:val="false"/>
-                <w:b w:val="false"/>
-                <w:u w:val="none"/>
-                <w:strike w:val="false"/>
-                <w:sz w:val="22"/>
-                <w:szCs w:val="22"/>
-                <w:color w:val="000000"/>
-              </w:rPr>
-              <w:t xml:space="preserve">Management (was Industrial Management)   </w:t>
-            </w:r>
-          </w:p>
-        </w:tc>
-        <w:tc>
-          <w:tcPr>
-            <w:tcBorders>
-              <w:bottom w:val="none" w:sz="0" w:space="0" w:color="000000"/>
-              <w:top w:val="none" w:sz="0" w:space="0" w:color="000000"/>
-              <w:left w:val="none" w:sz="0" w:space="0" w:color="000000"/>
-              <w:right w:val="none" w:sz="0" w:space="0" w:color="000000"/>
-            </w:tcBorders>
-            <w:shd w:val="clear" w:color="auto" w:fill="FFFFFF"/>
-            <w:tcMar>
-              <w:top w:w="0" w:type="dxa"/>
-              <w:bottom w:w="0" w:type="dxa"/>
-              <w:left w:w="0" w:type="dxa"/>
-              <w:right w:w="0" w:type="dxa"/>
-            </w:tcMar>
-            <w:vAlign w:val="center"/>
-          </w:tcPr>
-          <w:p>
-            <w:pPr>
-              <w:jc w:val="left"/>
-              <w:pBdr>
-                <w:bottom w:val="none" w:sz="0" w:space="0" w:color="000000"/>
-                <w:top w:val="none" w:sz="0" w:space="0" w:color="000000"/>
-                <w:left w:val="none" w:sz="0" w:space="0" w:color="000000"/>
-                <w:right w:val="none" w:sz="0" w:space="0" w:color="000000"/>
-              </w:pBdr>
-              <w:spacing w:after="100" w:before="100" w:line="480"/>
-              <w:ind w:left="100" w:right="100" w:firstLine="0" w:firstLineChars="0"/>
-              <w:rPr>
-                <w:rFonts w:ascii="Times New Roman" w:hAnsi="Times New Roman" w:eastAsia="Times New Roman" w:cs="Times New Roman"/>
-                <w:i w:val="false"/>
-                <w:b w:val="false"/>
-                <w:u w:val="none"/>
-                <w:strike w:val="false"/>
-                <w:sz w:val="22"/>
-                <w:szCs w:val="22"/>
-                <w:color w:val="000000"/>
-              </w:rPr>
-            </w:pPr>
-            <w:r xmlns:w="http://schemas.openxmlformats.org/wordprocessingml/2006/main" xmlns:wp="http://schemas.openxmlformats.org/drawingml/2006/wordprocessingDrawing" xmlns:r="http://schemas.openxmlformats.org/officeDocument/2006/relationships" xmlns:w14="http://schemas.microsoft.com/office/word/2010/wordml">
-              <w:rPr>
-                <w:rFonts w:ascii="Times New Roman" w:hAnsi="Times New Roman" w:eastAsia="Times New Roman" w:cs="Times New Roman"/>
-                <w:i w:val="false"/>
-                <w:b w:val="false"/>
-                <w:u w:val="none"/>
-                <w:strike w:val="false"/>
-                <w:sz w:val="22"/>
-                <w:szCs w:val="22"/>
-                <w:color w:val="000000"/>
-              </w:rPr>
-              <w:t xml:space="preserve">1</w:t>
-            </w:r>
-          </w:p>
-        </w:tc>
-        <w:tc>
-          <w:tcPr>
-            <w:tcBorders>
-              <w:bottom w:val="none" w:sz="0" w:space="0" w:color="000000"/>
-              <w:top w:val="none" w:sz="0" w:space="0" w:color="000000"/>
-              <w:left w:val="none" w:sz="0" w:space="0" w:color="000000"/>
-              <w:right w:val="none" w:sz="0" w:space="0" w:color="000000"/>
-            </w:tcBorders>
-            <w:shd w:val="clear" w:color="auto" w:fill="FFFFFF"/>
-            <w:tcMar>
-              <w:top w:w="0" w:type="dxa"/>
-              <w:bottom w:w="0" w:type="dxa"/>
-              <w:left w:w="0" w:type="dxa"/>
-              <w:right w:w="0" w:type="dxa"/>
-            </w:tcMar>
-            <w:vAlign w:val="center"/>
-          </w:tcPr>
-          <w:p>
-            <w:pPr>
-              <w:jc w:val="left"/>
-              <w:pBdr>
-                <w:bottom w:val="none" w:sz="0" w:space="0" w:color="000000"/>
-                <w:top w:val="none" w:sz="0" w:space="0" w:color="000000"/>
-                <w:left w:val="none" w:sz="0" w:space="0" w:color="000000"/>
-                <w:right w:val="none" w:sz="0" w:space="0" w:color="000000"/>
-              </w:pBdr>
-              <w:spacing w:after="100" w:before="100" w:line="480"/>
-              <w:ind w:left="100" w:right="100" w:firstLine="0" w:firstLineChars="0"/>
-              <w:rPr>
-                <w:rFonts w:ascii="Times New Roman" w:hAnsi="Times New Roman" w:eastAsia="Times New Roman" w:cs="Times New Roman"/>
-                <w:i w:val="false"/>
-                <w:b w:val="false"/>
-                <w:u w:val="none"/>
-                <w:strike w:val="false"/>
-                <w:sz w:val="22"/>
-                <w:szCs w:val="22"/>
-                <w:color w:val="000000"/>
-              </w:rPr>
-            </w:pPr>
-            <w:r xmlns:w="http://schemas.openxmlformats.org/wordprocessingml/2006/main" xmlns:wp="http://schemas.openxmlformats.org/drawingml/2006/wordprocessingDrawing" xmlns:r="http://schemas.openxmlformats.org/officeDocument/2006/relationships" xmlns:w14="http://schemas.microsoft.com/office/word/2010/wordml">
-              <w:rPr>
-                <w:rFonts w:ascii="Times New Roman" w:hAnsi="Times New Roman" w:eastAsia="Times New Roman" w:cs="Times New Roman"/>
-                <w:i w:val="false"/>
-                <w:b w:val="false"/>
-                <w:u w:val="none"/>
-                <w:strike w:val="false"/>
-                <w:sz w:val="22"/>
-                <w:szCs w:val="22"/>
-                <w:color w:val="000000"/>
-              </w:rPr>
-              <w:t xml:space="preserve">0.81</w:t>
-            </w:r>
-          </w:p>
-        </w:tc>
-      </w:tr>
-      <w:tr>
-        <w:trPr>
-          <w:trHeight w:val="360" w:hRule="auto"/>
-        </w:trPr>
-        body18
-        <w:tc>
-          <w:tcPr>
-            <w:tcBorders>
-              <w:bottom w:val="none" w:sz="0" w:space="0" w:color="000000"/>
-              <w:top w:val="none" w:sz="0" w:space="0" w:color="000000"/>
-              <w:left w:val="none" w:sz="0" w:space="0" w:color="000000"/>
-              <w:right w:val="none" w:sz="0" w:space="0" w:color="000000"/>
-            </w:tcBorders>
-            <w:shd w:val="clear" w:color="auto" w:fill="FFFFFF"/>
-            <w:tcMar>
-              <w:top w:w="0" w:type="dxa"/>
-              <w:bottom w:w="0" w:type="dxa"/>
-              <w:left w:w="0" w:type="dxa"/>
-              <w:right w:w="0" w:type="dxa"/>
-            </w:tcMar>
-            <w:vAlign w:val="center"/>
-          </w:tcPr>
-          <w:p>
-            <w:pPr>
-              <w:jc w:val="left"/>
-              <w:pBdr>
-                <w:bottom w:val="none" w:sz="0" w:space="0" w:color="000000"/>
-                <w:top w:val="none" w:sz="0" w:space="0" w:color="000000"/>
-                <w:left w:val="none" w:sz="0" w:space="0" w:color="000000"/>
-                <w:right w:val="none" w:sz="0" w:space="0" w:color="000000"/>
-              </w:pBdr>
-              <w:spacing w:after="100" w:before="100" w:line="480"/>
-              <w:ind w:left="100" w:right="100" w:firstLine="0" w:firstLineChars="0"/>
-              <w:rPr>
-                <w:rFonts w:ascii="Times New Roman" w:hAnsi="Times New Roman" w:eastAsia="Times New Roman" w:cs="Times New Roman"/>
-                <w:i w:val="false"/>
-                <w:b w:val="false"/>
-                <w:u w:val="none"/>
-                <w:strike w:val="false"/>
-                <w:sz w:val="22"/>
-                <w:szCs w:val="22"/>
-                <w:color w:val="000000"/>
-              </w:rPr>
-            </w:pPr>
-            <w:r xmlns:w="http://schemas.openxmlformats.org/wordprocessingml/2006/main" xmlns:wp="http://schemas.openxmlformats.org/drawingml/2006/wordprocessingDrawing" xmlns:r="http://schemas.openxmlformats.org/officeDocument/2006/relationships" xmlns:w14="http://schemas.microsoft.com/office/word/2010/wordml">
-              <w:rPr>
-                <w:rFonts w:ascii="Times New Roman" w:hAnsi="Times New Roman" w:eastAsia="Times New Roman" w:cs="Times New Roman"/>
-                <w:i w:val="false"/>
-                <w:b w:val="false"/>
-                <w:u w:val="none"/>
-                <w:strike w:val="false"/>
-                <w:sz w:val="22"/>
-                <w:szCs w:val="22"/>
-                <w:color w:val="000000"/>
-              </w:rPr>
-              <w:t xml:space="preserve">Manufacturing Engineering   </w:t>
-            </w:r>
-          </w:p>
-        </w:tc>
-        <w:tc>
-          <w:tcPr>
-            <w:tcBorders>
-              <w:bottom w:val="none" w:sz="0" w:space="0" w:color="000000"/>
-              <w:top w:val="none" w:sz="0" w:space="0" w:color="000000"/>
-              <w:left w:val="none" w:sz="0" w:space="0" w:color="000000"/>
-              <w:right w:val="none" w:sz="0" w:space="0" w:color="000000"/>
-            </w:tcBorders>
-            <w:shd w:val="clear" w:color="auto" w:fill="FFFFFF"/>
-            <w:tcMar>
-              <w:top w:w="0" w:type="dxa"/>
-              <w:bottom w:w="0" w:type="dxa"/>
-              <w:left w:w="0" w:type="dxa"/>
-              <w:right w:w="0" w:type="dxa"/>
-            </w:tcMar>
-            <w:vAlign w:val="center"/>
-          </w:tcPr>
-          <w:p>
-            <w:pPr>
-              <w:jc w:val="left"/>
-              <w:pBdr>
-                <w:bottom w:val="none" w:sz="0" w:space="0" w:color="000000"/>
-                <w:top w:val="none" w:sz="0" w:space="0" w:color="000000"/>
-                <w:left w:val="none" w:sz="0" w:space="0" w:color="000000"/>
-                <w:right w:val="none" w:sz="0" w:space="0" w:color="000000"/>
-              </w:pBdr>
-              <w:spacing w:after="100" w:before="100" w:line="480"/>
-              <w:ind w:left="100" w:right="100" w:firstLine="0" w:firstLineChars="0"/>
-              <w:rPr>
-                <w:rFonts w:ascii="Times New Roman" w:hAnsi="Times New Roman" w:eastAsia="Times New Roman" w:cs="Times New Roman"/>
-                <w:i w:val="false"/>
-                <w:b w:val="false"/>
-                <w:u w:val="none"/>
-                <w:strike w:val="false"/>
-                <w:sz w:val="22"/>
-                <w:szCs w:val="22"/>
-                <w:color w:val="000000"/>
-              </w:rPr>
-            </w:pPr>
-            <w:r xmlns:w="http://schemas.openxmlformats.org/wordprocessingml/2006/main" xmlns:wp="http://schemas.openxmlformats.org/drawingml/2006/wordprocessingDrawing" xmlns:r="http://schemas.openxmlformats.org/officeDocument/2006/relationships" xmlns:w14="http://schemas.microsoft.com/office/word/2010/wordml">
-              <w:rPr>
-                <w:rFonts w:ascii="Times New Roman" w:hAnsi="Times New Roman" w:eastAsia="Times New Roman" w:cs="Times New Roman"/>
-                <w:i w:val="false"/>
-                <w:b w:val="false"/>
-                <w:u w:val="none"/>
-                <w:strike w:val="false"/>
-                <w:sz w:val="22"/>
-                <w:szCs w:val="22"/>
-                <w:color w:val="000000"/>
-              </w:rPr>
-              <w:t xml:space="preserve">3</w:t>
-            </w:r>
-          </w:p>
-        </w:tc>
-        <w:tc>
-          <w:tcPr>
-            <w:tcBorders>
-              <w:bottom w:val="none" w:sz="0" w:space="0" w:color="000000"/>
-              <w:top w:val="none" w:sz="0" w:space="0" w:color="000000"/>
-              <w:left w:val="none" w:sz="0" w:space="0" w:color="000000"/>
-              <w:right w:val="none" w:sz="0" w:space="0" w:color="000000"/>
-            </w:tcBorders>
-            <w:shd w:val="clear" w:color="auto" w:fill="FFFFFF"/>
-            <w:tcMar>
-              <w:top w:w="0" w:type="dxa"/>
-              <w:bottom w:w="0" w:type="dxa"/>
-              <w:left w:w="0" w:type="dxa"/>
-              <w:right w:w="0" w:type="dxa"/>
-            </w:tcMar>
-            <w:vAlign w:val="center"/>
-          </w:tcPr>
-          <w:p>
-            <w:pPr>
-              <w:jc w:val="left"/>
-              <w:pBdr>
-                <w:bottom w:val="none" w:sz="0" w:space="0" w:color="000000"/>
-                <w:top w:val="none" w:sz="0" w:space="0" w:color="000000"/>
-                <w:left w:val="none" w:sz="0" w:space="0" w:color="000000"/>
-                <w:right w:val="none" w:sz="0" w:space="0" w:color="000000"/>
-              </w:pBdr>
-              <w:spacing w:after="100" w:before="100" w:line="480"/>
-              <w:ind w:left="100" w:right="100" w:firstLine="0" w:firstLineChars="0"/>
-              <w:rPr>
-                <w:rFonts w:ascii="Times New Roman" w:hAnsi="Times New Roman" w:eastAsia="Times New Roman" w:cs="Times New Roman"/>
-                <w:i w:val="false"/>
-                <w:b w:val="false"/>
-                <w:u w:val="none"/>
-                <w:strike w:val="false"/>
-                <w:sz w:val="22"/>
-                <w:szCs w:val="22"/>
-                <w:color w:val="000000"/>
-              </w:rPr>
-            </w:pPr>
-            <w:r xmlns:w="http://schemas.openxmlformats.org/wordprocessingml/2006/main" xmlns:wp="http://schemas.openxmlformats.org/drawingml/2006/wordprocessingDrawing" xmlns:r="http://schemas.openxmlformats.org/officeDocument/2006/relationships" xmlns:w14="http://schemas.microsoft.com/office/word/2010/wordml">
-              <w:rPr>
-                <w:rFonts w:ascii="Times New Roman" w:hAnsi="Times New Roman" w:eastAsia="Times New Roman" w:cs="Times New Roman"/>
-                <w:i w:val="false"/>
-                <w:b w:val="false"/>
-                <w:u w:val="none"/>
-                <w:strike w:val="false"/>
-                <w:sz w:val="22"/>
-                <w:szCs w:val="22"/>
-                <w:color w:val="000000"/>
-              </w:rPr>
-              <w:t xml:space="preserve">2.42</w:t>
-            </w:r>
-          </w:p>
-        </w:tc>
-      </w:tr>
-      <w:tr>
-        <w:trPr>
-          <w:trHeight w:val="360" w:hRule="auto"/>
-        </w:trPr>
-        body19
-        <w:tc>
-          <w:tcPr>
-            <w:tcBorders>
-              <w:bottom w:val="none" w:sz="0" w:space="0" w:color="000000"/>
-              <w:top w:val="none" w:sz="0" w:space="0" w:color="000000"/>
-              <w:left w:val="none" w:sz="0" w:space="0" w:color="000000"/>
-              <w:right w:val="none" w:sz="0" w:space="0" w:color="000000"/>
-            </w:tcBorders>
-            <w:shd w:val="clear" w:color="auto" w:fill="FFFFFF"/>
-            <w:tcMar>
-              <w:top w:w="0" w:type="dxa"/>
-              <w:bottom w:w="0" w:type="dxa"/>
-              <w:left w:w="0" w:type="dxa"/>
-              <w:right w:w="0" w:type="dxa"/>
-            </w:tcMar>
-            <w:vAlign w:val="center"/>
-          </w:tcPr>
-          <w:p>
-            <w:pPr>
-              <w:jc w:val="left"/>
-              <w:pBdr>
-                <w:bottom w:val="none" w:sz="0" w:space="0" w:color="000000"/>
-                <w:top w:val="none" w:sz="0" w:space="0" w:color="000000"/>
-                <w:left w:val="none" w:sz="0" w:space="0" w:color="000000"/>
-                <w:right w:val="none" w:sz="0" w:space="0" w:color="000000"/>
-              </w:pBdr>
-              <w:spacing w:after="100" w:before="100" w:line="480"/>
-              <w:ind w:left="100" w:right="100" w:firstLine="0" w:firstLineChars="0"/>
-              <w:rPr>
-                <w:rFonts w:ascii="Times New Roman" w:hAnsi="Times New Roman" w:eastAsia="Times New Roman" w:cs="Times New Roman"/>
-                <w:i w:val="false"/>
-                <w:b w:val="false"/>
-                <w:u w:val="none"/>
-                <w:strike w:val="false"/>
-                <w:sz w:val="22"/>
-                <w:szCs w:val="22"/>
-                <w:color w:val="000000"/>
-              </w:rPr>
-            </w:pPr>
-            <w:r xmlns:w="http://schemas.openxmlformats.org/wordprocessingml/2006/main" xmlns:wp="http://schemas.openxmlformats.org/drawingml/2006/wordprocessingDrawing" xmlns:r="http://schemas.openxmlformats.org/officeDocument/2006/relationships" xmlns:w14="http://schemas.microsoft.com/office/word/2010/wordml">
-              <w:rPr>
-                <w:rFonts w:ascii="Times New Roman" w:hAnsi="Times New Roman" w:eastAsia="Times New Roman" w:cs="Times New Roman"/>
-                <w:i w:val="false"/>
-                <w:b w:val="false"/>
-                <w:u w:val="none"/>
-                <w:strike w:val="false"/>
-                <w:sz w:val="22"/>
-                <w:szCs w:val="22"/>
-                <w:color w:val="000000"/>
-              </w:rPr>
-              <w:t xml:space="preserve">Marketing &amp; Business Education   </w:t>
-            </w:r>
-          </w:p>
-        </w:tc>
-        <w:tc>
-          <w:tcPr>
-            <w:tcBorders>
-              <w:bottom w:val="none" w:sz="0" w:space="0" w:color="000000"/>
-              <w:top w:val="none" w:sz="0" w:space="0" w:color="000000"/>
-              <w:left w:val="none" w:sz="0" w:space="0" w:color="000000"/>
-              <w:right w:val="none" w:sz="0" w:space="0" w:color="000000"/>
-            </w:tcBorders>
-            <w:shd w:val="clear" w:color="auto" w:fill="FFFFFF"/>
-            <w:tcMar>
-              <w:top w:w="0" w:type="dxa"/>
-              <w:bottom w:w="0" w:type="dxa"/>
-              <w:left w:w="0" w:type="dxa"/>
-              <w:right w:w="0" w:type="dxa"/>
-            </w:tcMar>
-            <w:vAlign w:val="center"/>
-          </w:tcPr>
-          <w:p>
-            <w:pPr>
-              <w:jc w:val="left"/>
-              <w:pBdr>
-                <w:bottom w:val="none" w:sz="0" w:space="0" w:color="000000"/>
-                <w:top w:val="none" w:sz="0" w:space="0" w:color="000000"/>
-                <w:left w:val="none" w:sz="0" w:space="0" w:color="000000"/>
-                <w:right w:val="none" w:sz="0" w:space="0" w:color="000000"/>
-              </w:pBdr>
-              <w:spacing w:after="100" w:before="100" w:line="480"/>
-              <w:ind w:left="100" w:right="100" w:firstLine="0" w:firstLineChars="0"/>
-              <w:rPr>
-                <w:rFonts w:ascii="Times New Roman" w:hAnsi="Times New Roman" w:eastAsia="Times New Roman" w:cs="Times New Roman"/>
-                <w:i w:val="false"/>
-                <w:b w:val="false"/>
-                <w:u w:val="none"/>
-                <w:strike w:val="false"/>
-                <w:sz w:val="22"/>
-                <w:szCs w:val="22"/>
-                <w:color w:val="000000"/>
-              </w:rPr>
-            </w:pPr>
-            <w:r xmlns:w="http://schemas.openxmlformats.org/wordprocessingml/2006/main" xmlns:wp="http://schemas.openxmlformats.org/drawingml/2006/wordprocessingDrawing" xmlns:r="http://schemas.openxmlformats.org/officeDocument/2006/relationships" xmlns:w14="http://schemas.microsoft.com/office/word/2010/wordml">
-              <w:rPr>
-                <w:rFonts w:ascii="Times New Roman" w:hAnsi="Times New Roman" w:eastAsia="Times New Roman" w:cs="Times New Roman"/>
-                <w:i w:val="false"/>
-                <w:b w:val="false"/>
-                <w:u w:val="none"/>
-                <w:strike w:val="false"/>
-                <w:sz w:val="22"/>
-                <w:szCs w:val="22"/>
-                <w:color w:val="000000"/>
-              </w:rPr>
-              <w:t xml:space="preserve">2</w:t>
-            </w:r>
-          </w:p>
-        </w:tc>
-        <w:tc>
-          <w:tcPr>
-            <w:tcBorders>
-              <w:bottom w:val="none" w:sz="0" w:space="0" w:color="000000"/>
-              <w:top w:val="none" w:sz="0" w:space="0" w:color="000000"/>
-              <w:left w:val="none" w:sz="0" w:space="0" w:color="000000"/>
-              <w:right w:val="none" w:sz="0" w:space="0" w:color="000000"/>
-            </w:tcBorders>
-            <w:shd w:val="clear" w:color="auto" w:fill="FFFFFF"/>
-            <w:tcMar>
-              <w:top w:w="0" w:type="dxa"/>
-              <w:bottom w:w="0" w:type="dxa"/>
-              <w:left w:w="0" w:type="dxa"/>
-              <w:right w:w="0" w:type="dxa"/>
-            </w:tcMar>
-            <w:vAlign w:val="center"/>
-          </w:tcPr>
-          <w:p>
-            <w:pPr>
-              <w:jc w:val="left"/>
-              <w:pBdr>
-                <w:bottom w:val="none" w:sz="0" w:space="0" w:color="000000"/>
-                <w:top w:val="none" w:sz="0" w:space="0" w:color="000000"/>
-                <w:left w:val="none" w:sz="0" w:space="0" w:color="000000"/>
-                <w:right w:val="none" w:sz="0" w:space="0" w:color="000000"/>
-              </w:pBdr>
-              <w:spacing w:after="100" w:before="100" w:line="480"/>
-              <w:ind w:left="100" w:right="100" w:firstLine="0" w:firstLineChars="0"/>
-              <w:rPr>
-                <w:rFonts w:ascii="Times New Roman" w:hAnsi="Times New Roman" w:eastAsia="Times New Roman" w:cs="Times New Roman"/>
-                <w:i w:val="false"/>
-                <w:b w:val="false"/>
-                <w:u w:val="none"/>
-                <w:strike w:val="false"/>
-                <w:sz w:val="22"/>
-                <w:szCs w:val="22"/>
-                <w:color w:val="000000"/>
-              </w:rPr>
-            </w:pPr>
-            <w:r xmlns:w="http://schemas.openxmlformats.org/wordprocessingml/2006/main" xmlns:wp="http://schemas.openxmlformats.org/drawingml/2006/wordprocessingDrawing" xmlns:r="http://schemas.openxmlformats.org/officeDocument/2006/relationships" xmlns:w14="http://schemas.microsoft.com/office/word/2010/wordml">
-              <w:rPr>
-                <w:rFonts w:ascii="Times New Roman" w:hAnsi="Times New Roman" w:eastAsia="Times New Roman" w:cs="Times New Roman"/>
-                <w:i w:val="false"/>
-                <w:b w:val="false"/>
-                <w:u w:val="none"/>
-                <w:strike w:val="false"/>
-                <w:sz w:val="22"/>
-                <w:szCs w:val="22"/>
-                <w:color w:val="000000"/>
-              </w:rPr>
-              <w:t xml:space="preserve">1.61</w:t>
-            </w:r>
-          </w:p>
-        </w:tc>
-      </w:tr>
-      <w:tr>
-        <w:trPr>
-          <w:trHeight w:val="360" w:hRule="auto"/>
-        </w:trPr>
-        body20
-        <w:tc>
-          <w:tcPr>
-            <w:tcBorders>
-              <w:bottom w:val="none" w:sz="0" w:space="0" w:color="000000"/>
-              <w:top w:val="none" w:sz="0" w:space="0" w:color="000000"/>
-              <w:left w:val="none" w:sz="0" w:space="0" w:color="000000"/>
-              <w:right w:val="none" w:sz="0" w:space="0" w:color="000000"/>
-            </w:tcBorders>
-            <w:shd w:val="clear" w:color="auto" w:fill="FFFFFF"/>
-            <w:tcMar>
-              <w:top w:w="0" w:type="dxa"/>
-              <w:bottom w:w="0" w:type="dxa"/>
-              <w:left w:w="0" w:type="dxa"/>
-              <w:right w:w="0" w:type="dxa"/>
-            </w:tcMar>
-            <w:vAlign w:val="center"/>
-          </w:tcPr>
-          <w:p>
-            <w:pPr>
-              <w:jc w:val="left"/>
-              <w:pBdr>
-                <w:bottom w:val="none" w:sz="0" w:space="0" w:color="000000"/>
-                <w:top w:val="none" w:sz="0" w:space="0" w:color="000000"/>
-                <w:left w:val="none" w:sz="0" w:space="0" w:color="000000"/>
-                <w:right w:val="none" w:sz="0" w:space="0" w:color="000000"/>
-              </w:pBdr>
-              <w:spacing w:after="100" w:before="100" w:line="480"/>
-              <w:ind w:left="100" w:right="100" w:firstLine="0" w:firstLineChars="0"/>
-              <w:rPr>
-                <w:rFonts w:ascii="Times New Roman" w:hAnsi="Times New Roman" w:eastAsia="Times New Roman" w:cs="Times New Roman"/>
-                <w:i w:val="false"/>
-                <w:b w:val="false"/>
-                <w:u w:val="none"/>
-                <w:strike w:val="false"/>
-                <w:sz w:val="22"/>
-                <w:szCs w:val="22"/>
-                <w:color w:val="000000"/>
-              </w:rPr>
-            </w:pPr>
-            <w:r xmlns:w="http://schemas.openxmlformats.org/wordprocessingml/2006/main" xmlns:wp="http://schemas.openxmlformats.org/drawingml/2006/wordprocessingDrawing" xmlns:r="http://schemas.openxmlformats.org/officeDocument/2006/relationships" xmlns:w14="http://schemas.microsoft.com/office/word/2010/wordml">
-              <w:rPr>
-                <w:rFonts w:ascii="Times New Roman" w:hAnsi="Times New Roman" w:eastAsia="Times New Roman" w:cs="Times New Roman"/>
-                <w:i w:val="false"/>
-                <w:b w:val="false"/>
-                <w:u w:val="none"/>
-                <w:strike w:val="false"/>
-                <w:sz w:val="22"/>
-                <w:szCs w:val="22"/>
-                <w:color w:val="000000"/>
-              </w:rPr>
-              <w:t xml:space="preserve">Mechanical Engineering</w:t>
-            </w:r>
-          </w:p>
-        </w:tc>
-        <w:tc>
-          <w:tcPr>
-            <w:tcBorders>
-              <w:bottom w:val="none" w:sz="0" w:space="0" w:color="000000"/>
-              <w:top w:val="none" w:sz="0" w:space="0" w:color="000000"/>
-              <w:left w:val="none" w:sz="0" w:space="0" w:color="000000"/>
-              <w:right w:val="none" w:sz="0" w:space="0" w:color="000000"/>
-            </w:tcBorders>
-            <w:shd w:val="clear" w:color="auto" w:fill="FFFFFF"/>
-            <w:tcMar>
-              <w:top w:w="0" w:type="dxa"/>
-              <w:bottom w:w="0" w:type="dxa"/>
-              <w:left w:w="0" w:type="dxa"/>
-              <w:right w:w="0" w:type="dxa"/>
-            </w:tcMar>
-            <w:vAlign w:val="center"/>
-          </w:tcPr>
-          <w:p>
-            <w:pPr>
-              <w:jc w:val="left"/>
-              <w:pBdr>
-                <w:bottom w:val="none" w:sz="0" w:space="0" w:color="000000"/>
-                <w:top w:val="none" w:sz="0" w:space="0" w:color="000000"/>
-                <w:left w:val="none" w:sz="0" w:space="0" w:color="000000"/>
-                <w:right w:val="none" w:sz="0" w:space="0" w:color="000000"/>
-              </w:pBdr>
-              <w:spacing w:after="100" w:before="100" w:line="480"/>
-              <w:ind w:left="100" w:right="100" w:firstLine="0" w:firstLineChars="0"/>
-              <w:rPr>
-                <w:rFonts w:ascii="Times New Roman" w:hAnsi="Times New Roman" w:eastAsia="Times New Roman" w:cs="Times New Roman"/>
-                <w:i w:val="false"/>
-                <w:b w:val="false"/>
-                <w:u w:val="none"/>
-                <w:strike w:val="false"/>
-                <w:sz w:val="22"/>
-                <w:szCs w:val="22"/>
-                <w:color w:val="000000"/>
-              </w:rPr>
-            </w:pPr>
-            <w:r xmlns:w="http://schemas.openxmlformats.org/wordprocessingml/2006/main" xmlns:wp="http://schemas.openxmlformats.org/drawingml/2006/wordprocessingDrawing" xmlns:r="http://schemas.openxmlformats.org/officeDocument/2006/relationships" xmlns:w14="http://schemas.microsoft.com/office/word/2010/wordml">
-              <w:rPr>
-                <w:rFonts w:ascii="Times New Roman" w:hAnsi="Times New Roman" w:eastAsia="Times New Roman" w:cs="Times New Roman"/>
-                <w:i w:val="false"/>
-                <w:b w:val="false"/>
-                <w:u w:val="none"/>
-                <w:strike w:val="false"/>
-                <w:sz w:val="22"/>
-                <w:szCs w:val="22"/>
-                <w:color w:val="000000"/>
-              </w:rPr>
-              <w:t xml:space="preserve">5</w:t>
-            </w:r>
-          </w:p>
-        </w:tc>
-        <w:tc>
-          <w:tcPr>
-            <w:tcBorders>
-              <w:bottom w:val="none" w:sz="0" w:space="0" w:color="000000"/>
-              <w:top w:val="none" w:sz="0" w:space="0" w:color="000000"/>
-              <w:left w:val="none" w:sz="0" w:space="0" w:color="000000"/>
-              <w:right w:val="none" w:sz="0" w:space="0" w:color="000000"/>
-            </w:tcBorders>
-            <w:shd w:val="clear" w:color="auto" w:fill="FFFFFF"/>
-            <w:tcMar>
-              <w:top w:w="0" w:type="dxa"/>
-              <w:bottom w:w="0" w:type="dxa"/>
-              <w:left w:w="0" w:type="dxa"/>
-              <w:right w:w="0" w:type="dxa"/>
-            </w:tcMar>
-            <w:vAlign w:val="center"/>
-          </w:tcPr>
-          <w:p>
-            <w:pPr>
-              <w:jc w:val="left"/>
-              <w:pBdr>
-                <w:bottom w:val="none" w:sz="0" w:space="0" w:color="000000"/>
-                <w:top w:val="none" w:sz="0" w:space="0" w:color="000000"/>
-                <w:left w:val="none" w:sz="0" w:space="0" w:color="000000"/>
-                <w:right w:val="none" w:sz="0" w:space="0" w:color="000000"/>
-              </w:pBdr>
-              <w:spacing w:after="100" w:before="100" w:line="480"/>
-              <w:ind w:left="100" w:right="100" w:firstLine="0" w:firstLineChars="0"/>
-              <w:rPr>
-                <w:rFonts w:ascii="Times New Roman" w:hAnsi="Times New Roman" w:eastAsia="Times New Roman" w:cs="Times New Roman"/>
-                <w:i w:val="false"/>
-                <w:b w:val="false"/>
-                <w:u w:val="none"/>
-                <w:strike w:val="false"/>
-                <w:sz w:val="22"/>
-                <w:szCs w:val="22"/>
-                <w:color w:val="000000"/>
-              </w:rPr>
-            </w:pPr>
-            <w:r xmlns:w="http://schemas.openxmlformats.org/wordprocessingml/2006/main" xmlns:wp="http://schemas.openxmlformats.org/drawingml/2006/wordprocessingDrawing" xmlns:r="http://schemas.openxmlformats.org/officeDocument/2006/relationships" xmlns:w14="http://schemas.microsoft.com/office/word/2010/wordml">
-              <w:rPr>
-                <w:rFonts w:ascii="Times New Roman" w:hAnsi="Times New Roman" w:eastAsia="Times New Roman" w:cs="Times New Roman"/>
-                <w:i w:val="false"/>
-                <w:b w:val="false"/>
-                <w:u w:val="none"/>
-                <w:strike w:val="false"/>
-                <w:sz w:val="22"/>
-                <w:szCs w:val="22"/>
-                <w:color w:val="000000"/>
-              </w:rPr>
-              <w:t xml:space="preserve">4.03</w:t>
-            </w:r>
-          </w:p>
-        </w:tc>
-      </w:tr>
-      <w:tr>
-        <w:trPr>
-          <w:trHeight w:val="360" w:hRule="auto"/>
-        </w:trPr>
-        body21
-        <w:tc>
-          <w:tcPr>
-            <w:tcBorders>
-              <w:bottom w:val="none" w:sz="0" w:space="0" w:color="000000"/>
-              <w:top w:val="none" w:sz="0" w:space="0" w:color="000000"/>
-              <w:left w:val="none" w:sz="0" w:space="0" w:color="000000"/>
-              <w:right w:val="none" w:sz="0" w:space="0" w:color="000000"/>
-            </w:tcBorders>
-            <w:shd w:val="clear" w:color="auto" w:fill="FFFFFF"/>
-            <w:tcMar>
-              <w:top w:w="0" w:type="dxa"/>
-              <w:bottom w:w="0" w:type="dxa"/>
-              <w:left w:w="0" w:type="dxa"/>
-              <w:right w:w="0" w:type="dxa"/>
-            </w:tcMar>
-            <w:vAlign w:val="center"/>
-          </w:tcPr>
-          <w:p>
-            <w:pPr>
-              <w:jc w:val="left"/>
-              <w:pBdr>
-                <w:bottom w:val="none" w:sz="0" w:space="0" w:color="000000"/>
-                <w:top w:val="none" w:sz="0" w:space="0" w:color="000000"/>
-                <w:left w:val="none" w:sz="0" w:space="0" w:color="000000"/>
-                <w:right w:val="none" w:sz="0" w:space="0" w:color="000000"/>
-              </w:pBdr>
-              <w:spacing w:after="100" w:before="100" w:line="480"/>
-              <w:ind w:left="100" w:right="100" w:firstLine="0" w:firstLineChars="0"/>
-              <w:rPr>
-                <w:rFonts w:ascii="Times New Roman" w:hAnsi="Times New Roman" w:eastAsia="Times New Roman" w:cs="Times New Roman"/>
-                <w:i w:val="false"/>
-                <w:b w:val="false"/>
-                <w:u w:val="none"/>
-                <w:strike w:val="false"/>
-                <w:sz w:val="22"/>
-                <w:szCs w:val="22"/>
-                <w:color w:val="000000"/>
-              </w:rPr>
-            </w:pPr>
-            <w:r xmlns:w="http://schemas.openxmlformats.org/wordprocessingml/2006/main" xmlns:wp="http://schemas.openxmlformats.org/drawingml/2006/wordprocessingDrawing" xmlns:r="http://schemas.openxmlformats.org/officeDocument/2006/relationships" xmlns:w14="http://schemas.microsoft.com/office/word/2010/wordml">
-              <w:rPr>
-                <w:rFonts w:ascii="Times New Roman" w:hAnsi="Times New Roman" w:eastAsia="Times New Roman" w:cs="Times New Roman"/>
-                <w:i w:val="false"/>
-                <w:b w:val="false"/>
-                <w:u w:val="none"/>
-                <w:strike w:val="false"/>
-                <w:sz w:val="22"/>
-                <w:szCs w:val="22"/>
-                <w:color w:val="000000"/>
-              </w:rPr>
-              <w:t xml:space="preserve">Packaging   </w:t>
-            </w:r>
-          </w:p>
-        </w:tc>
-        <w:tc>
-          <w:tcPr>
-            <w:tcBorders>
-              <w:bottom w:val="none" w:sz="0" w:space="0" w:color="000000"/>
-              <w:top w:val="none" w:sz="0" w:space="0" w:color="000000"/>
-              <w:left w:val="none" w:sz="0" w:space="0" w:color="000000"/>
-              <w:right w:val="none" w:sz="0" w:space="0" w:color="000000"/>
-            </w:tcBorders>
-            <w:shd w:val="clear" w:color="auto" w:fill="FFFFFF"/>
-            <w:tcMar>
-              <w:top w:w="0" w:type="dxa"/>
-              <w:bottom w:w="0" w:type="dxa"/>
-              <w:left w:w="0" w:type="dxa"/>
-              <w:right w:w="0" w:type="dxa"/>
-            </w:tcMar>
-            <w:vAlign w:val="center"/>
-          </w:tcPr>
-          <w:p>
-            <w:pPr>
-              <w:jc w:val="left"/>
-              <w:pBdr>
-                <w:bottom w:val="none" w:sz="0" w:space="0" w:color="000000"/>
-                <w:top w:val="none" w:sz="0" w:space="0" w:color="000000"/>
-                <w:left w:val="none" w:sz="0" w:space="0" w:color="000000"/>
-                <w:right w:val="none" w:sz="0" w:space="0" w:color="000000"/>
-              </w:pBdr>
-              <w:spacing w:after="100" w:before="100" w:line="480"/>
-              <w:ind w:left="100" w:right="100" w:firstLine="0" w:firstLineChars="0"/>
-              <w:rPr>
-                <w:rFonts w:ascii="Times New Roman" w:hAnsi="Times New Roman" w:eastAsia="Times New Roman" w:cs="Times New Roman"/>
-                <w:i w:val="false"/>
-                <w:b w:val="false"/>
-                <w:u w:val="none"/>
-                <w:strike w:val="false"/>
-                <w:sz w:val="22"/>
-                <w:szCs w:val="22"/>
-                <w:color w:val="000000"/>
-              </w:rPr>
-            </w:pPr>
-            <w:r xmlns:w="http://schemas.openxmlformats.org/wordprocessingml/2006/main" xmlns:wp="http://schemas.openxmlformats.org/drawingml/2006/wordprocessingDrawing" xmlns:r="http://schemas.openxmlformats.org/officeDocument/2006/relationships" xmlns:w14="http://schemas.microsoft.com/office/word/2010/wordml">
-              <w:rPr>
-                <w:rFonts w:ascii="Times New Roman" w:hAnsi="Times New Roman" w:eastAsia="Times New Roman" w:cs="Times New Roman"/>
-                <w:i w:val="false"/>
-                <w:b w:val="false"/>
-                <w:u w:val="none"/>
-                <w:strike w:val="false"/>
-                <w:sz w:val="22"/>
-                <w:szCs w:val="22"/>
-                <w:color w:val="000000"/>
-              </w:rPr>
-              <w:t xml:space="preserve">1</w:t>
-            </w:r>
-          </w:p>
-        </w:tc>
-        <w:tc>
-          <w:tcPr>
-            <w:tcBorders>
-              <w:bottom w:val="none" w:sz="0" w:space="0" w:color="000000"/>
-              <w:top w:val="none" w:sz="0" w:space="0" w:color="000000"/>
-              <w:left w:val="none" w:sz="0" w:space="0" w:color="000000"/>
-              <w:right w:val="none" w:sz="0" w:space="0" w:color="000000"/>
-            </w:tcBorders>
-            <w:shd w:val="clear" w:color="auto" w:fill="FFFFFF"/>
-            <w:tcMar>
-              <w:top w:w="0" w:type="dxa"/>
-              <w:bottom w:w="0" w:type="dxa"/>
-              <w:left w:w="0" w:type="dxa"/>
-              <w:right w:w="0" w:type="dxa"/>
-            </w:tcMar>
-            <w:vAlign w:val="center"/>
-          </w:tcPr>
-          <w:p>
-            <w:pPr>
-              <w:jc w:val="left"/>
-              <w:pBdr>
-                <w:bottom w:val="none" w:sz="0" w:space="0" w:color="000000"/>
-                <w:top w:val="none" w:sz="0" w:space="0" w:color="000000"/>
-                <w:left w:val="none" w:sz="0" w:space="0" w:color="000000"/>
-                <w:right w:val="none" w:sz="0" w:space="0" w:color="000000"/>
-              </w:pBdr>
-              <w:spacing w:after="100" w:before="100" w:line="480"/>
-              <w:ind w:left="100" w:right="100" w:firstLine="0" w:firstLineChars="0"/>
-              <w:rPr>
-                <w:rFonts w:ascii="Times New Roman" w:hAnsi="Times New Roman" w:eastAsia="Times New Roman" w:cs="Times New Roman"/>
-                <w:i w:val="false"/>
-                <w:b w:val="false"/>
-                <w:u w:val="none"/>
-                <w:strike w:val="false"/>
-                <w:sz w:val="22"/>
-                <w:szCs w:val="22"/>
-                <w:color w:val="000000"/>
-              </w:rPr>
-            </w:pPr>
-            <w:r xmlns:w="http://schemas.openxmlformats.org/wordprocessingml/2006/main" xmlns:wp="http://schemas.openxmlformats.org/drawingml/2006/wordprocessingDrawing" xmlns:r="http://schemas.openxmlformats.org/officeDocument/2006/relationships" xmlns:w14="http://schemas.microsoft.com/office/word/2010/wordml">
-              <w:rPr>
-                <w:rFonts w:ascii="Times New Roman" w:hAnsi="Times New Roman" w:eastAsia="Times New Roman" w:cs="Times New Roman"/>
-                <w:i w:val="false"/>
-                <w:b w:val="false"/>
-                <w:u w:val="none"/>
-                <w:strike w:val="false"/>
-                <w:sz w:val="22"/>
-                <w:szCs w:val="22"/>
-                <w:color w:val="000000"/>
-              </w:rPr>
-              <w:t xml:space="preserve">0.81</w:t>
-            </w:r>
-          </w:p>
-        </w:tc>
-      </w:tr>
-      <w:tr>
-        <w:trPr>
-          <w:trHeight w:val="360" w:hRule="auto"/>
-        </w:trPr>
-        body22
-        <w:tc>
-          <w:tcPr>
-            <w:tcBorders>
-              <w:bottom w:val="none" w:sz="0" w:space="0" w:color="000000"/>
-              <w:top w:val="none" w:sz="0" w:space="0" w:color="000000"/>
-              <w:left w:val="none" w:sz="0" w:space="0" w:color="000000"/>
-              <w:right w:val="none" w:sz="0" w:space="0" w:color="000000"/>
-            </w:tcBorders>
-            <w:shd w:val="clear" w:color="auto" w:fill="FFFFFF"/>
-            <w:tcMar>
-              <w:top w:w="0" w:type="dxa"/>
-              <w:bottom w:w="0" w:type="dxa"/>
-              <w:left w:w="0" w:type="dxa"/>
-              <w:right w:w="0" w:type="dxa"/>
-            </w:tcMar>
-            <w:vAlign w:val="center"/>
-          </w:tcPr>
-          <w:p>
-            <w:pPr>
-              <w:jc w:val="left"/>
-              <w:pBdr>
-                <w:bottom w:val="none" w:sz="0" w:space="0" w:color="000000"/>
-                <w:top w:val="none" w:sz="0" w:space="0" w:color="000000"/>
-                <w:left w:val="none" w:sz="0" w:space="0" w:color="000000"/>
-                <w:right w:val="none" w:sz="0" w:space="0" w:color="000000"/>
-              </w:pBdr>
-              <w:spacing w:after="100" w:before="100" w:line="480"/>
-              <w:ind w:left="100" w:right="100" w:firstLine="0" w:firstLineChars="0"/>
-              <w:rPr>
-                <w:rFonts w:ascii="Times New Roman" w:hAnsi="Times New Roman" w:eastAsia="Times New Roman" w:cs="Times New Roman"/>
-                <w:i w:val="false"/>
-                <w:b w:val="false"/>
-                <w:u w:val="none"/>
-                <w:strike w:val="false"/>
-                <w:sz w:val="22"/>
-                <w:szCs w:val="22"/>
-                <w:color w:val="000000"/>
-              </w:rPr>
-            </w:pPr>
-            <w:r xmlns:w="http://schemas.openxmlformats.org/wordprocessingml/2006/main" xmlns:wp="http://schemas.openxmlformats.org/drawingml/2006/wordprocessingDrawing" xmlns:r="http://schemas.openxmlformats.org/officeDocument/2006/relationships" xmlns:w14="http://schemas.microsoft.com/office/word/2010/wordml">
-              <w:rPr>
-                <w:rFonts w:ascii="Times New Roman" w:hAnsi="Times New Roman" w:eastAsia="Times New Roman" w:cs="Times New Roman"/>
-                <w:i w:val="false"/>
-                <w:b w:val="false"/>
-                <w:u w:val="none"/>
-                <w:strike w:val="false"/>
-                <w:sz w:val="22"/>
-                <w:szCs w:val="22"/>
-                <w:color w:val="000000"/>
-              </w:rPr>
-              <w:t xml:space="preserve">Psychology </w:t>
-            </w:r>
-          </w:p>
-        </w:tc>
-        <w:tc>
-          <w:tcPr>
-            <w:tcBorders>
-              <w:bottom w:val="none" w:sz="0" w:space="0" w:color="000000"/>
-              <w:top w:val="none" w:sz="0" w:space="0" w:color="000000"/>
-              <w:left w:val="none" w:sz="0" w:space="0" w:color="000000"/>
-              <w:right w:val="none" w:sz="0" w:space="0" w:color="000000"/>
-            </w:tcBorders>
-            <w:shd w:val="clear" w:color="auto" w:fill="FFFFFF"/>
-            <w:tcMar>
-              <w:top w:w="0" w:type="dxa"/>
-              <w:bottom w:w="0" w:type="dxa"/>
-              <w:left w:w="0" w:type="dxa"/>
-              <w:right w:w="0" w:type="dxa"/>
-            </w:tcMar>
-            <w:vAlign w:val="center"/>
-          </w:tcPr>
-          <w:p>
-            <w:pPr>
-              <w:jc w:val="left"/>
-              <w:pBdr>
-                <w:bottom w:val="none" w:sz="0" w:space="0" w:color="000000"/>
-                <w:top w:val="none" w:sz="0" w:space="0" w:color="000000"/>
-                <w:left w:val="none" w:sz="0" w:space="0" w:color="000000"/>
-                <w:right w:val="none" w:sz="0" w:space="0" w:color="000000"/>
-              </w:pBdr>
-              <w:spacing w:after="100" w:before="100" w:line="480"/>
-              <w:ind w:left="100" w:right="100" w:firstLine="0" w:firstLineChars="0"/>
-              <w:rPr>
-                <w:rFonts w:ascii="Times New Roman" w:hAnsi="Times New Roman" w:eastAsia="Times New Roman" w:cs="Times New Roman"/>
-                <w:i w:val="false"/>
-                <w:b w:val="false"/>
-                <w:u w:val="none"/>
-                <w:strike w:val="false"/>
-                <w:sz w:val="22"/>
-                <w:szCs w:val="22"/>
-                <w:color w:val="000000"/>
-              </w:rPr>
-            </w:pPr>
-            <w:r xmlns:w="http://schemas.openxmlformats.org/wordprocessingml/2006/main" xmlns:wp="http://schemas.openxmlformats.org/drawingml/2006/wordprocessingDrawing" xmlns:r="http://schemas.openxmlformats.org/officeDocument/2006/relationships" xmlns:w14="http://schemas.microsoft.com/office/word/2010/wordml">
-              <w:rPr>
-                <w:rFonts w:ascii="Times New Roman" w:hAnsi="Times New Roman" w:eastAsia="Times New Roman" w:cs="Times New Roman"/>
-                <w:i w:val="false"/>
-                <w:b w:val="false"/>
-                <w:u w:val="none"/>
-                <w:strike w:val="false"/>
-                <w:sz w:val="22"/>
-                <w:szCs w:val="22"/>
-                <w:color w:val="000000"/>
-              </w:rPr>
-              <w:t xml:space="preserve">48</w:t>
-            </w:r>
-          </w:p>
-        </w:tc>
-        <w:tc>
-          <w:tcPr>
-            <w:tcBorders>
-              <w:bottom w:val="none" w:sz="0" w:space="0" w:color="000000"/>
-              <w:top w:val="none" w:sz="0" w:space="0" w:color="000000"/>
-              <w:left w:val="none" w:sz="0" w:space="0" w:color="000000"/>
-              <w:right w:val="none" w:sz="0" w:space="0" w:color="000000"/>
-            </w:tcBorders>
-            <w:shd w:val="clear" w:color="auto" w:fill="FFFFFF"/>
-            <w:tcMar>
-              <w:top w:w="0" w:type="dxa"/>
-              <w:bottom w:w="0" w:type="dxa"/>
-              <w:left w:w="0" w:type="dxa"/>
-              <w:right w:w="0" w:type="dxa"/>
-            </w:tcMar>
-            <w:vAlign w:val="center"/>
-          </w:tcPr>
-          <w:p>
-            <w:pPr>
-              <w:jc w:val="left"/>
-              <w:pBdr>
-                <w:bottom w:val="none" w:sz="0" w:space="0" w:color="000000"/>
-                <w:top w:val="none" w:sz="0" w:space="0" w:color="000000"/>
-                <w:left w:val="none" w:sz="0" w:space="0" w:color="000000"/>
-                <w:right w:val="none" w:sz="0" w:space="0" w:color="000000"/>
-              </w:pBdr>
-              <w:spacing w:after="100" w:before="100" w:line="480"/>
-              <w:ind w:left="100" w:right="100" w:firstLine="0" w:firstLineChars="0"/>
-              <w:rPr>
-                <w:rFonts w:ascii="Times New Roman" w:hAnsi="Times New Roman" w:eastAsia="Times New Roman" w:cs="Times New Roman"/>
-                <w:i w:val="false"/>
-                <w:b w:val="false"/>
-                <w:u w:val="none"/>
-                <w:strike w:val="false"/>
-                <w:sz w:val="22"/>
-                <w:szCs w:val="22"/>
-                <w:color w:val="000000"/>
-              </w:rPr>
-            </w:pPr>
-            <w:r xmlns:w="http://schemas.openxmlformats.org/wordprocessingml/2006/main" xmlns:wp="http://schemas.openxmlformats.org/drawingml/2006/wordprocessingDrawing" xmlns:r="http://schemas.openxmlformats.org/officeDocument/2006/relationships" xmlns:w14="http://schemas.microsoft.com/office/word/2010/wordml">
-              <w:rPr>
-                <w:rFonts w:ascii="Times New Roman" w:hAnsi="Times New Roman" w:eastAsia="Times New Roman" w:cs="Times New Roman"/>
-                <w:i w:val="false"/>
-                <w:b w:val="false"/>
-                <w:u w:val="none"/>
-                <w:strike w:val="false"/>
-                <w:sz w:val="22"/>
-                <w:szCs w:val="22"/>
-                <w:color w:val="000000"/>
-              </w:rPr>
-              <w:t xml:space="preserve">38.71</w:t>
-            </w:r>
-          </w:p>
-        </w:tc>
-      </w:tr>
-      <w:tr>
-        <w:trPr>
-          <w:trHeight w:val="360" w:hRule="auto"/>
-        </w:trPr>
-        body23
-        <w:tc>
-          <w:tcPr>
-            <w:tcBorders>
-              <w:bottom w:val="none" w:sz="0" w:space="0" w:color="000000"/>
-              <w:top w:val="none" w:sz="0" w:space="0" w:color="000000"/>
-              <w:left w:val="none" w:sz="0" w:space="0" w:color="000000"/>
-              <w:right w:val="none" w:sz="0" w:space="0" w:color="000000"/>
-            </w:tcBorders>
-            <w:shd w:val="clear" w:color="auto" w:fill="FFFFFF"/>
-            <w:tcMar>
-              <w:top w:w="0" w:type="dxa"/>
-              <w:bottom w:w="0" w:type="dxa"/>
-              <w:left w:w="0" w:type="dxa"/>
-              <w:right w:w="0" w:type="dxa"/>
-            </w:tcMar>
-            <w:vAlign w:val="center"/>
-          </w:tcPr>
-          <w:p>
-            <w:pPr>
-              <w:jc w:val="left"/>
-              <w:pBdr>
-                <w:bottom w:val="none" w:sz="0" w:space="0" w:color="000000"/>
-                <w:top w:val="none" w:sz="0" w:space="0" w:color="000000"/>
-                <w:left w:val="none" w:sz="0" w:space="0" w:color="000000"/>
-                <w:right w:val="none" w:sz="0" w:space="0" w:color="000000"/>
-              </w:pBdr>
-              <w:spacing w:after="100" w:before="100" w:line="480"/>
-              <w:ind w:left="100" w:right="100" w:firstLine="0" w:firstLineChars="0"/>
-              <w:rPr>
-                <w:rFonts w:ascii="Times New Roman" w:hAnsi="Times New Roman" w:eastAsia="Times New Roman" w:cs="Times New Roman"/>
-                <w:i w:val="false"/>
-                <w:b w:val="false"/>
-                <w:u w:val="none"/>
-                <w:strike w:val="false"/>
-                <w:sz w:val="22"/>
-                <w:szCs w:val="22"/>
-                <w:color w:val="000000"/>
-              </w:rPr>
-            </w:pPr>
-            <w:r xmlns:w="http://schemas.openxmlformats.org/wordprocessingml/2006/main" xmlns:wp="http://schemas.openxmlformats.org/drawingml/2006/wordprocessingDrawing" xmlns:r="http://schemas.openxmlformats.org/officeDocument/2006/relationships" xmlns:w14="http://schemas.microsoft.com/office/word/2010/wordml">
-              <w:rPr>
-                <w:rFonts w:ascii="Times New Roman" w:hAnsi="Times New Roman" w:eastAsia="Times New Roman" w:cs="Times New Roman"/>
-                <w:i w:val="false"/>
-                <w:b w:val="false"/>
-                <w:u w:val="none"/>
-                <w:strike w:val="false"/>
-                <w:sz w:val="22"/>
-                <w:szCs w:val="22"/>
-                <w:color w:val="000000"/>
-              </w:rPr>
-              <w:t xml:space="preserve">Studio Art </w:t>
-            </w:r>
-          </w:p>
-        </w:tc>
-        <w:tc>
-          <w:tcPr>
-            <w:tcBorders>
-              <w:bottom w:val="none" w:sz="0" w:space="0" w:color="000000"/>
-              <w:top w:val="none" w:sz="0" w:space="0" w:color="000000"/>
-              <w:left w:val="none" w:sz="0" w:space="0" w:color="000000"/>
-              <w:right w:val="none" w:sz="0" w:space="0" w:color="000000"/>
-            </w:tcBorders>
-            <w:shd w:val="clear" w:color="auto" w:fill="FFFFFF"/>
-            <w:tcMar>
-              <w:top w:w="0" w:type="dxa"/>
-              <w:bottom w:w="0" w:type="dxa"/>
-              <w:left w:w="0" w:type="dxa"/>
-              <w:right w:w="0" w:type="dxa"/>
-            </w:tcMar>
-            <w:vAlign w:val="center"/>
-          </w:tcPr>
-          <w:p>
-            <w:pPr>
-              <w:jc w:val="left"/>
-              <w:pBdr>
-                <w:bottom w:val="none" w:sz="0" w:space="0" w:color="000000"/>
-                <w:top w:val="none" w:sz="0" w:space="0" w:color="000000"/>
-                <w:left w:val="none" w:sz="0" w:space="0" w:color="000000"/>
-                <w:right w:val="none" w:sz="0" w:space="0" w:color="000000"/>
-              </w:pBdr>
-              <w:spacing w:after="100" w:before="100" w:line="480"/>
-              <w:ind w:left="100" w:right="100" w:firstLine="0" w:firstLineChars="0"/>
-              <w:rPr>
-                <w:rFonts w:ascii="Times New Roman" w:hAnsi="Times New Roman" w:eastAsia="Times New Roman" w:cs="Times New Roman"/>
-                <w:i w:val="false"/>
-                <w:b w:val="false"/>
-                <w:u w:val="none"/>
-                <w:strike w:val="false"/>
-                <w:sz w:val="22"/>
-                <w:szCs w:val="22"/>
-                <w:color w:val="000000"/>
-              </w:rPr>
-            </w:pPr>
-            <w:r xmlns:w="http://schemas.openxmlformats.org/wordprocessingml/2006/main" xmlns:wp="http://schemas.openxmlformats.org/drawingml/2006/wordprocessingDrawing" xmlns:r="http://schemas.openxmlformats.org/officeDocument/2006/relationships" xmlns:w14="http://schemas.microsoft.com/office/word/2010/wordml">
-              <w:rPr>
-                <w:rFonts w:ascii="Times New Roman" w:hAnsi="Times New Roman" w:eastAsia="Times New Roman" w:cs="Times New Roman"/>
-                <w:i w:val="false"/>
-                <w:b w:val="false"/>
-                <w:u w:val="none"/>
-                <w:strike w:val="false"/>
-                <w:sz w:val="22"/>
-                <w:szCs w:val="22"/>
-                <w:color w:val="000000"/>
-              </w:rPr>
-              <w:t xml:space="preserve">2</w:t>
-            </w:r>
-          </w:p>
-        </w:tc>
-        <w:tc>
-          <w:tcPr>
-            <w:tcBorders>
-              <w:bottom w:val="none" w:sz="0" w:space="0" w:color="000000"/>
-              <w:top w:val="none" w:sz="0" w:space="0" w:color="000000"/>
-              <w:left w:val="none" w:sz="0" w:space="0" w:color="000000"/>
-              <w:right w:val="none" w:sz="0" w:space="0" w:color="000000"/>
-            </w:tcBorders>
-            <w:shd w:val="clear" w:color="auto" w:fill="FFFFFF"/>
-            <w:tcMar>
-              <w:top w:w="0" w:type="dxa"/>
-              <w:bottom w:w="0" w:type="dxa"/>
-              <w:left w:w="0" w:type="dxa"/>
-              <w:right w:w="0" w:type="dxa"/>
-            </w:tcMar>
-            <w:vAlign w:val="center"/>
-          </w:tcPr>
-          <w:p>
-            <w:pPr>
-              <w:jc w:val="left"/>
-              <w:pBdr>
-                <w:bottom w:val="none" w:sz="0" w:space="0" w:color="000000"/>
-                <w:top w:val="none" w:sz="0" w:space="0" w:color="000000"/>
-                <w:left w:val="none" w:sz="0" w:space="0" w:color="000000"/>
-                <w:right w:val="none" w:sz="0" w:space="0" w:color="000000"/>
-              </w:pBdr>
-              <w:spacing w:after="100" w:before="100" w:line="480"/>
-              <w:ind w:left="100" w:right="100" w:firstLine="0" w:firstLineChars="0"/>
-              <w:rPr>
-                <w:rFonts w:ascii="Times New Roman" w:hAnsi="Times New Roman" w:eastAsia="Times New Roman" w:cs="Times New Roman"/>
-                <w:i w:val="false"/>
-                <w:b w:val="false"/>
-                <w:u w:val="none"/>
-                <w:strike w:val="false"/>
-                <w:sz w:val="22"/>
-                <w:szCs w:val="22"/>
-                <w:color w:val="000000"/>
-              </w:rPr>
-            </w:pPr>
-            <w:r xmlns:w="http://schemas.openxmlformats.org/wordprocessingml/2006/main" xmlns:wp="http://schemas.openxmlformats.org/drawingml/2006/wordprocessingDrawing" xmlns:r="http://schemas.openxmlformats.org/officeDocument/2006/relationships" xmlns:w14="http://schemas.microsoft.com/office/word/2010/wordml">
-              <w:rPr>
-                <w:rFonts w:ascii="Times New Roman" w:hAnsi="Times New Roman" w:eastAsia="Times New Roman" w:cs="Times New Roman"/>
-                <w:i w:val="false"/>
-                <w:b w:val="false"/>
-                <w:u w:val="none"/>
-                <w:strike w:val="false"/>
-                <w:sz w:val="22"/>
-                <w:szCs w:val="22"/>
-                <w:color w:val="000000"/>
-              </w:rPr>
-              <w:t xml:space="preserve">1.61</w:t>
-            </w:r>
-          </w:p>
-        </w:tc>
-      </w:tr>
-      <w:tr>
-        <w:trPr>
-          <w:trHeight w:val="360" w:hRule="auto"/>
-        </w:trPr>
-        body24
-        <w:tc>
-          <w:tcPr>
-            <w:tcBorders>
-              <w:bottom w:val="none" w:sz="0" w:space="0" w:color="000000"/>
-              <w:top w:val="none" w:sz="0" w:space="0" w:color="000000"/>
-              <w:left w:val="none" w:sz="0" w:space="0" w:color="000000"/>
-              <w:right w:val="none" w:sz="0" w:space="0" w:color="000000"/>
-            </w:tcBorders>
-            <w:shd w:val="clear" w:color="auto" w:fill="FFFFFF"/>
-            <w:tcMar>
-              <w:top w:w="0" w:type="dxa"/>
-              <w:bottom w:w="0" w:type="dxa"/>
-              <w:left w:w="0" w:type="dxa"/>
-              <w:right w:w="0" w:type="dxa"/>
-            </w:tcMar>
-            <w:vAlign w:val="center"/>
-          </w:tcPr>
-          <w:p>
-            <w:pPr>
-              <w:jc w:val="left"/>
-              <w:pBdr>
-                <w:bottom w:val="none" w:sz="0" w:space="0" w:color="000000"/>
-                <w:top w:val="none" w:sz="0" w:space="0" w:color="000000"/>
-                <w:left w:val="none" w:sz="0" w:space="0" w:color="000000"/>
-                <w:right w:val="none" w:sz="0" w:space="0" w:color="000000"/>
-              </w:pBdr>
-              <w:spacing w:after="100" w:before="100" w:line="480"/>
-              <w:ind w:left="100" w:right="100" w:firstLine="0" w:firstLineChars="0"/>
-              <w:rPr>
-                <w:rFonts w:ascii="Times New Roman" w:hAnsi="Times New Roman" w:eastAsia="Times New Roman" w:cs="Times New Roman"/>
-                <w:i w:val="false"/>
-                <w:b w:val="false"/>
-                <w:u w:val="none"/>
-                <w:strike w:val="false"/>
-                <w:sz w:val="22"/>
-                <w:szCs w:val="22"/>
-                <w:color w:val="000000"/>
-              </w:rPr>
-            </w:pPr>
-            <w:r xmlns:w="http://schemas.openxmlformats.org/wordprocessingml/2006/main" xmlns:wp="http://schemas.openxmlformats.org/drawingml/2006/wordprocessingDrawing" xmlns:r="http://schemas.openxmlformats.org/officeDocument/2006/relationships" xmlns:w14="http://schemas.microsoft.com/office/word/2010/wordml">
-              <w:rPr>
-                <w:rFonts w:ascii="Times New Roman" w:hAnsi="Times New Roman" w:eastAsia="Times New Roman" w:cs="Times New Roman"/>
-                <w:i w:val="false"/>
-                <w:b w:val="false"/>
-                <w:u w:val="none"/>
-                <w:strike w:val="false"/>
-                <w:sz w:val="22"/>
-                <w:szCs w:val="22"/>
-                <w:color w:val="000000"/>
-              </w:rPr>
-              <w:t xml:space="preserve">Undeclared Major</w:t>
-            </w:r>
-          </w:p>
-        </w:tc>
-        <w:tc>
-          <w:tcPr>
-            <w:tcBorders>
-              <w:bottom w:val="none" w:sz="0" w:space="0" w:color="000000"/>
-              <w:top w:val="none" w:sz="0" w:space="0" w:color="000000"/>
-              <w:left w:val="none" w:sz="0" w:space="0" w:color="000000"/>
-              <w:right w:val="none" w:sz="0" w:space="0" w:color="000000"/>
-            </w:tcBorders>
-            <w:shd w:val="clear" w:color="auto" w:fill="FFFFFF"/>
-            <w:tcMar>
-              <w:top w:w="0" w:type="dxa"/>
-              <w:bottom w:w="0" w:type="dxa"/>
-              <w:left w:w="0" w:type="dxa"/>
-              <w:right w:w="0" w:type="dxa"/>
-            </w:tcMar>
-            <w:vAlign w:val="center"/>
-          </w:tcPr>
-          <w:p>
-            <w:pPr>
-              <w:jc w:val="left"/>
-              <w:pBdr>
-                <w:bottom w:val="none" w:sz="0" w:space="0" w:color="000000"/>
-                <w:top w:val="none" w:sz="0" w:space="0" w:color="000000"/>
-                <w:left w:val="none" w:sz="0" w:space="0" w:color="000000"/>
-                <w:right w:val="none" w:sz="0" w:space="0" w:color="000000"/>
-              </w:pBdr>
-              <w:spacing w:after="100" w:before="100" w:line="480"/>
-              <w:ind w:left="100" w:right="100" w:firstLine="0" w:firstLineChars="0"/>
-              <w:rPr>
-                <w:rFonts w:ascii="Times New Roman" w:hAnsi="Times New Roman" w:eastAsia="Times New Roman" w:cs="Times New Roman"/>
-                <w:i w:val="false"/>
-                <w:b w:val="false"/>
-                <w:u w:val="none"/>
-                <w:strike w:val="false"/>
-                <w:sz w:val="22"/>
-                <w:szCs w:val="22"/>
-                <w:color w:val="000000"/>
-              </w:rPr>
-            </w:pPr>
-            <w:r xmlns:w="http://schemas.openxmlformats.org/wordprocessingml/2006/main" xmlns:wp="http://schemas.openxmlformats.org/drawingml/2006/wordprocessingDrawing" xmlns:r="http://schemas.openxmlformats.org/officeDocument/2006/relationships" xmlns:w14="http://schemas.microsoft.com/office/word/2010/wordml">
-              <w:rPr>
-                <w:rFonts w:ascii="Times New Roman" w:hAnsi="Times New Roman" w:eastAsia="Times New Roman" w:cs="Times New Roman"/>
-                <w:i w:val="false"/>
-                <w:b w:val="false"/>
-                <w:u w:val="none"/>
-                <w:strike w:val="false"/>
-                <w:sz w:val="22"/>
-                <w:szCs w:val="22"/>
-                <w:color w:val="000000"/>
-              </w:rPr>
-              <w:t xml:space="preserve">1</w:t>
-            </w:r>
-          </w:p>
-        </w:tc>
-        <w:tc>
-          <w:tcPr>
-            <w:tcBorders>
-              <w:bottom w:val="none" w:sz="0" w:space="0" w:color="000000"/>
-              <w:top w:val="none" w:sz="0" w:space="0" w:color="000000"/>
-              <w:left w:val="none" w:sz="0" w:space="0" w:color="000000"/>
-              <w:right w:val="none" w:sz="0" w:space="0" w:color="000000"/>
-            </w:tcBorders>
-            <w:shd w:val="clear" w:color="auto" w:fill="FFFFFF"/>
-            <w:tcMar>
-              <w:top w:w="0" w:type="dxa"/>
-              <w:bottom w:w="0" w:type="dxa"/>
-              <w:left w:w="0" w:type="dxa"/>
-              <w:right w:w="0" w:type="dxa"/>
-            </w:tcMar>
-            <w:vAlign w:val="center"/>
-          </w:tcPr>
-          <w:p>
-            <w:pPr>
-              <w:jc w:val="left"/>
-              <w:pBdr>
-                <w:bottom w:val="none" w:sz="0" w:space="0" w:color="000000"/>
-                <w:top w:val="none" w:sz="0" w:space="0" w:color="000000"/>
-                <w:left w:val="none" w:sz="0" w:space="0" w:color="000000"/>
-                <w:right w:val="none" w:sz="0" w:space="0" w:color="000000"/>
-              </w:pBdr>
-              <w:spacing w:after="100" w:before="100" w:line="480"/>
-              <w:ind w:left="100" w:right="100" w:firstLine="0" w:firstLineChars="0"/>
-              <w:rPr>
-                <w:rFonts w:ascii="Times New Roman" w:hAnsi="Times New Roman" w:eastAsia="Times New Roman" w:cs="Times New Roman"/>
-                <w:i w:val="false"/>
-                <w:b w:val="false"/>
-                <w:u w:val="none"/>
-                <w:strike w:val="false"/>
-                <w:sz w:val="22"/>
-                <w:szCs w:val="22"/>
-                <w:color w:val="000000"/>
-              </w:rPr>
-            </w:pPr>
-            <w:r xmlns:w="http://schemas.openxmlformats.org/wordprocessingml/2006/main" xmlns:wp="http://schemas.openxmlformats.org/drawingml/2006/wordprocessingDrawing" xmlns:r="http://schemas.openxmlformats.org/officeDocument/2006/relationships" xmlns:w14="http://schemas.microsoft.com/office/word/2010/wordml">
-              <w:rPr>
-                <w:rFonts w:ascii="Times New Roman" w:hAnsi="Times New Roman" w:eastAsia="Times New Roman" w:cs="Times New Roman"/>
-                <w:i w:val="false"/>
-                <w:b w:val="false"/>
-                <w:u w:val="none"/>
-                <w:strike w:val="false"/>
-                <w:sz w:val="22"/>
-                <w:szCs w:val="22"/>
-                <w:color w:val="000000"/>
-              </w:rPr>
-              <w:t xml:space="preserve">0.81</w:t>
-            </w:r>
-          </w:p>
-        </w:tc>
-      </w:tr>
-      <w:tr>
-        <w:trPr>
-          <w:trHeight w:val="360" w:hRule="auto"/>
-        </w:trPr>
-        body25
-        <w:tc>
-          <w:tcPr>
-            <w:tcBorders>
-              <w:bottom w:val="single" w:sz="6" w:space="0" w:color="000000"/>
-              <w:top w:val="none" w:sz="0" w:space="0" w:color="000000"/>
-              <w:left w:val="none" w:sz="0" w:space="0" w:color="000000"/>
-              <w:right w:val="none" w:sz="0" w:space="0" w:color="000000"/>
-            </w:tcBorders>
-            <w:shd w:val="clear" w:color="auto" w:fill="FFFFFF"/>
-            <w:tcMar>
-              <w:top w:w="0" w:type="dxa"/>
-              <w:bottom w:w="0" w:type="dxa"/>
-              <w:left w:w="0" w:type="dxa"/>
-              <w:right w:w="0" w:type="dxa"/>
-            </w:tcMar>
-            <w:vAlign w:val="center"/>
-          </w:tcPr>
-          <w:p>
-            <w:pPr>
-              <w:jc w:val="left"/>
-              <w:pBdr>
-                <w:bottom w:val="none" w:sz="0" w:space="0" w:color="000000"/>
-                <w:top w:val="none" w:sz="0" w:space="0" w:color="000000"/>
-                <w:left w:val="none" w:sz="0" w:space="0" w:color="000000"/>
-                <w:right w:val="none" w:sz="0" w:space="0" w:color="000000"/>
-              </w:pBdr>
-              <w:spacing w:after="100" w:before="100" w:line="480"/>
-              <w:ind w:left="100" w:right="100" w:firstLine="0" w:firstLineChars="0"/>
-              <w:rPr>
-                <w:rFonts w:ascii="Times New Roman" w:hAnsi="Times New Roman" w:eastAsia="Times New Roman" w:cs="Times New Roman"/>
-                <w:i w:val="false"/>
-                <w:b w:val="false"/>
-                <w:u w:val="none"/>
-                <w:strike w:val="false"/>
-                <w:sz w:val="22"/>
-                <w:szCs w:val="22"/>
-                <w:color w:val="000000"/>
-              </w:rPr>
-            </w:pPr>
-            <w:r xmlns:w="http://schemas.openxmlformats.org/wordprocessingml/2006/main" xmlns:wp="http://schemas.openxmlformats.org/drawingml/2006/wordprocessingDrawing" xmlns:r="http://schemas.openxmlformats.org/officeDocument/2006/relationships" xmlns:w14="http://schemas.microsoft.com/office/word/2010/wordml">
-              <w:rPr>
-                <w:rFonts w:ascii="Times New Roman" w:hAnsi="Times New Roman" w:eastAsia="Times New Roman" w:cs="Times New Roman"/>
-                <w:i w:val="false"/>
-                <w:b w:val="false"/>
-                <w:u w:val="none"/>
-                <w:strike w:val="false"/>
-                <w:sz w:val="22"/>
-                <w:szCs w:val="22"/>
-                <w:color w:val="000000"/>
-              </w:rPr>
-              <w:t xml:space="preserve">Video Production</w:t>
-            </w:r>
-          </w:p>
-        </w:tc>
-        <w:tc>
-          <w:tcPr>
-            <w:tcBorders>
-              <w:bottom w:val="single" w:sz="6" w:space="0" w:color="000000"/>
-              <w:top w:val="none" w:sz="0" w:space="0" w:color="000000"/>
-              <w:left w:val="none" w:sz="0" w:space="0" w:color="000000"/>
-              <w:right w:val="none" w:sz="0" w:space="0" w:color="000000"/>
-            </w:tcBorders>
-            <w:shd w:val="clear" w:color="auto" w:fill="FFFFFF"/>
-            <w:tcMar>
-              <w:top w:w="0" w:type="dxa"/>
-              <w:bottom w:w="0" w:type="dxa"/>
-              <w:left w:w="0" w:type="dxa"/>
-              <w:right w:w="0" w:type="dxa"/>
-            </w:tcMar>
-            <w:vAlign w:val="center"/>
-          </w:tcPr>
-          <w:p>
-            <w:pPr>
-              <w:jc w:val="left"/>
-              <w:pBdr>
-                <w:bottom w:val="none" w:sz="0" w:space="0" w:color="000000"/>
-                <w:top w:val="none" w:sz="0" w:space="0" w:color="000000"/>
-                <w:left w:val="none" w:sz="0" w:space="0" w:color="000000"/>
-                <w:right w:val="none" w:sz="0" w:space="0" w:color="000000"/>
-              </w:pBdr>
-              <w:spacing w:after="100" w:before="100" w:line="480"/>
-              <w:ind w:left="100" w:right="100" w:firstLine="0" w:firstLineChars="0"/>
-              <w:rPr>
-                <w:rFonts w:ascii="Times New Roman" w:hAnsi="Times New Roman" w:eastAsia="Times New Roman" w:cs="Times New Roman"/>
-                <w:i w:val="false"/>
-                <w:b w:val="false"/>
-                <w:u w:val="none"/>
-                <w:strike w:val="false"/>
-                <w:sz w:val="22"/>
-                <w:szCs w:val="22"/>
-                <w:color w:val="000000"/>
-              </w:rPr>
-            </w:pPr>
-            <w:r xmlns:w="http://schemas.openxmlformats.org/wordprocessingml/2006/main" xmlns:wp="http://schemas.openxmlformats.org/drawingml/2006/wordprocessingDrawing" xmlns:r="http://schemas.openxmlformats.org/officeDocument/2006/relationships" xmlns:w14="http://schemas.microsoft.com/office/word/2010/wordml">
-              <w:rPr>
-                <w:rFonts w:ascii="Times New Roman" w:hAnsi="Times New Roman" w:eastAsia="Times New Roman" w:cs="Times New Roman"/>
-                <w:i w:val="false"/>
-                <w:b w:val="false"/>
-                <w:u w:val="none"/>
-                <w:strike w:val="false"/>
-                <w:sz w:val="22"/>
-                <w:szCs w:val="22"/>
-                <w:color w:val="000000"/>
-              </w:rPr>
-              <w:t xml:space="preserve">1</w:t>
-            </w:r>
-          </w:p>
-        </w:tc>
-        <w:tc>
-          <w:tcPr>
-            <w:tcBorders>
-              <w:bottom w:val="single" w:sz="6" w:space="0" w:color="000000"/>
-              <w:top w:val="none" w:sz="0" w:space="0" w:color="000000"/>
-              <w:left w:val="none" w:sz="0" w:space="0" w:color="000000"/>
-              <w:right w:val="none" w:sz="0" w:space="0" w:color="000000"/>
-            </w:tcBorders>
-            <w:shd w:val="clear" w:color="auto" w:fill="FFFFFF"/>
-            <w:tcMar>
-              <w:top w:w="0" w:type="dxa"/>
-              <w:bottom w:w="0" w:type="dxa"/>
-              <w:left w:w="0" w:type="dxa"/>
-              <w:right w:w="0" w:type="dxa"/>
-            </w:tcMar>
-            <w:vAlign w:val="center"/>
-          </w:tcPr>
-          <w:p>
-            <w:pPr>
-              <w:jc w:val="left"/>
-              <w:pBdr>
-                <w:bottom w:val="none" w:sz="0" w:space="0" w:color="000000"/>
-                <w:top w:val="none" w:sz="0" w:space="0" w:color="000000"/>
-                <w:left w:val="none" w:sz="0" w:space="0" w:color="000000"/>
-                <w:right w:val="none" w:sz="0" w:space="0" w:color="000000"/>
-              </w:pBdr>
-              <w:spacing w:after="100" w:before="100" w:line="480"/>
-              <w:ind w:left="100" w:right="100" w:firstLine="0" w:firstLineChars="0"/>
-              <w:rPr>
-                <w:rFonts w:ascii="Times New Roman" w:hAnsi="Times New Roman" w:eastAsia="Times New Roman" w:cs="Times New Roman"/>
-                <w:i w:val="false"/>
-                <w:b w:val="false"/>
-                <w:u w:val="none"/>
-                <w:strike w:val="false"/>
-                <w:sz w:val="22"/>
-                <w:szCs w:val="22"/>
-                <w:color w:val="000000"/>
-              </w:rPr>
-            </w:pPr>
-            <w:r xmlns:w="http://schemas.openxmlformats.org/wordprocessingml/2006/main" xmlns:wp="http://schemas.openxmlformats.org/drawingml/2006/wordprocessingDrawing" xmlns:r="http://schemas.openxmlformats.org/officeDocument/2006/relationships" xmlns:w14="http://schemas.microsoft.com/office/word/2010/wordml">
-              <w:rPr>
-                <w:rFonts w:ascii="Times New Roman" w:hAnsi="Times New Roman" w:eastAsia="Times New Roman" w:cs="Times New Roman"/>
-                <w:i w:val="false"/>
-                <w:b w:val="false"/>
-                <w:u w:val="none"/>
-                <w:strike w:val="false"/>
-                <w:sz w:val="22"/>
-                <w:szCs w:val="22"/>
-                <w:color w:val="000000"/>
-              </w:rPr>
-              <w:t xml:space="preserve">0.81</w:t>
-            </w:r>
-          </w:p>
-        </w:tc>
-      </w:tr>
-    </w:tbl>
-    <w:bookmarkEnd w:id="48"/>
     <w:p>
       <w:r>
         <w:br w:type="page"/>
       </w:r>
     </w:p>
-    <w:bookmarkStart w:id="49" w:name="tbl-corrs"/>
+    <w:bookmarkStart w:id="48" w:name="tbl-corrs"/>
     <w:p>
       <w:pPr>
         <w:pStyle w:val="FigureTitle"/>
@@ -9361,13 +4948,13 @@
         </w:tc>
       </w:tr>
     </w:tbl>
-    <w:bookmarkEnd w:id="49"/>
+    <w:bookmarkEnd w:id="48"/>
     <w:p>
       <w:r>
         <w:br w:type="page"/>
       </w:r>
     </w:p>
-    <w:bookmarkStart w:id="53" w:name="fig-net-gpt"/>
+    <w:bookmarkStart w:id="52" w:name="fig-net-gpt"/>
     <w:p>
       <w:pPr>
         <w:pStyle w:val="FigureTitle"/>
@@ -9393,18 +4980,18 @@
           <wp:inline>
             <wp:extent cx="5943600" cy="5943600"/>
             <wp:effectExtent b="0" l="0" r="0" t="0"/>
-            <wp:docPr descr="" title="" id="51" name="Picture"/>
+            <wp:docPr descr="" title="" id="50" name="Picture"/>
             <a:graphic>
               <a:graphicData uri="http://schemas.openxmlformats.org/drawingml/2006/picture">
                 <pic:pic>
                   <pic:nvPicPr>
-                    <pic:cNvPr descr="AI_JCM_files/figure-docx/fig-net-gpt-1.png" id="52" name="Picture"/>
+                    <pic:cNvPr descr="AI_JCM_files/figure-docx/fig-net-gpt-1.png" id="51" name="Picture"/>
                     <pic:cNvPicPr>
                       <a:picLocks noChangeArrowheads="1" noChangeAspect="1"/>
                     </pic:cNvPicPr>
                   </pic:nvPicPr>
                   <pic:blipFill>
-                    <a:blip r:embed="rId50"/>
+                    <a:blip r:embed="rId49"/>
                     <a:stretch>
                       <a:fillRect/>
                     </a:stretch>
@@ -9431,13 +5018,13 @@
         </w:drawing>
       </w:r>
     </w:p>
-    <w:bookmarkEnd w:id="53"/>
+    <w:bookmarkEnd w:id="52"/>
     <w:p>
       <w:r>
         <w:br w:type="page"/>
       </w:r>
     </w:p>
-    <w:bookmarkStart w:id="57" w:name="fig-net-sme"/>
+    <w:bookmarkStart w:id="56" w:name="fig-net-sme"/>
     <w:p>
       <w:pPr>
         <w:pStyle w:val="FigureTitle"/>
@@ -9463,18 +5050,18 @@
           <wp:inline>
             <wp:extent cx="5943600" cy="5943600"/>
             <wp:effectExtent b="0" l="0" r="0" t="0"/>
-            <wp:docPr descr="" title="" id="55" name="Picture"/>
+            <wp:docPr descr="" title="" id="54" name="Picture"/>
             <a:graphic>
               <a:graphicData uri="http://schemas.openxmlformats.org/drawingml/2006/picture">
                 <pic:pic>
                   <pic:nvPicPr>
-                    <pic:cNvPr descr="AI_JCM_files/figure-docx/fig-net-sme-1.png" id="56" name="Picture"/>
+                    <pic:cNvPr descr="AI_JCM_files/figure-docx/fig-net-sme-1.png" id="55" name="Picture"/>
                     <pic:cNvPicPr>
                       <a:picLocks noChangeArrowheads="1" noChangeAspect="1"/>
                     </pic:cNvPicPr>
                   </pic:nvPicPr>
                   <pic:blipFill>
-                    <a:blip r:embed="rId54"/>
+                    <a:blip r:embed="rId53"/>
                     <a:stretch>
                       <a:fillRect/>
                     </a:stretch>
@@ -9501,13 +5088,13 @@
         </w:drawing>
       </w:r>
     </w:p>
-    <w:bookmarkEnd w:id="57"/>
+    <w:bookmarkEnd w:id="56"/>
     <w:p>
       <w:r>
         <w:br w:type="page"/>
       </w:r>
     </w:p>
-    <w:bookmarkStart w:id="61" w:name="fig-net-genie"/>
+    <w:bookmarkStart w:id="60" w:name="fig-net-genie"/>
     <w:p>
       <w:pPr>
         <w:pStyle w:val="FigureTitle"/>
@@ -9533,18 +5120,18 @@
           <wp:inline>
             <wp:extent cx="5943600" cy="5943600"/>
             <wp:effectExtent b="0" l="0" r="0" t="0"/>
-            <wp:docPr descr="" title="" id="59" name="Picture"/>
+            <wp:docPr descr="" title="" id="58" name="Picture"/>
             <a:graphic>
               <a:graphicData uri="http://schemas.openxmlformats.org/drawingml/2006/picture">
                 <pic:pic>
                   <pic:nvPicPr>
-                    <pic:cNvPr descr="AI_JCM_files/figure-docx/fig-net-genie-1.png" id="60" name="Picture"/>
+                    <pic:cNvPr descr="AI_JCM_files/figure-docx/fig-net-genie-1.png" id="59" name="Picture"/>
                     <pic:cNvPicPr>
                       <a:picLocks noChangeArrowheads="1" noChangeAspect="1"/>
                     </pic:cNvPicPr>
                   </pic:nvPicPr>
                   <pic:blipFill>
-                    <a:blip r:embed="rId58"/>
+                    <a:blip r:embed="rId57"/>
                     <a:stretch>
                       <a:fillRect/>
                     </a:stretch>
@@ -9571,13 +5158,13 @@
         </w:drawing>
       </w:r>
     </w:p>
-    <w:bookmarkEnd w:id="61"/>
+    <w:bookmarkEnd w:id="60"/>
     <w:p>
       <w:r>
         <w:br w:type="page"/>
       </w:r>
     </w:p>
-    <w:bookmarkStart w:id="65" w:name="fig-ega-gpt"/>
+    <w:bookmarkStart w:id="64" w:name="fig-ega-gpt"/>
     <w:p>
       <w:pPr>
         <w:pStyle w:val="FigureTitle"/>
@@ -9603,18 +5190,18 @@
           <wp:inline>
             <wp:extent cx="5943600" cy="5943600"/>
             <wp:effectExtent b="0" l="0" r="0" t="0"/>
-            <wp:docPr descr="" title="" id="63" name="Picture"/>
+            <wp:docPr descr="" title="" id="62" name="Picture"/>
             <a:graphic>
               <a:graphicData uri="http://schemas.openxmlformats.org/drawingml/2006/picture">
                 <pic:pic>
                   <pic:nvPicPr>
-                    <pic:cNvPr descr="AI_JCM_files/figure-docx/fig-ega-gpt-1.png" id="64" name="Picture"/>
+                    <pic:cNvPr descr="AI_JCM_files/figure-docx/fig-ega-gpt-1.png" id="63" name="Picture"/>
                     <pic:cNvPicPr>
                       <a:picLocks noChangeArrowheads="1" noChangeAspect="1"/>
                     </pic:cNvPicPr>
                   </pic:nvPicPr>
                   <pic:blipFill>
-                    <a:blip r:embed="rId62"/>
+                    <a:blip r:embed="rId61"/>
                     <a:stretch>
                       <a:fillRect/>
                     </a:stretch>
@@ -9641,13 +5228,13 @@
         </w:drawing>
       </w:r>
     </w:p>
-    <w:bookmarkEnd w:id="65"/>
+    <w:bookmarkEnd w:id="64"/>
     <w:p>
       <w:r>
         <w:br w:type="page"/>
       </w:r>
     </w:p>
-    <w:bookmarkStart w:id="69" w:name="fig-ega-sme"/>
+    <w:bookmarkStart w:id="68" w:name="fig-ega-sme"/>
     <w:p>
       <w:pPr>
         <w:pStyle w:val="FigureTitle"/>
@@ -9673,18 +5260,18 @@
           <wp:inline>
             <wp:extent cx="5943600" cy="5943600"/>
             <wp:effectExtent b="0" l="0" r="0" t="0"/>
-            <wp:docPr descr="" title="" id="67" name="Picture"/>
+            <wp:docPr descr="" title="" id="66" name="Picture"/>
             <a:graphic>
               <a:graphicData uri="http://schemas.openxmlformats.org/drawingml/2006/picture">
                 <pic:pic>
                   <pic:nvPicPr>
-                    <pic:cNvPr descr="AI_JCM_files/figure-docx/fig-ega-sme-1.png" id="68" name="Picture"/>
+                    <pic:cNvPr descr="AI_JCM_files/figure-docx/fig-ega-sme-1.png" id="67" name="Picture"/>
                     <pic:cNvPicPr>
                       <a:picLocks noChangeArrowheads="1" noChangeAspect="1"/>
                     </pic:cNvPicPr>
                   </pic:nvPicPr>
                   <pic:blipFill>
-                    <a:blip r:embed="rId66"/>
+                    <a:blip r:embed="rId65"/>
                     <a:stretch>
                       <a:fillRect/>
                     </a:stretch>
@@ -9711,13 +5298,13 @@
         </w:drawing>
       </w:r>
     </w:p>
-    <w:bookmarkEnd w:id="69"/>
+    <w:bookmarkEnd w:id="68"/>
     <w:p>
       <w:r>
         <w:br w:type="page"/>
       </w:r>
     </w:p>
-    <w:bookmarkStart w:id="73" w:name="fig-ega-genie"/>
+    <w:bookmarkStart w:id="72" w:name="fig-ega-genie"/>
     <w:p>
       <w:pPr>
         <w:pStyle w:val="FigureTitle"/>
@@ -9743,18 +5330,18 @@
           <wp:inline>
             <wp:extent cx="5943600" cy="5943600"/>
             <wp:effectExtent b="0" l="0" r="0" t="0"/>
-            <wp:docPr descr="" title="" id="71" name="Picture"/>
+            <wp:docPr descr="" title="" id="70" name="Picture"/>
             <a:graphic>
               <a:graphicData uri="http://schemas.openxmlformats.org/drawingml/2006/picture">
                 <pic:pic>
                   <pic:nvPicPr>
-                    <pic:cNvPr descr="AI_JCM_files/figure-docx/fig-ega-genie-1.png" id="72" name="Picture"/>
+                    <pic:cNvPr descr="AI_JCM_files/figure-docx/fig-ega-genie-1.png" id="71" name="Picture"/>
                     <pic:cNvPicPr>
                       <a:picLocks noChangeArrowheads="1" noChangeAspect="1"/>
                     </pic:cNvPicPr>
                   </pic:nvPicPr>
                   <pic:blipFill>
-                    <a:blip r:embed="rId70"/>
+                    <a:blip r:embed="rId69"/>
                     <a:stretch>
                       <a:fillRect/>
                     </a:stretch>
@@ -9781,13 +5368,13 @@
         </w:drawing>
       </w:r>
     </w:p>
+    <w:bookmarkEnd w:id="72"/>
+    <w:p>
+      <w:r>
+        <w:br w:type="page"/>
+      </w:r>
+    </w:p>
     <w:bookmarkEnd w:id="73"/>
-    <w:p>
-      <w:r>
-        <w:br w:type="page"/>
-      </w:r>
-    </w:p>
-    <w:bookmarkEnd w:id="74"/>
     <w:sectPr>
       <w:headerReference r:id="rId9" w:type="even"/>
       <w:headerReference r:id="rId11" w:type="default"/>

</xml_diff>

<commit_message>
pushing for Diego - hopefully also fixed project file
</commit_message>
<xml_diff>
--- a/AI_JCM.docx
+++ b/AI_JCM.docx
@@ -2,7 +2,7 @@
 <file path=word/document.xml><?xml version="1.0" encoding="utf-8"?>
 <w:document xmlns:w="http://schemas.openxmlformats.org/wordprocessingml/2006/main" xmlns:m="http://schemas.openxmlformats.org/officeDocument/2006/math" xmlns:r="http://schemas.openxmlformats.org/officeDocument/2006/relationships" xmlns:o="urn:schemas-microsoft-com:office:office" xmlns:v="urn:schemas-microsoft-com:vml" xmlns:w10="urn:schemas-microsoft-com:office:word" xmlns:a="http://schemas.openxmlformats.org/drawingml/2006/main" xmlns:pic="http://schemas.openxmlformats.org/drawingml/2006/picture" xmlns:wp="http://schemas.openxmlformats.org/drawingml/2006/wordprocessingDrawing">
   <w:body>
-    <w:bookmarkStart w:id="22" w:name="firstheader"/>
+    <w:bookmarkStart w:id="24" w:name="firstheader"/>
     <w:p>
       <w:pPr>
         <w:pStyle w:val="Heading1"/>
@@ -24,7 +24,55 @@
         <w:pStyle w:val="BodyText"/>
       </w:pPr>
       <w:r>
-        <w:t xml:space="preserve">The present study is an exploratory comparison of three approaches to developing items intended to assess employees’ orientations toward workplace AI. Items for Callari and Puppione (2025)’s qualitatively-derived ideal AI user types were generated through (a) ChatGPT, (b) AI-GENIE, and (c) industrial-organizational psychology subject-matter experts. Traditional (e.g., EFAs) and semantic (e.g., exploratory graph analyses) results suggest noteworthy differences in the factor structure and communities across the three item-generation procedures.</w:t>
+        <w:t xml:space="preserve">The present study is an exploratory comparison of three approaches to</w:t>
+      </w:r>
+      <w:r>
+        <w:t xml:space="preserve"> </w:t>
+      </w:r>
+      <w:r>
+        <w:t xml:space="preserve">developing items intended to assess employees’ orientations toward</w:t>
+      </w:r>
+      <w:r>
+        <w:t xml:space="preserve"> </w:t>
+      </w:r>
+      <w:r>
+        <w:t xml:space="preserve">workplace AI. Items for Callari and Puppione (2025)’s</w:t>
+      </w:r>
+      <w:r>
+        <w:t xml:space="preserve"> </w:t>
+      </w:r>
+      <w:r>
+        <w:t xml:space="preserve">qualitatively-derived ideal AI user types were generated through (a)</w:t>
+      </w:r>
+      <w:r>
+        <w:t xml:space="preserve"> </w:t>
+      </w:r>
+      <w:r>
+        <w:t xml:space="preserve">ChatGPT, (b) AI-GENIE, and (c) industrial-organizational psychology</w:t>
+      </w:r>
+      <w:r>
+        <w:t xml:space="preserve"> </w:t>
+      </w:r>
+      <w:r>
+        <w:t xml:space="preserve">subject-matter experts. Traditional (e.g., EFAs) and semantic (e.g.,</w:t>
+      </w:r>
+      <w:r>
+        <w:t xml:space="preserve"> </w:t>
+      </w:r>
+      <w:r>
+        <w:t xml:space="preserve">exploratory graph analyses) results suggest noteworthy differences in</w:t>
+      </w:r>
+      <w:r>
+        <w:t xml:space="preserve"> </w:t>
+      </w:r>
+      <w:r>
+        <w:t xml:space="preserve">the factor structure and communities across the three item-generation</w:t>
+      </w:r>
+      <w:r>
+        <w:t xml:space="preserve"> </w:t>
+      </w:r>
+      <w:r>
+        <w:t xml:space="preserve">procedures.</w:t>
       </w:r>
     </w:p>
     <w:p>
@@ -75,7 +123,43 @@
         <w:t xml:space="preserve"> </w:t>
       </w:r>
       <w:r>
-        <w:t xml:space="preserve">proposes that core job characteristics shape critical psychological states and, ultimately, important employee outcomes, and emerging research suggests that digitization may substantially alter these characteristics. For example, digital technologies may automate repetitive tasks, but they may also fragment work, limit skill use, or diminish employees’ sense of ownership over their work.</w:t>
+        <w:t xml:space="preserve">proposes that core job</w:t>
+      </w:r>
+      <w:r>
+        <w:t xml:space="preserve"> </w:t>
+      </w:r>
+      <w:r>
+        <w:t xml:space="preserve">characteristics shape critical psychological states and, ultimately,</w:t>
+      </w:r>
+      <w:r>
+        <w:t xml:space="preserve"> </w:t>
+      </w:r>
+      <w:r>
+        <w:t xml:space="preserve">important employee outcomes, and emerging research suggests that</w:t>
+      </w:r>
+      <w:r>
+        <w:t xml:space="preserve"> </w:t>
+      </w:r>
+      <w:r>
+        <w:t xml:space="preserve">digitization may substantially alter these characteristics. For example,</w:t>
+      </w:r>
+      <w:r>
+        <w:t xml:space="preserve"> </w:t>
+      </w:r>
+      <w:r>
+        <w:t xml:space="preserve">digital technologies may automate repetitive tasks, but they may also</w:t>
+      </w:r>
+      <w:r>
+        <w:t xml:space="preserve"> </w:t>
+      </w:r>
+      <w:r>
+        <w:t xml:space="preserve">fragment work, limit skill use, or diminish employees’ sense of</w:t>
+      </w:r>
+      <w:r>
+        <w:t xml:space="preserve"> </w:t>
+      </w:r>
+      <w:r>
+        <w:t xml:space="preserve">ownership over their work.</w:t>
       </w:r>
       <w:r>
         <w:t xml:space="preserve"> </w:t>
@@ -95,34 +179,108 @@
         <w:t xml:space="preserve">)</w:t>
       </w:r>
       <w:r>
-        <w:t xml:space="preserve">’s review of meaningful work in the digital age</w:t>
-      </w:r>
-      <w:r>
-        <w:t xml:space="preserve"> </w:t>
-      </w:r>
-      <w:r>
-        <w:t xml:space="preserve">identifies autonomy, skill variety, feedback, task significance, and</w:t>
-      </w:r>
-      <w:r>
-        <w:t xml:space="preserve"> </w:t>
-      </w:r>
-      <w:r>
-        <w:t xml:space="preserve">task identity as job characteristics affected by workplace digitization.</w:t>
-      </w:r>
-      <w:r>
-        <w:t xml:space="preserve"> </w:t>
-      </w:r>
-      <w:r>
-        <w:t xml:space="preserve">As such, as AI’s role in the design and performance of work grows it is important to understand how employees engage with the technology. The present makes two key contributions to our understanding of AI in the workplace: Our first aim is to create a measure of type of AI adopter. Second, we accomplish to goal of scale creation via a novel comparison of three approaches to developing items, comparing traditionally-derived subject matter expert ratings, with LLM-derived procedures including prompting via ChatGPT and through a dedicated R package (AI-GENIE).</w:t>
-      </w:r>
-    </w:p>
-    <w:bookmarkStart w:id="20" w:name="conceptualizing-ai-use-in-the-workplace"/>
+        <w:t xml:space="preserve">’s review of meaningful</w:t>
+      </w:r>
+      <w:r>
+        <w:t xml:space="preserve"> </w:t>
+      </w:r>
+      <w:r>
+        <w:t xml:space="preserve">work in the digital age identifies autonomy, skill variety, feedback,</w:t>
+      </w:r>
+      <w:r>
+        <w:t xml:space="preserve"> </w:t>
+      </w:r>
+      <w:r>
+        <w:t xml:space="preserve">task significance, and task identity as job characteristics affected by</w:t>
+      </w:r>
+      <w:r>
+        <w:t xml:space="preserve"> </w:t>
+      </w:r>
+      <w:r>
+        <w:t xml:space="preserve">workplace digitization. As such, as AI’s role in the design and</w:t>
+      </w:r>
+      <w:r>
+        <w:t xml:space="preserve"> </w:t>
+      </w:r>
+      <w:r>
+        <w:t xml:space="preserve">performance of work grows it is important to understand how employees</w:t>
+      </w:r>
+      <w:r>
+        <w:t xml:space="preserve"> </w:t>
+      </w:r>
+      <w:r>
+        <w:t xml:space="preserve">engage with the technology. The present research makes two key</w:t>
+      </w:r>
+      <w:r>
+        <w:t xml:space="preserve"> </w:t>
+      </w:r>
+      <w:r>
+        <w:t xml:space="preserve">contributions to our understanding of AI in the workplace: Our first aim</w:t>
+      </w:r>
+      <w:r>
+        <w:t xml:space="preserve"> </w:t>
+      </w:r>
+      <w:r>
+        <w:t xml:space="preserve">is to create a measure of AI adopter</w:t>
+      </w:r>
+      <w:r>
+        <w:t xml:space="preserve"> </w:t>
+      </w:r>
+      <w:r>
+        <w:t xml:space="preserve">“type”</w:t>
+      </w:r>
+      <w:r>
+        <w:t xml:space="preserve"> </w:t>
+      </w:r>
+      <w:r>
+        <w:t xml:space="preserve">as recently defined by</w:t>
+      </w:r>
+      <w:r>
+        <w:t xml:space="preserve"> </w:t>
+      </w:r>
+      <w:r>
+        <w:t xml:space="preserve">Callari and Puppione (</w:t>
+      </w:r>
+      <w:hyperlink w:anchor="ref-callari2025meaningful">
+        <w:r>
+          <w:rPr>
+            <w:rStyle w:val="Hyperlink"/>
+          </w:rPr>
+          <w:t xml:space="preserve">2025</w:t>
+        </w:r>
+      </w:hyperlink>
+      <w:r>
+        <w:t xml:space="preserve">)</w:t>
+      </w:r>
+      <w:r>
+        <w:t xml:space="preserve">. Second, we approach scale development via a novel</w:t>
+      </w:r>
+      <w:r>
+        <w:t xml:space="preserve"> </w:t>
+      </w:r>
+      <w:r>
+        <w:t xml:space="preserve">“competition”</w:t>
+      </w:r>
+      <w:r>
+        <w:t xml:space="preserve"> </w:t>
+      </w:r>
+      <w:r>
+        <w:t xml:space="preserve">of three approaches, (1) comparing traditionally-derived subject matter expert ratings, (2) with LLM-derived procedures including prompting via</w:t>
+      </w:r>
+      <w:r>
+        <w:t xml:space="preserve"> </w:t>
+      </w:r>
+      <w:r>
+        <w:t xml:space="preserve">ChatGPT and (3) through a dedicated R package (AI-GENIE). The contributions are both practical (a measure of AI adopter type) and methodological (combining semantic as well as quantitative indicators of measure quality).</w:t>
+      </w:r>
+    </w:p>
+    <w:bookmarkStart w:id="22" w:name="ai-use-in-the-workplace"/>
     <w:p>
       <w:pPr>
         <w:pStyle w:val="Heading2"/>
       </w:pPr>
       <w:r>
-        <w:t xml:space="preserve">Conceptualizing AI Use in the Workplace</w:t>
+        <w:t xml:space="preserve">AI Use in the Workplace</w:t>
       </w:r>
     </w:p>
     <w:p>
@@ -231,7 +389,23 @@
         <w:t xml:space="preserve"> </w:t>
       </w:r>
       <w:r>
-        <w:t xml:space="preserve">measures that capture how they incorporate AI into their work.</w:t>
+        <w:t xml:space="preserve">measures that capture</w:t>
+      </w:r>
+      <w:r>
+        <w:t xml:space="preserve"> </w:t>
+      </w:r>
+      <w:r>
+        <w:rPr>
+          <w:i/>
+          <w:iCs/>
+        </w:rPr>
+        <w:t xml:space="preserve">how</w:t>
+      </w:r>
+      <w:r>
+        <w:t xml:space="preserve"> </w:t>
+      </w:r>
+      <w:r>
+        <w:t xml:space="preserve">they incorporate AI into their work.</w:t>
       </w:r>
     </w:p>
     <w:p>
@@ -256,43 +430,19 @@
         <w:t xml:space="preserve"> </w:t>
       </w:r>
       <w:r>
-        <w:t xml:space="preserve">provide one framework for distinguish forms of AI</w:t>
-      </w:r>
-      <w:r>
-        <w:t xml:space="preserve"> </w:t>
-      </w:r>
-      <w:r>
-        <w:t xml:space="preserve">use. Drawing on qualitative data from employees using Microsoft 365</w:t>
-      </w:r>
-      <w:r>
-        <w:t xml:space="preserve"> </w:t>
-      </w:r>
-      <w:r>
-        <w:t xml:space="preserve">Copilot, they identified three ideal types of AI users</w:t>
-      </w:r>
-      <w:r>
-        <w:t xml:space="preserve"> </w:t>
-      </w:r>
-      <w:r>
-        <w:t xml:space="preserve">Efficiency-Seeking, Pragmatic Integrators, and Collaborative Optimizers.</w:t>
-      </w:r>
-      <w:r>
-        <w:t xml:space="preserve"> </w:t>
-      </w:r>
-      <w:r>
-        <w:t xml:space="preserve">These ideal types imply qualitatively different relationships between AI</w:t>
-      </w:r>
-      <w:r>
-        <w:t xml:space="preserve"> </w:t>
-      </w:r>
-      <w:r>
-        <w:t xml:space="preserve">and features of work including autonomy, skill utilization, cognitive</w:t>
-      </w:r>
-      <w:r>
-        <w:t xml:space="preserve"> </w:t>
-      </w:r>
-      <w:r>
-        <w:t xml:space="preserve">effort, and decision-making. The</w:t>
+        <w:t xml:space="preserve">provide such a framework for distinguish forms of AI</w:t>
+      </w:r>
+      <w:r>
+        <w:t xml:space="preserve"> </w:t>
+      </w:r>
+      <w:r>
+        <w:t xml:space="preserve">use. Drawing on qualitative data from employees who use Microsoft 365</w:t>
+      </w:r>
+      <w:r>
+        <w:t xml:space="preserve"> </w:t>
+      </w:r>
+      <w:r>
+        <w:t xml:space="preserve">Copilot at their jobs, they identified three ideal types of AI users and labeled these types as: Efficiency-Seeking, Pragmatic Integrators, and Collaborative Optimisers. These categories imply qualitatively different relationships between AI and features of work including autonomy, skill utilization, cognitive effort, and decision-making. The</w:t>
       </w:r>
       <w:r>
         <w:t xml:space="preserve"> </w:t>
@@ -315,37 +465,27 @@
         <w:t xml:space="preserve"> </w:t>
       </w:r>
       <w:r>
-        <w:t xml:space="preserve">framework</w:t>
-      </w:r>
-      <w:r>
-        <w:t xml:space="preserve"> </w:t>
-      </w:r>
-      <w:r>
-        <w:t xml:space="preserve">suggests that AI use is not a uniform behavior but rather is best</w:t>
-      </w:r>
-      <w:r>
-        <w:t xml:space="preserve"> </w:t>
-      </w:r>
-      <w:r>
-        <w:t xml:space="preserve">considered multidimensional.Yet, translating qualitative ideal types</w:t>
-      </w:r>
-      <w:r>
-        <w:t xml:space="preserve"> </w:t>
-      </w:r>
-      <w:r>
-        <w:t xml:space="preserve">into quantitative measures presents a challenge. Ideal types represent</w:t>
-      </w:r>
-      <w:r>
-        <w:t xml:space="preserve"> </w:t>
-      </w:r>
-      <w:r>
-        <w:t xml:space="preserve">recurring patterns of behavior and experience, but they do not</w:t>
-      </w:r>
-      <w:r>
-        <w:t xml:space="preserve"> </w:t>
-      </w:r>
-      <w:r>
-        <w:t xml:space="preserve">necessarily correspond to distinct psychological constructs. Additional</w:t>
+        <w:t xml:space="preserve">framework suggests that AI use is not a uniform behavior but rather is best</w:t>
+      </w:r>
+      <w:r>
+        <w:t xml:space="preserve"> </w:t>
+      </w:r>
+      <w:r>
+        <w:t xml:space="preserve">considered multidimensional. Yet, translating qualitative ideal types</w:t>
+      </w:r>
+      <w:r>
+        <w:t xml:space="preserve"> </w:t>
+      </w:r>
+      <w:r>
+        <w:t xml:space="preserve">into quantitative measures presents a challenge.</w:t>
+      </w:r>
+    </w:p>
+    <w:p>
+      <w:pPr>
+        <w:pStyle w:val="BodyText"/>
+      </w:pPr>
+      <w:r>
+        <w:t xml:space="preserve">Ideal types represent recurring patterns of behavior and experience, but they do not necessarily correspond to distinct psychological constructs. Additional</w:t>
       </w:r>
       <w:r>
         <w:t xml:space="preserve"> </w:t>
@@ -380,59 +520,17 @@
         <w:t xml:space="preserve"> </w:t>
       </w:r>
       <w:r>
-        <w:t xml:space="preserve">can be measured with survey</w:t>
-      </w:r>
-      <w:r>
-        <w:t xml:space="preserve"> </w:t>
-      </w:r>
-      <w:r>
-        <w:t xml:space="preserve">items. Interestingly, the measurement of AI use is potentially enriched</w:t>
-      </w:r>
-      <w:r>
-        <w:t xml:space="preserve"> </w:t>
-      </w:r>
-      <w:r>
-        <w:t xml:space="preserve">by recent technological developments. For a long time, the scale</w:t>
-      </w:r>
-      <w:r>
-        <w:t xml:space="preserve"> </w:t>
-      </w:r>
-      <w:r>
-        <w:t xml:space="preserve">development process has relied on the efforts of researchers and</w:t>
-      </w:r>
-      <w:r>
-        <w:t xml:space="preserve"> </w:t>
-      </w:r>
-      <w:r>
-        <w:t xml:space="preserve">subject-matter experts to turn construct definitions to survey items</w:t>
-      </w:r>
-      <w:r>
-        <w:t xml:space="preserve"> </w:t>
-      </w:r>
-      <w:r>
-        <w:t xml:space="preserve">measuring the construct. Now, generative AI now provides tools for</w:t>
-      </w:r>
-      <w:r>
-        <w:t xml:space="preserve"> </w:t>
-      </w:r>
-      <w:r>
-        <w:t xml:space="preserve">producing surveys that measure constructs from idea generation to item</w:t>
-      </w:r>
-      <w:r>
-        <w:t xml:space="preserve"> </w:t>
-      </w:r>
-      <w:r>
-        <w:t xml:space="preserve">testing. However, the question of whether survey items produced by</w:t>
-      </w:r>
-      <w:r>
-        <w:t xml:space="preserve"> </w:t>
-      </w:r>
-      <w:r>
-        <w:t xml:space="preserve">generative AI can properly measure constructs.</w:t>
-      </w:r>
-    </w:p>
-    <w:bookmarkEnd w:id="20"/>
-    <w:bookmarkStart w:id="21" w:name="the-current-study"/>
+        <w:t xml:space="preserve">can be measured with survey items.</w:t>
+      </w:r>
+      <w:r>
+        <w:t xml:space="preserve"> </w:t>
+      </w:r>
+      <w:r>
+        <w:t xml:space="preserve">Interestingly, the measurement of AI use is potentially enriched by recent technological developments. For a long time, the scale development process has relied on the efforts of researchers and subject-matter experts to turn construct definitions to survey items measuring the construct. Now, generative AI provides tools for producing surveys that measure constructs from idea generation to item testing. However, the question of whether survey items produced by generative AI can properly measure constructs remains.</w:t>
+      </w:r>
+    </w:p>
+    <w:bookmarkEnd w:id="22"/>
+    <w:bookmarkStart w:id="23" w:name="the-current-study"/>
     <w:p>
       <w:pPr>
         <w:pStyle w:val="Heading2"/>
@@ -446,19 +544,19 @@
         <w:pStyle w:val="FirstParagraph"/>
       </w:pPr>
       <w:r>
-        <w:t xml:space="preserve">The present study is an exploratory comparison of three approaches to developing items intended</w:t>
-      </w:r>
-      <w:r>
-        <w:t xml:space="preserve"> </w:t>
-      </w:r>
-      <w:r>
-        <w:t xml:space="preserve">to assess employees’ orientations toward workplace AI use. Specifically,</w:t>
-      </w:r>
-      <w:r>
-        <w:t xml:space="preserve"> </w:t>
-      </w:r>
-      <w:r>
-        <w:t xml:space="preserve">we compare items generated through (a) ChatGPT based on</w:t>
+        <w:t xml:space="preserve">The present study is an exploratory comparison of three approaches to</w:t>
+      </w:r>
+      <w:r>
+        <w:t xml:space="preserve"> </w:t>
+      </w:r>
+      <w:r>
+        <w:t xml:space="preserve">developing items intended to assess employees’ orientations toward</w:t>
+      </w:r>
+      <w:r>
+        <w:t xml:space="preserve"> </w:t>
+      </w:r>
+      <w:r>
+        <w:t xml:space="preserve">workplace AI use. Specifically, we develop items based on</w:t>
       </w:r>
       <w:r>
         <w:t xml:space="preserve"> </w:t>
@@ -478,67 +576,7 @@
         <w:t xml:space="preserve">)</w:t>
       </w:r>
       <w:r>
-        <w:t xml:space="preserve">’s (2025) ideal AI user types, (b) AI-GENIE, and (c)</w:t>
-      </w:r>
-      <w:r>
-        <w:t xml:space="preserve"> </w:t>
-      </w:r>
-      <w:r>
-        <w:t xml:space="preserve">industrial-organizational psychology subject-matter experts. We evaluate</w:t>
-      </w:r>
-      <w:r>
-        <w:t xml:space="preserve"> </w:t>
-      </w:r>
-      <w:r>
-        <w:t xml:space="preserve">the internal consistency and underlying factor structure of each item</w:t>
-      </w:r>
-      <w:r>
-        <w:t xml:space="preserve"> </w:t>
-      </w:r>
-      <w:r>
-        <w:t xml:space="preserve">set. In doing so, this study has two primary objectives: first, to</w:t>
-      </w:r>
-      <w:r>
-        <w:t xml:space="preserve"> </w:t>
-      </w:r>
-      <w:r>
-        <w:t xml:space="preserve">provide evidence regarding whether qualitatively derived forms of</w:t>
-      </w:r>
-      <w:r>
-        <w:t xml:space="preserve"> </w:t>
-      </w:r>
-      <w:r>
-        <w:t xml:space="preserve">human–AI interaction can be operationalized as quantitative constructs,</w:t>
-      </w:r>
-      <w:r>
-        <w:t xml:space="preserve"> </w:t>
-      </w:r>
-      <w:r>
-        <w:t xml:space="preserve">and second, to examine whether different approaches to item generation</w:t>
-      </w:r>
-      <w:r>
-        <w:t xml:space="preserve"> </w:t>
-      </w:r>
-      <w:r>
-        <w:t xml:space="preserve">yield comparable representations of those constructs. More broadly,</w:t>
-      </w:r>
-      <w:r>
-        <w:t xml:space="preserve"> </w:t>
-      </w:r>
-      <w:r>
-        <w:t xml:space="preserve">establishing how employees differ in their use of AI represents an</w:t>
-      </w:r>
-      <w:r>
-        <w:t xml:space="preserve"> </w:t>
-      </w:r>
-      <w:r>
-        <w:t xml:space="preserve">important step toward understanding how AI may reshape established</w:t>
-      </w:r>
-      <w:r>
-        <w:t xml:space="preserve"> </w:t>
-      </w:r>
-      <w:r>
-        <w:t xml:space="preserve">features of job design and the psychological experience of work.</w:t>
+        <w:t xml:space="preserve">’s ideal AI user types via (a) ChatGPT, (b) AI–GENIE, and (c) industrial-organizational psychology subject-matter experts (SMEs). We evaluate the internal consistency, underlying factor structure, and implied semantic groupings of each item set. In doing so, this study has two primary objectives: first, to provide evidence regarding whether qualitatively derived forms of human–AI interaction can be operationalized as quantitative constructs, and second, to examine whether different approaches to item generation yield comparable representations of those constructs. More broadly, establishing how employees differ in their use of AI represents an important step toward understanding how AI may reshape established features of job design and the psychological experience of work.</w:t>
       </w:r>
     </w:p>
     <w:p>
@@ -553,7 +591,13 @@
         <w:t xml:space="preserve">Research Question 1</w:t>
       </w:r>
       <w:r>
-        <w:t xml:space="preserve">: Is one instrument development procedure (ChatGPT, AI-GENIE, or SMEs) yet a more coherent structure through a traditional lens?</w:t>
+        <w:t xml:space="preserve">: Does one instrument development procedure</w:t>
+      </w:r>
+      <w:r>
+        <w:t xml:space="preserve"> </w:t>
+      </w:r>
+      <w:r>
+        <w:t xml:space="preserve">(ChatGPT, AI-GENIE, or SMEs) yeild a more coherent structure than others?</w:t>
       </w:r>
     </w:p>
     <w:p>
@@ -568,36 +612,71 @@
         <w:t xml:space="preserve">Research Question 2</w:t>
       </w:r>
       <w:r>
-        <w:t xml:space="preserve">: Is one instrument development procedure (ChatGPT, AI-GENIE, or SMEs) yet a more coherent structure through a contemporary lens?</w:t>
-      </w:r>
-    </w:p>
-    <w:p>
-      <w:pPr>
-        <w:pStyle w:val="BlockText"/>
-      </w:pPr>
+        <w:t xml:space="preserve">: Can a combination of traditional and</w:t>
+      </w:r>
+      <w:r>
+        <w:t xml:space="preserve"> </w:t>
+      </w:r>
+      <w:r>
+        <w:t xml:space="preserve">contemporary analyses provide a richer understanding of scale structure</w:t>
+      </w:r>
+      <w:r>
+        <w:t xml:space="preserve"> </w:t>
+      </w:r>
+      <w:r>
+        <w:t xml:space="preserve">than either approach alone?</w:t>
+      </w:r>
+    </w:p>
+    <w:bookmarkEnd w:id="23"/>
+    <w:bookmarkEnd w:id="24"/>
+    <w:bookmarkStart w:id="31" w:name="method"/>
+    <w:p>
+      <w:pPr>
+        <w:pStyle w:val="Heading1"/>
+      </w:pPr>
+      <w:r>
+        <w:t xml:space="preserve">Method</w:t>
+      </w:r>
+    </w:p>
+    <w:bookmarkStart w:id="25" w:name="procedure"/>
+    <w:p>
+      <w:pPr>
+        <w:pStyle w:val="Heading2"/>
+      </w:pPr>
+      <w:r>
+        <w:t xml:space="preserve">Procedure</w:t>
+      </w:r>
+    </w:p>
+    <w:p>
+      <w:pPr>
+        <w:pStyle w:val="FirstParagraph"/>
+      </w:pPr>
+      <w:r>
+        <w:t xml:space="preserve">After reading a brief description of the online survey purpose and providing consent, students were asked to think of the context where they use AI the most frequently (for example, as a student or as an employee) and to keep that role in mind for the entire survey. Respondents were presented items in fixed ordering (grouped sequentially within item development procedure), followed by a few demographic questions. Responses to all AI–Adopter items were provided along a shared 5-point Likert-type scale ranging from 1 (</w:t>
+      </w:r>
       <w:r>
         <w:rPr>
           <w:i/>
           <w:iCs/>
         </w:rPr>
-        <w:t xml:space="preserve">Research Question 3</w:t>
-      </w:r>
-      <w:r>
-        <w:t xml:space="preserve">: Does the combination of traditional and contemporary analyses provide a richer understanding of the structure than either alone?</w:t>
-      </w:r>
-    </w:p>
-    <w:bookmarkEnd w:id="21"/>
-    <w:bookmarkEnd w:id="22"/>
-    <w:bookmarkStart w:id="29" w:name="method"/>
-    <w:p>
-      <w:pPr>
-        <w:pStyle w:val="Heading1"/>
-      </w:pPr>
-      <w:r>
-        <w:t xml:space="preserve">Method</w:t>
-      </w:r>
-    </w:p>
-    <w:bookmarkStart w:id="23" w:name="participants"/>
+        <w:t xml:space="preserve">Strongly Agree</w:t>
+      </w:r>
+      <w:r>
+        <w:t xml:space="preserve">) to 5 (</w:t>
+      </w:r>
+      <w:r>
+        <w:rPr>
+          <w:i/>
+          <w:iCs/>
+        </w:rPr>
+        <w:t xml:space="preserve">Strongly Disagree</w:t>
+      </w:r>
+      <w:r>
+        <w:t xml:space="preserve">). Following the survey, respondents were debriefed and offered course credit for their time.</w:t>
+      </w:r>
+    </w:p>
+    <w:bookmarkEnd w:id="25"/>
+    <w:bookmarkStart w:id="26" w:name="participants"/>
     <w:p>
       <w:pPr>
         <w:pStyle w:val="Heading2"/>
@@ -611,13 +690,61 @@
         <w:pStyle w:val="FirstParagraph"/>
       </w:pPr>
       <w:r>
-        <w:t xml:space="preserve">124 undergraduate students responded (Mean age = 21.58, SD = 5.61). The students were given the choice of 50 different majors to choose from, with the greatest representation being Psychology at 38.71%, with a second largest group of Construction at 15.32%. When asked,</w:t>
-      </w:r>
-      <w:r>
-        <w:t xml:space="preserve"> </w:t>
-      </w:r>
-      <w:r>
-        <w:t xml:space="preserve">“Which context did you have in mind as you responded to the statements in this survey?”</w:t>
+        <w:t xml:space="preserve">124 undergraduate students responded (Mean age =</w:t>
+      </w:r>
+      <w:r>
+        <w:t xml:space="preserve"> </w:t>
+      </w:r>
+      <w:r>
+        <w:t xml:space="preserve">21.58, SD =</w:t>
+      </w:r>
+      <w:r>
+        <w:t xml:space="preserve"> </w:t>
+      </w:r>
+      <w:r>
+        <w:t xml:space="preserve">5.61). The students were given the</w:t>
+      </w:r>
+      <w:r>
+        <w:t xml:space="preserve"> </w:t>
+      </w:r>
+      <w:r>
+        <w:t xml:space="preserve">choice of 50 different majors to choose from, with the greatest</w:t>
+      </w:r>
+      <w:r>
+        <w:t xml:space="preserve"> </w:t>
+      </w:r>
+      <w:r>
+        <w:t xml:space="preserve">representation being Psychology at</w:t>
+      </w:r>
+      <w:r>
+        <w:t xml:space="preserve"> </w:t>
+      </w:r>
+      <w:r>
+        <w:t xml:space="preserve">38.71%, with a second largest group being</w:t>
+      </w:r>
+      <w:r>
+        <w:t xml:space="preserve"> </w:t>
+      </w:r>
+      <w:r>
+        <w:t xml:space="preserve">Construction majors (15.32%). When asked,</w:t>
+      </w:r>
+      <w:r>
+        <w:t xml:space="preserve"> </w:t>
+      </w:r>
+      <w:r>
+        <w:t xml:space="preserve">“Which context</w:t>
+      </w:r>
+      <w:r>
+        <w:t xml:space="preserve"> </w:t>
+      </w:r>
+      <w:r>
+        <w:t xml:space="preserve">did you have in mind as you responded to the statements in this</w:t>
+      </w:r>
+      <w:r>
+        <w:t xml:space="preserve"> </w:t>
+      </w:r>
+      <w:r>
+        <w:t xml:space="preserve">survey?”</w:t>
       </w:r>
       <w:r>
         <w:t xml:space="preserve">, 79.03% indicated</w:t>
@@ -629,7 +756,13 @@
         <w:t xml:space="preserve">“school”</w:t>
       </w:r>
       <w:r>
-        <w:t xml:space="preserve">, 12.9% indicated</w:t>
+        <w:t xml:space="preserve">,</w:t>
+      </w:r>
+      <w:r>
+        <w:t xml:space="preserve"> </w:t>
+      </w:r>
+      <w:r>
+        <w:t xml:space="preserve">12.9% indicated</w:t>
       </w:r>
       <w:r>
         <w:t xml:space="preserve"> </w:t>
@@ -638,7 +771,13 @@
         <w:t xml:space="preserve">“work”</w:t>
       </w:r>
       <w:r>
-        <w:t xml:space="preserve">, and 7.26% stated</w:t>
+        <w:t xml:space="preserve">, and</w:t>
+      </w:r>
+      <w:r>
+        <w:t xml:space="preserve"> </w:t>
+      </w:r>
+      <w:r>
+        <w:t xml:space="preserve">7.26% stated</w:t>
       </w:r>
       <w:r>
         <w:t xml:space="preserve"> </w:t>
@@ -650,8 +789,8 @@
         <w:t xml:space="preserve">.</w:t>
       </w:r>
     </w:p>
-    <w:bookmarkEnd w:id="23"/>
-    <w:bookmarkStart w:id="27" w:name="materials"/>
+    <w:bookmarkEnd w:id="26"/>
+    <w:bookmarkStart w:id="30" w:name="materials"/>
     <w:p>
       <w:pPr>
         <w:pStyle w:val="Heading2"/>
@@ -688,10 +827,16 @@
         <w:t xml:space="preserve"> </w:t>
       </w:r>
       <w:r>
-        <w:t xml:space="preserve">in their qualitative study on the way employees perceive meaningful work in tasks co-generated by Microsoft 365 Copilot specifically. They identified three ideal types, including an Efficiency-Seeking Type (perceives the AI tool as a straightforward task-assistance tool), a Pragmatic Integrator Type (perceives AI tool as a smarter assistant), and a Collaborative Optimiser Type (perceives AI tool an expert-like teammate). Three different methods of item generation were used (and compared) here.</w:t>
-      </w:r>
-    </w:p>
-    <w:bookmarkStart w:id="24" w:name="expertgenerated-items."/>
+        <w:t xml:space="preserve">in their qualitative study on the way employees</w:t>
+      </w:r>
+      <w:r>
+        <w:t xml:space="preserve"> </w:t>
+      </w:r>
+      <w:r>
+        <w:t xml:space="preserve">perceive meaningful work in tasks co-generated by Microsoft 365 Copilot. They identified three ideal types, including an Efficiency-Seeking Type (perceives the AI tool as a straightforward task-assistance tool), a Pragmatic Integrator Type (perceives AI tool as a smarter assistant), and a Collaborative Optimiser Type (perceives AI tool an expert-like teammate). Three different methods of item generation were used (and compared) here.</w:t>
+      </w:r>
+    </w:p>
+    <w:bookmarkStart w:id="27" w:name="expertgenerated-items."/>
     <w:p>
       <w:pPr>
         <w:pStyle w:val="Heading3"/>
@@ -705,7 +850,19 @@
         <w:pStyle w:val="FirstParagraph"/>
       </w:pPr>
       <w:r>
-        <w:t xml:space="preserve">Three of the researchers independently generated 6-8 items per dimension. Combined lists of items were discussed by dimension, and the initial list of 57 candidate items was reduced to</w:t>
+        <w:t xml:space="preserve">Three of the researchers independently generated 6-8 items per</w:t>
+      </w:r>
+      <w:r>
+        <w:t xml:space="preserve"> </w:t>
+      </w:r>
+      <w:r>
+        <w:t xml:space="preserve">dimension. Combined lists of items were discussed by dimension, and the</w:t>
+      </w:r>
+      <w:r>
+        <w:t xml:space="preserve"> </w:t>
+      </w:r>
+      <w:r>
+        <w:t xml:space="preserve">initial list of 57 candidate items was reduced to</w:t>
       </w:r>
       <w:r>
         <w:t xml:space="preserve"> </w:t>
@@ -718,11 +875,17 @@
         <w:t xml:space="preserve">k</w:t>
       </w:r>
       <w:r>
-        <w:t xml:space="preserve">=18 through consensus evaluation of item clarity and content domain coverage.</w:t>
-      </w:r>
-    </w:p>
-    <w:bookmarkEnd w:id="24"/>
-    <w:bookmarkStart w:id="25" w:name="chatgpt-generated-items."/>
+        <w:t xml:space="preserve">=18 through</w:t>
+      </w:r>
+      <w:r>
+        <w:t xml:space="preserve"> </w:t>
+      </w:r>
+      <w:r>
+        <w:t xml:space="preserve">consensus evaluation of item clarity and content domain coverage.</w:t>
+      </w:r>
+    </w:p>
+    <w:bookmarkEnd w:id="27"/>
+    <w:bookmarkStart w:id="28" w:name="chatgpt-generated-items."/>
     <w:p>
       <w:pPr>
         <w:pStyle w:val="Heading3"/>
@@ -736,19 +899,43 @@
         <w:pStyle w:val="FirstParagraph"/>
       </w:pPr>
       <w:r>
-        <w:t xml:space="preserve">The following prompt was input into ChatGPT version:</w:t>
-      </w:r>
-      <w:r>
-        <w:t xml:space="preserve"> </w:t>
-      </w:r>
-      <w:r>
-        <w:t xml:space="preserve">“I need your help with generating a tentative list of survey items. I am reading the attached paper for the third time. I am interested in the three AI user ideal types and the survey items that could be generated to measure an employee’s propensity toward one type or another.”</w:t>
-      </w:r>
-      <w:r>
-        <w:t xml:space="preserve"> </w:t>
-      </w:r>
-      <w:r>
-        <w:t xml:space="preserve">Eight items were generated per dimension, along with rationale for those item choices (total</w:t>
+        <w:t xml:space="preserve">The following prompt was input into ChatGPT version: “I need your help</w:t>
+      </w:r>
+      <w:r>
+        <w:t xml:space="preserve"> </w:t>
+      </w:r>
+      <w:r>
+        <w:t xml:space="preserve">with generating a tentative list of survey items. I am reading the</w:t>
+      </w:r>
+      <w:r>
+        <w:t xml:space="preserve"> </w:t>
+      </w:r>
+      <w:r>
+        <w:t xml:space="preserve">attached paper for the third time. I am interested in the three AI user</w:t>
+      </w:r>
+      <w:r>
+        <w:t xml:space="preserve"> </w:t>
+      </w:r>
+      <w:r>
+        <w:t xml:space="preserve">ideal types and the survey items that could be generated to measure an</w:t>
+      </w:r>
+      <w:r>
+        <w:t xml:space="preserve"> </w:t>
+      </w:r>
+      <w:r>
+        <w:t xml:space="preserve">employee’s propensity toward one type or another.” Eight items were</w:t>
+      </w:r>
+      <w:r>
+        <w:t xml:space="preserve"> </w:t>
+      </w:r>
+      <w:r>
+        <w:t xml:space="preserve">generated per dimension, along with rationale for those item choices</w:t>
+      </w:r>
+      <w:r>
+        <w:t xml:space="preserve"> </w:t>
+      </w:r>
+      <w:r>
+        <w:t xml:space="preserve">(total</w:t>
       </w:r>
       <w:r>
         <w:t xml:space="preserve"> </w:t>
@@ -761,11 +948,11 @@
         <w:t xml:space="preserve">k</w:t>
       </w:r>
       <w:r>
-        <w:t xml:space="preserve">=24). See Appendix B for the full ChatGPT prompt and output, and Appendix C for a full list of items.</w:t>
-      </w:r>
-    </w:p>
-    <w:bookmarkEnd w:id="25"/>
-    <w:bookmarkStart w:id="26" w:name="ai-genie-generated-items."/>
+        <w:t xml:space="preserve">=24).</w:t>
+      </w:r>
+    </w:p>
+    <w:bookmarkEnd w:id="28"/>
+    <w:bookmarkStart w:id="29" w:name="ai-genie-generated-items."/>
     <w:p>
       <w:pPr>
         <w:pStyle w:val="Heading3"/>
@@ -779,7 +966,13 @@
         <w:pStyle w:val="FirstParagraph"/>
       </w:pPr>
       <w:r>
-        <w:t xml:space="preserve">AI-GENIE is a tool for automated item development and validation using large language models and network psychometrics</w:t>
+        <w:t xml:space="preserve">AI-GENIE is a tool for automated item development and validation using</w:t>
+      </w:r>
+      <w:r>
+        <w:t xml:space="preserve"> </w:t>
+      </w:r>
+      <w:r>
+        <w:t xml:space="preserve">large language models and network psychometrics</w:t>
       </w:r>
       <w:r>
         <w:t xml:space="preserve"> </w:t>
@@ -805,7 +998,25 @@
         <w:t xml:space="preserve"> </w:t>
       </w:r>
       <w:r>
-        <w:t xml:space="preserve">“You are an expert scale developer and methodologist who writes high quality and succinct (although with a use a 7th grade reading level) items based on the overarching definition of AI Adopter Type as articulated in</w:t>
+        <w:t xml:space="preserve">“You</w:t>
+      </w:r>
+      <w:r>
+        <w:t xml:space="preserve"> </w:t>
+      </w:r>
+      <w:r>
+        <w:t xml:space="preserve">are an expert scale developer and methodologist who writes high quality</w:t>
+      </w:r>
+      <w:r>
+        <w:t xml:space="preserve"> </w:t>
+      </w:r>
+      <w:r>
+        <w:t xml:space="preserve">and succinct (although with a use a 7th grade reading level) items based</w:t>
+      </w:r>
+      <w:r>
+        <w:t xml:space="preserve"> </w:t>
+      </w:r>
+      <w:r>
+        <w:t xml:space="preserve">on the overarching definition of AI Adopter Type as articulated in</w:t>
       </w:r>
       <w:r>
         <w:t xml:space="preserve"> </w:t>
@@ -825,13 +1036,67 @@
         <w:t xml:space="preserve">)</w:t>
       </w:r>
       <w:r>
-        <w:t xml:space="preserve">: “Three Ideal Types were identified: Ideal Type (1) – the Efficiency-Seeking Type – perceives AI as a straightforward task-assistance tool, Ideal Type (2) – the Pragmatic Integrator Type – views AI as a smarter assistant, and Ideal Type (3) – the Collaborative Optimiser Type – considers AI an expert-like teammate.”</w:t>
-      </w:r>
-      <w:r>
-        <w:t xml:space="preserve"> </w:t>
-      </w:r>
-      <w:r>
-        <w:t xml:space="preserve">Definitions of all three of the above dimensions, as well as example descriptors are provided as part of the prompt. Thirty items were initially generated. Combined lists of items were discussed by the researchers by dimension, and the most unique and clearly-written items were retained for the survey (total</w:t>
+        <w:t xml:space="preserve">: “Three Ideal Types were identified: Ideal Type</w:t>
+      </w:r>
+      <w:r>
+        <w:t xml:space="preserve"> </w:t>
+      </w:r>
+      <w:r>
+        <w:t xml:space="preserve">(1) – the Efficiency-Seeking Type – perceives AI as a straightforward</w:t>
+      </w:r>
+      <w:r>
+        <w:t xml:space="preserve"> </w:t>
+      </w:r>
+      <w:r>
+        <w:t xml:space="preserve">task-assistance tool, Ideal Type (2) – the Pragmatic Integrator Type –</w:t>
+      </w:r>
+      <w:r>
+        <w:t xml:space="preserve"> </w:t>
+      </w:r>
+      <w:r>
+        <w:t xml:space="preserve">views AI as a smarter assistant, and Ideal Type (3) – the Collaborative</w:t>
+      </w:r>
+      <w:r>
+        <w:t xml:space="preserve"> </w:t>
+      </w:r>
+      <w:r>
+        <w:t xml:space="preserve">Optimiser Type – considers AI an expert-like teammate.”</w:t>
+      </w:r>
+      <w:r>
+        <w:t xml:space="preserve"> </w:t>
+      </w:r>
+      <w:r>
+        <w:t xml:space="preserve">Definitions of</w:t>
+      </w:r>
+      <w:r>
+        <w:t xml:space="preserve"> </w:t>
+      </w:r>
+      <w:r>
+        <w:t xml:space="preserve">all three of the above dimensions, as well as example descriptors were</w:t>
+      </w:r>
+      <w:r>
+        <w:t xml:space="preserve"> </w:t>
+      </w:r>
+      <w:r>
+        <w:t xml:space="preserve">provided as part of the prompt. Thirty items were initially generated.</w:t>
+      </w:r>
+      <w:r>
+        <w:t xml:space="preserve"> </w:t>
+      </w:r>
+      <w:r>
+        <w:t xml:space="preserve">Combined lists of items were discussed by the researchers by dimension,</w:t>
+      </w:r>
+      <w:r>
+        <w:t xml:space="preserve"> </w:t>
+      </w:r>
+      <w:r>
+        <w:t xml:space="preserve">and the most unique and clearly-written items were retained for the</w:t>
+      </w:r>
+      <w:r>
+        <w:t xml:space="preserve"> </w:t>
+      </w:r>
+      <w:r>
+        <w:t xml:space="preserve">survey (total</w:t>
       </w:r>
       <w:r>
         <w:t xml:space="preserve"> </w:t>
@@ -844,18 +1109,28 @@
         <w:t xml:space="preserve">k</w:t>
       </w:r>
       <w:r>
-        <w:t xml:space="preserve">=21). See the Appendix for all study items.</w:t>
-      </w:r>
-    </w:p>
-    <w:bookmarkEnd w:id="26"/>
-    <w:bookmarkEnd w:id="27"/>
-    <w:bookmarkStart w:id="28" w:name="procedure"/>
+        <w:t xml:space="preserve">=21). All study items, prompts, and materials are available on a publicly accessible repository [hidden for blind review].</w:t>
+      </w:r>
+    </w:p>
+    <w:bookmarkEnd w:id="29"/>
+    <w:bookmarkEnd w:id="30"/>
+    <w:bookmarkEnd w:id="31"/>
+    <w:bookmarkStart w:id="34" w:name="results"/>
+    <w:p>
+      <w:pPr>
+        <w:pStyle w:val="Heading1"/>
+      </w:pPr>
+      <w:r>
+        <w:t xml:space="preserve">Results</w:t>
+      </w:r>
+    </w:p>
+    <w:bookmarkStart w:id="32" w:name="traditional-analyses"/>
     <w:p>
       <w:pPr>
         <w:pStyle w:val="Heading2"/>
       </w:pPr>
       <w:r>
-        <w:t xml:space="preserve">Procedure</w:t>
+        <w:t xml:space="preserve">Traditional Analyses</w:t>
       </w:r>
     </w:p>
     <w:p>
@@ -863,55 +1138,13 @@
         <w:pStyle w:val="FirstParagraph"/>
       </w:pPr>
       <w:r>
-        <w:t xml:space="preserve">After consent, students were asked to think of the context where they use AI the most frequently (for example, as a student or as an employee) and to keep that role in mind for the entire survey. Respondents were shown items within generative grouping, followed by a few demographic questions. They responded to all AI–Adopter items on a 5-point Likert-type scale ranging from 1 (</w:t>
-      </w:r>
-      <w:r>
-        <w:rPr>
-          <w:i/>
-          <w:iCs/>
-        </w:rPr>
-        <w:t xml:space="preserve">strongly agree</w:t>
-      </w:r>
-      <w:r>
-        <w:t xml:space="preserve">) to 5 (</w:t>
-      </w:r>
-      <w:r>
-        <w:rPr>
-          <w:i/>
-          <w:iCs/>
-        </w:rPr>
-        <w:t xml:space="preserve">strongly disagree</w:t>
-      </w:r>
-      <w:r>
-        <w:t xml:space="preserve">). Following the survey, respondents were debriefed and offered course credit for their time.</w:t>
-      </w:r>
-    </w:p>
-    <w:bookmarkEnd w:id="28"/>
-    <w:bookmarkEnd w:id="29"/>
-    <w:bookmarkStart w:id="33" w:name="results"/>
-    <w:p>
-      <w:pPr>
-        <w:pStyle w:val="Heading1"/>
-      </w:pPr>
-      <w:r>
-        <w:t xml:space="preserve">Results</w:t>
-      </w:r>
-    </w:p>
-    <w:bookmarkStart w:id="31" w:name="traditional-lens"/>
-    <w:p>
-      <w:pPr>
-        <w:pStyle w:val="Heading2"/>
-      </w:pPr>
-      <w:r>
-        <w:t xml:space="preserve">Traditional Lens</w:t>
-      </w:r>
-    </w:p>
-    <w:p>
-      <w:pPr>
-        <w:pStyle w:val="FirstParagraph"/>
-      </w:pPr>
-      <w:r>
-        <w:t xml:space="preserve">Inter–scale correlations as well as scale means and standard deviations are presented in</w:t>
+        <w:t xml:space="preserve">Inter–scale correlations as well as scale means and standard deviations</w:t>
+      </w:r>
+      <w:r>
+        <w:t xml:space="preserve"> </w:t>
+      </w:r>
+      <w:r>
+        <w:t xml:space="preserve">are presented in</w:t>
       </w:r>
       <w:r>
         <w:t xml:space="preserve"> </w:t>
@@ -925,7 +1158,19 @@
         </w:r>
       </w:hyperlink>
       <w:r>
-        <w:t xml:space="preserve">. Here, the Efficiency Seeking scales exhibit the least intra–dimension agreement (correlations across development methodologies ranging from</w:t>
+        <w:t xml:space="preserve">. Here, the Efficiency Seeking</w:t>
+      </w:r>
+      <w:r>
+        <w:t xml:space="preserve"> </w:t>
+      </w:r>
+      <w:r>
+        <w:t xml:space="preserve">scales exhibit the least intra–dimension agreement (correlations across</w:t>
+      </w:r>
+      <w:r>
+        <w:t xml:space="preserve"> </w:t>
+      </w:r>
+      <w:r>
+        <w:t xml:space="preserve">item–generation methodologies ranging from</w:t>
       </w:r>
       <w:r>
         <w:t xml:space="preserve"> </w:t>
@@ -1035,7 +1280,19 @@
         <w:t xml:space="preserve"> </w:t>
       </w:r>
       <w:r>
-        <w:t xml:space="preserve">&lt; .001). Pragmatic Integrator and Collaborative Optimiser scales exhibited consistently higher intra–dimension associations (ranging from a low of</w:t>
+        <w:t xml:space="preserve">&lt; .001). Pragmatic Integrator and</w:t>
+      </w:r>
+      <w:r>
+        <w:t xml:space="preserve"> </w:t>
+      </w:r>
+      <w:r>
+        <w:t xml:space="preserve">Collaborative Optimiser scales exhibited consistently higher</w:t>
+      </w:r>
+      <w:r>
+        <w:t xml:space="preserve"> </w:t>
+      </w:r>
+      <w:r>
+        <w:t xml:space="preserve">intra–dimension associations (ranging from a low of</w:t>
       </w:r>
       <w:r>
         <w:t xml:space="preserve"> </w:t>
@@ -1063,22 +1320,24 @@
             <m:r>
               <m:t>e</m:t>
             </m:r>
-            <m:d>
-              <m:dPr>
-                <m:begChr m:val="("/>
-                <m:sepChr m:val=""/>
-                <m:endChr m:val=")"/>
-                <m:grow/>
-              </m:dPr>
-              <m:e>
-                <m:r>
-                  <m:t>C</m:t>
-                </m:r>
-                <m:r>
-                  <m:t>O</m:t>
-                </m:r>
-              </m:e>
-            </m:d>
+            <m:r>
+              <m:rPr>
+                <m:sty m:val="p"/>
+              </m:rPr>
+              <m:t>(</m:t>
+            </m:r>
+            <m:r>
+              <m:t>C</m:t>
+            </m:r>
+            <m:r>
+              <m:t>O</m:t>
+            </m:r>
+            <m:r>
+              <m:rPr>
+                <m:sty m:val="p"/>
+              </m:rPr>
+              <m:t>)</m:t>
+            </m:r>
             <m:r>
               <m:rPr>
                 <m:sty m:val="p"/>
@@ -1094,22 +1353,24 @@
             <m:r>
               <m:t>E</m:t>
             </m:r>
-            <m:d>
-              <m:dPr>
-                <m:begChr m:val="("/>
-                <m:sepChr m:val=""/>
-                <m:endChr m:val=")"/>
-                <m:grow/>
-              </m:dPr>
-              <m:e>
-                <m:r>
-                  <m:t>C</m:t>
-                </m:r>
-                <m:r>
-                  <m:t>O</m:t>
-                </m:r>
-              </m:e>
-            </m:d>
+            <m:r>
+              <m:rPr>
+                <m:sty m:val="p"/>
+              </m:rPr>
+              <m:t>(</m:t>
+            </m:r>
+            <m:r>
+              <m:t>C</m:t>
+            </m:r>
+            <m:r>
+              <m:t>O</m:t>
+            </m:r>
+            <m:r>
+              <m:rPr>
+                <m:sty m:val="p"/>
+              </m:rPr>
+              <m:t>)</m:t>
+            </m:r>
           </m:sub>
         </m:sSub>
       </m:oMath>
@@ -1161,22 +1422,24 @@
             <m:r>
               <m:t>e</m:t>
             </m:r>
-            <m:d>
-              <m:dPr>
-                <m:begChr m:val="("/>
-                <m:sepChr m:val=""/>
-                <m:endChr m:val=")"/>
-                <m:grow/>
-              </m:dPr>
-              <m:e>
-                <m:r>
-                  <m:t>P</m:t>
-                </m:r>
-                <m:r>
-                  <m:t>I</m:t>
-                </m:r>
-              </m:e>
-            </m:d>
+            <m:r>
+              <m:rPr>
+                <m:sty m:val="p"/>
+              </m:rPr>
+              <m:t>(</m:t>
+            </m:r>
+            <m:r>
+              <m:t>P</m:t>
+            </m:r>
+            <m:r>
+              <m:t>I</m:t>
+            </m:r>
+            <m:r>
+              <m:rPr>
+                <m:sty m:val="p"/>
+              </m:rPr>
+              <m:t>)</m:t>
+            </m:r>
             <m:r>
               <m:rPr>
                 <m:sty m:val="p"/>
@@ -1192,22 +1455,24 @@
             <m:r>
               <m:t>E</m:t>
             </m:r>
-            <m:d>
-              <m:dPr>
-                <m:begChr m:val="("/>
-                <m:sepChr m:val=""/>
-                <m:endChr m:val=")"/>
-                <m:grow/>
-              </m:dPr>
-              <m:e>
-                <m:r>
-                  <m:t>P</m:t>
-                </m:r>
-                <m:r>
-                  <m:t>I</m:t>
-                </m:r>
-              </m:e>
-            </m:d>
+            <m:r>
+              <m:rPr>
+                <m:sty m:val="p"/>
+              </m:rPr>
+              <m:t>(</m:t>
+            </m:r>
+            <m:r>
+              <m:t>P</m:t>
+            </m:r>
+            <m:r>
+              <m:t>I</m:t>
+            </m:r>
+            <m:r>
+              <m:rPr>
+                <m:sty m:val="p"/>
+              </m:rPr>
+              <m:t>)</m:t>
+            </m:r>
           </m:sub>
         </m:sSub>
       </m:oMath>
@@ -1259,7 +1524,25 @@
         <w:t xml:space="preserve"> </w:t>
       </w:r>
       <w:r>
-        <w:t xml:space="preserve">scale dimensions was most prominent with the Efficiency Seeking scales, particularly so for the ChatGPT developed scale (and to a lesser degree, the SME–derived scale; e.g., the average magnitude of correlation was</w:t>
+        <w:t xml:space="preserve">scale dimensions was most prominent with the Efficiency Seeking</w:t>
+      </w:r>
+      <w:r>
+        <w:t xml:space="preserve"> </w:t>
+      </w:r>
+      <w:r>
+        <w:t xml:space="preserve">scales, particularly so for the ChatGPT developed scale (and to a lesser</w:t>
+      </w:r>
+      <w:r>
+        <w:t xml:space="preserve"> </w:t>
+      </w:r>
+      <w:r>
+        <w:t xml:space="preserve">degree, the SME–derived scale; e.g., the average magnitude of</w:t>
+      </w:r>
+      <w:r>
+        <w:t xml:space="preserve"> </w:t>
+      </w:r>
+      <w:r>
+        <w:t xml:space="preserve">correlation was</w:t>
       </w:r>
       <w:r>
         <w:t xml:space="preserve"> </w:t>
@@ -1280,7 +1563,19 @@
         <w:pStyle w:val="BodyText"/>
       </w:pPr>
       <w:r>
-        <w:t xml:space="preserve">Individual scale alphas were predominantly within the .8 to .9 range, although two scales exhibited suppressed values (the ChatGPT Efficiency Seeking scale</w:t>
+        <w:t xml:space="preserve">Individual scale alphas were predominantly within the .8 to .9 range,</w:t>
+      </w:r>
+      <w:r>
+        <w:t xml:space="preserve"> </w:t>
+      </w:r>
+      <w:r>
+        <w:t xml:space="preserve">although two scales exhibited suppressed values (the ChatGPT Efficiency</w:t>
+      </w:r>
+      <w:r>
+        <w:t xml:space="preserve"> </w:t>
+      </w:r>
+      <w:r>
+        <w:t xml:space="preserve">Seeking scale</w:t>
       </w:r>
       <w:r>
         <w:t xml:space="preserve"> </w:t>
@@ -1308,7 +1603,13 @@
         <w:t xml:space="preserve"> </w:t>
       </w:r>
       <w:r>
-        <w:t xml:space="preserve">= .59). Note that: 1) these are the two scales that also exhibited the lowest average inter–scale associations (see</w:t>
+        <w:t xml:space="preserve">= .59). Note that: 1) these are the two scales that also</w:t>
+      </w:r>
+      <w:r>
+        <w:t xml:space="preserve"> </w:t>
+      </w:r>
+      <w:r>
+        <w:t xml:space="preserve">exhibited the lowest average inter–scale associations (see</w:t>
       </w:r>
       <w:r>
         <w:t xml:space="preserve"> </w:t>
@@ -1322,7 +1623,13 @@
         </w:r>
       </w:hyperlink>
       <w:r>
-        <w:t xml:space="preserve">), and 2) the numbers of items differed across scales (</w:t>
+        <w:t xml:space="preserve">),</w:t>
+      </w:r>
+      <w:r>
+        <w:t xml:space="preserve"> </w:t>
+      </w:r>
+      <w:r>
+        <w:t xml:space="preserve">and 2) the numbers of items differed across scales (</w:t>
       </w:r>
       <w:r>
         <w:rPr>
@@ -1402,7 +1709,13 @@
         </m:r>
       </m:oMath>
       <w:r>
-        <w:t xml:space="preserve">’s are presented in</w:t>
+        <w:t xml:space="preserve">’s are</w:t>
+      </w:r>
+      <w:r>
+        <w:t xml:space="preserve"> </w:t>
+      </w:r>
+      <w:r>
+        <w:t xml:space="preserve">presented in</w:t>
       </w:r>
       <w:r>
         <w:t xml:space="preserve"> </w:t>
@@ -1421,7 +1734,25 @@
         <w:pStyle w:val="BodyText"/>
       </w:pPr>
       <w:r>
-        <w:t xml:space="preserve">Exploratory factor analyses (EFAs) were also conducted. One–, two–, and three–factor solutions were estimated for each item set using maximum likelihood estimation and an oblique Quartimin rotation. Following</w:t>
+        <w:t xml:space="preserve">Exploratory factor analyses (EFAs) were also conducted within item sets. One–, two–,</w:t>
+      </w:r>
+      <w:r>
+        <w:t xml:space="preserve"> </w:t>
+      </w:r>
+      <w:r>
+        <w:t xml:space="preserve">and three–factor solutions were estimated for each item set using</w:t>
+      </w:r>
+      <w:r>
+        <w:t xml:space="preserve"> </w:t>
+      </w:r>
+      <w:r>
+        <w:t xml:space="preserve">maximum likelihood estimation and an oblique Quartimin rotation.</w:t>
+      </w:r>
+      <w:r>
+        <w:t xml:space="preserve"> </w:t>
+      </w:r>
+      <w:r>
+        <w:t xml:space="preserve">Following</w:t>
       </w:r>
       <w:r>
         <w:t xml:space="preserve"> </w:t>
@@ -1441,7 +1772,19 @@
         <w:t xml:space="preserve">)</w:t>
       </w:r>
       <w:r>
-        <w:t xml:space="preserve">’s guidelines, model fit was evaluated using multiple indicators. The results presented here focus only on the three–factor models.</w:t>
+        <w:t xml:space="preserve">’s guidelines, model fit was evaluated using</w:t>
+      </w:r>
+      <w:r>
+        <w:t xml:space="preserve"> </w:t>
+      </w:r>
+      <w:r>
+        <w:t xml:space="preserve">multiple indicators. The results presented here focus only on the</w:t>
+      </w:r>
+      <w:r>
+        <w:t xml:space="preserve"> </w:t>
+      </w:r>
+      <w:r>
+        <w:t xml:space="preserve">three–factor models.</w:t>
       </w:r>
     </w:p>
     <w:p>
@@ -1449,7 +1792,13 @@
         <w:pStyle w:val="BodyText"/>
       </w:pPr>
       <w:r>
-        <w:t xml:space="preserve">The three-factor model for the ChatGPT-Generated items returned the weakest structural evidence (χ²(207) = 347.09,</w:t>
+        <w:t xml:space="preserve">The three-factor model for the ChatGPT-Generated items returned the</w:t>
+      </w:r>
+      <w:r>
+        <w:t xml:space="preserve"> </w:t>
+      </w:r>
+      <w:r>
+        <w:t xml:space="preserve">weakest structural evidence (χ²(207) = 347.09,</w:t>
       </w:r>
       <w:r>
         <w:t xml:space="preserve"> </w:t>
@@ -1465,7 +1814,19 @@
         <w:t xml:space="preserve"> </w:t>
       </w:r>
       <w:r>
-        <w:t xml:space="preserve">&lt; .001, RMSEA = .084, 90% CI [.068, .099], CFI = .879, TLI = .838, and SRMR = .053). Factors 1 and 2 were significantly correlated (r** = .48,</w:t>
+        <w:t xml:space="preserve">&lt; .001, RMSEA =</w:t>
+      </w:r>
+      <w:r>
+        <w:t xml:space="preserve"> </w:t>
+      </w:r>
+      <w:r>
+        <w:t xml:space="preserve">.084, 90% CI [.068, .099], CFI = .879, TLI = .838, and SRMR = .053).</w:t>
+      </w:r>
+      <w:r>
+        <w:t xml:space="preserve"> </w:t>
+      </w:r>
+      <w:r>
+        <w:t xml:space="preserve">Factors 1 and 2 were significantly correlated (r** = .48,</w:t>
       </w:r>
       <w:r>
         <w:t xml:space="preserve"> </w:t>
@@ -1481,7 +1842,19 @@
         <w:t xml:space="preserve"> </w:t>
       </w:r>
       <w:r>
-        <w:t xml:space="preserve">&lt; .05), while Factor 3 was did not have a significant correlation with Factor 1 (</w:t>
+        <w:t xml:space="preserve">&lt; .05),</w:t>
+      </w:r>
+      <w:r>
+        <w:t xml:space="preserve"> </w:t>
+      </w:r>
+      <w:r>
+        <w:t xml:space="preserve">while Factor 3 was did not have a significant correlation with Factor 1</w:t>
+      </w:r>
+      <w:r>
+        <w:t xml:space="preserve"> </w:t>
+      </w:r>
+      <w:r>
+        <w:t xml:space="preserve">(</w:t>
       </w:r>
       <w:r>
         <w:rPr>
@@ -1507,7 +1880,13 @@
         <w:t xml:space="preserve"> </w:t>
       </w:r>
       <w:r>
-        <w:t xml:space="preserve">= -.15). Visual representation of loadings is presented in</w:t>
+        <w:t xml:space="preserve">= -.15). Visual representation of loadings</w:t>
+      </w:r>
+      <w:r>
+        <w:t xml:space="preserve"> </w:t>
+      </w:r>
+      <w:r>
+        <w:t xml:space="preserve">is presented in</w:t>
       </w:r>
       <w:r>
         <w:t xml:space="preserve"> </w:t>
@@ -1521,7 +1900,7 @@
         </w:r>
       </w:hyperlink>
       <w:r>
-        <w:t xml:space="preserve">.</w:t>
+        <w:t xml:space="preserve">.[^Each figure shows the results of an exploratory factor analysis as a network. The large grey nodes are the extracted factors. The smaller colored nodes are the survey items, and their color shows which subscale the item was written for: Efficiency Seeking, Pragmatic Integrator or Collaborative Optimiser. A line between an item and a factor means the item loads on that factor at |.30| or higher. Thicker, darker lines mean stronger loadings, and red lines mean negative loadings. If the items worked as intended, each factor would be surrounded by a cluster of items of a single color, and each item would connect to only one factor. Factors that collect items of mixed colors, or items that connect to several factors (cross-loadings), suggest the intended three-type structure is not holding up.]</w:t>
       </w:r>
     </w:p>
     <w:p>
@@ -1535,7 +1914,7 @@
         <w:t xml:space="preserve"> </w:t>
       </w:r>
       <w:r>
-        <w:t xml:space="preserve">strongest overall model fit of the three item-generation approaches,</w:t>
+        <w:t xml:space="preserve">strongest overall model fit of the three item–generation approaches,</w:t>
       </w:r>
       <w:r>
         <w:t xml:space="preserve"> </w:t>
@@ -1563,7 +1942,13 @@
         <w:t xml:space="preserve"> </w:t>
       </w:r>
       <w:r>
-        <w:t xml:space="preserve">.962, TLI = .947, and SRMR = .050. All three factors were significantly correlated at the 5% level threshold (</w:t>
+        <w:t xml:space="preserve">.962, TLI = .947, and SRMR = .050. All three factors were significantly</w:t>
+      </w:r>
+      <w:r>
+        <w:t xml:space="preserve"> </w:t>
+      </w:r>
+      <w:r>
+        <w:t xml:space="preserve">correlated at the 5% level threshold (</w:t>
       </w:r>
       <w:r>
         <w:rPr>
@@ -1576,7 +1961,31 @@
         <w:t xml:space="preserve"> </w:t>
       </w:r>
       <w:r>
-        <w:t xml:space="preserve">&lt; .05) . Factor 1 correlated .44 with Factor 2 and .64 with Factor 3, while Factors 2 and 3 correlated .46. Overall, the three-factor model provided strong fit, although the like the AI–GENIE items, loadings did not create three distinct item groupings (see</w:t>
+        <w:t xml:space="preserve">&lt; .05) . Factor 1 correlated</w:t>
+      </w:r>
+      <w:r>
+        <w:t xml:space="preserve"> </w:t>
+      </w:r>
+      <w:r>
+        <w:t xml:space="preserve">.44 with Factor 2 and .64 with Factor 3, while Factors 2 and 3</w:t>
+      </w:r>
+      <w:r>
+        <w:t xml:space="preserve"> </w:t>
+      </w:r>
+      <w:r>
+        <w:t xml:space="preserve">correlated .46. Overall, the three-factor model provided strong fit,</w:t>
+      </w:r>
+      <w:r>
+        <w:t xml:space="preserve"> </w:t>
+      </w:r>
+      <w:r>
+        <w:t xml:space="preserve">although the like the AI–GENIE items, loadings did not create three</w:t>
+      </w:r>
+      <w:r>
+        <w:t xml:space="preserve"> </w:t>
+      </w:r>
+      <w:r>
+        <w:t xml:space="preserve">distinct item groupings (see</w:t>
       </w:r>
       <w:r>
         <w:t xml:space="preserve"> </w:t>
@@ -1598,7 +2007,13 @@
         <w:pStyle w:val="BodyText"/>
       </w:pPr>
       <w:r>
-        <w:t xml:space="preserve">The AI-GENIE-generated items demonstrated fair fit to the three–factor solution, χ²(150) = 207.64,</w:t>
+        <w:t xml:space="preserve">The AI-GENIE-generated items demonstrated fair fit to the three–factor</w:t>
+      </w:r>
+      <w:r>
+        <w:t xml:space="preserve"> </w:t>
+      </w:r>
+      <w:r>
+        <w:t xml:space="preserve">solution, χ²(150) = 207.64,</w:t>
       </w:r>
       <w:r>
         <w:t xml:space="preserve"> </w:t>
@@ -1614,7 +2029,25 @@
         <w:t xml:space="preserve"> </w:t>
       </w:r>
       <w:r>
-        <w:t xml:space="preserve">= .001, RMSEA = .064, 90% CI [.041, .084], CFI = .960, TLI = .944, and SRMR = .036. Item loading patterns provided partial support, with several non–hypothesized associations and substantive cross–loadings (see</w:t>
+        <w:t xml:space="preserve">= .001, RMSEA = .064, 90% CI [.041,</w:t>
+      </w:r>
+      <w:r>
+        <w:t xml:space="preserve"> </w:t>
+      </w:r>
+      <w:r>
+        <w:t xml:space="preserve">.084], CFI = .960, TLI = .944, and SRMR = .036. Item loading patterns</w:t>
+      </w:r>
+      <w:r>
+        <w:t xml:space="preserve"> </w:t>
+      </w:r>
+      <w:r>
+        <w:t xml:space="preserve">provided partial support, with several non–hypothesized associations</w:t>
+      </w:r>
+      <w:r>
+        <w:t xml:space="preserve"> </w:t>
+      </w:r>
+      <w:r>
+        <w:t xml:space="preserve">and substantive cross–loadings (see</w:t>
       </w:r>
       <w:r>
         <w:t xml:space="preserve"> </w:t>
@@ -1631,16 +2064,19 @@
         <w:t xml:space="preserve"> </w:t>
       </w:r>
       <w:r>
-        <w:t xml:space="preserve">for a visual representation)</w:t>
-      </w:r>
-      <w:r>
-        <w:rPr>
-          <w:rStyle w:val="FootnoteReference"/>
-        </w:rPr>
-        <w:footnoteReference w:id="30"/>
-      </w:r>
-      <w:r>
-        <w:t xml:space="preserve">. Factors 1 and 2 exhibited a significant correlation (r = .76,</w:t>
+        <w:t xml:space="preserve">for a visual</w:t>
+      </w:r>
+      <w:r>
+        <w:t xml:space="preserve"> </w:t>
+      </w:r>
+      <w:r>
+        <w:t xml:space="preserve">representation)[^1]. Factors 1 and 2 exhibited a significant correlation</w:t>
+      </w:r>
+      <w:r>
+        <w:t xml:space="preserve"> </w:t>
+      </w:r>
+      <w:r>
+        <w:t xml:space="preserve">(r = .76,</w:t>
       </w:r>
       <w:r>
         <w:t xml:space="preserve"> </w:t>
@@ -1656,7 +2092,13 @@
         <w:t xml:space="preserve"> </w:t>
       </w:r>
       <w:r>
-        <w:t xml:space="preserve">&lt; .05), whereas the correlations of Factor 3 with Factors 1 (</w:t>
+        <w:t xml:space="preserve">&lt; .05), whereas the correlations of Factor 3 with Factors</w:t>
+      </w:r>
+      <w:r>
+        <w:t xml:space="preserve"> </w:t>
+      </w:r>
+      <w:r>
+        <w:t xml:space="preserve">1 (</w:t>
       </w:r>
       <w:r>
         <w:rPr>
@@ -1682,7 +2124,25 @@
         <w:t xml:space="preserve"> </w:t>
       </w:r>
       <w:r>
-        <w:t xml:space="preserve">= .29) did not approach statistical significance. Overall, the three-factor model demonstrated relatively good fit, the loading pattern suggests two somewhat clear factors with item cross loadings and an ambiguous third factor.</w:t>
+        <w:t xml:space="preserve">= .29) did not approach statistical</w:t>
+      </w:r>
+      <w:r>
+        <w:t xml:space="preserve"> </w:t>
+      </w:r>
+      <w:r>
+        <w:t xml:space="preserve">significance. Overall, the three-factor model demonstrated relatively</w:t>
+      </w:r>
+      <w:r>
+        <w:t xml:space="preserve"> </w:t>
+      </w:r>
+      <w:r>
+        <w:t xml:space="preserve">good fit, the loading pattern suggests two somewhat clear factors with</w:t>
+      </w:r>
+      <w:r>
+        <w:t xml:space="preserve"> </w:t>
+      </w:r>
+      <w:r>
+        <w:t xml:space="preserve">item cross loadings and an ambiguous third factor.</w:t>
       </w:r>
     </w:p>
     <w:p>
@@ -1690,17 +2150,57 @@
         <w:pStyle w:val="BodyText"/>
       </w:pPr>
       <w:r>
-        <w:t xml:space="preserve">Taken together, these results point toward the ChatGPT–generated items as exhibiting the weakest traditional (empirical) evidence, with the observed structure largely not conforming to the theoretical associations. Additionally, the ChatGPT-generated items demonstrated worse model fit than the corresponding SME and AI–GENIE item sets.</w:t>
-      </w:r>
-    </w:p>
-    <w:bookmarkEnd w:id="31"/>
-    <w:bookmarkStart w:id="32" w:name="contemporary-lens"/>
+        <w:t xml:space="preserve">Taken together, these results point toward the ChatGPT–generated items</w:t>
+      </w:r>
+      <w:r>
+        <w:t xml:space="preserve"> </w:t>
+      </w:r>
+      <w:r>
+        <w:t xml:space="preserve">as exhibiting the weakest traditional (empirical) evidence, with the</w:t>
+      </w:r>
+      <w:r>
+        <w:t xml:space="preserve"> </w:t>
+      </w:r>
+      <w:r>
+        <w:t xml:space="preserve">observed structure largely not conforming to the theoretical</w:t>
+      </w:r>
+      <w:r>
+        <w:t xml:space="preserve"> </w:t>
+      </w:r>
+      <w:r>
+        <w:t xml:space="preserve">associations. Additionally, the ChatGPT-generated items demonstrated</w:t>
+      </w:r>
+      <w:r>
+        <w:t xml:space="preserve"> </w:t>
+      </w:r>
+      <w:r>
+        <w:t xml:space="preserve">worse model fit than the corresponding SME and AI–GENIE item sets, although</w:t>
+      </w:r>
+      <w:r>
+        <w:t xml:space="preserve"> </w:t>
+      </w:r>
+      <w:r>
+        <w:rPr>
+          <w:i/>
+          <w:iCs/>
+        </w:rPr>
+        <w:t xml:space="preserve">none</w:t>
+      </w:r>
+      <w:r>
+        <w:t xml:space="preserve"> </w:t>
+      </w:r>
+      <w:r>
+        <w:t xml:space="preserve">of the approaches satisfactorily converged on hypothesized associations (e.g., all extracted solutions exhibited a greater–than–desired number of cross–loadings and/or non–hypothesized item–dimension associations).</w:t>
+      </w:r>
+    </w:p>
+    <w:bookmarkEnd w:id="32"/>
+    <w:bookmarkStart w:id="33" w:name="network-psychometric-analyses"/>
     <w:p>
       <w:pPr>
         <w:pStyle w:val="Heading2"/>
       </w:pPr>
       <w:r>
-        <w:t xml:space="preserve">Contemporary Lens</w:t>
+        <w:t xml:space="preserve">Network Psychometric Analyses</w:t>
       </w:r>
     </w:p>
     <w:p>
@@ -1756,7 +2256,7 @@
         <w:t xml:space="preserve">)</w:t>
       </w:r>
       <w:r>
-        <w:t xml:space="preserve">.</w:t>
+        <w:t xml:space="preserve">. Exploratory graph analysis (EGA) is a procedure that, similar to traditional factor analysis, is aimed at discovering how items on a psychological measure group together. Each item is treated as a node, and the strength of the unique association between items (after accounting for all other items) is shown as an edge; items that remain strongly linked tend to form clusters. A community-detection algorithm then identifies those clusters, which are interpreted as the dimensions or factors of the construct. An EGA plot therefore shows both the estimated structure and the item membership of each dimension in one figure.</w:t>
       </w:r>
     </w:p>
     <w:p>
@@ -1764,15 +2264,19 @@
         <w:pStyle w:val="BodyText"/>
       </w:pPr>
       <w:r>
-        <w:t xml:space="preserve">Exploratory graph analysis (EGA) is a procedure that, similar to traditional factor analysis, is aimed at discovering how items on a psychological measure group together. Each item is treated as a node, and the strength of the unique association between items (after accounting for all other items) is shown as an edge; items that remain strongly linked tend to form clusters. A community-detection algorithm then identifies those clusters, which are interpreted as the dimensions or factors of the construct. An EGA plot therefore shows both the estimated structure and the item membership of each dimension in one figure.</w:t>
-      </w:r>
-    </w:p>
-    <w:p>
-      <w:pPr>
-        <w:pStyle w:val="BodyText"/>
-      </w:pPr>
-      <w:r>
-        <w:t xml:space="preserve">Exploratory Graph Analyses do not specify factors in advance. Instead they estimates a network directly among items via semantic association, and the results of these are presented in</w:t>
+        <w:t xml:space="preserve">Exploratory Graph Analyses do not specify factors in advance. Instead</w:t>
+      </w:r>
+      <w:r>
+        <w:t xml:space="preserve"> </w:t>
+      </w:r>
+      <w:r>
+        <w:t xml:space="preserve">they estimates a network directly among items via semantic association,</w:t>
+      </w:r>
+      <w:r>
+        <w:t xml:space="preserve"> </w:t>
+      </w:r>
+      <w:r>
+        <w:t xml:space="preserve">and the results of these are presented in</w:t>
       </w:r>
       <w:r>
         <w:t xml:space="preserve"> </w:t>
@@ -1800,7 +2304,13 @@
         </w:r>
       </w:hyperlink>
       <w:r>
-        <w:t xml:space="preserve">, and</w:t>
+        <w:t xml:space="preserve">,</w:t>
+      </w:r>
+      <w:r>
+        <w:t xml:space="preserve"> </w:t>
+      </w:r>
+      <w:r>
+        <w:t xml:space="preserve">and</w:t>
       </w:r>
       <w:r>
         <w:t xml:space="preserve"> </w:t>
@@ -1814,12 +2324,72 @@
         </w:r>
       </w:hyperlink>
       <w:r>
-        <w:t xml:space="preserve">. Each line is a regularized partial correlation (EBICglasso), meaning the relationship between two items after controlling for all the other items. Thicker lines are stronger associations, and the line colour shows whether the association is positive or negative. Weak relationships are shrunk to zero and dropped. The Walktrap algorithm then detects communities: groups of items that are more tightly connected to each other than to the rest of the network. Unlike in the EFA plots, the node colours here mark these empirically detected communities, not the intended subscales. The number of communities is the EGA estimate of the dimensionality of each item set.</w:t>
-      </w:r>
-    </w:p>
-    <w:bookmarkEnd w:id="32"/>
+        <w:t xml:space="preserve">. Each line is a regularized partial correlation</w:t>
+      </w:r>
+      <w:r>
+        <w:t xml:space="preserve"> </w:t>
+      </w:r>
+      <w:r>
+        <w:t xml:space="preserve">(EBICglasso), meaning the relationship between two items after</w:t>
+      </w:r>
+      <w:r>
+        <w:t xml:space="preserve"> </w:t>
+      </w:r>
+      <w:r>
+        <w:t xml:space="preserve">controlling for all the other items. Thicker lines are stronger</w:t>
+      </w:r>
+      <w:r>
+        <w:t xml:space="preserve"> </w:t>
+      </w:r>
+      <w:r>
+        <w:t xml:space="preserve">associations, and the line colour shows whether the association is</w:t>
+      </w:r>
+      <w:r>
+        <w:t xml:space="preserve"> </w:t>
+      </w:r>
+      <w:r>
+        <w:t xml:space="preserve">positive or negative. Weak relationships are shrunk to zero and dropped.</w:t>
+      </w:r>
+      <w:r>
+        <w:t xml:space="preserve"> </w:t>
+      </w:r>
+      <w:r>
+        <w:t xml:space="preserve">The Walktrap algorithm then detects communities: groups of items that</w:t>
+      </w:r>
+      <w:r>
+        <w:t xml:space="preserve"> </w:t>
+      </w:r>
+      <w:r>
+        <w:t xml:space="preserve">are more tightly connected to each other than to the rest of the</w:t>
+      </w:r>
+      <w:r>
+        <w:t xml:space="preserve"> </w:t>
+      </w:r>
+      <w:r>
+        <w:t xml:space="preserve">network. Unlike in the EFA plots, the node colours here mark these</w:t>
+      </w:r>
+      <w:r>
+        <w:t xml:space="preserve"> </w:t>
+      </w:r>
+      <w:r>
+        <w:t xml:space="preserve">empirically detected communities, not the intended subscales. The number</w:t>
+      </w:r>
+      <w:r>
+        <w:t xml:space="preserve"> </w:t>
+      </w:r>
+      <w:r>
+        <w:t xml:space="preserve">of communities is the EGA estimate of the dimensionality of each item</w:t>
+      </w:r>
+      <w:r>
+        <w:t xml:space="preserve"> </w:t>
+      </w:r>
+      <w:r>
+        <w:t xml:space="preserve">set.</w:t>
+      </w:r>
+    </w:p>
     <w:bookmarkEnd w:id="33"/>
-    <w:bookmarkStart w:id="37" w:name="discussion"/>
+    <w:bookmarkEnd w:id="34"/>
+    <w:bookmarkStart w:id="38" w:name="discussion"/>
     <w:p>
       <w:pPr>
         <w:pStyle w:val="Heading1"/>
@@ -1833,7 +2403,43 @@
         <w:pStyle w:val="FirstParagraph"/>
       </w:pPr>
       <w:r>
-        <w:t xml:space="preserve">The purpose of this stuy was twofold: 1) to create a measure of type of AI adopter, 2) to compare three approaches to developing items, comparing traditionally-derived subject matter expert ratings, with LLM-derivded procedures using ChatGPT and AI-GENIE. The primary question of interest was whether the AI-driven item-generation procedures (i.e., ChatGPT or AI-GENIE) as good as, or even superior to, traditionally generated SME items.</w:t>
+        <w:t xml:space="preserve">The purpose of this stuy was twofold: 1) to create a measure of type of</w:t>
+      </w:r>
+      <w:r>
+        <w:t xml:space="preserve"> </w:t>
+      </w:r>
+      <w:r>
+        <w:t xml:space="preserve">AI adopter, 2) to compare three approaches to developing items,</w:t>
+      </w:r>
+      <w:r>
+        <w:t xml:space="preserve"> </w:t>
+      </w:r>
+      <w:r>
+        <w:t xml:space="preserve">comparing traditionally-derived subject matter expert ratings, with</w:t>
+      </w:r>
+      <w:r>
+        <w:t xml:space="preserve"> </w:t>
+      </w:r>
+      <w:r>
+        <w:t xml:space="preserve">LLM-derivded procedures using ChatGPT and AI-GENIE. The primary question</w:t>
+      </w:r>
+      <w:r>
+        <w:t xml:space="preserve"> </w:t>
+      </w:r>
+      <w:r>
+        <w:t xml:space="preserve">of interest was whether the AI-driven item-generation procedures (i.e.,</w:t>
+      </w:r>
+      <w:r>
+        <w:t xml:space="preserve"> </w:t>
+      </w:r>
+      <w:r>
+        <w:t xml:space="preserve">ChatGPT or AI-GENIE) as good as, or even superior to, traditionally</w:t>
+      </w:r>
+      <w:r>
+        <w:t xml:space="preserve"> </w:t>
+      </w:r>
+      <w:r>
+        <w:t xml:space="preserve">generated SME items.</w:t>
       </w:r>
     </w:p>
     <w:p>
@@ -1841,7 +2447,31 @@
         <w:pStyle w:val="BodyText"/>
       </w:pPr>
       <w:r>
-        <w:t xml:space="preserve">First, all three procedures did result in a measure of AI adopter type. The results of the traditional analyses suggest the the SME-generated items demonstrated the best fit, followed by AI-GENIE and then ChatGPT. However, items did not load cleanly as expected within dimensions. The semantic exploratory graph analyses…</w:t>
+        <w:t xml:space="preserve">First, all three procedures did result in a measure of AI adopter type.</w:t>
+      </w:r>
+      <w:r>
+        <w:t xml:space="preserve"> </w:t>
+      </w:r>
+      <w:r>
+        <w:t xml:space="preserve">The results of the traditional analyses suggest the the SME-generated</w:t>
+      </w:r>
+      <w:r>
+        <w:t xml:space="preserve"> </w:t>
+      </w:r>
+      <w:r>
+        <w:t xml:space="preserve">items demonstrated the best fit, followed by AI-GENIE and then ChatGPT.</w:t>
+      </w:r>
+      <w:r>
+        <w:t xml:space="preserve"> </w:t>
+      </w:r>
+      <w:r>
+        <w:t xml:space="preserve">However, items did not load cleanly as expected within dimensions. The</w:t>
+      </w:r>
+      <w:r>
+        <w:t xml:space="preserve"> </w:t>
+      </w:r>
+      <w:r>
+        <w:t xml:space="preserve">semantic exploratory graph analyses…</w:t>
       </w:r>
     </w:p>
     <w:p>
@@ -1849,7 +2479,13 @@
         <w:pStyle w:val="BlockText"/>
       </w:pPr>
       <w:r>
-        <w:t xml:space="preserve">DISCUSSION CENTER: Resolving the EFA visuals with the EGA visuals – also discussing the possibility that there are not</w:t>
+        <w:t xml:space="preserve">DISCUSSION CENTER: Resolving the EFA visuals with the EGA visuals –</w:t>
+      </w:r>
+      <w:r>
+        <w:t xml:space="preserve"> </w:t>
+      </w:r>
+      <w:r>
+        <w:t xml:space="preserve">also discussing the possibility that there are not</w:t>
       </w:r>
       <w:r>
         <w:t xml:space="preserve"> </w:t>
@@ -1861,7 +2497,25 @@
         <w:t xml:space="preserve"> </w:t>
       </w:r>
       <w:r>
-        <w:t xml:space="preserve">but rather three different levels of AI comfort: introductory, intermediate, and expert… it’s a matter of degree not type, and therefore the measurement results from three different methodologies may reasonably be expected to not differentiate greatly (</w:t>
+        <w:t xml:space="preserve">but rather three different levels of AI comfort: introductory,</w:t>
+      </w:r>
+      <w:r>
+        <w:t xml:space="preserve"> </w:t>
+      </w:r>
+      <w:r>
+        <w:t xml:space="preserve">intermediate, and expert… it’s a matter of degree not type, and</w:t>
+      </w:r>
+      <w:r>
+        <w:t xml:space="preserve"> </w:t>
+      </w:r>
+      <w:r>
+        <w:t xml:space="preserve">therefore the measurement results from three different methodologies</w:t>
+      </w:r>
+      <w:r>
+        <w:t xml:space="preserve"> </w:t>
+      </w:r>
+      <w:r>
+        <w:t xml:space="preserve">may reasonably be expected to not differentiate greatly (</w:t>
       </w:r>
       <w:hyperlink w:anchor="tbl-corrs">
         <w:r>
@@ -1872,10 +2526,28 @@
         </w:r>
       </w:hyperlink>
       <w:r>
-        <w:t xml:space="preserve">), or to result in muddled structures when imposed on the data (EFAs). Implications are that this construct may benefit from further THEORETICAL specification</w:t>
-      </w:r>
-    </w:p>
-    <w:bookmarkStart w:id="34" w:name="implications"/>
+        <w:t xml:space="preserve">),</w:t>
+      </w:r>
+      <w:r>
+        <w:t xml:space="preserve"> </w:t>
+      </w:r>
+      <w:r>
+        <w:t xml:space="preserve">or to result in muddled structures when imposed on the data (EFAs).</w:t>
+      </w:r>
+      <w:r>
+        <w:t xml:space="preserve"> </w:t>
+      </w:r>
+      <w:r>
+        <w:t xml:space="preserve">Implications are that this construct may benefit from further</w:t>
+      </w:r>
+      <w:r>
+        <w:t xml:space="preserve"> </w:t>
+      </w:r>
+      <w:r>
+        <w:t xml:space="preserve">THEORETICAL specification</w:t>
+      </w:r>
+    </w:p>
+    <w:bookmarkStart w:id="35" w:name="implications"/>
     <w:p>
       <w:pPr>
         <w:pStyle w:val="Heading2"/>
@@ -1889,7 +2561,13 @@
         <w:pStyle w:val="FirstParagraph"/>
       </w:pPr>
       <w:r>
-        <w:t xml:space="preserve">One of the theoretical contributions we make is to explore the ways AI is being used at present.</w:t>
+        <w:t xml:space="preserve">One of the theoretical contributions we make is to explore the ways AI</w:t>
+      </w:r>
+      <w:r>
+        <w:t xml:space="preserve"> </w:t>
+      </w:r>
+      <w:r>
+        <w:t xml:space="preserve">is being used at present.</w:t>
       </w:r>
       <w:r>
         <w:t xml:space="preserve"> </w:t>
@@ -1912,11 +2590,41 @@
         <w:t xml:space="preserve"> </w:t>
       </w:r>
       <w:r>
-        <w:t xml:space="preserve">presented three ideal types of AI users that we based our quantitative scale creation on. The somewhat mixed results suggest that there may not be distinct types of AI users, but rather, we can conceptualize AI use on an continuum of expertise, whereby greater levels of expertise are evidenced by a higher degree of AI collaboration.</w:t>
-      </w:r>
-    </w:p>
-    <w:bookmarkEnd w:id="34"/>
-    <w:bookmarkStart w:id="35" w:name="limitations-future-directions"/>
+        <w:t xml:space="preserve">presented three ideal</w:t>
+      </w:r>
+      <w:r>
+        <w:t xml:space="preserve"> </w:t>
+      </w:r>
+      <w:r>
+        <w:t xml:space="preserve">types of AI users that we based our quantitative scale creation on. The</w:t>
+      </w:r>
+      <w:r>
+        <w:t xml:space="preserve"> </w:t>
+      </w:r>
+      <w:r>
+        <w:t xml:space="preserve">somewhat mixed results suggest that there may not be distinct types of</w:t>
+      </w:r>
+      <w:r>
+        <w:t xml:space="preserve"> </w:t>
+      </w:r>
+      <w:r>
+        <w:t xml:space="preserve">AI users, but rather, we can conceptualize AI use on an continuum of</w:t>
+      </w:r>
+      <w:r>
+        <w:t xml:space="preserve"> </w:t>
+      </w:r>
+      <w:r>
+        <w:t xml:space="preserve">expertise, whereby greater levels of expertise are evidenced by a higher</w:t>
+      </w:r>
+      <w:r>
+        <w:t xml:space="preserve"> </w:t>
+      </w:r>
+      <w:r>
+        <w:t xml:space="preserve">degree of AI collaboration.</w:t>
+      </w:r>
+    </w:p>
+    <w:bookmarkEnd w:id="35"/>
+    <w:bookmarkStart w:id="36" w:name="limitations-future-directions"/>
     <w:p>
       <w:pPr>
         <w:pStyle w:val="Heading2"/>
@@ -1930,11 +2638,65 @@
         <w:pStyle w:val="FirstParagraph"/>
       </w:pPr>
       <w:r>
-        <w:t xml:space="preserve">We note a number of limitations that future study/comparisons would benefit from. First, for this SIOP submission, we present a modest sample size. An additional study comparing these three procedures with a larger sample size is warranted. In addition, this first pilot sample was obtained from university students were were asked to keep one context in mind as they responded to the survey. The majority of respondents indicated they had school in mind, whereas a smaller percentage had work in mind. Future research should incorporate full time employees across industries, and account for degree of AI integration within their workplaces.</w:t>
-      </w:r>
-    </w:p>
-    <w:bookmarkEnd w:id="35"/>
-    <w:bookmarkStart w:id="36" w:name="conclusion"/>
+        <w:t xml:space="preserve">We note a number of limitations that future study/comparisons would</w:t>
+      </w:r>
+      <w:r>
+        <w:t xml:space="preserve"> </w:t>
+      </w:r>
+      <w:r>
+        <w:t xml:space="preserve">benefit from. First, for this SIOP submission, we present a modest</w:t>
+      </w:r>
+      <w:r>
+        <w:t xml:space="preserve"> </w:t>
+      </w:r>
+      <w:r>
+        <w:t xml:space="preserve">sample size. An additional study comparing these three procedures with a</w:t>
+      </w:r>
+      <w:r>
+        <w:t xml:space="preserve"> </w:t>
+      </w:r>
+      <w:r>
+        <w:t xml:space="preserve">larger sample size is warranted. In addition, this first pilot sample</w:t>
+      </w:r>
+      <w:r>
+        <w:t xml:space="preserve"> </w:t>
+      </w:r>
+      <w:r>
+        <w:t xml:space="preserve">was obtained from university students were were asked to keep one</w:t>
+      </w:r>
+      <w:r>
+        <w:t xml:space="preserve"> </w:t>
+      </w:r>
+      <w:r>
+        <w:t xml:space="preserve">context in mind as they responded to the survey. The majority of</w:t>
+      </w:r>
+      <w:r>
+        <w:t xml:space="preserve"> </w:t>
+      </w:r>
+      <w:r>
+        <w:t xml:space="preserve">respondents indicated they had school in mind, whereas a smaller</w:t>
+      </w:r>
+      <w:r>
+        <w:t xml:space="preserve"> </w:t>
+      </w:r>
+      <w:r>
+        <w:t xml:space="preserve">percentage had work in mind. Future research should incorporate full</w:t>
+      </w:r>
+      <w:r>
+        <w:t xml:space="preserve"> </w:t>
+      </w:r>
+      <w:r>
+        <w:t xml:space="preserve">time employees across industries, and account for degree of AI</w:t>
+      </w:r>
+      <w:r>
+        <w:t xml:space="preserve"> </w:t>
+      </w:r>
+      <w:r>
+        <w:t xml:space="preserve">integration within their workplaces.</w:t>
+      </w:r>
+    </w:p>
+    <w:bookmarkEnd w:id="36"/>
+    <w:bookmarkStart w:id="37" w:name="conclusion"/>
     <w:p>
       <w:pPr>
         <w:pStyle w:val="Heading2"/>
@@ -1948,12 +2710,34 @@
         <w:pStyle w:val="FirstParagraph"/>
       </w:pPr>
       <w:r>
-        <w:t xml:space="preserve">Please add after viewing</w:t>
-      </w:r>
-    </w:p>
-    <w:bookmarkEnd w:id="36"/>
+        <w:t xml:space="preserve">Ideally discuss: 1) how the conceptualization of AI adopter type may be better structured as differences of AI adopter</w:t>
+      </w:r>
+      <w:r>
+        <w:t xml:space="preserve"> </w:t>
+      </w:r>
+      <w:r>
+        <w:rPr>
+          <w:i/>
+          <w:iCs/>
+        </w:rPr>
+        <w:t xml:space="preserve">degree</w:t>
+      </w:r>
+      <w:r>
+        <w:t xml:space="preserve"> </w:t>
+      </w:r>
+      <w:r>
+        <w:t xml:space="preserve">(e.g., novice, intermediate, or expert), and 2) mutual consideration of traditional and newer lenses for scale development may provide greater insight than does consideration of either approach in isolation.</w:t>
+      </w:r>
+      <w:r>
+        <w:t xml:space="preserve"> </w:t>
+      </w:r>
+      <w:r>
+        <w:t xml:space="preserve">&gt; Note that this is the conclusion only if these points are first made within the discussion!!</w:t>
+      </w:r>
+    </w:p>
     <w:bookmarkEnd w:id="37"/>
-    <w:bookmarkStart w:id="75" w:name="references"/>
+    <w:bookmarkEnd w:id="38"/>
+    <w:bookmarkStart w:id="76" w:name="references"/>
     <w:p>
       <w:pPr>
         <w:pStyle w:val="Heading1"/>
@@ -1962,8 +2746,8 @@
         <w:t xml:space="preserve">References</w:t>
       </w:r>
     </w:p>
-    <w:bookmarkStart w:id="48" w:name="refs"/>
-    <w:bookmarkStart w:id="38" w:name="ref-arora2025meaningful"/>
+    <w:bookmarkStart w:id="49" w:name="refs"/>
+    <w:bookmarkStart w:id="39" w:name="ref-arora2025meaningful"/>
     <w:p>
       <w:pPr>
         <w:pStyle w:val="Bibliography"/>
@@ -1998,8 +2782,8 @@
         <w:t xml:space="preserve">(2), 169–193.</w:t>
       </w:r>
     </w:p>
-    <w:bookmarkEnd w:id="38"/>
-    <w:bookmarkStart w:id="39" w:name="ref-borsboom2022possible"/>
+    <w:bookmarkEnd w:id="39"/>
+    <w:bookmarkStart w:id="40" w:name="ref-borsboom2022possible"/>
     <w:p>
       <w:pPr>
         <w:pStyle w:val="Bibliography"/>
@@ -2034,8 +2818,8 @@
         <w:t xml:space="preserve">(1), 253–265.</w:t>
       </w:r>
     </w:p>
-    <w:bookmarkEnd w:id="39"/>
-    <w:bookmarkStart w:id="40" w:name="ref-borsboom2013network"/>
+    <w:bookmarkEnd w:id="40"/>
+    <w:bookmarkStart w:id="41" w:name="ref-borsboom2013network"/>
     <w:p>
       <w:pPr>
         <w:pStyle w:val="Bibliography"/>
@@ -2070,8 +2854,8 @@
         <w:t xml:space="preserve">(1), 91–121.</w:t>
       </w:r>
     </w:p>
-    <w:bookmarkEnd w:id="40"/>
-    <w:bookmarkStart w:id="41" w:name="ref-callari2025meaningful"/>
+    <w:bookmarkEnd w:id="41"/>
+    <w:bookmarkStart w:id="42" w:name="ref-callari2025meaningful"/>
     <w:p>
       <w:pPr>
         <w:pStyle w:val="Bibliography"/>
@@ -2106,8 +2890,8 @@
         <w:t xml:space="preserve">(10), 5001–5027.</w:t>
       </w:r>
     </w:p>
-    <w:bookmarkEnd w:id="41"/>
-    <w:bookmarkStart w:id="42" w:name="ref-epskamp2018network"/>
+    <w:bookmarkEnd w:id="42"/>
+    <w:bookmarkStart w:id="43" w:name="ref-epskamp2018network"/>
     <w:p>
       <w:pPr>
         <w:pStyle w:val="Bibliography"/>
@@ -2129,8 +2913,8 @@
         <w:t xml:space="preserve">, 953–986.</w:t>
       </w:r>
     </w:p>
-    <w:bookmarkEnd w:id="42"/>
-    <w:bookmarkStart w:id="43" w:name="ref-hackman1975development"/>
+    <w:bookmarkEnd w:id="43"/>
+    <w:bookmarkStart w:id="44" w:name="ref-hackman1975development"/>
     <w:p>
       <w:pPr>
         <w:pStyle w:val="Bibliography"/>
@@ -2165,8 +2949,8 @@
         <w:t xml:space="preserve">(2), 159.</w:t>
       </w:r>
     </w:p>
-    <w:bookmarkEnd w:id="43"/>
-    <w:bookmarkStart w:id="44" w:name="ref-hackman1976motivation"/>
+    <w:bookmarkEnd w:id="44"/>
+    <w:bookmarkStart w:id="45" w:name="ref-hackman1976motivation"/>
     <w:p>
       <w:pPr>
         <w:pStyle w:val="Bibliography"/>
@@ -2201,8 +2985,8 @@
         <w:t xml:space="preserve">(2), 250–279.</w:t>
       </w:r>
     </w:p>
-    <w:bookmarkEnd w:id="44"/>
-    <w:bookmarkStart w:id="45" w:name="ref-hu1999cutoff"/>
+    <w:bookmarkEnd w:id="45"/>
+    <w:bookmarkStart w:id="46" w:name="ref-hu1999cutoff"/>
     <w:p>
       <w:pPr>
         <w:pStyle w:val="Bibliography"/>
@@ -2237,8 +3021,8 @@
         <w:t xml:space="preserve">(1), 1–55.</w:t>
       </w:r>
     </w:p>
-    <w:bookmarkEnd w:id="45"/>
-    <w:bookmarkStart w:id="46" w:name="ref-russell2026generative"/>
+    <w:bookmarkEnd w:id="46"/>
+    <w:bookmarkStart w:id="47" w:name="ref-russell2026generative"/>
     <w:p>
       <w:pPr>
         <w:pStyle w:val="Bibliography"/>
@@ -2273,8 +3057,8 @@
         <w:t xml:space="preserve">(8), 217.</w:t>
       </w:r>
     </w:p>
-    <w:bookmarkEnd w:id="46"/>
-    <w:bookmarkStart w:id="47" w:name="ref-zhang2026artificial"/>
+    <w:bookmarkEnd w:id="47"/>
+    <w:bookmarkStart w:id="48" w:name="ref-zhang2026artificial"/>
     <w:p>
       <w:pPr>
         <w:pStyle w:val="Bibliography"/>
@@ -2296,9 +3080,9 @@
         <w:t xml:space="preserve">, 1–18.</w:t>
       </w:r>
     </w:p>
-    <w:bookmarkEnd w:id="47"/>
     <w:bookmarkEnd w:id="48"/>
-    <w:bookmarkStart w:id="49" w:name="tbl-alphas"/>
+    <w:bookmarkEnd w:id="49"/>
+    <w:bookmarkStart w:id="50" w:name="tbl-alphas"/>
     <w:p>
       <w:pPr>
         <w:pStyle w:val="FigureTitle"/>
@@ -2351,6 +3135,7 @@
           </w:tcPr>
           <w:p>
             <w:pPr>
+              <w:pStyle w:val="Normal"/>
               <w:jc w:val="left"/>
               <w:pBdr>
                 <w:bottom w:val="none" w:sz="0" w:space="0" w:color="000000"/>
@@ -2365,7 +3150,6 @@
                 <w:i w:val="false"/>
                 <w:b w:val="false"/>
                 <w:u w:val="none"/>
-                <w:strike w:val="false"/>
                 <w:sz w:val="22"/>
                 <w:szCs w:val="22"/>
                 <w:color w:val="000000"/>
@@ -2377,7 +3161,6 @@
                 <w:i w:val="false"/>
                 <w:b w:val="false"/>
                 <w:u w:val="none"/>
-                <w:strike w:val="false"/>
                 <w:sz w:val="22"/>
                 <w:szCs w:val="22"/>
                 <w:color w:val="000000"/>
@@ -2405,6 +3188,7 @@
           </w:tcPr>
           <w:p>
             <w:pPr>
+              <w:pStyle w:val="Normal"/>
               <w:jc w:val="left"/>
               <w:pBdr>
                 <w:bottom w:val="none" w:sz="0" w:space="0" w:color="000000"/>
@@ -2419,7 +3203,6 @@
                 <w:i w:val="false"/>
                 <w:b w:val="false"/>
                 <w:u w:val="none"/>
-                <w:strike w:val="false"/>
                 <w:sz w:val="22"/>
                 <w:szCs w:val="22"/>
                 <w:color w:val="000000"/>
@@ -2431,7 +3214,6 @@
                 <w:i w:val="false"/>
                 <w:b w:val="false"/>
                 <w:u w:val="none"/>
-                <w:strike w:val="false"/>
                 <w:sz w:val="22"/>
                 <w:szCs w:val="22"/>
                 <w:color w:val="000000"/>
@@ -2459,6 +3241,7 @@
           </w:tcPr>
           <w:p>
             <w:pPr>
+              <w:pStyle w:val="Normal"/>
               <w:jc w:val="left"/>
               <w:pBdr>
                 <w:bottom w:val="none" w:sz="0" w:space="0" w:color="000000"/>
@@ -2473,7 +3256,6 @@
                 <w:i w:val="false"/>
                 <w:b w:val="false"/>
                 <w:u w:val="none"/>
-                <w:strike w:val="false"/>
                 <w:sz w:val="22"/>
                 <w:szCs w:val="22"/>
                 <w:color w:val="000000"/>
@@ -2485,7 +3267,6 @@
                 <w:i w:val="false"/>
                 <w:b w:val="false"/>
                 <w:u w:val="none"/>
-                <w:strike w:val="false"/>
                 <w:sz w:val="22"/>
                 <w:szCs w:val="22"/>
                 <w:color w:val="000000"/>
@@ -2519,6 +3300,7 @@
           </w:tcPr>
           <w:p>
             <w:pPr>
+              <w:pStyle w:val="Normal"/>
               <w:jc w:val="left"/>
               <w:pBdr>
                 <w:bottom w:val="none" w:sz="0" w:space="0" w:color="000000"/>
@@ -2533,7 +3315,6 @@
                 <w:i w:val="false"/>
                 <w:b w:val="false"/>
                 <w:u w:val="none"/>
-                <w:strike w:val="false"/>
                 <w:sz w:val="22"/>
                 <w:szCs w:val="22"/>
                 <w:color w:val="000000"/>
@@ -2545,7 +3326,6 @@
                 <w:i w:val="false"/>
                 <w:b w:val="false"/>
                 <w:u w:val="none"/>
-                <w:strike w:val="false"/>
                 <w:sz w:val="22"/>
                 <w:szCs w:val="22"/>
                 <w:color w:val="000000"/>
@@ -2573,6 +3353,7 @@
           </w:tcPr>
           <w:p>
             <w:pPr>
+              <w:pStyle w:val="Normal"/>
               <w:jc w:val="left"/>
               <w:pBdr>
                 <w:bottom w:val="none" w:sz="0" w:space="0" w:color="000000"/>
@@ -2587,7 +3368,6 @@
                 <w:i w:val="false"/>
                 <w:b w:val="false"/>
                 <w:u w:val="none"/>
-                <w:strike w:val="false"/>
                 <w:sz w:val="22"/>
                 <w:szCs w:val="22"/>
                 <w:color w:val="000000"/>
@@ -2599,7 +3379,6 @@
                 <w:i w:val="false"/>
                 <w:b w:val="false"/>
                 <w:u w:val="none"/>
-                <w:strike w:val="false"/>
                 <w:sz w:val="22"/>
                 <w:szCs w:val="22"/>
                 <w:color w:val="000000"/>
@@ -2627,6 +3406,7 @@
           </w:tcPr>
           <w:p>
             <w:pPr>
+              <w:pStyle w:val="Normal"/>
               <w:jc w:val="left"/>
               <w:pBdr>
                 <w:bottom w:val="none" w:sz="0" w:space="0" w:color="000000"/>
@@ -2641,7 +3421,6 @@
                 <w:i w:val="false"/>
                 <w:b w:val="false"/>
                 <w:u w:val="none"/>
-                <w:strike w:val="false"/>
                 <w:sz w:val="22"/>
                 <w:szCs w:val="22"/>
                 <w:color w:val="000000"/>
@@ -2653,7 +3432,6 @@
                 <w:i w:val="false"/>
                 <w:b w:val="false"/>
                 <w:u w:val="none"/>
-                <w:strike w:val="false"/>
                 <w:sz w:val="22"/>
                 <w:szCs w:val="22"/>
                 <w:color w:val="000000"/>
@@ -2687,6 +3465,7 @@
           </w:tcPr>
           <w:p>
             <w:pPr>
+              <w:pStyle w:val="Normal"/>
               <w:jc w:val="left"/>
               <w:pBdr>
                 <w:bottom w:val="none" w:sz="0" w:space="0" w:color="000000"/>
@@ -2701,7 +3480,6 @@
                 <w:i w:val="false"/>
                 <w:b w:val="false"/>
                 <w:u w:val="none"/>
-                <w:strike w:val="false"/>
                 <w:sz w:val="22"/>
                 <w:szCs w:val="22"/>
                 <w:color w:val="000000"/>
@@ -2713,7 +3491,6 @@
                 <w:i w:val="false"/>
                 <w:b w:val="false"/>
                 <w:u w:val="none"/>
-                <w:strike w:val="false"/>
                 <w:sz w:val="22"/>
                 <w:szCs w:val="22"/>
                 <w:color w:val="000000"/>
@@ -2741,6 +3518,7 @@
           </w:tcPr>
           <w:p>
             <w:pPr>
+              <w:pStyle w:val="Normal"/>
               <w:jc w:val="left"/>
               <w:pBdr>
                 <w:bottom w:val="none" w:sz="0" w:space="0" w:color="000000"/>
@@ -2755,7 +3533,6 @@
                 <w:i w:val="false"/>
                 <w:b w:val="false"/>
                 <w:u w:val="none"/>
-                <w:strike w:val="false"/>
                 <w:sz w:val="22"/>
                 <w:szCs w:val="22"/>
                 <w:color w:val="000000"/>
@@ -2767,7 +3544,6 @@
                 <w:i w:val="false"/>
                 <w:b w:val="false"/>
                 <w:u w:val="none"/>
-                <w:strike w:val="false"/>
                 <w:sz w:val="22"/>
                 <w:szCs w:val="22"/>
                 <w:color w:val="000000"/>
@@ -2795,6 +3571,7 @@
           </w:tcPr>
           <w:p>
             <w:pPr>
+              <w:pStyle w:val="Normal"/>
               <w:jc w:val="left"/>
               <w:pBdr>
                 <w:bottom w:val="none" w:sz="0" w:space="0" w:color="000000"/>
@@ -2809,7 +3586,6 @@
                 <w:i w:val="false"/>
                 <w:b w:val="false"/>
                 <w:u w:val="none"/>
-                <w:strike w:val="false"/>
                 <w:sz w:val="22"/>
                 <w:szCs w:val="22"/>
                 <w:color w:val="000000"/>
@@ -2821,7 +3597,6 @@
                 <w:i w:val="false"/>
                 <w:b w:val="false"/>
                 <w:u w:val="none"/>
-                <w:strike w:val="false"/>
                 <w:sz w:val="22"/>
                 <w:szCs w:val="22"/>
                 <w:color w:val="000000"/>
@@ -2855,6 +3630,7 @@
           </w:tcPr>
           <w:p>
             <w:pPr>
+              <w:pStyle w:val="Normal"/>
               <w:jc w:val="left"/>
               <w:pBdr>
                 <w:bottom w:val="none" w:sz="0" w:space="0" w:color="000000"/>
@@ -2869,7 +3645,6 @@
                 <w:i w:val="false"/>
                 <w:b w:val="false"/>
                 <w:u w:val="none"/>
-                <w:strike w:val="false"/>
                 <w:sz w:val="22"/>
                 <w:szCs w:val="22"/>
                 <w:color w:val="000000"/>
@@ -2881,7 +3656,6 @@
                 <w:i w:val="false"/>
                 <w:b w:val="false"/>
                 <w:u w:val="none"/>
-                <w:strike w:val="false"/>
                 <w:sz w:val="22"/>
                 <w:szCs w:val="22"/>
                 <w:color w:val="000000"/>
@@ -2909,6 +3683,7 @@
           </w:tcPr>
           <w:p>
             <w:pPr>
+              <w:pStyle w:val="Normal"/>
               <w:jc w:val="left"/>
               <w:pBdr>
                 <w:bottom w:val="none" w:sz="0" w:space="0" w:color="000000"/>
@@ -2923,7 +3698,6 @@
                 <w:i w:val="false"/>
                 <w:b w:val="false"/>
                 <w:u w:val="none"/>
-                <w:strike w:val="false"/>
                 <w:sz w:val="22"/>
                 <w:szCs w:val="22"/>
                 <w:color w:val="000000"/>
@@ -2935,7 +3709,6 @@
                 <w:i w:val="false"/>
                 <w:b w:val="false"/>
                 <w:u w:val="none"/>
-                <w:strike w:val="false"/>
                 <w:sz w:val="22"/>
                 <w:szCs w:val="22"/>
                 <w:color w:val="000000"/>
@@ -2963,6 +3736,7 @@
           </w:tcPr>
           <w:p>
             <w:pPr>
+              <w:pStyle w:val="Normal"/>
               <w:jc w:val="left"/>
               <w:pBdr>
                 <w:bottom w:val="none" w:sz="0" w:space="0" w:color="000000"/>
@@ -2977,7 +3751,6 @@
                 <w:i w:val="false"/>
                 <w:b w:val="false"/>
                 <w:u w:val="none"/>
-                <w:strike w:val="false"/>
                 <w:sz w:val="22"/>
                 <w:szCs w:val="22"/>
                 <w:color w:val="000000"/>
@@ -2989,7 +3762,6 @@
                 <w:i w:val="false"/>
                 <w:b w:val="false"/>
                 <w:u w:val="none"/>
-                <w:strike w:val="false"/>
                 <w:sz w:val="22"/>
                 <w:szCs w:val="22"/>
                 <w:color w:val="000000"/>
@@ -3023,6 +3795,7 @@
           </w:tcPr>
           <w:p>
             <w:pPr>
+              <w:pStyle w:val="Normal"/>
               <w:jc w:val="left"/>
               <w:pBdr>
                 <w:bottom w:val="none" w:sz="0" w:space="0" w:color="000000"/>
@@ -3037,7 +3810,6 @@
                 <w:i w:val="false"/>
                 <w:b w:val="false"/>
                 <w:u w:val="none"/>
-                <w:strike w:val="false"/>
                 <w:sz w:val="22"/>
                 <w:szCs w:val="22"/>
                 <w:color w:val="000000"/>
@@ -3049,7 +3821,6 @@
                 <w:i w:val="false"/>
                 <w:b w:val="false"/>
                 <w:u w:val="none"/>
-                <w:strike w:val="false"/>
                 <w:sz w:val="22"/>
                 <w:szCs w:val="22"/>
                 <w:color w:val="000000"/>
@@ -3077,6 +3848,7 @@
           </w:tcPr>
           <w:p>
             <w:pPr>
+              <w:pStyle w:val="Normal"/>
               <w:jc w:val="left"/>
               <w:pBdr>
                 <w:bottom w:val="none" w:sz="0" w:space="0" w:color="000000"/>
@@ -3091,7 +3863,6 @@
                 <w:i w:val="false"/>
                 <w:b w:val="false"/>
                 <w:u w:val="none"/>
-                <w:strike w:val="false"/>
                 <w:sz w:val="22"/>
                 <w:szCs w:val="22"/>
                 <w:color w:val="000000"/>
@@ -3103,7 +3874,6 @@
                 <w:i w:val="false"/>
                 <w:b w:val="false"/>
                 <w:u w:val="none"/>
-                <w:strike w:val="false"/>
                 <w:sz w:val="22"/>
                 <w:szCs w:val="22"/>
                 <w:color w:val="000000"/>
@@ -3131,6 +3901,7 @@
           </w:tcPr>
           <w:p>
             <w:pPr>
+              <w:pStyle w:val="Normal"/>
               <w:jc w:val="left"/>
               <w:pBdr>
                 <w:bottom w:val="none" w:sz="0" w:space="0" w:color="000000"/>
@@ -3145,7 +3916,6 @@
                 <w:i w:val="false"/>
                 <w:b w:val="false"/>
                 <w:u w:val="none"/>
-                <w:strike w:val="false"/>
                 <w:sz w:val="22"/>
                 <w:szCs w:val="22"/>
                 <w:color w:val="000000"/>
@@ -3157,7 +3927,6 @@
                 <w:i w:val="false"/>
                 <w:b w:val="false"/>
                 <w:u w:val="none"/>
-                <w:strike w:val="false"/>
                 <w:sz w:val="22"/>
                 <w:szCs w:val="22"/>
                 <w:color w:val="000000"/>
@@ -3191,6 +3960,7 @@
           </w:tcPr>
           <w:p>
             <w:pPr>
+              <w:pStyle w:val="Normal"/>
               <w:jc w:val="left"/>
               <w:pBdr>
                 <w:bottom w:val="none" w:sz="0" w:space="0" w:color="000000"/>
@@ -3205,7 +3975,6 @@
                 <w:i w:val="false"/>
                 <w:b w:val="false"/>
                 <w:u w:val="none"/>
-                <w:strike w:val="false"/>
                 <w:sz w:val="22"/>
                 <w:szCs w:val="22"/>
                 <w:color w:val="000000"/>
@@ -3217,7 +3986,6 @@
                 <w:i w:val="false"/>
                 <w:b w:val="false"/>
                 <w:u w:val="none"/>
-                <w:strike w:val="false"/>
                 <w:sz w:val="22"/>
                 <w:szCs w:val="22"/>
                 <w:color w:val="000000"/>
@@ -3245,6 +4013,7 @@
           </w:tcPr>
           <w:p>
             <w:pPr>
+              <w:pStyle w:val="Normal"/>
               <w:jc w:val="left"/>
               <w:pBdr>
                 <w:bottom w:val="none" w:sz="0" w:space="0" w:color="000000"/>
@@ -3259,7 +4028,6 @@
                 <w:i w:val="false"/>
                 <w:b w:val="false"/>
                 <w:u w:val="none"/>
-                <w:strike w:val="false"/>
                 <w:sz w:val="22"/>
                 <w:szCs w:val="22"/>
                 <w:color w:val="000000"/>
@@ -3271,7 +4039,6 @@
                 <w:i w:val="false"/>
                 <w:b w:val="false"/>
                 <w:u w:val="none"/>
-                <w:strike w:val="false"/>
                 <w:sz w:val="22"/>
                 <w:szCs w:val="22"/>
                 <w:color w:val="000000"/>
@@ -3299,6 +4066,7 @@
           </w:tcPr>
           <w:p>
             <w:pPr>
+              <w:pStyle w:val="Normal"/>
               <w:jc w:val="left"/>
               <w:pBdr>
                 <w:bottom w:val="none" w:sz="0" w:space="0" w:color="000000"/>
@@ -3313,7 +4081,6 @@
                 <w:i w:val="false"/>
                 <w:b w:val="false"/>
                 <w:u w:val="none"/>
-                <w:strike w:val="false"/>
                 <w:sz w:val="22"/>
                 <w:szCs w:val="22"/>
                 <w:color w:val="000000"/>
@@ -3325,7 +4092,6 @@
                 <w:i w:val="false"/>
                 <w:b w:val="false"/>
                 <w:u w:val="none"/>
-                <w:strike w:val="false"/>
                 <w:sz w:val="22"/>
                 <w:szCs w:val="22"/>
                 <w:color w:val="000000"/>
@@ -3359,6 +4125,7 @@
           </w:tcPr>
           <w:p>
             <w:pPr>
+              <w:pStyle w:val="Normal"/>
               <w:jc w:val="left"/>
               <w:pBdr>
                 <w:bottom w:val="none" w:sz="0" w:space="0" w:color="000000"/>
@@ -3373,7 +4140,6 @@
                 <w:i w:val="false"/>
                 <w:b w:val="false"/>
                 <w:u w:val="none"/>
-                <w:strike w:val="false"/>
                 <w:sz w:val="22"/>
                 <w:szCs w:val="22"/>
                 <w:color w:val="000000"/>
@@ -3385,7 +4151,6 @@
                 <w:i w:val="false"/>
                 <w:b w:val="false"/>
                 <w:u w:val="none"/>
-                <w:strike w:val="false"/>
                 <w:sz w:val="22"/>
                 <w:szCs w:val="22"/>
                 <w:color w:val="000000"/>
@@ -3413,6 +4178,7 @@
           </w:tcPr>
           <w:p>
             <w:pPr>
+              <w:pStyle w:val="Normal"/>
               <w:jc w:val="left"/>
               <w:pBdr>
                 <w:bottom w:val="none" w:sz="0" w:space="0" w:color="000000"/>
@@ -3427,7 +4193,6 @@
                 <w:i w:val="false"/>
                 <w:b w:val="false"/>
                 <w:u w:val="none"/>
-                <w:strike w:val="false"/>
                 <w:sz w:val="22"/>
                 <w:szCs w:val="22"/>
                 <w:color w:val="000000"/>
@@ -3439,7 +4204,6 @@
                 <w:i w:val="false"/>
                 <w:b w:val="false"/>
                 <w:u w:val="none"/>
-                <w:strike w:val="false"/>
                 <w:sz w:val="22"/>
                 <w:szCs w:val="22"/>
                 <w:color w:val="000000"/>
@@ -3467,6 +4231,7 @@
           </w:tcPr>
           <w:p>
             <w:pPr>
+              <w:pStyle w:val="Normal"/>
               <w:jc w:val="left"/>
               <w:pBdr>
                 <w:bottom w:val="none" w:sz="0" w:space="0" w:color="000000"/>
@@ -3481,7 +4246,6 @@
                 <w:i w:val="false"/>
                 <w:b w:val="false"/>
                 <w:u w:val="none"/>
-                <w:strike w:val="false"/>
                 <w:sz w:val="22"/>
                 <w:szCs w:val="22"/>
                 <w:color w:val="000000"/>
@@ -3493,7 +4257,6 @@
                 <w:i w:val="false"/>
                 <w:b w:val="false"/>
                 <w:u w:val="none"/>
-                <w:strike w:val="false"/>
                 <w:sz w:val="22"/>
                 <w:szCs w:val="22"/>
                 <w:color w:val="000000"/>
@@ -3527,6 +4290,7 @@
           </w:tcPr>
           <w:p>
             <w:pPr>
+              <w:pStyle w:val="Normal"/>
               <w:jc w:val="left"/>
               <w:pBdr>
                 <w:bottom w:val="none" w:sz="0" w:space="0" w:color="000000"/>
@@ -3541,7 +4305,6 @@
                 <w:i w:val="false"/>
                 <w:b w:val="false"/>
                 <w:u w:val="none"/>
-                <w:strike w:val="false"/>
                 <w:sz w:val="22"/>
                 <w:szCs w:val="22"/>
                 <w:color w:val="000000"/>
@@ -3553,7 +4316,6 @@
                 <w:i w:val="false"/>
                 <w:b w:val="false"/>
                 <w:u w:val="none"/>
-                <w:strike w:val="false"/>
                 <w:sz w:val="22"/>
                 <w:szCs w:val="22"/>
                 <w:color w:val="000000"/>
@@ -3581,6 +4343,7 @@
           </w:tcPr>
           <w:p>
             <w:pPr>
+              <w:pStyle w:val="Normal"/>
               <w:jc w:val="left"/>
               <w:pBdr>
                 <w:bottom w:val="none" w:sz="0" w:space="0" w:color="000000"/>
@@ -3595,7 +4358,6 @@
                 <w:i w:val="false"/>
                 <w:b w:val="false"/>
                 <w:u w:val="none"/>
-                <w:strike w:val="false"/>
                 <w:sz w:val="22"/>
                 <w:szCs w:val="22"/>
                 <w:color w:val="000000"/>
@@ -3607,7 +4369,6 @@
                 <w:i w:val="false"/>
                 <w:b w:val="false"/>
                 <w:u w:val="none"/>
-                <w:strike w:val="false"/>
                 <w:sz w:val="22"/>
                 <w:szCs w:val="22"/>
                 <w:color w:val="000000"/>
@@ -3635,6 +4396,7 @@
           </w:tcPr>
           <w:p>
             <w:pPr>
+              <w:pStyle w:val="Normal"/>
               <w:jc w:val="left"/>
               <w:pBdr>
                 <w:bottom w:val="none" w:sz="0" w:space="0" w:color="000000"/>
@@ -3649,7 +4411,6 @@
                 <w:i w:val="false"/>
                 <w:b w:val="false"/>
                 <w:u w:val="none"/>
-                <w:strike w:val="false"/>
                 <w:sz w:val="22"/>
                 <w:szCs w:val="22"/>
                 <w:color w:val="000000"/>
@@ -3661,7 +4422,6 @@
                 <w:i w:val="false"/>
                 <w:b w:val="false"/>
                 <w:u w:val="none"/>
-                <w:strike w:val="false"/>
                 <w:sz w:val="22"/>
                 <w:szCs w:val="22"/>
                 <w:color w:val="000000"/>
@@ -3695,6 +4455,7 @@
           </w:tcPr>
           <w:p>
             <w:pPr>
+              <w:pStyle w:val="Normal"/>
               <w:jc w:val="left"/>
               <w:pBdr>
                 <w:bottom w:val="none" w:sz="0" w:space="0" w:color="000000"/>
@@ -3709,7 +4470,6 @@
                 <w:i w:val="false"/>
                 <w:b w:val="false"/>
                 <w:u w:val="none"/>
-                <w:strike w:val="false"/>
                 <w:sz w:val="22"/>
                 <w:szCs w:val="22"/>
                 <w:color w:val="000000"/>
@@ -3721,7 +4481,6 @@
                 <w:i w:val="false"/>
                 <w:b w:val="false"/>
                 <w:u w:val="none"/>
-                <w:strike w:val="false"/>
                 <w:sz w:val="22"/>
                 <w:szCs w:val="22"/>
                 <w:color w:val="000000"/>
@@ -3749,6 +4508,7 @@
           </w:tcPr>
           <w:p>
             <w:pPr>
+              <w:pStyle w:val="Normal"/>
               <w:jc w:val="left"/>
               <w:pBdr>
                 <w:bottom w:val="none" w:sz="0" w:space="0" w:color="000000"/>
@@ -3763,7 +4523,6 @@
                 <w:i w:val="false"/>
                 <w:b w:val="false"/>
                 <w:u w:val="none"/>
-                <w:strike w:val="false"/>
                 <w:sz w:val="22"/>
                 <w:szCs w:val="22"/>
                 <w:color w:val="000000"/>
@@ -3775,7 +4534,6 @@
                 <w:i w:val="false"/>
                 <w:b w:val="false"/>
                 <w:u w:val="none"/>
-                <w:strike w:val="false"/>
                 <w:sz w:val="22"/>
                 <w:szCs w:val="22"/>
                 <w:color w:val="000000"/>
@@ -3803,6 +4561,7 @@
           </w:tcPr>
           <w:p>
             <w:pPr>
+              <w:pStyle w:val="Normal"/>
               <w:jc w:val="left"/>
               <w:pBdr>
                 <w:bottom w:val="none" w:sz="0" w:space="0" w:color="000000"/>
@@ -3817,7 +4576,6 @@
                 <w:i w:val="false"/>
                 <w:b w:val="false"/>
                 <w:u w:val="none"/>
-                <w:strike w:val="false"/>
                 <w:sz w:val="22"/>
                 <w:szCs w:val="22"/>
                 <w:color w:val="000000"/>
@@ -3829,7 +4587,6 @@
                 <w:i w:val="false"/>
                 <w:b w:val="false"/>
                 <w:u w:val="none"/>
-                <w:strike w:val="false"/>
                 <w:sz w:val="22"/>
                 <w:szCs w:val="22"/>
                 <w:color w:val="000000"/>
@@ -3863,6 +4620,7 @@
           </w:tcPr>
           <w:p>
             <w:pPr>
+              <w:pStyle w:val="Normal"/>
               <w:jc w:val="left"/>
               <w:pBdr>
                 <w:bottom w:val="none" w:sz="0" w:space="0" w:color="000000"/>
@@ -3877,7 +4635,6 @@
                 <w:i w:val="false"/>
                 <w:b w:val="false"/>
                 <w:u w:val="none"/>
-                <w:strike w:val="false"/>
                 <w:sz w:val="22"/>
                 <w:szCs w:val="22"/>
                 <w:color w:val="000000"/>
@@ -3889,7 +4646,6 @@
                 <w:i w:val="false"/>
                 <w:b w:val="false"/>
                 <w:u w:val="none"/>
-                <w:strike w:val="false"/>
                 <w:sz w:val="22"/>
                 <w:szCs w:val="22"/>
                 <w:color w:val="000000"/>
@@ -3917,6 +4673,7 @@
           </w:tcPr>
           <w:p>
             <w:pPr>
+              <w:pStyle w:val="Normal"/>
               <w:jc w:val="left"/>
               <w:pBdr>
                 <w:bottom w:val="none" w:sz="0" w:space="0" w:color="000000"/>
@@ -3931,7 +4688,6 @@
                 <w:i w:val="false"/>
                 <w:b w:val="false"/>
                 <w:u w:val="none"/>
-                <w:strike w:val="false"/>
                 <w:sz w:val="22"/>
                 <w:szCs w:val="22"/>
                 <w:color w:val="000000"/>
@@ -3943,7 +4699,6 @@
                 <w:i w:val="false"/>
                 <w:b w:val="false"/>
                 <w:u w:val="none"/>
-                <w:strike w:val="false"/>
                 <w:sz w:val="22"/>
                 <w:szCs w:val="22"/>
                 <w:color w:val="000000"/>
@@ -3971,6 +4726,7 @@
           </w:tcPr>
           <w:p>
             <w:pPr>
+              <w:pStyle w:val="Normal"/>
               <w:jc w:val="left"/>
               <w:pBdr>
                 <w:bottom w:val="none" w:sz="0" w:space="0" w:color="000000"/>
@@ -3985,7 +4741,6 @@
                 <w:i w:val="false"/>
                 <w:b w:val="false"/>
                 <w:u w:val="none"/>
-                <w:strike w:val="false"/>
                 <w:sz w:val="22"/>
                 <w:szCs w:val="22"/>
                 <w:color w:val="000000"/>
@@ -3997,7 +4752,6 @@
                 <w:i w:val="false"/>
                 <w:b w:val="false"/>
                 <w:u w:val="none"/>
-                <w:strike w:val="false"/>
                 <w:sz w:val="22"/>
                 <w:szCs w:val="22"/>
                 <w:color w:val="000000"/>
@@ -4008,13 +4762,13 @@
         </w:tc>
       </w:tr>
     </w:tbl>
-    <w:bookmarkEnd w:id="49"/>
+    <w:bookmarkEnd w:id="50"/>
     <w:p>
       <w:r>
         <w:br w:type="page"/>
       </w:r>
     </w:p>
-    <w:bookmarkStart w:id="50" w:name="tbl-corrs"/>
+    <w:bookmarkStart w:id="51" w:name="tbl-corrs"/>
     <w:p>
       <w:pPr>
         <w:pStyle w:val="FigureTitle"/>
@@ -4179,6 +4933,9 @@
                 <m:t>M</m:t>
               </m:r>
             </m:oMath>
+            <w:r>
+              <w:t xml:space="preserve">​</w:t>
+            </w:r>
           </w:p>
         </w:tc>
         <w:tc>
@@ -4196,6 +4953,9 @@
                 <m:t>D</m:t>
               </m:r>
             </m:oMath>
+            <w:r>
+              <w:t xml:space="preserve">​</w:t>
+            </w:r>
           </w:p>
         </w:tc>
       </w:tr>
@@ -5311,13 +6071,13 @@
         <w:t xml:space="preserve"> </w:t>
       </w:r>
     </w:p>
-    <w:bookmarkEnd w:id="50"/>
+    <w:bookmarkEnd w:id="51"/>
     <w:p>
       <w:r>
         <w:br w:type="page"/>
       </w:r>
     </w:p>
-    <w:bookmarkStart w:id="54" w:name="fig-net-gpt"/>
+    <w:bookmarkStart w:id="55" w:name="fig-net-gpt"/>
     <w:p>
       <w:pPr>
         <w:pStyle w:val="FigureTitle"/>
@@ -5343,18 +6103,18 @@
           <wp:inline>
             <wp:extent cx="5943600" cy="5943600"/>
             <wp:effectExtent b="0" l="0" r="0" t="0"/>
-            <wp:docPr descr="" title="" id="52" name="Picture"/>
+            <wp:docPr descr="" title="" id="53" name="Picture"/>
             <a:graphic>
               <a:graphicData uri="http://schemas.openxmlformats.org/drawingml/2006/picture">
                 <pic:pic>
                   <pic:nvPicPr>
-                    <pic:cNvPr descr="AI_JCM_files/figure-docx/fig-net-gpt-1.png" id="53" name="Picture"/>
+                    <pic:cNvPr descr="AI_JCM_files/figure-docx/fig-net-gpt-1.png" id="54" name="Picture"/>
                     <pic:cNvPicPr>
                       <a:picLocks noChangeArrowheads="1" noChangeAspect="1"/>
                     </pic:cNvPicPr>
                   </pic:nvPicPr>
                   <pic:blipFill>
-                    <a:blip r:embed="rId51"/>
+                    <a:blip r:embed="rId52"/>
                     <a:stretch>
                       <a:fillRect/>
                     </a:stretch>
@@ -5381,13 +6141,13 @@
         </w:drawing>
       </w:r>
     </w:p>
-    <w:bookmarkEnd w:id="54"/>
+    <w:bookmarkEnd w:id="55"/>
     <w:p>
       <w:r>
         <w:br w:type="page"/>
       </w:r>
     </w:p>
-    <w:bookmarkStart w:id="58" w:name="fig-net-sme"/>
+    <w:bookmarkStart w:id="59" w:name="fig-net-sme"/>
     <w:p>
       <w:pPr>
         <w:pStyle w:val="FigureTitle"/>
@@ -5413,18 +6173,18 @@
           <wp:inline>
             <wp:extent cx="5943600" cy="5943600"/>
             <wp:effectExtent b="0" l="0" r="0" t="0"/>
-            <wp:docPr descr="" title="" id="56" name="Picture"/>
+            <wp:docPr descr="" title="" id="57" name="Picture"/>
             <a:graphic>
               <a:graphicData uri="http://schemas.openxmlformats.org/drawingml/2006/picture">
                 <pic:pic>
                   <pic:nvPicPr>
-                    <pic:cNvPr descr="AI_JCM_files/figure-docx/fig-net-sme-1.png" id="57" name="Picture"/>
+                    <pic:cNvPr descr="AI_JCM_files/figure-docx/fig-net-sme-1.png" id="58" name="Picture"/>
                     <pic:cNvPicPr>
                       <a:picLocks noChangeArrowheads="1" noChangeAspect="1"/>
                     </pic:cNvPicPr>
                   </pic:nvPicPr>
                   <pic:blipFill>
-                    <a:blip r:embed="rId55"/>
+                    <a:blip r:embed="rId56"/>
                     <a:stretch>
                       <a:fillRect/>
                     </a:stretch>
@@ -5451,13 +6211,13 @@
         </w:drawing>
       </w:r>
     </w:p>
-    <w:bookmarkEnd w:id="58"/>
+    <w:bookmarkEnd w:id="59"/>
     <w:p>
       <w:r>
         <w:br w:type="page"/>
       </w:r>
     </w:p>
-    <w:bookmarkStart w:id="62" w:name="fig-net-genie"/>
+    <w:bookmarkStart w:id="63" w:name="fig-net-genie"/>
     <w:p>
       <w:pPr>
         <w:pStyle w:val="FigureTitle"/>
@@ -5483,18 +6243,18 @@
           <wp:inline>
             <wp:extent cx="5943600" cy="5943600"/>
             <wp:effectExtent b="0" l="0" r="0" t="0"/>
-            <wp:docPr descr="" title="" id="60" name="Picture"/>
+            <wp:docPr descr="" title="" id="61" name="Picture"/>
             <a:graphic>
               <a:graphicData uri="http://schemas.openxmlformats.org/drawingml/2006/picture">
                 <pic:pic>
                   <pic:nvPicPr>
-                    <pic:cNvPr descr="AI_JCM_files/figure-docx/fig-net-genie-1.png" id="61" name="Picture"/>
+                    <pic:cNvPr descr="AI_JCM_files/figure-docx/fig-net-genie-1.png" id="62" name="Picture"/>
                     <pic:cNvPicPr>
                       <a:picLocks noChangeArrowheads="1" noChangeAspect="1"/>
                     </pic:cNvPicPr>
                   </pic:nvPicPr>
                   <pic:blipFill>
-                    <a:blip r:embed="rId59"/>
+                    <a:blip r:embed="rId60"/>
                     <a:stretch>
                       <a:fillRect/>
                     </a:stretch>
@@ -5521,13 +6281,13 @@
         </w:drawing>
       </w:r>
     </w:p>
-    <w:bookmarkEnd w:id="62"/>
+    <w:bookmarkEnd w:id="63"/>
     <w:p>
       <w:r>
         <w:br w:type="page"/>
       </w:r>
     </w:p>
-    <w:bookmarkStart w:id="66" w:name="fig-ega-gpt"/>
+    <w:bookmarkStart w:id="67" w:name="fig-ega-gpt"/>
     <w:p>
       <w:pPr>
         <w:pStyle w:val="FigureTitle"/>
@@ -5553,18 +6313,18 @@
           <wp:inline>
             <wp:extent cx="5943600" cy="5943600"/>
             <wp:effectExtent b="0" l="0" r="0" t="0"/>
-            <wp:docPr descr="" title="" id="64" name="Picture"/>
+            <wp:docPr descr="" title="" id="65" name="Picture"/>
             <a:graphic>
               <a:graphicData uri="http://schemas.openxmlformats.org/drawingml/2006/picture">
                 <pic:pic>
                   <pic:nvPicPr>
-                    <pic:cNvPr descr="AI_JCM_files/figure-docx/fig-ega-gpt-1.png" id="65" name="Picture"/>
+                    <pic:cNvPr descr="AI_JCM_files/figure-docx/fig-ega-gpt-1.png" id="66" name="Picture"/>
                     <pic:cNvPicPr>
                       <a:picLocks noChangeArrowheads="1" noChangeAspect="1"/>
                     </pic:cNvPicPr>
                   </pic:nvPicPr>
                   <pic:blipFill>
-                    <a:blip r:embed="rId63"/>
+                    <a:blip r:embed="rId64"/>
                     <a:stretch>
                       <a:fillRect/>
                     </a:stretch>
@@ -5591,13 +6351,13 @@
         </w:drawing>
       </w:r>
     </w:p>
-    <w:bookmarkEnd w:id="66"/>
+    <w:bookmarkEnd w:id="67"/>
     <w:p>
       <w:r>
         <w:br w:type="page"/>
       </w:r>
     </w:p>
-    <w:bookmarkStart w:id="70" w:name="fig-ega-sme"/>
+    <w:bookmarkStart w:id="71" w:name="fig-ega-sme"/>
     <w:p>
       <w:pPr>
         <w:pStyle w:val="FigureTitle"/>
@@ -5623,18 +6383,18 @@
           <wp:inline>
             <wp:extent cx="5943600" cy="5943600"/>
             <wp:effectExtent b="0" l="0" r="0" t="0"/>
-            <wp:docPr descr="" title="" id="68" name="Picture"/>
+            <wp:docPr descr="" title="" id="69" name="Picture"/>
             <a:graphic>
               <a:graphicData uri="http://schemas.openxmlformats.org/drawingml/2006/picture">
                 <pic:pic>
                   <pic:nvPicPr>
-                    <pic:cNvPr descr="AI_JCM_files/figure-docx/fig-ega-sme-1.png" id="69" name="Picture"/>
+                    <pic:cNvPr descr="AI_JCM_files/figure-docx/fig-ega-sme-1.png" id="70" name="Picture"/>
                     <pic:cNvPicPr>
                       <a:picLocks noChangeArrowheads="1" noChangeAspect="1"/>
                     </pic:cNvPicPr>
                   </pic:nvPicPr>
                   <pic:blipFill>
-                    <a:blip r:embed="rId67"/>
+                    <a:blip r:embed="rId68"/>
                     <a:stretch>
                       <a:fillRect/>
                     </a:stretch>
@@ -5661,13 +6421,13 @@
         </w:drawing>
       </w:r>
     </w:p>
-    <w:bookmarkEnd w:id="70"/>
+    <w:bookmarkEnd w:id="71"/>
     <w:p>
       <w:r>
         <w:br w:type="page"/>
       </w:r>
     </w:p>
-    <w:bookmarkStart w:id="74" w:name="fig-ega-genie"/>
+    <w:bookmarkStart w:id="75" w:name="fig-ega-genie"/>
     <w:p>
       <w:pPr>
         <w:pStyle w:val="FigureTitle"/>
@@ -5693,18 +6453,18 @@
           <wp:inline>
             <wp:extent cx="5943600" cy="5943600"/>
             <wp:effectExtent b="0" l="0" r="0" t="0"/>
-            <wp:docPr descr="" title="" id="72" name="Picture"/>
+            <wp:docPr descr="" title="" id="73" name="Picture"/>
             <a:graphic>
               <a:graphicData uri="http://schemas.openxmlformats.org/drawingml/2006/picture">
                 <pic:pic>
                   <pic:nvPicPr>
-                    <pic:cNvPr descr="AI_JCM_files/figure-docx/fig-ega-genie-1.png" id="73" name="Picture"/>
+                    <pic:cNvPr descr="AI_JCM_files/figure-docx/fig-ega-genie-1.png" id="74" name="Picture"/>
                     <pic:cNvPicPr>
                       <a:picLocks noChangeArrowheads="1" noChangeAspect="1"/>
                     </pic:cNvPicPr>
                   </pic:nvPicPr>
                   <pic:blipFill>
-                    <a:blip r:embed="rId71"/>
+                    <a:blip r:embed="rId72"/>
                     <a:stretch>
                       <a:fillRect/>
                     </a:stretch>
@@ -5731,20 +6491,20 @@
         </w:drawing>
       </w:r>
     </w:p>
-    <w:bookmarkEnd w:id="74"/>
+    <w:bookmarkEnd w:id="75"/>
     <w:p>
       <w:r>
         <w:br w:type="page"/>
       </w:r>
     </w:p>
-    <w:bookmarkEnd w:id="75"/>
+    <w:bookmarkEnd w:id="76"/>
     <w:sectPr>
-      <w:headerReference r:id="rId9" w:type="even"/>
-      <w:headerReference r:id="rId11" w:type="default"/>
-      <w:footerReference r:id="rId14" w:type="even"/>
-      <w:footerReference r:id="rId13" w:type="default"/>
-      <w:headerReference r:id="rId10" w:type="first"/>
-      <w:footerReference r:id="rId12" w:type="first"/>
+      <w:headerReference r:id="rId8" w:type="even"/>
+      <w:headerReference r:id="rId9" w:type="default"/>
+      <w:footerReference r:id="rId10" w:type="even"/>
+      <w:footerReference r:id="rId11" w:type="default"/>
+      <w:headerReference r:id="rId12" w:type="first"/>
+      <w:footerReference r:id="rId13" w:type="first"/>
       <w:pgSz w:h="15840" w:w="12240"/>
       <w:pgMar w:bottom="1440" w:footer="720" w:gutter="0" w:header="720" w:left="1440" w:right="1440" w:top="1440"/>
       <w:cols w:space="720"/>
@@ -5800,25 +6560,6 @@
     <w:p>
       <w:r>
         <w:separator/>
-      </w:r>
-    </w:p>
-  </w:footnote>
-  <w:footnote w:id="30">
-    <w:p>
-      <w:pPr>
-        <w:pStyle w:val="FootnoteText"/>
-      </w:pPr>
-      <w:r>
-        <w:rPr>
-          <w:rStyle w:val="FootnoteReference"/>
-        </w:rPr>
-        <w:footnoteRef/>
-      </w:r>
-      <w:r>
-        <w:t xml:space="preserve"> </w:t>
-      </w:r>
-      <w:r>
-        <w:t xml:space="preserve">Each figure shows the results of an exploratory factor analysis as a network. The large grey nodes are the extracted factors. The smaller colored nodes are the survey items, and their color shows which subscale the item was written for: Efficiency Seeking, Pragmatic Integrator or Collaborative Optimiser. A line between an item and a factor means the item loads on that factor at |.30| or higher. Thicker, darker lines mean stronger loadings, and red lines mean negative loadings. If the items worked as intended, each factor would be surrounded by a cluster of items of a single color, and each item would connect to only one factor. Factors that collect items of mixed colors, or items that connect to several factors (cross-loadings), suggest the intended three-type structure is not holding up.</w:t>
       </w:r>
     </w:p>
   </w:footnote>

</xml_diff>